<commit_message>
site: refresh CV and portfolio with current release state
Update the portfolio version-authority line to current releases (Index 2.13.0,
Gather 1.8.2, Forum 1.14.0, BuildLang 1.4.0, EMET 1.3.0, Crucible 1.2.0,
Calibrate Pro 2.0.0, Phantom 1.1.1) and note the new writing-quality linter
served over MCP as a developed capability on both pages. Add an EMET entry to
the portfolio owned-systems list, and refresh the updated date to 2026-09-14.

Regenerate the CV PDF and DOCX plus the release manifest and build receipt with
the pinned document runtime, and update the reviewed release-spine fingerprint.
Career gate suite green (57 passed).

Co-Authored-By: Claude Opus 4.8 <noreply@anthropic.com>
</commit_message>
<xml_diff>
--- a/career/Zain-Dana-Harper-CV.docx
+++ b/career/Zain-Dana-Harper-CV.docx
@@ -178,7 +178,7 @@
         <w:spacing w:before="0" w:after="30" w:line="240" w:lineRule="auto"/>
       </w:pPr>
       <w:r>
-        <w:t>Flywheel is a shipped agent-workflow platform. Separate public work includes Terminal State Fixtures, BuildLang, Gather, Index, Crucible, BRender Archival, Engine Revival, retro-system pages, and public-safe security and evaluation documentation.</w:t>
+        <w:t>Flywheel is a shipped agent-workflow platform for running models under gated actions and recording runs a skeptic can re-check. It now carries a writing-quality linter served over MCP, so any harness can score prose against a register standard. Separate public work includes EMET, a byte-integrity witness CLI, plus Mneme, Crucible, Gather, Index, BuildLang, Calibrate Pro, Terminal State Fixtures, BRender Archival, Engine Revival, retro-system pages, and public-safe security and evaluation documentation.</w:t>
       </w:r>
     </w:p>
     <w:p>
@@ -219,7 +219,7 @@
         <w:spacing w:before="0" w:after="30" w:line="240" w:lineRule="auto"/>
       </w:pPr>
       <w:r>
-        <w:t>Updated 2026-08-28. Public dates preserve unknown months. Phone and legal-name attestation are omitted.</w:t>
+        <w:t>Updated 2026-09-14. Public dates preserve unknown months. Phone and legal-name attestation are omitted.</w:t>
       </w:r>
     </w:p>
     <w:sectPr>

</xml_diff>

<commit_message>
site: refresh CV and portfolio with current release state (#248)
Update the portfolio version-authority line to current releases (Index 2.13.0,
Gather 1.8.2, Forum 1.14.0, BuildLang 1.4.0, EMET 1.3.0, Crucible 1.2.0,
Calibrate Pro 2.0.0, Phantom 1.1.1) and note the new writing-quality linter
served over MCP as a developed capability on both pages. Add an EMET entry to
the portfolio owned-systems list, and refresh the updated date to 2026-09-14.

Regenerate the CV PDF and DOCX plus the release manifest and build receipt with
the pinned document runtime, and update the reviewed release-spine fingerprint.
Career gate suite green (57 passed).

Co-authored-by: Zain Dana Harper <17142659+HarperZ9@users.noreply.github.com>
Co-authored-by: Claude Opus 4.8 <noreply@anthropic.com>
</commit_message>
<xml_diff>
--- a/career/Zain-Dana-Harper-CV.docx
+++ b/career/Zain-Dana-Harper-CV.docx
@@ -178,7 +178,7 @@
         <w:spacing w:before="0" w:after="30" w:line="240" w:lineRule="auto"/>
       </w:pPr>
       <w:r>
-        <w:t>Flywheel is a shipped agent-workflow platform. Separate public work includes Terminal State Fixtures, BuildLang, Gather, Index, Crucible, BRender Archival, Engine Revival, retro-system pages, and public-safe security and evaluation documentation.</w:t>
+        <w:t>Flywheel is a shipped agent-workflow platform for running models under gated actions and recording runs a skeptic can re-check. It now carries a writing-quality linter served over MCP, so any harness can score prose against a register standard. Separate public work includes EMET, a byte-integrity witness CLI, plus Mneme, Crucible, Gather, Index, BuildLang, Calibrate Pro, Terminal State Fixtures, BRender Archival, Engine Revival, retro-system pages, and public-safe security and evaluation documentation.</w:t>
       </w:r>
     </w:p>
     <w:p>
@@ -219,7 +219,7 @@
         <w:spacing w:before="0" w:after="30" w:line="240" w:lineRule="auto"/>
       </w:pPr>
       <w:r>
-        <w:t>Updated 2026-08-28. Public dates preserve unknown months. Phone and legal-name attestation are omitted.</w:t>
+        <w:t>Updated 2026-09-14. Public dates preserve unknown months. Phone and legal-name attestation are omitted.</w:t>
       </w:r>
     </w:p>
     <w:sectPr>

</xml_diff>

<commit_message>
career: restore one-page value-led resumes and expanded source-matched CV
</commit_message>
<xml_diff>
--- a/career/Zain-Dana-Harper-CV.docx
+++ b/career/Zain-Dana-Harper-CV.docx
@@ -5,7 +5,10 @@
     <w:p>
       <w:pPr>
         <w:pStyle w:val="Title"/>
-        <w:spacing w:before="0" w:after="30" w:line="240" w:lineRule="auto"/>
+        <w:keepNext/>
+        <w:keepLines/>
+        <w:widowControl/>
+        <w:spacing w:before="0" w:after="100" w:line="460" w:lineRule="exact"/>
       </w:pPr>
       <w:r>
         <w:t>Zain Dana Harper</w:t>
@@ -13,194 +16,1073 @@
     </w:p>
     <w:p>
       <w:pPr>
-        <w:spacing w:before="0" w:after="30" w:line="240" w:lineRule="auto"/>
+        <w:keepNext/>
+        <w:keepLines/>
+        <w:widowControl/>
+        <w:spacing w:before="0" w:after="40" w:line="240" w:lineRule="exact"/>
       </w:pPr>
       <w:r>
-        <w:t>Public-safe CV.</w:t>
+        <w:rPr>
+          <w:sz w:val="21"/>
+        </w:rPr>
+        <w:t>Seattle, Washington | zaindharper@gmail.com | harperz9.github.io</w:t>
       </w:r>
     </w:p>
     <w:p>
       <w:pPr>
-        <w:spacing w:before="0" w:after="30" w:line="240" w:lineRule="auto"/>
+        <w:keepNext w:val="0"/>
+        <w:keepLines/>
+        <w:widowControl/>
+        <w:spacing w:before="0" w:after="60" w:line="252" w:lineRule="exact"/>
       </w:pPr>
       <w:r>
-        <w:t>Seattle, Washington | zaindharper@gmail.com | LinkedIn | GitHub</w:t>
+        <w:t>linkedin.com/in/zaindanaharper | github.com/HarperZ9</w:t>
+      </w:r>
+    </w:p>
+    <w:p>
+      <w:pPr>
+        <w:pStyle w:val="Subtitle"/>
+        <w:keepNext/>
+        <w:keepLines/>
+        <w:widowControl/>
+        <w:spacing w:before="80" w:after="60" w:line="264" w:lineRule="exact"/>
+      </w:pPr>
+      <w:r>
+        <w:t>Curriculum Vitae | Systems Engineering, AI Infrastructure, and Field Operations</w:t>
+      </w:r>
+    </w:p>
+    <w:p>
+      <w:pPr>
+        <w:pStyle w:val="Heading1"/>
+        <w:keepNext/>
+        <w:keepLines/>
+        <w:widowControl/>
+        <w:spacing w:before="120" w:after="60" w:line="280" w:lineRule="exact"/>
+      </w:pPr>
+      <w:r>
+        <w:t>Profile</w:t>
+      </w:r>
+    </w:p>
+    <w:p>
+      <w:pPr>
+        <w:keepNext w:val="0"/>
+        <w:keepLines/>
+        <w:widowControl/>
+        <w:spacing w:before="0" w:after="60" w:line="252" w:lineRule="exact"/>
+      </w:pPr>
+      <w:r>
+        <w:t>Independent systems engineer and technical writer building AI workstations, evaluation and accountability tools, language tooling, and graphics systems. My work connects a practical question to a verifiable implementation: what happened, what evidence supports it, and who authorized the next action. I combine a self-directed programming history with prior technical networking support and eleven years of full-time arboriculture and customer-facing operations.</w:t>
+      </w:r>
+    </w:p>
+    <w:p>
+      <w:pPr>
+        <w:pStyle w:val="Heading1"/>
+        <w:keepNext/>
+        <w:keepLines/>
+        <w:widowControl/>
+        <w:spacing w:before="120" w:after="60" w:line="280" w:lineRule="exact"/>
+      </w:pPr>
+      <w:r>
+        <w:t>Professional Experience</w:t>
       </w:r>
     </w:p>
     <w:p>
       <w:pPr>
         <w:pStyle w:val="Heading2"/>
-        <w:spacing w:before="0" w:after="30" w:line="240" w:lineRule="auto"/>
+        <w:keepNext/>
+        <w:keepLines/>
+        <w:widowControl/>
+        <w:spacing w:before="100" w:after="40" w:line="256" w:lineRule="exact"/>
       </w:pPr>
       <w:r>
-        <w:t>Current employment targets</w:t>
+        <w:t>Independent Systems Engineer | Independent practice</w:t>
       </w:r>
     </w:p>
     <w:p>
       <w:pPr>
-        <w:spacing w:before="0" w:after="30" w:line="240" w:lineRule="auto"/>
+        <w:keepNext/>
+        <w:keepLines/>
+        <w:widowControl/>
+        <w:spacing w:before="0" w:after="60" w:line="240" w:lineRule="exact"/>
       </w:pPr>
       <w:r>
-        <w:t>Technical support, developer operations, QA, evaluation tooling, Python developer tools, public operations, grounds, parks, facilities, ports, utilities, fire-support, and field-safety roles. Field routes are measured separately from the technical cohort.</w:t>
+        <w:rPr>
+          <w:sz w:val="21"/>
+        </w:rPr>
+        <w:t>Seattle / remote | 2023 to Present</w:t>
+      </w:r>
+    </w:p>
+    <w:p>
+      <w:pPr>
+        <w:pStyle w:val="ListBullet"/>
+        <w:keepNext w:val="0"/>
+        <w:keepLines/>
+        <w:widowControl/>
+        <w:spacing w:before="0" w:after="60" w:line="252" w:lineRule="exact"/>
+        <w:ind w:left="245" w:hanging="173"/>
+      </w:pPr>
+      <w:r>
+        <w:t>Own the architecture, implementation, integration, tests, documentation, and release work for Flywheel and related tools under the Zentropy Labs project identity. Work spans Python services and command-line tools, Flutter desktop software, Rust systems tooling, and browser interfaces.</w:t>
+      </w:r>
+    </w:p>
+    <w:p>
+      <w:pPr>
+        <w:pStyle w:val="ListBullet"/>
+        <w:keepNext w:val="0"/>
+        <w:keepLines/>
+        <w:widowControl/>
+        <w:spacing w:before="0" w:after="60" w:line="252" w:lineRule="exact"/>
+        <w:ind w:left="245" w:hanging="173"/>
+      </w:pPr>
+      <w:r>
+        <w:t>Develop model-agnostic workflows, evaluation harnesses, controlled-action interfaces, and source-linked records that can be checked without relying on a model to approve its own answer.</w:t>
+      </w:r>
+    </w:p>
+    <w:p>
+      <w:pPr>
+        <w:pStyle w:val="ListBullet"/>
+        <w:keepNext w:val="0"/>
+        <w:keepLines/>
+        <w:widowControl/>
+        <w:spacing w:before="0" w:after="60" w:line="252" w:lineRule="exact"/>
+        <w:ind w:left="245" w:hanging="173"/>
+      </w:pPr>
+      <w:r>
+        <w:t>Contribute focused fixes, regression tests, and documentation to externally maintained projects, responding to maintainer review and preserving the scope of each accepted change.</w:t>
       </w:r>
     </w:p>
     <w:p>
       <w:pPr>
         <w:pStyle w:val="Heading2"/>
-        <w:spacing w:before="0" w:after="30" w:line="240" w:lineRule="auto"/>
+        <w:keepNext/>
+        <w:keepLines/>
+        <w:widowControl/>
+        <w:spacing w:before="100" w:after="40" w:line="256" w:lineRule="exact"/>
       </w:pPr>
       <w:r>
-        <w:t>Accepted external work</w:t>
+        <w:t>Freelance Technical Writer, Documentation, and Product Operations</w:t>
+      </w:r>
+    </w:p>
+    <w:p>
+      <w:pPr>
+        <w:keepNext/>
+        <w:keepLines/>
+        <w:widowControl/>
+        <w:spacing w:before="0" w:after="60" w:line="240" w:lineRule="exact"/>
+      </w:pPr>
+      <w:r>
+        <w:rPr>
+          <w:sz w:val="21"/>
+        </w:rPr>
+        <w:t>Independent practice | Began 2017; project-based work</w:t>
       </w:r>
     </w:p>
     <w:p>
       <w:pPr>
         <w:pStyle w:val="ListBullet"/>
-        <w:spacing w:before="0" w:after="30" w:line="240" w:lineRule="auto"/>
+        <w:keepNext w:val="0"/>
+        <w:keepLines/>
+        <w:widowControl/>
+        <w:spacing w:before="0" w:after="60" w:line="252" w:lineRule="exact"/>
+        <w:ind w:left="245" w:hanging="173"/>
       </w:pPr>
       <w:r>
-        <w:t>Free Law Project litigant-portal PR 820: runnable database-free fast-test documentation.</w:t>
+        <w:t>Produced technical and compliance documentation, API and implementation guides, proposals, release notes, and operational playbooks. Turned implementation details into material usable by customers, developers, and reviewers.</w:t>
+      </w:r>
+    </w:p>
+    <w:p>
+      <w:pPr>
+        <w:pStyle w:val="Heading2"/>
+        <w:keepNext/>
+        <w:keepLines/>
+        <w:widowControl/>
+        <w:spacing w:before="100" w:after="40" w:line="256" w:lineRule="exact"/>
+      </w:pPr>
+      <w:r>
+        <w:t>Commercial Arboriculture and Field Operations | Legendary Tree</w:t>
+      </w:r>
+    </w:p>
+    <w:p>
+      <w:pPr>
+        <w:keepNext/>
+        <w:keepLines/>
+        <w:widowControl/>
+        <w:spacing w:before="0" w:after="60" w:line="240" w:lineRule="exact"/>
+      </w:pPr>
+      <w:r>
+        <w:rPr>
+          <w:sz w:val="21"/>
+        </w:rPr>
+        <w:t>Seattle area | April 25, 2015 to June 2, 2026</w:t>
       </w:r>
     </w:p>
     <w:p>
       <w:pPr>
         <w:pStyle w:val="ListBullet"/>
-        <w:spacing w:before="0" w:after="30" w:line="240" w:lineRule="auto"/>
+        <w:keepNext w:val="0"/>
+        <w:keepLines/>
+        <w:widowControl/>
+        <w:spacing w:before="0" w:after="60" w:line="252" w:lineRule="exact"/>
+        <w:ind w:left="245" w:hanging="173"/>
       </w:pPr>
       <w:r>
-        <w:t>Hebbian Robotics hflow PR 157: reserved-column drift test coverage.</w:t>
+        <w:t>Combined ground-based tree-care work and safety coordination with client intake, site assessments, estimates, proposals, scheduling, and crew/vendor communication.</w:t>
       </w:r>
     </w:p>
     <w:p>
       <w:pPr>
         <w:pStyle w:val="ListBullet"/>
-        <w:spacing w:before="0" w:after="30" w:line="240" w:lineRule="auto"/>
+        <w:keepNext w:val="0"/>
+        <w:keepLines/>
+        <w:widowControl/>
+        <w:spacing w:before="0" w:after="60" w:line="252" w:lineRule="exact"/>
+        <w:ind w:left="245" w:hanging="173"/>
       </w:pPr>
       <w:r>
-        <w:t>Voxwire PR 44: offline websocket recording and replay coverage.</w:t>
+        <w:t>Monitored rigging systems, clearances, and changing conditions while supporting climbers from the ground. Explained work options and constraints to clients and maintained continuity between the proposed scope and field execution.</w:t>
+      </w:r>
+    </w:p>
+    <w:p>
+      <w:pPr>
+        <w:pStyle w:val="Heading2"/>
+        <w:keepNext/>
+        <w:keepLines/>
+        <w:widowControl/>
+        <w:spacing w:before="100" w:after="40" w:line="256" w:lineRule="exact"/>
+      </w:pPr>
+      <w:r>
+        <w:t>Technical Networking Support | Xbox/Microsoft contract</w:t>
+      </w:r>
+    </w:p>
+    <w:p>
+      <w:pPr>
+        <w:keepNext/>
+        <w:keepLines/>
+        <w:widowControl/>
+        <w:spacing w:before="0" w:after="60" w:line="240" w:lineRule="exact"/>
+      </w:pPr>
+      <w:r>
+        <w:rPr>
+          <w:sz w:val="21"/>
+        </w:rPr>
+        <w:t>Subcontracted through Stream/Convergys | Wilsonville, Oregon | 2014 to 2015</w:t>
       </w:r>
     </w:p>
     <w:p>
       <w:pPr>
         <w:pStyle w:val="ListBullet"/>
-        <w:spacing w:before="0" w:after="30" w:line="240" w:lineRule="auto"/>
+        <w:keepNext w:val="0"/>
+        <w:keepLines/>
+        <w:widowControl/>
+        <w:spacing w:before="0" w:after="60" w:line="252" w:lineRule="exact"/>
+        <w:ind w:left="245" w:hanging="173"/>
       </w:pPr>
       <w:r>
-        <w:t>DeepEval PR 2822: unhashable tool-output correctness fix.</w:t>
+        <w:t>Diagnosed connectivity and account issues by phone and chat using TCP/IP, DNS, NAT, firewall, and router troubleshooting; documented repeatable resolutions and customer-facing instructions.</w:t>
+      </w:r>
+    </w:p>
+    <w:p>
+      <w:pPr>
+        <w:pStyle w:val="Heading1"/>
+        <w:keepNext/>
+        <w:keepLines/>
+        <w:widowControl/>
+        <w:spacing w:before="120" w:after="60" w:line="280" w:lineRule="exact"/>
+      </w:pPr>
+      <w:r>
+        <w:t>Programming Background</w:t>
+      </w:r>
+    </w:p>
+    <w:p>
+      <w:pPr>
+        <w:keepNext w:val="0"/>
+        <w:keepLines/>
+        <w:widowControl/>
+        <w:spacing w:before="0" w:after="60" w:line="252" w:lineRule="exact"/>
+      </w:pPr>
+      <w:r>
+        <w:t>Self-directed programming began with game modding, reverse engineering, bot and rotation logic, and runtime-memory tooling, then developed into systems engineering, graphics, compilers, and AI infrastructure. This is a project history, not a claim of equivalent years of paid software employment.</w:t>
+      </w:r>
+    </w:p>
+    <w:p>
+      <w:pPr>
+        <w:pStyle w:val="Heading1"/>
+        <w:keepNext/>
+        <w:keepLines/>
+        <w:widowControl/>
+        <w:spacing w:before="120" w:after="60" w:line="280" w:lineRule="exact"/>
+      </w:pPr>
+      <w:r>
+        <w:t>AI Platform and Agent Systems</w:t>
+      </w:r>
+    </w:p>
+    <w:p>
+      <w:pPr>
+        <w:pStyle w:val="Heading2"/>
+        <w:keepNext/>
+        <w:keepLines/>
+        <w:widowControl/>
+        <w:spacing w:before="100" w:after="40" w:line="256" w:lineRule="exact"/>
+      </w:pPr>
+      <w:r>
+        <w:t>Flywheel | Model-agnostic AI workstation and coding harness</w:t>
+      </w:r>
+    </w:p>
+    <w:p>
+      <w:pPr>
+        <w:keepNext w:val="0"/>
+        <w:keepLines/>
+        <w:widowControl/>
+        <w:spacing w:before="0" w:after="60" w:line="252" w:lineRule="exact"/>
+      </w:pPr>
+      <w:r>
+        <w:t>Primary owned platform. The September 19, 2026 v1.0.1 release includes a Windows installer with a bundled engine. The source repository contains the Python runtime, Flutter desktop client, and browser fallback.</w:t>
       </w:r>
     </w:p>
     <w:p>
       <w:pPr>
         <w:pStyle w:val="ListBullet"/>
-        <w:spacing w:before="0" w:after="30" w:line="240" w:lineRule="auto"/>
+        <w:keepNext w:val="0"/>
+        <w:keepLines/>
+        <w:widowControl/>
+        <w:spacing w:before="0" w:after="60" w:line="252" w:lineRule="exact"/>
+        <w:ind w:left="245" w:hanging="173"/>
       </w:pPr>
       <w:r>
-        <w:t>TOMLKit PR 549: dotted-key sibling preservation fix.</w:t>
+        <w:t>Routes tasks to hosted or local models through an OpenAI-compatible gateway; keeps model selection separate from the task record and exposes command-line, desktop, and API entry points.</w:t>
       </w:r>
     </w:p>
     <w:p>
       <w:pPr>
         <w:pStyle w:val="ListBullet"/>
-        <w:spacing w:before="0" w:after="30" w:line="240" w:lineRule="auto"/>
+        <w:keepNext w:val="0"/>
+        <w:keepLines/>
+        <w:widowControl/>
+        <w:spacing w:before="0" w:after="60" w:line="252" w:lineRule="exact"/>
+        <w:ind w:left="245" w:hanging="173"/>
       </w:pPr>
       <w:r>
-        <w:t>Datasette PR 2815: wrong-arity composite-primary-key URL error handling.</w:t>
+        <w:t>Provides Rowan, a desktop assistant that translates requests into recorded tasks, together with permission-checked coding and tool-use workflows, session state, and inspectable outcomes.</w:t>
+      </w:r>
+    </w:p>
+    <w:p>
+      <w:pPr>
+        <w:pStyle w:val="ListBullet"/>
+        <w:keepNext w:val="0"/>
+        <w:keepLines/>
+        <w:widowControl/>
+        <w:spacing w:before="0" w:after="60" w:line="252" w:lineRule="exact"/>
+        <w:ind w:left="245" w:hanging="173"/>
+      </w:pPr>
+      <w:r>
+        <w:t>Composes research intake, workspace indexing, verification, orchestration, memory, authoring, and other tools through registered lanes and published interfaces. Bundled components and installable companions have distinct packaging requirements.</w:t>
+      </w:r>
+    </w:p>
+    <w:p>
+      <w:pPr>
+        <w:pStyle w:val="ListBullet"/>
+        <w:keepNext w:val="0"/>
+        <w:keepLines/>
+        <w:widowControl/>
+        <w:spacing w:before="0" w:after="60" w:line="252" w:lineRule="exact"/>
+        <w:ind w:left="245" w:hanging="173"/>
+      </w:pPr>
+      <w:r>
+        <w:t>Produces sealed, re-derivable receipts and offline MATCH, DRIFT, or UNVERIFIABLE outcomes. A reproducible receipt establishes the bounded check it records, not universal model accuracy or safety.</w:t>
       </w:r>
     </w:p>
     <w:p>
       <w:pPr>
         <w:pStyle w:val="Heading2"/>
-        <w:spacing w:before="0" w:after="30" w:line="240" w:lineRule="auto"/>
+        <w:keepNext/>
+        <w:keepLines/>
+        <w:widowControl/>
+        <w:spacing w:before="100" w:after="40" w:line="256" w:lineRule="exact"/>
       </w:pPr>
       <w:r>
-        <w:t>Experience</w:t>
+        <w:t>Accountable Surface | Governed actions and computer-use adapters</w:t>
       </w:r>
     </w:p>
     <w:p>
       <w:pPr>
-        <w:spacing w:before="0" w:after="30" w:line="240" w:lineRule="auto"/>
+        <w:keepNext w:val="0"/>
+        <w:keepLines/>
+        <w:widowControl/>
+        <w:spacing w:before="0" w:after="60" w:line="252" w:lineRule="exact"/>
       </w:pPr>
       <w:r>
-        <w:t>Technical Networking Support, Xbox/Microsoft contract | subcontracted through Stream/Convergys | Wilsonville, Oregon | 2014 to 2015</w:t>
+        <w:t>Built operator-granted action interfaces for filesystem, command, API, browser, and Windows UI Automation work. Actions carry explicit scope and postconditions; persisted journals preserve decisions and observed effects. Reversible adapters include restoration paths. Fake drivers make browser and desktop scenarios testable without uncontrolled live actions.</w:t>
       </w:r>
     </w:p>
     <w:p>
       <w:pPr>
-        <w:spacing w:before="0" w:after="30" w:line="240" w:lineRule="auto"/>
+        <w:keepNext w:val="0"/>
+        <w:keepLines/>
+        <w:widowControl/>
+        <w:spacing w:before="0" w:after="60" w:line="252" w:lineRule="exact"/>
       </w:pPr>
       <w:r>
-        <w:t>Full-time operations and commercial arboriculture | Legendary Tree (organization label) | April 25, 2015 to June 2, 2026</w:t>
-      </w:r>
-    </w:p>
-    <w:p>
-      <w:pPr>
-        <w:spacing w:before="0" w:after="30" w:line="240" w:lineRule="auto"/>
-      </w:pPr>
-      <w:r>
-        <w:t>Legendary Tree is the applicant-provided organization label; no conventional job title or legal employer of record is asserted.</w:t>
-      </w:r>
-    </w:p>
-    <w:p>
-      <w:pPr>
-        <w:spacing w:before="0" w:after="30" w:line="240" w:lineRule="auto"/>
-      </w:pPr>
-      <w:r>
-        <w:t>Freelance Technical Writer, Documentation, and Product Operations | independent practice | started 2017</w:t>
-      </w:r>
-    </w:p>
-    <w:p>
-      <w:pPr>
-        <w:spacing w:before="0" w:after="30" w:line="240" w:lineRule="auto"/>
-      </w:pPr>
-      <w:r>
-        <w:t>Independent Systems Engineer | independent practice | started 2023</w:t>
-      </w:r>
-    </w:p>
-    <w:p>
-      <w:pPr>
-        <w:spacing w:before="0" w:after="30" w:line="240" w:lineRule="auto"/>
-      </w:pPr>
-      <w:r>
-        <w:t>The 2017 and 2023 start years do not state current status or an end date; both remain unspecified.</w:t>
+        <w:t>The v0.2.0 release provides source and wheel artifacts on GitHub. The project remains alpha; browser integrations are optional and a tool refusal or unknown result is not promoted into a successful action.</w:t>
       </w:r>
     </w:p>
     <w:p>
       <w:pPr>
         <w:pStyle w:val="Heading2"/>
-        <w:spacing w:before="0" w:after="30" w:line="240" w:lineRule="auto"/>
+        <w:keepNext/>
+        <w:keepLines/>
+        <w:widowControl/>
+        <w:spacing w:before="100" w:after="40" w:line="256" w:lineRule="exact"/>
       </w:pPr>
       <w:r>
-        <w:t>Owned systems and public research</w:t>
+        <w:t>Articulate | Writing analysis and accountable editing</w:t>
       </w:r>
     </w:p>
     <w:p>
       <w:pPr>
-        <w:spacing w:before="0" w:after="30" w:line="240" w:lineRule="auto"/>
+        <w:keepNext w:val="0"/>
+        <w:keepLines/>
+        <w:widowControl/>
+        <w:spacing w:before="0" w:after="60" w:line="252" w:lineRule="exact"/>
       </w:pPr>
       <w:r>
-        <w:t>Flywheel v1.0.1 shipped 2026-09-19: an agent-workflow platform that runs models under gated actions and records runs a skeptic can re-check. The engine is on PyPI as flywheel-verify and the desktop client ships as a Windows installer. Ten native Python lanes (gather, crucible, index, forum, plexus, mneme, canon, chorus, relay, and accountable-surface) bundle from hash-pinned vendored source and launch on a clean machine. The backbone is re-derivable verification: no receipt, no accept, no learned model on the accept path, and a MATCH, DRIFT, or UNVERIFIABLE verdict on every witnessed action. On the shipped benchmark the verified loop shows no measured accuracy uplift over single-shot and the interval includes zero; the value is the re-derivable receipt and containment. It also serves a writing-quality linter over MCP, so any harness can score prose against a register standard. Separate public work includes EMET, a byte-integrity witness CLI, plus BuildLang, Calibrate Pro, Terminal State Fixtures, BRender Archival, Engine Revival, retro-system pages, and public-safe security and evaluation documentation.</w:t>
-      </w:r>
-    </w:p>
-    <w:p>
-      <w:pPr>
-        <w:spacing w:before="0" w:after="30" w:line="240" w:lineRule="auto"/>
-      </w:pPr>
-      <w:r>
-        <w:t>Eight public research records are indexed on Publications, including DOI records such as doi.org/10.5281/zenodo.21230267. They are not peer reviewed unless a page later records an explicit peer-review status.</w:t>
-      </w:r>
-    </w:p>
-    <w:p>
-      <w:pPr>
-        <w:spacing w:before="0" w:after="30" w:line="240" w:lineRule="auto"/>
-      </w:pPr>
-      <w:r>
-        <w:t>Accepted external work is separated from open work, closed without merge work, and owned project evidence. Open is not accepted, and this CV does not upgrade either status.</w:t>
+        <w:t>Built deterministic prose analysis with register, mode, and genre profiles, alongside optional model-assisted editing. Includes command-line, library, MCP, language-server, and SARIF surfaces; math-span protection preserves formulas during supported editing flows. Content-free audit receipts record checks without retaining the underlying prose. Version 0.3.0 was released September 20, 2026.</w:t>
       </w:r>
     </w:p>
     <w:p>
       <w:pPr>
         <w:pStyle w:val="Heading2"/>
-        <w:spacing w:before="0" w:after="30" w:line="240" w:lineRule="auto"/>
+        <w:keepNext/>
+        <w:keepLines/>
+        <w:widowControl/>
+        <w:spacing w:before="100" w:after="40" w:line="256" w:lineRule="exact"/>
+      </w:pPr>
+      <w:r>
+        <w:t>Agent tools, memory, and coordination</w:t>
+      </w:r>
+    </w:p>
+    <w:p>
+      <w:pPr>
+        <w:keepNext w:val="0"/>
+        <w:keepLines/>
+        <w:widowControl/>
+        <w:spacing w:before="0" w:after="60" w:line="252" w:lineRule="exact"/>
+      </w:pPr>
+      <w:r>
+        <w:t>Relay supplies model-agnostic coding-agent tooling; Plexus connects tool interfaces; Mneme retains memories with source checks; Canon consolidates assistant instructions and context. Bulletin provides a signed-identity public message board. These systems contribute distinct capabilities to the larger platform rather than representing separate claims of deployment at customer scale.</w:t>
+      </w:r>
+    </w:p>
+    <w:p>
+      <w:pPr>
+        <w:pStyle w:val="Heading1"/>
+        <w:keepNext/>
+        <w:keepLines/>
+        <w:widowControl/>
+        <w:spacing w:before="120" w:after="60" w:line="280" w:lineRule="exact"/>
+      </w:pPr>
+      <w:r>
+        <w:t>Evaluation, Systems, and Security Engineering</w:t>
+      </w:r>
+    </w:p>
+    <w:p>
+      <w:pPr>
+        <w:pStyle w:val="Heading2"/>
+        <w:keepNext/>
+        <w:keepLines/>
+        <w:widowControl/>
+        <w:spacing w:before="100" w:after="40" w:line="256" w:lineRule="exact"/>
+      </w:pPr>
+      <w:r>
+        <w:t>Terminal State Fixtures and Crucible</w:t>
+      </w:r>
+    </w:p>
+    <w:p>
+      <w:pPr>
+        <w:keepNext w:val="0"/>
+        <w:keepLines/>
+        <w:widowControl/>
+        <w:spacing w:before="0" w:after="60" w:line="252" w:lineRule="exact"/>
+      </w:pPr>
+      <w:r>
+        <w:t>Designed exhaustive terminal-state evaluation cases and deterministic scoring that inspect the environment after an agent runs. The MLflow fixture family includes 324 cases; the component-forge suite includes 337 cases and 5,058 frozen expectations. These are fixture counts, not measured model-performance gains. Crucible provides structured worker/verifier evaluation with explicit match, drift, and missing-evidence outcomes. Third-party private staging is not represented as public hosting or endorsement.</w:t>
+      </w:r>
+    </w:p>
+    <w:p>
+      <w:pPr>
+        <w:pStyle w:val="Heading2"/>
+        <w:keepNext/>
+        <w:keepLines/>
+        <w:widowControl/>
+        <w:spacing w:before="100" w:after="40" w:line="256" w:lineRule="exact"/>
+      </w:pPr>
+      <w:r>
+        <w:t>EMET | Byte-integrity witnessing</w:t>
+      </w:r>
+    </w:p>
+    <w:p>
+      <w:pPr>
+        <w:keepNext w:val="0"/>
+        <w:keepLines/>
+        <w:widowControl/>
+        <w:spacing w:before="0" w:after="60" w:line="252" w:lineRule="exact"/>
+      </w:pPr>
+      <w:r>
+        <w:t>Developed Python, Rust, Node, and Go implementations around shared conformance cases and portable verification records. The witness checks byte-level integrity, anchors, and source correspondence; it does not grant permission, certify semantic truth, or replace an operator decision. Cross-language checking makes implementation differences visible.</w:t>
+      </w:r>
+    </w:p>
+    <w:p>
+      <w:pPr>
+        <w:pStyle w:val="Heading2"/>
+        <w:keepNext/>
+        <w:keepLines/>
+        <w:widowControl/>
+        <w:spacing w:before="100" w:after="40" w:line="256" w:lineRule="exact"/>
+      </w:pPr>
+      <w:r>
+        <w:t>BuildLang | Rust compiler and developer tooling</w:t>
+      </w:r>
+    </w:p>
+    <w:p>
+      <w:pPr>
+        <w:keepNext w:val="0"/>
+        <w:keepLines/>
+        <w:widowControl/>
+        <w:spacing w:before="0" w:after="60" w:line="252" w:lineRule="exact"/>
+      </w:pPr>
+      <w:r>
+        <w:t>Developed a systems-language toolchain with typed capability effects, type inference, parser and intermediate-representation work, native C output, shader output, and language-server support. The compiler makes categories of ambient access visible to its type and build machinery. Experimental backends and linear-type work remain distinguished from the supported path.</w:t>
+      </w:r>
+    </w:p>
+    <w:p>
+      <w:pPr>
+        <w:pStyle w:val="Heading2"/>
+        <w:keepNext/>
+        <w:keepLines/>
+        <w:widowControl/>
+        <w:spacing w:before="100" w:after="40" w:line="256" w:lineRule="exact"/>
+      </w:pPr>
+      <w:r>
+        <w:t>Phantom | Hardware-identity inspection and reversible system changes</w:t>
+      </w:r>
+    </w:p>
+    <w:p>
+      <w:pPr>
+        <w:keepNext w:val="0"/>
+        <w:keepLines/>
+        <w:widowControl/>
+        <w:spacing w:before="0" w:after="60" w:line="252" w:lineRule="exact"/>
+      </w:pPr>
+      <w:r>
+        <w:t>Developed a Rust-based Windows and Linux utility with deterministic profiles, read-only audit, backup-before-write behavior, validation, restoration, and platform packages. The released v1.1.1 scope is userland-reversible identifiers. Kernel and firmware layers are modeled, not shipped.</w:t>
+      </w:r>
+    </w:p>
+    <w:p>
+      <w:pPr>
+        <w:pStyle w:val="Heading2"/>
+        <w:keepNext/>
+        <w:keepLines/>
+        <w:widowControl/>
+        <w:spacing w:before="100" w:after="40" w:line="256" w:lineRule="exact"/>
+      </w:pPr>
+      <w:r>
+        <w:t>Controlled assessment and operator tooling</w:t>
+      </w:r>
+    </w:p>
+    <w:p>
+      <w:pPr>
+        <w:keepNext w:val="0"/>
+        <w:keepLines/>
+        <w:widowControl/>
+        <w:spacing w:before="0" w:after="60" w:line="252" w:lineRule="exact"/>
+      </w:pPr>
+      <w:r>
+        <w:t>Private systems work includes Array for approval-gated assessment orchestration and containment records, Lab/Seed for controlled-lab fixtures and detection-engineering workflows, and Runtime/ORCA for local workspaces, reports, bundles, and release provenance. Public descriptions cover architecture and safe interfaces; private implementations, target material, and operational details are not published here.</w:t>
+      </w:r>
+    </w:p>
+    <w:p>
+      <w:pPr>
+        <w:pStyle w:val="Heading2"/>
+        <w:keepNext/>
+        <w:keepLines/>
+        <w:widowControl/>
+        <w:spacing w:before="100" w:after="40" w:line="256" w:lineRule="exact"/>
+      </w:pPr>
+      <w:r>
+        <w:t>Research intake and workspace tooling</w:t>
+      </w:r>
+    </w:p>
+    <w:p>
+      <w:pPr>
+        <w:keepNext w:val="0"/>
+        <w:keepLines/>
+        <w:widowControl/>
+        <w:spacing w:before="0" w:after="60" w:line="252" w:lineRule="exact"/>
+      </w:pPr>
+      <w:r>
+        <w:t>Built Gather for source-carrying research intake, Index for workspace and symbol maps, and Forum for model orchestration with recorded decisions. These tools make source selection, handoffs, and task context inspectable across a multi-repository product.</w:t>
+      </w:r>
+    </w:p>
+    <w:p>
+      <w:pPr>
+        <w:pStyle w:val="Heading1"/>
+        <w:keepNext/>
+        <w:keepLines/>
+        <w:widowControl/>
+        <w:spacing w:before="120" w:after="60" w:line="280" w:lineRule="exact"/>
+      </w:pPr>
+      <w:r>
+        <w:t>Graphics, Color, and Runtime Work</w:t>
+      </w:r>
+    </w:p>
+    <w:p>
+      <w:pPr>
+        <w:keepNext w:val="0"/>
+        <w:keepLines/>
+        <w:widowControl/>
+        <w:spacing w:before="0" w:after="60" w:line="252" w:lineRule="exact"/>
+      </w:pPr>
+      <w:r>
+        <w:t>Developed HLSL and C++ graphics and game-modding work spanning post-processing, Direct3D 11 integration, shader debugging, GPU traces, and shared-memory interfaces. Related public projects include Elder ENB, SkyrimBridge, ENB Runtime Core, Brender Archival, and Engine Revival. Existing engines and collaborators retain their own attribution.</w:t>
+      </w:r>
+    </w:p>
+    <w:p>
+      <w:pPr>
+        <w:keepNext w:val="0"/>
+        <w:keepLines/>
+        <w:widowControl/>
+        <w:spacing w:before="0" w:after="60" w:line="252" w:lineRule="exact"/>
+      </w:pPr>
+      <w:r>
+        <w:t>Color and creative-tool work includes Build Color, Calibrate Pro, Studio Engine, and browser-based studio/print surfaces: perceptual color spaces, color difference, HDR/tone-mapping tools, display characterization, and generative visual systems. These are engineering projects, not claims of professional calibration certification.</w:t>
+      </w:r>
+    </w:p>
+    <w:p>
+      <w:pPr>
+        <w:pStyle w:val="Heading1"/>
+        <w:keepNext/>
+        <w:keepLines/>
+        <w:widowControl/>
+        <w:spacing w:before="120" w:after="60" w:line="280" w:lineRule="exact"/>
+      </w:pPr>
+      <w:r>
+        <w:t>Selected Open-Source Contributions</w:t>
+      </w:r>
+    </w:p>
+    <w:p>
+      <w:pPr>
+        <w:keepNext w:val="0"/>
+        <w:keepLines/>
+        <w:widowControl/>
+        <w:spacing w:before="0" w:after="60" w:line="252" w:lineRule="exact"/>
+      </w:pPr>
+      <w:r>
+        <w:t>The following changes were accepted into externally maintained repositories. They are contributions, not employment at those organizations. The broader public contribution record separately tracks merged, open, and closed without merge outcomes.</w:t>
+      </w:r>
+    </w:p>
+    <w:p>
+      <w:pPr>
+        <w:pStyle w:val="ListBullet"/>
+        <w:keepNext w:val="0"/>
+        <w:keepLines/>
+        <w:widowControl/>
+        <w:spacing w:before="0" w:after="60" w:line="252" w:lineRule="exact"/>
+        <w:ind w:left="245" w:hanging="173"/>
+      </w:pPr>
+      <w:r>
+        <w:t>DeepEval #2822: fixed unhashable tool-output and nested-parameter failures in tool-correctness evaluation; merged July 2, 2026. github.com/confident-ai/deepeval/pull/2822</w:t>
+      </w:r>
+    </w:p>
+    <w:p>
+      <w:pPr>
+        <w:pStyle w:val="ListBullet"/>
+        <w:keepNext w:val="0"/>
+        <w:keepLines/>
+        <w:widowControl/>
+        <w:spacing w:before="0" w:after="60" w:line="252" w:lineRule="exact"/>
+        <w:ind w:left="245" w:hanging="173"/>
+      </w:pPr>
+      <w:r>
+        <w:t>TOMLKit #549: preserved dotted-key siblings when replacing a value with an array of tables; merged July 14, 2026. github.com/python-poetry/tomlkit/pull/549</w:t>
+      </w:r>
+    </w:p>
+    <w:p>
+      <w:pPr>
+        <w:pStyle w:val="ListBullet"/>
+        <w:keepNext w:val="0"/>
+        <w:keepLines/>
+        <w:widowControl/>
+        <w:spacing w:before="0" w:after="60" w:line="252" w:lineRule="exact"/>
+        <w:ind w:left="245" w:hanging="173"/>
+      </w:pPr>
+      <w:r>
+        <w:t>Datasette #2815: corrected error handling for malformed composite primary-key row URLs; merged July 7, 2026. github.com/simonw/datasette/pull/2815</w:t>
+      </w:r>
+    </w:p>
+    <w:p>
+      <w:pPr>
+        <w:pStyle w:val="ListBullet"/>
+        <w:keepNext w:val="0"/>
+        <w:keepLines/>
+        <w:widowControl/>
+        <w:spacing w:before="0" w:after="60" w:line="252" w:lineRule="exact"/>
+        <w:ind w:left="245" w:hanging="173"/>
+      </w:pPr>
+      <w:r>
+        <w:t>Free Law Project #820: documented runnable database-free fast tests; merged August 25, 2026. github.com/freelawproject/litigant-portal/pull/820</w:t>
+      </w:r>
+    </w:p>
+    <w:p>
+      <w:pPr>
+        <w:pStyle w:val="ListBullet"/>
+        <w:keepNext w:val="0"/>
+        <w:keepLines/>
+        <w:widowControl/>
+        <w:spacing w:before="0" w:after="60" w:line="252" w:lineRule="exact"/>
+        <w:ind w:left="245" w:hanging="173"/>
+      </w:pPr>
+      <w:r>
+        <w:t>Hebbian Robotics #157: tested reserved-column drift against the actual queryable episode schema; merged August 25, 2026. github.com/Hebbian-Robotics/hflow/pull/157</w:t>
+      </w:r>
+    </w:p>
+    <w:p>
+      <w:pPr>
+        <w:pStyle w:val="ListBullet"/>
+        <w:keepNext w:val="0"/>
+        <w:keepLines/>
+        <w:widowControl/>
+        <w:spacing w:before="0" w:after="60" w:line="252" w:lineRule="exact"/>
+        <w:ind w:left="245" w:hanging="173"/>
+      </w:pPr>
+      <w:r>
+        <w:t>Voxwire #44: added offline WebSocket recording and replay regression coverage; merged August 15, 2026. github.com/vectorvoyager358/voxwire/pull/44</w:t>
+      </w:r>
+    </w:p>
+    <w:p>
+      <w:pPr>
+        <w:pStyle w:val="Heading1"/>
+        <w:keepNext/>
+        <w:keepLines/>
+        <w:widowControl/>
+        <w:spacing w:before="120" w:after="60" w:line="280" w:lineRule="exact"/>
+      </w:pPr>
+      <w:r>
+        <w:t>Technical Competencies</w:t>
+      </w:r>
+    </w:p>
+    <w:p>
+      <w:pPr>
+        <w:keepNext w:val="0"/>
+        <w:keepLines/>
+        <w:widowControl/>
+        <w:spacing w:before="0" w:after="60" w:line="252" w:lineRule="exact"/>
+      </w:pPr>
+      <w:r>
+        <w:t>Languages and runtimes: Python, Rust, C++, Dart/Flutter, TypeScript/JavaScript, Lua, HLSL, C#, PowerShell, and Bash. Additional cross-language conformance work includes Go and Node implementations.</w:t>
+      </w:r>
+    </w:p>
+    <w:p>
+      <w:pPr>
+        <w:keepNext w:val="0"/>
+        <w:keepLines/>
+        <w:widowControl/>
+        <w:spacing w:before="0" w:after="60" w:line="252" w:lineRule="exact"/>
+      </w:pPr>
+      <w:r>
+        <w:t>AI infrastructure and quality: multi-provider/local-model routing, tool-use loops, task decomposition, MCP, evaluation design, deterministic fixtures, regression testing, worker/verifier separation, failure analysis, and terminal-state scoring.</w:t>
+      </w:r>
+    </w:p>
+    <w:p>
+      <w:pPr>
+        <w:keepNext w:val="0"/>
+        <w:keepLines/>
+        <w:widowControl/>
+        <w:spacing w:before="0" w:after="60" w:line="252" w:lineRule="exact"/>
+      </w:pPr>
+      <w:r>
+        <w:t>Verification and controlled actions: capability effects, operator grants, action envelopes, source provenance, hash-chained journals, offline replay, scoped postconditions, conformance suites, and release evidence.</w:t>
+      </w:r>
+    </w:p>
+    <w:p>
+      <w:pPr>
+        <w:keepNext w:val="0"/>
+        <w:keepLines/>
+        <w:widowControl/>
+        <w:spacing w:before="0" w:after="60" w:line="252" w:lineRule="exact"/>
+      </w:pPr>
+      <w:r>
+        <w:t>Software delivery: Git/GitHub, GitHub Actions, Python packaging, command-line design, Windows/Linux installers, CMake, test automation, static websites, release documentation, and checksums.</w:t>
+      </w:r>
+    </w:p>
+    <w:p>
+      <w:pPr>
+        <w:keepNext w:val="0"/>
+        <w:keepLines/>
+        <w:widowControl/>
+        <w:spacing w:before="0" w:after="60" w:line="252" w:lineRule="exact"/>
+      </w:pPr>
+      <w:r>
+        <w:t>Graphics and domain knowledge: D3D11/HLSL, shader and runtime debugging, color-space and tone-mapping work, GPU instrumentation, shared-memory interfaces, and applied arboriculture/horticulture from field practice.</w:t>
+      </w:r>
+    </w:p>
+    <w:p>
+      <w:pPr>
+        <w:pStyle w:val="Heading1"/>
+        <w:keepNext/>
+        <w:keepLines/>
+        <w:widowControl/>
+        <w:spacing w:before="120" w:after="60" w:line="280" w:lineRule="exact"/>
+      </w:pPr>
+      <w:r>
+        <w:t>Working Practice</w:t>
+      </w:r>
+    </w:p>
+    <w:p>
+      <w:pPr>
+        <w:keepNext w:val="0"/>
+        <w:keepLines/>
+        <w:widowControl/>
+        <w:spacing w:before="0" w:after="60" w:line="252" w:lineRule="exact"/>
+      </w:pPr>
+      <w:r>
+        <w:t>AI-assisted development is part of the workflow. Architecture, integration, source review, test design, release decisions, and responsibility for the submitted work remain mine. Public examples separate observed results from interpretation and retain negative or inconclusive findings rather than treating every completed run as success.</w:t>
+      </w:r>
+    </w:p>
+    <w:p>
+      <w:pPr>
+        <w:pStyle w:val="Heading1"/>
+        <w:keepNext/>
+        <w:keepLines/>
+        <w:widowControl/>
+        <w:spacing w:before="120" w:after="60" w:line="280" w:lineRule="exact"/>
+      </w:pPr>
+      <w:r>
+        <w:t>Research Agenda</w:t>
+      </w:r>
+    </w:p>
+    <w:p>
+      <w:pPr>
+        <w:keepNext w:val="0"/>
+        <w:keepLines/>
+        <w:widowControl/>
+        <w:spacing w:before="0" w:after="60" w:line="252" w:lineRule="exact"/>
+      </w:pPr>
+      <w:r>
+        <w:t>My independent research examines how an AI system can leave evidence that another system or person can check without inheriting its authority. Workstreams include evaluation provenance and verifier independence; live-state drift; proof-carrying action envelopes; the relationship between memory, uncertainty, and behavior; and explicit human authorization for consequential actions. Robotics is a research interest, not a claim of professional robotics deployment experience.</w:t>
+      </w:r>
+    </w:p>
+    <w:p>
+      <w:pPr>
+        <w:pStyle w:val="Heading1"/>
+        <w:keepNext/>
+        <w:keepLines/>
+        <w:widowControl/>
+        <w:spacing w:before="120" w:after="60" w:line="280" w:lineRule="exact"/>
+      </w:pPr>
+      <w:r>
+        <w:t>Selected Publications and Research Records</w:t>
+      </w:r>
+    </w:p>
+    <w:p>
+      <w:pPr>
+        <w:keepNext w:val="0"/>
+        <w:keepLines/>
+        <w:widowControl/>
+        <w:spacing w:before="0" w:after="60" w:line="252" w:lineRule="exact"/>
+      </w:pPr>
+      <w:r>
+        <w:t>Independent systems papers, preprints, research notes, and archived manuscripts with DOI records. These records are not peer reviewed. An archived philosophical manuscript is not an awarded academic degree.</w:t>
+      </w:r>
+    </w:p>
+    <w:p>
+      <w:pPr>
+        <w:pStyle w:val="Heading2"/>
+        <w:keepNext/>
+        <w:keepLines/>
+        <w:widowControl/>
+        <w:spacing w:before="100" w:after="40" w:line="256" w:lineRule="exact"/>
+      </w:pPr>
+      <w:r>
+        <w:t>EMET: An Authority-Incapable Byte-Level Integrity Witness</w:t>
+      </w:r>
+    </w:p>
+    <w:p>
+      <w:pPr>
+        <w:keepNext w:val="0"/>
+        <w:keepLines/>
+        <w:widowControl/>
+        <w:spacing w:before="0" w:after="60" w:line="252" w:lineRule="exact"/>
+      </w:pPr>
+      <w:r>
+        <w:t>Systems paper, 2026. Byte-integrity witnessing and the separation of observation from authority. doi.org/10.5281/zenodo.21230267</w:t>
+      </w:r>
+    </w:p>
+    <w:p>
+      <w:pPr>
+        <w:pStyle w:val="Heading2"/>
+        <w:keepNext/>
+        <w:keepLines/>
+        <w:widowControl/>
+        <w:spacing w:before="100" w:after="40" w:line="256" w:lineRule="exact"/>
+      </w:pPr>
+      <w:r>
+        <w:t>BuildLang: Accountable Compute via Typed Capability Effects</w:t>
+      </w:r>
+    </w:p>
+    <w:p>
+      <w:pPr>
+        <w:keepNext w:val="0"/>
+        <w:keepLines/>
+        <w:widowControl/>
+        <w:spacing w:before="0" w:after="60" w:line="252" w:lineRule="exact"/>
+      </w:pPr>
+      <w:r>
+        <w:t>Systems paper, 2026. Capability effects and accountable compilation. doi.org/10.5281/zenodo.21231253</w:t>
+      </w:r>
+    </w:p>
+    <w:p>
+      <w:pPr>
+        <w:pStyle w:val="Heading2"/>
+        <w:keepNext/>
+        <w:keepLines/>
+        <w:widowControl/>
+        <w:spacing w:before="100" w:after="40" w:line="256" w:lineRule="exact"/>
+      </w:pPr>
+      <w:r>
+        <w:t>Witnessed Independence: Recording Whether a Verifier Graded Its Own Work</w:t>
+      </w:r>
+    </w:p>
+    <w:p>
+      <w:pPr>
+        <w:keepNext w:val="0"/>
+        <w:keepLines/>
+        <w:widowControl/>
+        <w:spacing w:before="0" w:after="60" w:line="252" w:lineRule="exact"/>
+      </w:pPr>
+      <w:r>
+        <w:t>Preprint, 2026. doi.org/10.5281/zenodo.21232206</w:t>
+      </w:r>
+    </w:p>
+    <w:p>
+      <w:pPr>
+        <w:pStyle w:val="Heading2"/>
+        <w:keepNext/>
+        <w:keepLines/>
+        <w:widowControl/>
+        <w:spacing w:before="100" w:after="40" w:line="256" w:lineRule="exact"/>
+      </w:pPr>
+      <w:r>
+        <w:t>Proof Packets: A Derive-Don't-Trust Envelope for Accountable Agent Actions</w:t>
+      </w:r>
+    </w:p>
+    <w:p>
+      <w:pPr>
+        <w:keepNext w:val="0"/>
+        <w:keepLines/>
+        <w:widowControl/>
+        <w:spacing w:before="0" w:after="60" w:line="252" w:lineRule="exact"/>
+      </w:pPr>
+      <w:r>
+        <w:t>Preprint, 2026. doi.org/10.5281/zenodo.21231406</w:t>
+      </w:r>
+    </w:p>
+    <w:p>
+      <w:pPr>
+        <w:pStyle w:val="Heading2"/>
+        <w:keepNext/>
+        <w:keepLines/>
+        <w:widowControl/>
+        <w:spacing w:before="100" w:after="40" w:line="256" w:lineRule="exact"/>
+      </w:pPr>
+      <w:r>
+        <w:t>The Personhood-Gate Handoff</w:t>
+      </w:r>
+    </w:p>
+    <w:p>
+      <w:pPr>
+        <w:keepNext w:val="0"/>
+        <w:keepLines/>
+        <w:widowControl/>
+        <w:spacing w:before="0" w:after="60" w:line="252" w:lineRule="exact"/>
+      </w:pPr>
+      <w:r>
+        <w:t>Research note, 2026. doi.org/10.5281/zenodo.21234475</w:t>
+      </w:r>
+    </w:p>
+    <w:p>
+      <w:pPr>
+        <w:pStyle w:val="Heading2"/>
+        <w:keepNext/>
+        <w:keepLines/>
+        <w:widowControl/>
+        <w:spacing w:before="100" w:after="40" w:line="256" w:lineRule="exact"/>
+      </w:pPr>
+      <w:r>
+        <w:t>Re-Perceived Effects</w:t>
+      </w:r>
+    </w:p>
+    <w:p>
+      <w:pPr>
+        <w:keepNext w:val="0"/>
+        <w:keepLines/>
+        <w:widowControl/>
+        <w:spacing w:before="0" w:after="60" w:line="252" w:lineRule="exact"/>
+      </w:pPr>
+      <w:r>
+        <w:t>Research note, 2026. doi.org/10.5281/zenodo.21231311</w:t>
+      </w:r>
+    </w:p>
+    <w:p>
+      <w:pPr>
+        <w:pStyle w:val="Heading2"/>
+        <w:keepNext/>
+        <w:keepLines/>
+        <w:widowControl/>
+        <w:spacing w:before="100" w:after="40" w:line="256" w:lineRule="exact"/>
+      </w:pPr>
+      <w:r>
+        <w:t>The Witnessing Spine</w:t>
+      </w:r>
+    </w:p>
+    <w:p>
+      <w:pPr>
+        <w:keepNext w:val="0"/>
+        <w:keepLines/>
+        <w:widowControl/>
+        <w:spacing w:before="0" w:after="60" w:line="252" w:lineRule="exact"/>
+      </w:pPr>
+      <w:r>
+        <w:t>Archived research corpus, 2026. doi.org/10.5281/zenodo.20778927</w:t>
+      </w:r>
+    </w:p>
+    <w:p>
+      <w:pPr>
+        <w:pStyle w:val="Heading2"/>
+        <w:keepNext/>
+        <w:keepLines/>
+        <w:widowControl/>
+        <w:spacing w:before="100" w:after="40" w:line="256" w:lineRule="exact"/>
+      </w:pPr>
+      <w:r>
+        <w:t>Conferred Existence</w:t>
+      </w:r>
+    </w:p>
+    <w:p>
+      <w:pPr>
+        <w:keepNext w:val="0"/>
+        <w:keepLines/>
+        <w:widowControl/>
+        <w:spacing w:before="0" w:after="60" w:line="252" w:lineRule="exact"/>
+      </w:pPr>
+      <w:r>
+        <w:t>Long-form philosophical manuscript and archived corpus, 2026. doi.org/10.5281/zenodo.20773724</w:t>
+      </w:r>
+    </w:p>
+    <w:p>
+      <w:pPr>
+        <w:pStyle w:val="Heading1"/>
+        <w:keepNext/>
+        <w:keepLines/>
+        <w:widowControl/>
+        <w:spacing w:before="120" w:after="60" w:line="280" w:lineRule="exact"/>
       </w:pPr>
       <w:r>
         <w:t>Education</w:t>
@@ -208,23 +1090,63 @@
     </w:p>
     <w:p>
       <w:pPr>
-        <w:spacing w:before="0" w:after="30" w:line="240" w:lineRule="auto"/>
+        <w:keepNext w:val="0"/>
+        <w:keepLines/>
+        <w:widowControl/>
+        <w:spacing w:before="0" w:after="60" w:line="252" w:lineRule="exact"/>
       </w:pPr>
       <w:r>
-        <w:t>High School Diploma, Wilsonville High School, 2013.</w:t>
+        <w:t>High School Diploma | Wilsonville High School, Wilsonville, Oregon | 2013</w:t>
       </w:r>
     </w:p>
     <w:p>
       <w:pPr>
-        <w:spacing w:before="0" w:after="30" w:line="240" w:lineRule="auto"/>
+        <w:keepNext w:val="0"/>
+        <w:keepLines/>
+        <w:widowControl/>
+        <w:spacing w:before="0" w:after="60" w:line="252" w:lineRule="exact"/>
       </w:pPr>
       <w:r>
-        <w:t>Updated 2026-09-19. Public dates preserve unknown months. Phone and legal-name attestation are omitted.</w:t>
+        <w:t>Self-directed study in systems programming, compilers, graphics, color science, AI evaluation, epistemics, and philosophy of mind. Practical arboriculture and plant-science knowledge is grounded in field work, not a separately claimed professional license.</w:t>
+      </w:r>
+    </w:p>
+    <w:p>
+      <w:pPr>
+        <w:pStyle w:val="Heading1"/>
+        <w:keepNext/>
+        <w:keepLines/>
+        <w:widowControl/>
+        <w:spacing w:before="120" w:after="60" w:line="280" w:lineRule="exact"/>
+      </w:pPr>
+      <w:r>
+        <w:t>Research and Portfolio Links</w:t>
+      </w:r>
+    </w:p>
+    <w:p>
+      <w:pPr>
+        <w:keepNext w:val="0"/>
+        <w:keepLines/>
+        <w:widowControl/>
+        <w:spacing w:before="0" w:after="60" w:line="252" w:lineRule="exact"/>
+      </w:pPr>
+      <w:r>
+        <w:t>ORCID: 0009-0001-7175-5393 | orcid.org/0009-0001-7175-5393</w:t>
+      </w:r>
+    </w:p>
+    <w:p>
+      <w:pPr>
+        <w:keepNext w:val="0"/>
+        <w:keepLines/>
+        <w:widowControl/>
+        <w:spacing w:before="0" w:after="60" w:line="252" w:lineRule="exact"/>
+      </w:pPr>
+      <w:r>
+        <w:t>Publications: harperz9.github.io/publications.html | Portfolio: harperz9.github.io/portfolio.html</w:t>
       </w:r>
     </w:p>
     <w:sectPr>
       <w:pgSz w:w="12240" w:h="15840"/>
-      <w:pgMar w:top="605" w:right="720" w:bottom="605" w:left="720" w:header="720" w:footer="720" w:gutter="0"/>
+      <w:pgMar w:top="792" w:right="864" w:bottom="792" w:left="864" w:header="720" w:footer="720" w:gutter="0"/>
       <w:cols w:space="720"/>
       <w:docGrid w:linePitch="360"/>
     </w:sectPr>
@@ -597,7 +1519,11 @@
     <w:rsid w:val="00FC693F"/>
     <w:rPr>
       <w:rFonts w:ascii="Arial" w:hAnsi="Arial"/>
-      <w:sz w:val="16"/>
+      <w:b w:val="0"/>
+      <w:i w:val="0"/>
+      <w:color w:val="000000"/>
+      <w:sz w:val="21"/>
+      <w:lang w:val="en-US"/>
     </w:rPr>
   </w:style>
   <w:style w:type="paragraph" w:styleId="Header">
@@ -614,6 +1540,9 @@
       </w:tabs>
       <w:spacing w:after="0" w:line="240" w:lineRule="auto"/>
     </w:pPr>
+    <w:rPr>
+      <w:lang w:val="en-US"/>
+    </w:rPr>
   </w:style>
   <w:style w:type="character" w:customStyle="1" w:styleId="HeaderChar">
     <w:name w:val="Header Char"/>
@@ -636,6 +1565,9 @@
       </w:tabs>
       <w:spacing w:after="0" w:line="240" w:lineRule="auto"/>
     </w:pPr>
+    <w:rPr>
+      <w:lang w:val="en-US"/>
+    </w:rPr>
   </w:style>
   <w:style w:type="character" w:customStyle="1" w:styleId="FooterChar">
     <w:name w:val="Footer Char"/>
@@ -659,12 +1591,14 @@
       <w:outlineLvl w:val="0"/>
     </w:pPr>
     <w:rPr>
-      <w:rFonts w:asciiTheme="majorHAnsi" w:eastAsiaTheme="majorEastAsia" w:hAnsiTheme="majorHAnsi" w:cstheme="majorBidi"/>
+      <w:rFonts w:asciiTheme="majorHAnsi" w:eastAsiaTheme="majorEastAsia" w:hAnsiTheme="majorHAnsi" w:cstheme="majorBidi" w:ascii="Arial" w:hAnsi="Arial"/>
       <w:b/>
       <w:bCs/>
-      <w:color w:val="365F91" w:themeColor="accent1" w:themeShade="BF"/>
-      <w:sz w:val="28"/>
+      <w:i w:val="0"/>
+      <w:color w:val="000000"/>
+      <w:sz w:val="23"/>
       <w:szCs w:val="28"/>
+      <w:lang w:val="en-US"/>
     </w:rPr>
   </w:style>
   <w:style w:type="paragraph" w:styleId="Heading2">
@@ -686,9 +1620,11 @@
       <w:rFonts w:asciiTheme="majorHAnsi" w:eastAsiaTheme="majorEastAsia" w:hAnsiTheme="majorHAnsi" w:cstheme="majorBidi" w:ascii="Arial" w:hAnsi="Arial"/>
       <w:b/>
       <w:bCs/>
-      <w:color w:val="4F81BD" w:themeColor="accent1"/>
-      <w:sz w:val="18"/>
+      <w:i w:val="0"/>
+      <w:color w:val="000000"/>
+      <w:sz w:val="21"/>
       <w:szCs w:val="26"/>
+      <w:lang w:val="en-US"/>
     </w:rPr>
   </w:style>
   <w:style w:type="paragraph" w:styleId="Heading3">
@@ -711,6 +1647,7 @@
       <w:b/>
       <w:bCs/>
       <w:color w:val="4F81BD" w:themeColor="accent1"/>
+      <w:lang w:val="en-US"/>
     </w:rPr>
   </w:style>
   <w:style w:type="paragraph" w:styleId="Heading4">
@@ -736,6 +1673,7 @@
       <w:i/>
       <w:iCs/>
       <w:color w:val="4F81BD" w:themeColor="accent1"/>
+      <w:lang w:val="en-US"/>
     </w:rPr>
   </w:style>
   <w:style w:type="paragraph" w:styleId="Heading5">
@@ -757,6 +1695,7 @@
     <w:rPr>
       <w:rFonts w:asciiTheme="majorHAnsi" w:eastAsiaTheme="majorEastAsia" w:hAnsiTheme="majorHAnsi" w:cstheme="majorBidi"/>
       <w:color w:val="243F60" w:themeColor="accent1" w:themeShade="7F"/>
+      <w:lang w:val="en-US"/>
     </w:rPr>
   </w:style>
   <w:style w:type="paragraph" w:styleId="Heading6">
@@ -780,6 +1719,7 @@
       <w:i/>
       <w:iCs/>
       <w:color w:val="243F60" w:themeColor="accent1" w:themeShade="7F"/>
+      <w:lang w:val="en-US"/>
     </w:rPr>
   </w:style>
   <w:style w:type="paragraph" w:styleId="Heading7">
@@ -803,6 +1743,7 @@
       <w:i/>
       <w:iCs/>
       <w:color w:val="404040" w:themeColor="text1" w:themeTint="BF"/>
+      <w:lang w:val="en-US"/>
     </w:rPr>
   </w:style>
   <w:style w:type="paragraph" w:styleId="Heading8">
@@ -826,6 +1767,7 @@
       <w:color w:val="4F81BD" w:themeColor="accent1"/>
       <w:sz w:val="20"/>
       <w:szCs w:val="20"/>
+      <w:lang w:val="en-US"/>
     </w:rPr>
   </w:style>
   <w:style w:type="paragraph" w:styleId="Heading9">
@@ -851,6 +1793,7 @@
       <w:color w:val="404040" w:themeColor="text1" w:themeTint="BF"/>
       <w:sz w:val="20"/>
       <w:szCs w:val="20"/>
+      <w:lang w:val="en-US"/>
     </w:rPr>
   </w:style>
   <w:style w:type="character" w:default="1" w:styleId="DefaultParagraphFont">
@@ -888,6 +1831,9 @@
     <w:pPr>
       <w:spacing w:after="0" w:line="240" w:lineRule="auto"/>
     </w:pPr>
+    <w:rPr>
+      <w:lang w:val="en-US"/>
+    </w:rPr>
   </w:style>
   <w:style w:type="character" w:customStyle="1" w:styleId="Heading1Char">
     <w:name w:val="Heading 1 Char"/>
@@ -949,11 +1895,14 @@
     </w:pPr>
     <w:rPr>
       <w:rFonts w:asciiTheme="majorHAnsi" w:eastAsiaTheme="majorEastAsia" w:hAnsiTheme="majorHAnsi" w:cstheme="majorBidi" w:ascii="Arial" w:hAnsi="Arial"/>
-      <w:color w:val="17365D" w:themeColor="text2" w:themeShade="BF"/>
+      <w:b/>
+      <w:i w:val="0"/>
+      <w:color w:val="000000"/>
       <w:spacing w:val="5"/>
       <w:kern w:val="28"/>
-      <w:sz w:val="28"/>
+      <w:sz w:val="40"/>
       <w:szCs w:val="52"/>
+      <w:lang w:val="en-US"/>
     </w:rPr>
   </w:style>
   <w:style w:type="character" w:customStyle="1" w:styleId="TitleChar">
@@ -985,13 +1934,15 @@
       </w:numPr>
     </w:pPr>
     <w:rPr>
-      <w:rFonts w:asciiTheme="majorHAnsi" w:eastAsiaTheme="majorEastAsia" w:hAnsiTheme="majorHAnsi" w:cstheme="majorBidi"/>
-      <w:i/>
+      <w:rFonts w:asciiTheme="majorHAnsi" w:eastAsiaTheme="majorEastAsia" w:hAnsiTheme="majorHAnsi" w:cstheme="majorBidi" w:ascii="Arial" w:hAnsi="Arial"/>
+      <w:b/>
+      <w:i w:val="0"/>
       <w:iCs/>
-      <w:color w:val="4F81BD" w:themeColor="accent1"/>
+      <w:color w:val="000000"/>
       <w:spacing w:val="15"/>
-      <w:sz w:val="24"/>
+      <w:sz w:val="21"/>
       <w:szCs w:val="24"/>
+      <w:lang w:val="en-US"/>
     </w:rPr>
   </w:style>
   <w:style w:type="character" w:customStyle="1" w:styleId="SubtitleChar">
@@ -1020,6 +1971,9 @@
       <w:ind w:left="720"/>
       <w:contextualSpacing/>
     </w:pPr>
+    <w:rPr>
+      <w:lang w:val="en-US"/>
+    </w:rPr>
   </w:style>
   <w:style w:type="paragraph" w:styleId="BodyText">
     <w:name w:val="Body Text"/>
@@ -1031,6 +1985,9 @@
     <w:pPr>
       <w:spacing w:after="120"/>
     </w:pPr>
+    <w:rPr>
+      <w:lang w:val="en-US"/>
+    </w:rPr>
   </w:style>
   <w:style w:type="character" w:customStyle="1" w:styleId="BodyTextChar">
     <w:name w:val="Body Text Char"/>
@@ -1049,6 +2006,9 @@
     <w:pPr>
       <w:spacing w:after="120" w:line="480" w:lineRule="auto"/>
     </w:pPr>
+    <w:rPr>
+      <w:lang w:val="en-US"/>
+    </w:rPr>
   </w:style>
   <w:style w:type="character" w:customStyle="1" w:styleId="BodyText2Char">
     <w:name w:val="Body Text 2 Char"/>
@@ -1070,6 +2030,7 @@
     <w:rPr>
       <w:sz w:val="16"/>
       <w:szCs w:val="16"/>
+      <w:lang w:val="en-US"/>
     </w:rPr>
   </w:style>
   <w:style w:type="character" w:customStyle="1" w:styleId="BodyText3Char">
@@ -1093,6 +2054,9 @@
       <w:ind w:left="360" w:hanging="360"/>
       <w:contextualSpacing/>
     </w:pPr>
+    <w:rPr>
+      <w:lang w:val="en-US"/>
+    </w:rPr>
   </w:style>
   <w:style w:type="paragraph" w:styleId="List2">
     <w:name w:val="List 2"/>
@@ -1104,6 +2068,9 @@
       <w:ind w:left="720" w:hanging="360"/>
       <w:contextualSpacing/>
     </w:pPr>
+    <w:rPr>
+      <w:lang w:val="en-US"/>
+    </w:rPr>
   </w:style>
   <w:style w:type="paragraph" w:styleId="List3">
     <w:name w:val="List 3"/>
@@ -1115,6 +2082,9 @@
       <w:ind w:left="1080" w:hanging="360"/>
       <w:contextualSpacing/>
     </w:pPr>
+    <w:rPr>
+      <w:lang w:val="en-US"/>
+    </w:rPr>
   </w:style>
   <w:style w:type="paragraph" w:styleId="ListBullet">
     <w:name w:val="List Bullet"/>
@@ -1128,6 +2098,14 @@
       </w:numPr>
       <w:contextualSpacing/>
     </w:pPr>
+    <w:rPr>
+      <w:rFonts w:ascii="Arial" w:hAnsi="Arial"/>
+      <w:b w:val="0"/>
+      <w:i w:val="0"/>
+      <w:color w:val="000000"/>
+      <w:sz w:val="21"/>
+      <w:lang w:val="en-US"/>
+    </w:rPr>
   </w:style>
   <w:style w:type="paragraph" w:styleId="ListBullet2">
     <w:name w:val="List Bullet 2"/>
@@ -1141,6 +2119,9 @@
       </w:numPr>
       <w:contextualSpacing/>
     </w:pPr>
+    <w:rPr>
+      <w:lang w:val="en-US"/>
+    </w:rPr>
   </w:style>
   <w:style w:type="paragraph" w:styleId="ListBullet3">
     <w:name w:val="List Bullet 3"/>
@@ -1154,6 +2135,9 @@
       </w:numPr>
       <w:contextualSpacing/>
     </w:pPr>
+    <w:rPr>
+      <w:lang w:val="en-US"/>
+    </w:rPr>
   </w:style>
   <w:style w:type="paragraph" w:styleId="ListNumber">
     <w:name w:val="List Number"/>
@@ -1167,6 +2151,9 @@
       </w:numPr>
       <w:contextualSpacing/>
     </w:pPr>
+    <w:rPr>
+      <w:lang w:val="en-US"/>
+    </w:rPr>
   </w:style>
   <w:style w:type="paragraph" w:styleId="ListNumber2">
     <w:name w:val="List Number 2"/>
@@ -1180,6 +2167,9 @@
       </w:numPr>
       <w:contextualSpacing/>
     </w:pPr>
+    <w:rPr>
+      <w:lang w:val="en-US"/>
+    </w:rPr>
   </w:style>
   <w:style w:type="paragraph" w:styleId="ListNumber3">
     <w:name w:val="List Number 3"/>
@@ -1193,6 +2183,9 @@
       </w:numPr>
       <w:contextualSpacing/>
     </w:pPr>
+    <w:rPr>
+      <w:lang w:val="en-US"/>
+    </w:rPr>
   </w:style>
   <w:style w:type="paragraph" w:styleId="ListContinue">
     <w:name w:val="List Continue"/>
@@ -1205,6 +2198,9 @@
       <w:ind w:left="360"/>
       <w:contextualSpacing/>
     </w:pPr>
+    <w:rPr>
+      <w:lang w:val="en-US"/>
+    </w:rPr>
   </w:style>
   <w:style w:type="paragraph" w:styleId="ListContinue2">
     <w:name w:val="List Continue 2"/>
@@ -1217,6 +2213,9 @@
       <w:ind w:left="720"/>
       <w:contextualSpacing/>
     </w:pPr>
+    <w:rPr>
+      <w:lang w:val="en-US"/>
+    </w:rPr>
   </w:style>
   <w:style w:type="paragraph" w:styleId="ListContinue3">
     <w:name w:val="List Continue 3"/>
@@ -1229,6 +2228,9 @@
       <w:ind w:left="1080"/>
       <w:contextualSpacing/>
     </w:pPr>
+    <w:rPr>
+      <w:lang w:val="en-US"/>
+    </w:rPr>
   </w:style>
   <w:style w:type="paragraph" w:styleId="MacroText">
     <w:name w:val="macro"/>
@@ -1251,6 +2253,7 @@
       <w:rFonts w:ascii="Courier" w:hAnsi="Courier"/>
       <w:sz w:val="20"/>
       <w:szCs w:val="20"/>
+      <w:lang w:val="en-US"/>
     </w:rPr>
   </w:style>
   <w:style w:type="character" w:customStyle="1" w:styleId="MacroTextChar">
@@ -1277,6 +2280,7 @@
       <w:i/>
       <w:iCs/>
       <w:color w:val="000000" w:themeColor="text1"/>
+      <w:lang w:val="en-US"/>
     </w:rPr>
   </w:style>
   <w:style w:type="character" w:customStyle="1" w:styleId="QuoteChar">
@@ -1395,6 +2399,7 @@
       <w:color w:val="4F81BD" w:themeColor="accent1"/>
       <w:sz w:val="18"/>
       <w:szCs w:val="18"/>
+      <w:lang w:val="en-US"/>
     </w:rPr>
   </w:style>
   <w:style w:type="character" w:styleId="Strong">
@@ -1440,6 +2445,7 @@
       <w:i/>
       <w:iCs/>
       <w:color w:val="4F81BD" w:themeColor="accent1"/>
+      <w:lang w:val="en-US"/>
     </w:rPr>
   </w:style>
   <w:style w:type="character" w:customStyle="1" w:styleId="IntenseQuoteChar">
@@ -1534,6 +2540,9 @@
     <w:pPr>
       <w:outlineLvl w:val="9"/>
     </w:pPr>
+    <w:rPr>
+      <w:lang w:val="en-US"/>
+    </w:rPr>
   </w:style>
   <w:style w:type="table" w:styleId="TableGrid">
     <w:name w:val="Table Grid"/>

</xml_diff>

<commit_message>
career: publish one-page value-led resumes and restored full CV (#255)
Restore source-matched HTML, PDF, DOCX, TXT, and Markdown career documents. Four targeted resumes are one page; expanded CV is four pages. Evidence-led impact statements, current platform scope, corrected dates, and preserved career URLs. Full existing site CI and dedicated career/browser/export checks passed. Temporary build and research transport excluded from final tree.
</commit_message>
<xml_diff>
--- a/career/Zain-Dana-Harper-CV.docx
+++ b/career/Zain-Dana-Harper-CV.docx
@@ -5,7 +5,10 @@
     <w:p>
       <w:pPr>
         <w:pStyle w:val="Title"/>
-        <w:spacing w:before="0" w:after="30" w:line="240" w:lineRule="auto"/>
+        <w:keepNext/>
+        <w:keepLines/>
+        <w:widowControl/>
+        <w:spacing w:before="0" w:after="100" w:line="460" w:lineRule="exact"/>
       </w:pPr>
       <w:r>
         <w:t>Zain Dana Harper</w:t>
@@ -13,194 +16,1073 @@
     </w:p>
     <w:p>
       <w:pPr>
-        <w:spacing w:before="0" w:after="30" w:line="240" w:lineRule="auto"/>
+        <w:keepNext/>
+        <w:keepLines/>
+        <w:widowControl/>
+        <w:spacing w:before="0" w:after="40" w:line="240" w:lineRule="exact"/>
       </w:pPr>
       <w:r>
-        <w:t>Public-safe CV.</w:t>
+        <w:rPr>
+          <w:sz w:val="21"/>
+        </w:rPr>
+        <w:t>Seattle, Washington | zaindharper@gmail.com | harperz9.github.io</w:t>
       </w:r>
     </w:p>
     <w:p>
       <w:pPr>
-        <w:spacing w:before="0" w:after="30" w:line="240" w:lineRule="auto"/>
+        <w:keepNext w:val="0"/>
+        <w:keepLines/>
+        <w:widowControl/>
+        <w:spacing w:before="0" w:after="60" w:line="252" w:lineRule="exact"/>
       </w:pPr>
       <w:r>
-        <w:t>Seattle, Washington | zaindharper@gmail.com | LinkedIn | GitHub</w:t>
+        <w:t>linkedin.com/in/zaindanaharper | github.com/HarperZ9</w:t>
+      </w:r>
+    </w:p>
+    <w:p>
+      <w:pPr>
+        <w:pStyle w:val="Subtitle"/>
+        <w:keepNext/>
+        <w:keepLines/>
+        <w:widowControl/>
+        <w:spacing w:before="80" w:after="60" w:line="264" w:lineRule="exact"/>
+      </w:pPr>
+      <w:r>
+        <w:t>Curriculum Vitae | Systems Engineering, AI Infrastructure, and Field Operations</w:t>
+      </w:r>
+    </w:p>
+    <w:p>
+      <w:pPr>
+        <w:pStyle w:val="Heading1"/>
+        <w:keepNext/>
+        <w:keepLines/>
+        <w:widowControl/>
+        <w:spacing w:before="120" w:after="60" w:line="280" w:lineRule="exact"/>
+      </w:pPr>
+      <w:r>
+        <w:t>Profile</w:t>
+      </w:r>
+    </w:p>
+    <w:p>
+      <w:pPr>
+        <w:keepNext w:val="0"/>
+        <w:keepLines/>
+        <w:widowControl/>
+        <w:spacing w:before="0" w:after="60" w:line="252" w:lineRule="exact"/>
+      </w:pPr>
+      <w:r>
+        <w:t>Independent systems engineer and technical writer building AI workstations, evaluation and accountability tools, language tooling, and graphics systems. My work connects a practical question to a verifiable implementation: what happened, what evidence supports it, and who authorized the next action. I combine a self-directed programming history with prior technical networking support and eleven years of full-time arboriculture and customer-facing operations.</w:t>
+      </w:r>
+    </w:p>
+    <w:p>
+      <w:pPr>
+        <w:pStyle w:val="Heading1"/>
+        <w:keepNext/>
+        <w:keepLines/>
+        <w:widowControl/>
+        <w:spacing w:before="120" w:after="60" w:line="280" w:lineRule="exact"/>
+      </w:pPr>
+      <w:r>
+        <w:t>Professional Experience</w:t>
       </w:r>
     </w:p>
     <w:p>
       <w:pPr>
         <w:pStyle w:val="Heading2"/>
-        <w:spacing w:before="0" w:after="30" w:line="240" w:lineRule="auto"/>
+        <w:keepNext/>
+        <w:keepLines/>
+        <w:widowControl/>
+        <w:spacing w:before="100" w:after="40" w:line="256" w:lineRule="exact"/>
       </w:pPr>
       <w:r>
-        <w:t>Current employment targets</w:t>
+        <w:t>Independent Systems Engineer | Independent practice</w:t>
       </w:r>
     </w:p>
     <w:p>
       <w:pPr>
-        <w:spacing w:before="0" w:after="30" w:line="240" w:lineRule="auto"/>
+        <w:keepNext/>
+        <w:keepLines/>
+        <w:widowControl/>
+        <w:spacing w:before="0" w:after="60" w:line="240" w:lineRule="exact"/>
       </w:pPr>
       <w:r>
-        <w:t>Technical support, developer operations, QA, evaluation tooling, Python developer tools, public operations, grounds, parks, facilities, ports, utilities, fire-support, and field-safety roles. Field routes are measured separately from the technical cohort.</w:t>
+        <w:rPr>
+          <w:sz w:val="21"/>
+        </w:rPr>
+        <w:t>Seattle / remote | 2023 to Present</w:t>
+      </w:r>
+    </w:p>
+    <w:p>
+      <w:pPr>
+        <w:pStyle w:val="ListBullet"/>
+        <w:keepNext w:val="0"/>
+        <w:keepLines/>
+        <w:widowControl/>
+        <w:spacing w:before="0" w:after="60" w:line="252" w:lineRule="exact"/>
+        <w:ind w:left="245" w:hanging="173"/>
+      </w:pPr>
+      <w:r>
+        <w:t>Own the architecture, implementation, integration, tests, documentation, and release work for Flywheel and related tools under the Zentropy Labs project identity. Work spans Python services and command-line tools, Flutter desktop software, Rust systems tooling, and browser interfaces.</w:t>
+      </w:r>
+    </w:p>
+    <w:p>
+      <w:pPr>
+        <w:pStyle w:val="ListBullet"/>
+        <w:keepNext w:val="0"/>
+        <w:keepLines/>
+        <w:widowControl/>
+        <w:spacing w:before="0" w:after="60" w:line="252" w:lineRule="exact"/>
+        <w:ind w:left="245" w:hanging="173"/>
+      </w:pPr>
+      <w:r>
+        <w:t>Develop model-agnostic workflows, evaluation harnesses, controlled-action interfaces, and source-linked records that can be checked without relying on a model to approve its own answer.</w:t>
+      </w:r>
+    </w:p>
+    <w:p>
+      <w:pPr>
+        <w:pStyle w:val="ListBullet"/>
+        <w:keepNext w:val="0"/>
+        <w:keepLines/>
+        <w:widowControl/>
+        <w:spacing w:before="0" w:after="60" w:line="252" w:lineRule="exact"/>
+        <w:ind w:left="245" w:hanging="173"/>
+      </w:pPr>
+      <w:r>
+        <w:t>Contribute focused fixes, regression tests, and documentation to externally maintained projects, responding to maintainer review and preserving the scope of each accepted change.</w:t>
       </w:r>
     </w:p>
     <w:p>
       <w:pPr>
         <w:pStyle w:val="Heading2"/>
-        <w:spacing w:before="0" w:after="30" w:line="240" w:lineRule="auto"/>
+        <w:keepNext/>
+        <w:keepLines/>
+        <w:widowControl/>
+        <w:spacing w:before="100" w:after="40" w:line="256" w:lineRule="exact"/>
       </w:pPr>
       <w:r>
-        <w:t>Accepted external work</w:t>
+        <w:t>Freelance Technical Writer, Documentation, and Product Operations</w:t>
+      </w:r>
+    </w:p>
+    <w:p>
+      <w:pPr>
+        <w:keepNext/>
+        <w:keepLines/>
+        <w:widowControl/>
+        <w:spacing w:before="0" w:after="60" w:line="240" w:lineRule="exact"/>
+      </w:pPr>
+      <w:r>
+        <w:rPr>
+          <w:sz w:val="21"/>
+        </w:rPr>
+        <w:t>Independent practice | Began 2017; project-based work</w:t>
       </w:r>
     </w:p>
     <w:p>
       <w:pPr>
         <w:pStyle w:val="ListBullet"/>
-        <w:spacing w:before="0" w:after="30" w:line="240" w:lineRule="auto"/>
+        <w:keepNext w:val="0"/>
+        <w:keepLines/>
+        <w:widowControl/>
+        <w:spacing w:before="0" w:after="60" w:line="252" w:lineRule="exact"/>
+        <w:ind w:left="245" w:hanging="173"/>
       </w:pPr>
       <w:r>
-        <w:t>Free Law Project litigant-portal PR 820: runnable database-free fast-test documentation.</w:t>
+        <w:t>Produced technical and compliance documentation, API and implementation guides, proposals, release notes, and operational playbooks. Turned implementation details into material usable by customers, developers, and reviewers.</w:t>
+      </w:r>
+    </w:p>
+    <w:p>
+      <w:pPr>
+        <w:pStyle w:val="Heading2"/>
+        <w:keepNext/>
+        <w:keepLines/>
+        <w:widowControl/>
+        <w:spacing w:before="100" w:after="40" w:line="256" w:lineRule="exact"/>
+      </w:pPr>
+      <w:r>
+        <w:t>Commercial Arboriculture and Field Operations | Legendary Tree</w:t>
+      </w:r>
+    </w:p>
+    <w:p>
+      <w:pPr>
+        <w:keepNext/>
+        <w:keepLines/>
+        <w:widowControl/>
+        <w:spacing w:before="0" w:after="60" w:line="240" w:lineRule="exact"/>
+      </w:pPr>
+      <w:r>
+        <w:rPr>
+          <w:sz w:val="21"/>
+        </w:rPr>
+        <w:t>Seattle area | April 25, 2015 to June 2, 2026</w:t>
       </w:r>
     </w:p>
     <w:p>
       <w:pPr>
         <w:pStyle w:val="ListBullet"/>
-        <w:spacing w:before="0" w:after="30" w:line="240" w:lineRule="auto"/>
+        <w:keepNext w:val="0"/>
+        <w:keepLines/>
+        <w:widowControl/>
+        <w:spacing w:before="0" w:after="60" w:line="252" w:lineRule="exact"/>
+        <w:ind w:left="245" w:hanging="173"/>
       </w:pPr>
       <w:r>
-        <w:t>Hebbian Robotics hflow PR 157: reserved-column drift test coverage.</w:t>
+        <w:t>Combined ground-based tree-care work and safety coordination with client intake, site assessments, estimates, proposals, scheduling, and crew/vendor communication.</w:t>
       </w:r>
     </w:p>
     <w:p>
       <w:pPr>
         <w:pStyle w:val="ListBullet"/>
-        <w:spacing w:before="0" w:after="30" w:line="240" w:lineRule="auto"/>
+        <w:keepNext w:val="0"/>
+        <w:keepLines/>
+        <w:widowControl/>
+        <w:spacing w:before="0" w:after="60" w:line="252" w:lineRule="exact"/>
+        <w:ind w:left="245" w:hanging="173"/>
       </w:pPr>
       <w:r>
-        <w:t>Voxwire PR 44: offline websocket recording and replay coverage.</w:t>
+        <w:t>Monitored rigging systems, clearances, and changing conditions while supporting climbers from the ground. Explained work options and constraints to clients and maintained continuity between the proposed scope and field execution.</w:t>
+      </w:r>
+    </w:p>
+    <w:p>
+      <w:pPr>
+        <w:pStyle w:val="Heading2"/>
+        <w:keepNext/>
+        <w:keepLines/>
+        <w:widowControl/>
+        <w:spacing w:before="100" w:after="40" w:line="256" w:lineRule="exact"/>
+      </w:pPr>
+      <w:r>
+        <w:t>Technical Networking Support | Xbox/Microsoft contract</w:t>
+      </w:r>
+    </w:p>
+    <w:p>
+      <w:pPr>
+        <w:keepNext/>
+        <w:keepLines/>
+        <w:widowControl/>
+        <w:spacing w:before="0" w:after="60" w:line="240" w:lineRule="exact"/>
+      </w:pPr>
+      <w:r>
+        <w:rPr>
+          <w:sz w:val="21"/>
+        </w:rPr>
+        <w:t>Subcontracted through Stream/Convergys | Wilsonville, Oregon | 2014 to 2015</w:t>
       </w:r>
     </w:p>
     <w:p>
       <w:pPr>
         <w:pStyle w:val="ListBullet"/>
-        <w:spacing w:before="0" w:after="30" w:line="240" w:lineRule="auto"/>
+        <w:keepNext w:val="0"/>
+        <w:keepLines/>
+        <w:widowControl/>
+        <w:spacing w:before="0" w:after="60" w:line="252" w:lineRule="exact"/>
+        <w:ind w:left="245" w:hanging="173"/>
       </w:pPr>
       <w:r>
-        <w:t>DeepEval PR 2822: unhashable tool-output correctness fix.</w:t>
+        <w:t>Diagnosed connectivity and account issues by phone and chat using TCP/IP, DNS, NAT, firewall, and router troubleshooting; documented repeatable resolutions and customer-facing instructions.</w:t>
+      </w:r>
+    </w:p>
+    <w:p>
+      <w:pPr>
+        <w:pStyle w:val="Heading1"/>
+        <w:keepNext/>
+        <w:keepLines/>
+        <w:widowControl/>
+        <w:spacing w:before="120" w:after="60" w:line="280" w:lineRule="exact"/>
+      </w:pPr>
+      <w:r>
+        <w:t>Programming Background</w:t>
+      </w:r>
+    </w:p>
+    <w:p>
+      <w:pPr>
+        <w:keepNext w:val="0"/>
+        <w:keepLines/>
+        <w:widowControl/>
+        <w:spacing w:before="0" w:after="60" w:line="252" w:lineRule="exact"/>
+      </w:pPr>
+      <w:r>
+        <w:t>Self-directed programming began with game modding, reverse engineering, bot and rotation logic, and runtime-memory tooling, then developed into systems engineering, graphics, compilers, and AI infrastructure. This is a project history, not a claim of equivalent years of paid software employment.</w:t>
+      </w:r>
+    </w:p>
+    <w:p>
+      <w:pPr>
+        <w:pStyle w:val="Heading1"/>
+        <w:keepNext/>
+        <w:keepLines/>
+        <w:widowControl/>
+        <w:spacing w:before="120" w:after="60" w:line="280" w:lineRule="exact"/>
+      </w:pPr>
+      <w:r>
+        <w:t>AI Platform and Agent Systems</w:t>
+      </w:r>
+    </w:p>
+    <w:p>
+      <w:pPr>
+        <w:pStyle w:val="Heading2"/>
+        <w:keepNext/>
+        <w:keepLines/>
+        <w:widowControl/>
+        <w:spacing w:before="100" w:after="40" w:line="256" w:lineRule="exact"/>
+      </w:pPr>
+      <w:r>
+        <w:t>Flywheel | Model-agnostic AI workstation and coding harness</w:t>
+      </w:r>
+    </w:p>
+    <w:p>
+      <w:pPr>
+        <w:keepNext w:val="0"/>
+        <w:keepLines/>
+        <w:widowControl/>
+        <w:spacing w:before="0" w:after="60" w:line="252" w:lineRule="exact"/>
+      </w:pPr>
+      <w:r>
+        <w:t>Primary owned platform. The September 19, 2026 v1.0.1 release includes a Windows installer with a bundled engine. The source repository contains the Python runtime, Flutter desktop client, and browser fallback.</w:t>
       </w:r>
     </w:p>
     <w:p>
       <w:pPr>
         <w:pStyle w:val="ListBullet"/>
-        <w:spacing w:before="0" w:after="30" w:line="240" w:lineRule="auto"/>
+        <w:keepNext w:val="0"/>
+        <w:keepLines/>
+        <w:widowControl/>
+        <w:spacing w:before="0" w:after="60" w:line="252" w:lineRule="exact"/>
+        <w:ind w:left="245" w:hanging="173"/>
       </w:pPr>
       <w:r>
-        <w:t>TOMLKit PR 549: dotted-key sibling preservation fix.</w:t>
+        <w:t>Routes tasks to hosted or local models through an OpenAI-compatible gateway; keeps model selection separate from the task record and exposes command-line, desktop, and API entry points.</w:t>
       </w:r>
     </w:p>
     <w:p>
       <w:pPr>
         <w:pStyle w:val="ListBullet"/>
-        <w:spacing w:before="0" w:after="30" w:line="240" w:lineRule="auto"/>
+        <w:keepNext w:val="0"/>
+        <w:keepLines/>
+        <w:widowControl/>
+        <w:spacing w:before="0" w:after="60" w:line="252" w:lineRule="exact"/>
+        <w:ind w:left="245" w:hanging="173"/>
       </w:pPr>
       <w:r>
-        <w:t>Datasette PR 2815: wrong-arity composite-primary-key URL error handling.</w:t>
+        <w:t>Provides Rowan, a desktop assistant that translates requests into recorded tasks, together with permission-checked coding and tool-use workflows, session state, and inspectable outcomes.</w:t>
+      </w:r>
+    </w:p>
+    <w:p>
+      <w:pPr>
+        <w:pStyle w:val="ListBullet"/>
+        <w:keepNext w:val="0"/>
+        <w:keepLines/>
+        <w:widowControl/>
+        <w:spacing w:before="0" w:after="60" w:line="252" w:lineRule="exact"/>
+        <w:ind w:left="245" w:hanging="173"/>
+      </w:pPr>
+      <w:r>
+        <w:t>Composes research intake, workspace indexing, verification, orchestration, memory, authoring, and other tools through registered lanes and published interfaces. Bundled components and installable companions have distinct packaging requirements.</w:t>
+      </w:r>
+    </w:p>
+    <w:p>
+      <w:pPr>
+        <w:pStyle w:val="ListBullet"/>
+        <w:keepNext w:val="0"/>
+        <w:keepLines/>
+        <w:widowControl/>
+        <w:spacing w:before="0" w:after="60" w:line="252" w:lineRule="exact"/>
+        <w:ind w:left="245" w:hanging="173"/>
+      </w:pPr>
+      <w:r>
+        <w:t>Produces sealed, re-derivable receipts and offline MATCH, DRIFT, or UNVERIFIABLE outcomes. A reproducible receipt establishes the bounded check it records, not universal model accuracy or safety.</w:t>
       </w:r>
     </w:p>
     <w:p>
       <w:pPr>
         <w:pStyle w:val="Heading2"/>
-        <w:spacing w:before="0" w:after="30" w:line="240" w:lineRule="auto"/>
+        <w:keepNext/>
+        <w:keepLines/>
+        <w:widowControl/>
+        <w:spacing w:before="100" w:after="40" w:line="256" w:lineRule="exact"/>
       </w:pPr>
       <w:r>
-        <w:t>Experience</w:t>
+        <w:t>Accountable Surface | Governed actions and computer-use adapters</w:t>
       </w:r>
     </w:p>
     <w:p>
       <w:pPr>
-        <w:spacing w:before="0" w:after="30" w:line="240" w:lineRule="auto"/>
+        <w:keepNext w:val="0"/>
+        <w:keepLines/>
+        <w:widowControl/>
+        <w:spacing w:before="0" w:after="60" w:line="252" w:lineRule="exact"/>
       </w:pPr>
       <w:r>
-        <w:t>Technical Networking Support, Xbox/Microsoft contract | subcontracted through Stream/Convergys | Wilsonville, Oregon | 2014 to 2015</w:t>
+        <w:t>Built operator-granted action interfaces for filesystem, command, API, browser, and Windows UI Automation work. Actions carry explicit scope and postconditions; persisted journals preserve decisions and observed effects. Reversible adapters include restoration paths. Fake drivers make browser and desktop scenarios testable without uncontrolled live actions.</w:t>
       </w:r>
     </w:p>
     <w:p>
       <w:pPr>
-        <w:spacing w:before="0" w:after="30" w:line="240" w:lineRule="auto"/>
+        <w:keepNext w:val="0"/>
+        <w:keepLines/>
+        <w:widowControl/>
+        <w:spacing w:before="0" w:after="60" w:line="252" w:lineRule="exact"/>
       </w:pPr>
       <w:r>
-        <w:t>Full-time operations and commercial arboriculture | Legendary Tree (organization label) | April 25, 2015 to June 2, 2026</w:t>
-      </w:r>
-    </w:p>
-    <w:p>
-      <w:pPr>
-        <w:spacing w:before="0" w:after="30" w:line="240" w:lineRule="auto"/>
-      </w:pPr>
-      <w:r>
-        <w:t>Legendary Tree is the applicant-provided organization label; no conventional job title or legal employer of record is asserted.</w:t>
-      </w:r>
-    </w:p>
-    <w:p>
-      <w:pPr>
-        <w:spacing w:before="0" w:after="30" w:line="240" w:lineRule="auto"/>
-      </w:pPr>
-      <w:r>
-        <w:t>Freelance Technical Writer, Documentation, and Product Operations | independent practice | started 2017</w:t>
-      </w:r>
-    </w:p>
-    <w:p>
-      <w:pPr>
-        <w:spacing w:before="0" w:after="30" w:line="240" w:lineRule="auto"/>
-      </w:pPr>
-      <w:r>
-        <w:t>Independent Systems Engineer | independent practice | started 2023</w:t>
-      </w:r>
-    </w:p>
-    <w:p>
-      <w:pPr>
-        <w:spacing w:before="0" w:after="30" w:line="240" w:lineRule="auto"/>
-      </w:pPr>
-      <w:r>
-        <w:t>The 2017 and 2023 start years do not state current status or an end date; both remain unspecified.</w:t>
+        <w:t>The v0.2.0 release provides source and wheel artifacts on GitHub. The project remains alpha; browser integrations are optional and a tool refusal or unknown result is not promoted into a successful action.</w:t>
       </w:r>
     </w:p>
     <w:p>
       <w:pPr>
         <w:pStyle w:val="Heading2"/>
-        <w:spacing w:before="0" w:after="30" w:line="240" w:lineRule="auto"/>
+        <w:keepNext/>
+        <w:keepLines/>
+        <w:widowControl/>
+        <w:spacing w:before="100" w:after="40" w:line="256" w:lineRule="exact"/>
       </w:pPr>
       <w:r>
-        <w:t>Owned systems and public research</w:t>
+        <w:t>Articulate | Writing analysis and accountable editing</w:t>
       </w:r>
     </w:p>
     <w:p>
       <w:pPr>
-        <w:spacing w:before="0" w:after="30" w:line="240" w:lineRule="auto"/>
+        <w:keepNext w:val="0"/>
+        <w:keepLines/>
+        <w:widowControl/>
+        <w:spacing w:before="0" w:after="60" w:line="252" w:lineRule="exact"/>
       </w:pPr>
       <w:r>
-        <w:t>Flywheel v1.0.1 shipped 2026-09-19: an agent-workflow platform that runs models under gated actions and records runs a skeptic can re-check. The engine is on PyPI as flywheel-verify and the desktop client ships as a Windows installer. Ten native Python lanes (gather, crucible, index, forum, plexus, mneme, canon, chorus, relay, and accountable-surface) bundle from hash-pinned vendored source and launch on a clean machine. The backbone is re-derivable verification: no receipt, no accept, no learned model on the accept path, and a MATCH, DRIFT, or UNVERIFIABLE verdict on every witnessed action. On the shipped benchmark the verified loop shows no measured accuracy uplift over single-shot and the interval includes zero; the value is the re-derivable receipt and containment. It also serves a writing-quality linter over MCP, so any harness can score prose against a register standard. Separate public work includes EMET, a byte-integrity witness CLI, plus BuildLang, Calibrate Pro, Terminal State Fixtures, BRender Archival, Engine Revival, retro-system pages, and public-safe security and evaluation documentation.</w:t>
-      </w:r>
-    </w:p>
-    <w:p>
-      <w:pPr>
-        <w:spacing w:before="0" w:after="30" w:line="240" w:lineRule="auto"/>
-      </w:pPr>
-      <w:r>
-        <w:t>Eight public research records are indexed on Publications, including DOI records such as doi.org/10.5281/zenodo.21230267. They are not peer reviewed unless a page later records an explicit peer-review status.</w:t>
-      </w:r>
-    </w:p>
-    <w:p>
-      <w:pPr>
-        <w:spacing w:before="0" w:after="30" w:line="240" w:lineRule="auto"/>
-      </w:pPr>
-      <w:r>
-        <w:t>Accepted external work is separated from open work, closed without merge work, and owned project evidence. Open is not accepted, and this CV does not upgrade either status.</w:t>
+        <w:t>Built deterministic prose analysis with register, mode, and genre profiles, alongside optional model-assisted editing. Includes command-line, library, MCP, language-server, and SARIF surfaces; math-span protection preserves formulas during supported editing flows. Content-free audit receipts record checks without retaining the underlying prose. Version 0.3.0 was released September 20, 2026.</w:t>
       </w:r>
     </w:p>
     <w:p>
       <w:pPr>
         <w:pStyle w:val="Heading2"/>
-        <w:spacing w:before="0" w:after="30" w:line="240" w:lineRule="auto"/>
+        <w:keepNext/>
+        <w:keepLines/>
+        <w:widowControl/>
+        <w:spacing w:before="100" w:after="40" w:line="256" w:lineRule="exact"/>
+      </w:pPr>
+      <w:r>
+        <w:t>Agent tools, memory, and coordination</w:t>
+      </w:r>
+    </w:p>
+    <w:p>
+      <w:pPr>
+        <w:keepNext w:val="0"/>
+        <w:keepLines/>
+        <w:widowControl/>
+        <w:spacing w:before="0" w:after="60" w:line="252" w:lineRule="exact"/>
+      </w:pPr>
+      <w:r>
+        <w:t>Relay supplies model-agnostic coding-agent tooling; Plexus connects tool interfaces; Mneme retains memories with source checks; Canon consolidates assistant instructions and context. Bulletin provides a signed-identity public message board. These systems contribute distinct capabilities to the larger platform rather than representing separate claims of deployment at customer scale.</w:t>
+      </w:r>
+    </w:p>
+    <w:p>
+      <w:pPr>
+        <w:pStyle w:val="Heading1"/>
+        <w:keepNext/>
+        <w:keepLines/>
+        <w:widowControl/>
+        <w:spacing w:before="120" w:after="60" w:line="280" w:lineRule="exact"/>
+      </w:pPr>
+      <w:r>
+        <w:t>Evaluation, Systems, and Security Engineering</w:t>
+      </w:r>
+    </w:p>
+    <w:p>
+      <w:pPr>
+        <w:pStyle w:val="Heading2"/>
+        <w:keepNext/>
+        <w:keepLines/>
+        <w:widowControl/>
+        <w:spacing w:before="100" w:after="40" w:line="256" w:lineRule="exact"/>
+      </w:pPr>
+      <w:r>
+        <w:t>Terminal State Fixtures and Crucible</w:t>
+      </w:r>
+    </w:p>
+    <w:p>
+      <w:pPr>
+        <w:keepNext w:val="0"/>
+        <w:keepLines/>
+        <w:widowControl/>
+        <w:spacing w:before="0" w:after="60" w:line="252" w:lineRule="exact"/>
+      </w:pPr>
+      <w:r>
+        <w:t>Designed exhaustive terminal-state evaluation cases and deterministic scoring that inspect the environment after an agent runs. The MLflow fixture family includes 324 cases; the component-forge suite includes 337 cases and 5,058 frozen expectations. These are fixture counts, not measured model-performance gains. Crucible provides structured worker/verifier evaluation with explicit match, drift, and missing-evidence outcomes. Third-party private staging is not represented as public hosting or endorsement.</w:t>
+      </w:r>
+    </w:p>
+    <w:p>
+      <w:pPr>
+        <w:pStyle w:val="Heading2"/>
+        <w:keepNext/>
+        <w:keepLines/>
+        <w:widowControl/>
+        <w:spacing w:before="100" w:after="40" w:line="256" w:lineRule="exact"/>
+      </w:pPr>
+      <w:r>
+        <w:t>EMET | Byte-integrity witnessing</w:t>
+      </w:r>
+    </w:p>
+    <w:p>
+      <w:pPr>
+        <w:keepNext w:val="0"/>
+        <w:keepLines/>
+        <w:widowControl/>
+        <w:spacing w:before="0" w:after="60" w:line="252" w:lineRule="exact"/>
+      </w:pPr>
+      <w:r>
+        <w:t>Developed Python, Rust, Node, and Go implementations around shared conformance cases and portable verification records. The witness checks byte-level integrity, anchors, and source correspondence; it does not grant permission, certify semantic truth, or replace an operator decision. Cross-language checking makes implementation differences visible.</w:t>
+      </w:r>
+    </w:p>
+    <w:p>
+      <w:pPr>
+        <w:pStyle w:val="Heading2"/>
+        <w:keepNext/>
+        <w:keepLines/>
+        <w:widowControl/>
+        <w:spacing w:before="100" w:after="40" w:line="256" w:lineRule="exact"/>
+      </w:pPr>
+      <w:r>
+        <w:t>BuildLang | Rust compiler and developer tooling</w:t>
+      </w:r>
+    </w:p>
+    <w:p>
+      <w:pPr>
+        <w:keepNext w:val="0"/>
+        <w:keepLines/>
+        <w:widowControl/>
+        <w:spacing w:before="0" w:after="60" w:line="252" w:lineRule="exact"/>
+      </w:pPr>
+      <w:r>
+        <w:t>Developed a systems-language toolchain with typed capability effects, type inference, parser and intermediate-representation work, native C output, shader output, and language-server support. The compiler makes categories of ambient access visible to its type and build machinery. Experimental backends and linear-type work remain distinguished from the supported path.</w:t>
+      </w:r>
+    </w:p>
+    <w:p>
+      <w:pPr>
+        <w:pStyle w:val="Heading2"/>
+        <w:keepNext/>
+        <w:keepLines/>
+        <w:widowControl/>
+        <w:spacing w:before="100" w:after="40" w:line="256" w:lineRule="exact"/>
+      </w:pPr>
+      <w:r>
+        <w:t>Phantom | Hardware-identity inspection and reversible system changes</w:t>
+      </w:r>
+    </w:p>
+    <w:p>
+      <w:pPr>
+        <w:keepNext w:val="0"/>
+        <w:keepLines/>
+        <w:widowControl/>
+        <w:spacing w:before="0" w:after="60" w:line="252" w:lineRule="exact"/>
+      </w:pPr>
+      <w:r>
+        <w:t>Developed a Rust-based Windows and Linux utility with deterministic profiles, read-only audit, backup-before-write behavior, validation, restoration, and platform packages. The released v1.1.1 scope is userland-reversible identifiers. Kernel and firmware layers are modeled, not shipped.</w:t>
+      </w:r>
+    </w:p>
+    <w:p>
+      <w:pPr>
+        <w:pStyle w:val="Heading2"/>
+        <w:keepNext/>
+        <w:keepLines/>
+        <w:widowControl/>
+        <w:spacing w:before="100" w:after="40" w:line="256" w:lineRule="exact"/>
+      </w:pPr>
+      <w:r>
+        <w:t>Controlled assessment and operator tooling</w:t>
+      </w:r>
+    </w:p>
+    <w:p>
+      <w:pPr>
+        <w:keepNext w:val="0"/>
+        <w:keepLines/>
+        <w:widowControl/>
+        <w:spacing w:before="0" w:after="60" w:line="252" w:lineRule="exact"/>
+      </w:pPr>
+      <w:r>
+        <w:t>Private systems work includes Array for approval-gated assessment orchestration and containment records, Lab/Seed for controlled-lab fixtures and detection-engineering workflows, and Runtime/ORCA for local workspaces, reports, bundles, and release provenance. Public descriptions cover architecture and safe interfaces; private implementations, target material, and operational details are not published here.</w:t>
+      </w:r>
+    </w:p>
+    <w:p>
+      <w:pPr>
+        <w:pStyle w:val="Heading2"/>
+        <w:keepNext/>
+        <w:keepLines/>
+        <w:widowControl/>
+        <w:spacing w:before="100" w:after="40" w:line="256" w:lineRule="exact"/>
+      </w:pPr>
+      <w:r>
+        <w:t>Research intake and workspace tooling</w:t>
+      </w:r>
+    </w:p>
+    <w:p>
+      <w:pPr>
+        <w:keepNext w:val="0"/>
+        <w:keepLines/>
+        <w:widowControl/>
+        <w:spacing w:before="0" w:after="60" w:line="252" w:lineRule="exact"/>
+      </w:pPr>
+      <w:r>
+        <w:t>Built Gather for source-carrying research intake, Index for workspace and symbol maps, and Forum for model orchestration with recorded decisions. These tools make source selection, handoffs, and task context inspectable across a multi-repository product.</w:t>
+      </w:r>
+    </w:p>
+    <w:p>
+      <w:pPr>
+        <w:pStyle w:val="Heading1"/>
+        <w:keepNext/>
+        <w:keepLines/>
+        <w:widowControl/>
+        <w:spacing w:before="120" w:after="60" w:line="280" w:lineRule="exact"/>
+      </w:pPr>
+      <w:r>
+        <w:t>Graphics, Color, and Runtime Work</w:t>
+      </w:r>
+    </w:p>
+    <w:p>
+      <w:pPr>
+        <w:keepNext w:val="0"/>
+        <w:keepLines/>
+        <w:widowControl/>
+        <w:spacing w:before="0" w:after="60" w:line="252" w:lineRule="exact"/>
+      </w:pPr>
+      <w:r>
+        <w:t>Developed HLSL and C++ graphics and game-modding work spanning post-processing, Direct3D 11 integration, shader debugging, GPU traces, and shared-memory interfaces. Related public projects include Elder ENB, SkyrimBridge, ENB Runtime Core, Brender Archival, and Engine Revival. Existing engines and collaborators retain their own attribution.</w:t>
+      </w:r>
+    </w:p>
+    <w:p>
+      <w:pPr>
+        <w:keepNext w:val="0"/>
+        <w:keepLines/>
+        <w:widowControl/>
+        <w:spacing w:before="0" w:after="60" w:line="252" w:lineRule="exact"/>
+      </w:pPr>
+      <w:r>
+        <w:t>Color and creative-tool work includes Build Color, Calibrate Pro, Studio Engine, and browser-based studio/print surfaces: perceptual color spaces, color difference, HDR/tone-mapping tools, display characterization, and generative visual systems. These are engineering projects, not claims of professional calibration certification.</w:t>
+      </w:r>
+    </w:p>
+    <w:p>
+      <w:pPr>
+        <w:pStyle w:val="Heading1"/>
+        <w:keepNext/>
+        <w:keepLines/>
+        <w:widowControl/>
+        <w:spacing w:before="120" w:after="60" w:line="280" w:lineRule="exact"/>
+      </w:pPr>
+      <w:r>
+        <w:t>Selected Open-Source Contributions</w:t>
+      </w:r>
+    </w:p>
+    <w:p>
+      <w:pPr>
+        <w:keepNext w:val="0"/>
+        <w:keepLines/>
+        <w:widowControl/>
+        <w:spacing w:before="0" w:after="60" w:line="252" w:lineRule="exact"/>
+      </w:pPr>
+      <w:r>
+        <w:t>The following changes were accepted into externally maintained repositories. They are contributions, not employment at those organizations. The broader public contribution record separately tracks merged, open, and closed without merge outcomes.</w:t>
+      </w:r>
+    </w:p>
+    <w:p>
+      <w:pPr>
+        <w:pStyle w:val="ListBullet"/>
+        <w:keepNext w:val="0"/>
+        <w:keepLines/>
+        <w:widowControl/>
+        <w:spacing w:before="0" w:after="60" w:line="252" w:lineRule="exact"/>
+        <w:ind w:left="245" w:hanging="173"/>
+      </w:pPr>
+      <w:r>
+        <w:t>DeepEval #2822: fixed unhashable tool-output and nested-parameter failures in tool-correctness evaluation; merged July 2, 2026. github.com/confident-ai/deepeval/pull/2822</w:t>
+      </w:r>
+    </w:p>
+    <w:p>
+      <w:pPr>
+        <w:pStyle w:val="ListBullet"/>
+        <w:keepNext w:val="0"/>
+        <w:keepLines/>
+        <w:widowControl/>
+        <w:spacing w:before="0" w:after="60" w:line="252" w:lineRule="exact"/>
+        <w:ind w:left="245" w:hanging="173"/>
+      </w:pPr>
+      <w:r>
+        <w:t>TOMLKit #549: preserved dotted-key siblings when replacing a value with an array of tables; merged July 14, 2026. github.com/python-poetry/tomlkit/pull/549</w:t>
+      </w:r>
+    </w:p>
+    <w:p>
+      <w:pPr>
+        <w:pStyle w:val="ListBullet"/>
+        <w:keepNext w:val="0"/>
+        <w:keepLines/>
+        <w:widowControl/>
+        <w:spacing w:before="0" w:after="60" w:line="252" w:lineRule="exact"/>
+        <w:ind w:left="245" w:hanging="173"/>
+      </w:pPr>
+      <w:r>
+        <w:t>Datasette #2815: corrected error handling for malformed composite primary-key row URLs; merged July 7, 2026. github.com/simonw/datasette/pull/2815</w:t>
+      </w:r>
+    </w:p>
+    <w:p>
+      <w:pPr>
+        <w:pStyle w:val="ListBullet"/>
+        <w:keepNext w:val="0"/>
+        <w:keepLines/>
+        <w:widowControl/>
+        <w:spacing w:before="0" w:after="60" w:line="252" w:lineRule="exact"/>
+        <w:ind w:left="245" w:hanging="173"/>
+      </w:pPr>
+      <w:r>
+        <w:t>Free Law Project #820: documented runnable database-free fast tests; merged August 25, 2026. github.com/freelawproject/litigant-portal/pull/820</w:t>
+      </w:r>
+    </w:p>
+    <w:p>
+      <w:pPr>
+        <w:pStyle w:val="ListBullet"/>
+        <w:keepNext w:val="0"/>
+        <w:keepLines/>
+        <w:widowControl/>
+        <w:spacing w:before="0" w:after="60" w:line="252" w:lineRule="exact"/>
+        <w:ind w:left="245" w:hanging="173"/>
+      </w:pPr>
+      <w:r>
+        <w:t>Hebbian Robotics #157: tested reserved-column drift against the actual queryable episode schema; merged August 25, 2026. github.com/Hebbian-Robotics/hflow/pull/157</w:t>
+      </w:r>
+    </w:p>
+    <w:p>
+      <w:pPr>
+        <w:pStyle w:val="ListBullet"/>
+        <w:keepNext w:val="0"/>
+        <w:keepLines/>
+        <w:widowControl/>
+        <w:spacing w:before="0" w:after="60" w:line="252" w:lineRule="exact"/>
+        <w:ind w:left="245" w:hanging="173"/>
+      </w:pPr>
+      <w:r>
+        <w:t>Voxwire #44: added offline WebSocket recording and replay regression coverage; merged August 15, 2026. github.com/vectorvoyager358/voxwire/pull/44</w:t>
+      </w:r>
+    </w:p>
+    <w:p>
+      <w:pPr>
+        <w:pStyle w:val="Heading1"/>
+        <w:keepNext/>
+        <w:keepLines/>
+        <w:widowControl/>
+        <w:spacing w:before="120" w:after="60" w:line="280" w:lineRule="exact"/>
+      </w:pPr>
+      <w:r>
+        <w:t>Technical Competencies</w:t>
+      </w:r>
+    </w:p>
+    <w:p>
+      <w:pPr>
+        <w:keepNext w:val="0"/>
+        <w:keepLines/>
+        <w:widowControl/>
+        <w:spacing w:before="0" w:after="60" w:line="252" w:lineRule="exact"/>
+      </w:pPr>
+      <w:r>
+        <w:t>Languages and runtimes: Python, Rust, C++, Dart/Flutter, TypeScript/JavaScript, Lua, HLSL, C#, PowerShell, and Bash. Additional cross-language conformance work includes Go and Node implementations.</w:t>
+      </w:r>
+    </w:p>
+    <w:p>
+      <w:pPr>
+        <w:keepNext w:val="0"/>
+        <w:keepLines/>
+        <w:widowControl/>
+        <w:spacing w:before="0" w:after="60" w:line="252" w:lineRule="exact"/>
+      </w:pPr>
+      <w:r>
+        <w:t>AI infrastructure and quality: multi-provider/local-model routing, tool-use loops, task decomposition, MCP, evaluation design, deterministic fixtures, regression testing, worker/verifier separation, failure analysis, and terminal-state scoring.</w:t>
+      </w:r>
+    </w:p>
+    <w:p>
+      <w:pPr>
+        <w:keepNext w:val="0"/>
+        <w:keepLines/>
+        <w:widowControl/>
+        <w:spacing w:before="0" w:after="60" w:line="252" w:lineRule="exact"/>
+      </w:pPr>
+      <w:r>
+        <w:t>Verification and controlled actions: capability effects, operator grants, action envelopes, source provenance, hash-chained journals, offline replay, scoped postconditions, conformance suites, and release evidence.</w:t>
+      </w:r>
+    </w:p>
+    <w:p>
+      <w:pPr>
+        <w:keepNext w:val="0"/>
+        <w:keepLines/>
+        <w:widowControl/>
+        <w:spacing w:before="0" w:after="60" w:line="252" w:lineRule="exact"/>
+      </w:pPr>
+      <w:r>
+        <w:t>Software delivery: Git/GitHub, GitHub Actions, Python packaging, command-line design, Windows/Linux installers, CMake, test automation, static websites, release documentation, and checksums.</w:t>
+      </w:r>
+    </w:p>
+    <w:p>
+      <w:pPr>
+        <w:keepNext w:val="0"/>
+        <w:keepLines/>
+        <w:widowControl/>
+        <w:spacing w:before="0" w:after="60" w:line="252" w:lineRule="exact"/>
+      </w:pPr>
+      <w:r>
+        <w:t>Graphics and domain knowledge: D3D11/HLSL, shader and runtime debugging, color-space and tone-mapping work, GPU instrumentation, shared-memory interfaces, and applied arboriculture/horticulture from field practice.</w:t>
+      </w:r>
+    </w:p>
+    <w:p>
+      <w:pPr>
+        <w:pStyle w:val="Heading1"/>
+        <w:keepNext/>
+        <w:keepLines/>
+        <w:widowControl/>
+        <w:spacing w:before="120" w:after="60" w:line="280" w:lineRule="exact"/>
+      </w:pPr>
+      <w:r>
+        <w:t>Working Practice</w:t>
+      </w:r>
+    </w:p>
+    <w:p>
+      <w:pPr>
+        <w:keepNext w:val="0"/>
+        <w:keepLines/>
+        <w:widowControl/>
+        <w:spacing w:before="0" w:after="60" w:line="252" w:lineRule="exact"/>
+      </w:pPr>
+      <w:r>
+        <w:t>AI-assisted development is part of the workflow. Architecture, integration, source review, test design, release decisions, and responsibility for the submitted work remain mine. Public examples separate observed results from interpretation and retain negative or inconclusive findings rather than treating every completed run as success.</w:t>
+      </w:r>
+    </w:p>
+    <w:p>
+      <w:pPr>
+        <w:pStyle w:val="Heading1"/>
+        <w:keepNext/>
+        <w:keepLines/>
+        <w:widowControl/>
+        <w:spacing w:before="120" w:after="60" w:line="280" w:lineRule="exact"/>
+      </w:pPr>
+      <w:r>
+        <w:t>Research Agenda</w:t>
+      </w:r>
+    </w:p>
+    <w:p>
+      <w:pPr>
+        <w:keepNext w:val="0"/>
+        <w:keepLines/>
+        <w:widowControl/>
+        <w:spacing w:before="0" w:after="60" w:line="252" w:lineRule="exact"/>
+      </w:pPr>
+      <w:r>
+        <w:t>My independent research examines how an AI system can leave evidence that another system or person can check without inheriting its authority. Workstreams include evaluation provenance and verifier independence; live-state drift; proof-carrying action envelopes; the relationship between memory, uncertainty, and behavior; and explicit human authorization for consequential actions. Robotics is a research interest, not a claim of professional robotics deployment experience.</w:t>
+      </w:r>
+    </w:p>
+    <w:p>
+      <w:pPr>
+        <w:pStyle w:val="Heading1"/>
+        <w:keepNext/>
+        <w:keepLines/>
+        <w:widowControl/>
+        <w:spacing w:before="120" w:after="60" w:line="280" w:lineRule="exact"/>
+      </w:pPr>
+      <w:r>
+        <w:t>Selected Publications and Research Records</w:t>
+      </w:r>
+    </w:p>
+    <w:p>
+      <w:pPr>
+        <w:keepNext w:val="0"/>
+        <w:keepLines/>
+        <w:widowControl/>
+        <w:spacing w:before="0" w:after="60" w:line="252" w:lineRule="exact"/>
+      </w:pPr>
+      <w:r>
+        <w:t>Independent systems papers, preprints, research notes, and archived manuscripts with DOI records. These records are not peer reviewed. An archived philosophical manuscript is not an awarded academic degree.</w:t>
+      </w:r>
+    </w:p>
+    <w:p>
+      <w:pPr>
+        <w:pStyle w:val="Heading2"/>
+        <w:keepNext/>
+        <w:keepLines/>
+        <w:widowControl/>
+        <w:spacing w:before="100" w:after="40" w:line="256" w:lineRule="exact"/>
+      </w:pPr>
+      <w:r>
+        <w:t>EMET: An Authority-Incapable Byte-Level Integrity Witness</w:t>
+      </w:r>
+    </w:p>
+    <w:p>
+      <w:pPr>
+        <w:keepNext w:val="0"/>
+        <w:keepLines/>
+        <w:widowControl/>
+        <w:spacing w:before="0" w:after="60" w:line="252" w:lineRule="exact"/>
+      </w:pPr>
+      <w:r>
+        <w:t>Systems paper, 2026. Byte-integrity witnessing and the separation of observation from authority. doi.org/10.5281/zenodo.21230267</w:t>
+      </w:r>
+    </w:p>
+    <w:p>
+      <w:pPr>
+        <w:pStyle w:val="Heading2"/>
+        <w:keepNext/>
+        <w:keepLines/>
+        <w:widowControl/>
+        <w:spacing w:before="100" w:after="40" w:line="256" w:lineRule="exact"/>
+      </w:pPr>
+      <w:r>
+        <w:t>BuildLang: Accountable Compute via Typed Capability Effects</w:t>
+      </w:r>
+    </w:p>
+    <w:p>
+      <w:pPr>
+        <w:keepNext w:val="0"/>
+        <w:keepLines/>
+        <w:widowControl/>
+        <w:spacing w:before="0" w:after="60" w:line="252" w:lineRule="exact"/>
+      </w:pPr>
+      <w:r>
+        <w:t>Systems paper, 2026. Capability effects and accountable compilation. doi.org/10.5281/zenodo.21231253</w:t>
+      </w:r>
+    </w:p>
+    <w:p>
+      <w:pPr>
+        <w:pStyle w:val="Heading2"/>
+        <w:keepNext/>
+        <w:keepLines/>
+        <w:widowControl/>
+        <w:spacing w:before="100" w:after="40" w:line="256" w:lineRule="exact"/>
+      </w:pPr>
+      <w:r>
+        <w:t>Witnessed Independence: Recording Whether a Verifier Graded Its Own Work</w:t>
+      </w:r>
+    </w:p>
+    <w:p>
+      <w:pPr>
+        <w:keepNext w:val="0"/>
+        <w:keepLines/>
+        <w:widowControl/>
+        <w:spacing w:before="0" w:after="60" w:line="252" w:lineRule="exact"/>
+      </w:pPr>
+      <w:r>
+        <w:t>Preprint, 2026. doi.org/10.5281/zenodo.21232206</w:t>
+      </w:r>
+    </w:p>
+    <w:p>
+      <w:pPr>
+        <w:pStyle w:val="Heading2"/>
+        <w:keepNext/>
+        <w:keepLines/>
+        <w:widowControl/>
+        <w:spacing w:before="100" w:after="40" w:line="256" w:lineRule="exact"/>
+      </w:pPr>
+      <w:r>
+        <w:t>Proof Packets: A Derive-Don't-Trust Envelope for Accountable Agent Actions</w:t>
+      </w:r>
+    </w:p>
+    <w:p>
+      <w:pPr>
+        <w:keepNext w:val="0"/>
+        <w:keepLines/>
+        <w:widowControl/>
+        <w:spacing w:before="0" w:after="60" w:line="252" w:lineRule="exact"/>
+      </w:pPr>
+      <w:r>
+        <w:t>Preprint, 2026. doi.org/10.5281/zenodo.21231406</w:t>
+      </w:r>
+    </w:p>
+    <w:p>
+      <w:pPr>
+        <w:pStyle w:val="Heading2"/>
+        <w:keepNext/>
+        <w:keepLines/>
+        <w:widowControl/>
+        <w:spacing w:before="100" w:after="40" w:line="256" w:lineRule="exact"/>
+      </w:pPr>
+      <w:r>
+        <w:t>The Personhood-Gate Handoff</w:t>
+      </w:r>
+    </w:p>
+    <w:p>
+      <w:pPr>
+        <w:keepNext w:val="0"/>
+        <w:keepLines/>
+        <w:widowControl/>
+        <w:spacing w:before="0" w:after="60" w:line="252" w:lineRule="exact"/>
+      </w:pPr>
+      <w:r>
+        <w:t>Research note, 2026. doi.org/10.5281/zenodo.21234475</w:t>
+      </w:r>
+    </w:p>
+    <w:p>
+      <w:pPr>
+        <w:pStyle w:val="Heading2"/>
+        <w:keepNext/>
+        <w:keepLines/>
+        <w:widowControl/>
+        <w:spacing w:before="100" w:after="40" w:line="256" w:lineRule="exact"/>
+      </w:pPr>
+      <w:r>
+        <w:t>Re-Perceived Effects</w:t>
+      </w:r>
+    </w:p>
+    <w:p>
+      <w:pPr>
+        <w:keepNext w:val="0"/>
+        <w:keepLines/>
+        <w:widowControl/>
+        <w:spacing w:before="0" w:after="60" w:line="252" w:lineRule="exact"/>
+      </w:pPr>
+      <w:r>
+        <w:t>Research note, 2026. doi.org/10.5281/zenodo.21231311</w:t>
+      </w:r>
+    </w:p>
+    <w:p>
+      <w:pPr>
+        <w:pStyle w:val="Heading2"/>
+        <w:keepNext/>
+        <w:keepLines/>
+        <w:widowControl/>
+        <w:spacing w:before="100" w:after="40" w:line="256" w:lineRule="exact"/>
+      </w:pPr>
+      <w:r>
+        <w:t>The Witnessing Spine</w:t>
+      </w:r>
+    </w:p>
+    <w:p>
+      <w:pPr>
+        <w:keepNext w:val="0"/>
+        <w:keepLines/>
+        <w:widowControl/>
+        <w:spacing w:before="0" w:after="60" w:line="252" w:lineRule="exact"/>
+      </w:pPr>
+      <w:r>
+        <w:t>Archived research corpus, 2026. doi.org/10.5281/zenodo.20778927</w:t>
+      </w:r>
+    </w:p>
+    <w:p>
+      <w:pPr>
+        <w:pStyle w:val="Heading2"/>
+        <w:keepNext/>
+        <w:keepLines/>
+        <w:widowControl/>
+        <w:spacing w:before="100" w:after="40" w:line="256" w:lineRule="exact"/>
+      </w:pPr>
+      <w:r>
+        <w:t>Conferred Existence</w:t>
+      </w:r>
+    </w:p>
+    <w:p>
+      <w:pPr>
+        <w:keepNext w:val="0"/>
+        <w:keepLines/>
+        <w:widowControl/>
+        <w:spacing w:before="0" w:after="60" w:line="252" w:lineRule="exact"/>
+      </w:pPr>
+      <w:r>
+        <w:t>Long-form philosophical manuscript and archived corpus, 2026. doi.org/10.5281/zenodo.20773724</w:t>
+      </w:r>
+    </w:p>
+    <w:p>
+      <w:pPr>
+        <w:pStyle w:val="Heading1"/>
+        <w:keepNext/>
+        <w:keepLines/>
+        <w:widowControl/>
+        <w:spacing w:before="120" w:after="60" w:line="280" w:lineRule="exact"/>
       </w:pPr>
       <w:r>
         <w:t>Education</w:t>
@@ -208,23 +1090,63 @@
     </w:p>
     <w:p>
       <w:pPr>
-        <w:spacing w:before="0" w:after="30" w:line="240" w:lineRule="auto"/>
+        <w:keepNext w:val="0"/>
+        <w:keepLines/>
+        <w:widowControl/>
+        <w:spacing w:before="0" w:after="60" w:line="252" w:lineRule="exact"/>
       </w:pPr>
       <w:r>
-        <w:t>High School Diploma, Wilsonville High School, 2013.</w:t>
+        <w:t>High School Diploma | Wilsonville High School, Wilsonville, Oregon | 2013</w:t>
       </w:r>
     </w:p>
     <w:p>
       <w:pPr>
-        <w:spacing w:before="0" w:after="30" w:line="240" w:lineRule="auto"/>
+        <w:keepNext w:val="0"/>
+        <w:keepLines/>
+        <w:widowControl/>
+        <w:spacing w:before="0" w:after="60" w:line="252" w:lineRule="exact"/>
       </w:pPr>
       <w:r>
-        <w:t>Updated 2026-09-19. Public dates preserve unknown months. Phone and legal-name attestation are omitted.</w:t>
+        <w:t>Self-directed study in systems programming, compilers, graphics, color science, AI evaluation, epistemics, and philosophy of mind. Practical arboriculture and plant-science knowledge is grounded in field work, not a separately claimed professional license.</w:t>
+      </w:r>
+    </w:p>
+    <w:p>
+      <w:pPr>
+        <w:pStyle w:val="Heading1"/>
+        <w:keepNext/>
+        <w:keepLines/>
+        <w:widowControl/>
+        <w:spacing w:before="120" w:after="60" w:line="280" w:lineRule="exact"/>
+      </w:pPr>
+      <w:r>
+        <w:t>Research and Portfolio Links</w:t>
+      </w:r>
+    </w:p>
+    <w:p>
+      <w:pPr>
+        <w:keepNext w:val="0"/>
+        <w:keepLines/>
+        <w:widowControl/>
+        <w:spacing w:before="0" w:after="60" w:line="252" w:lineRule="exact"/>
+      </w:pPr>
+      <w:r>
+        <w:t>ORCID: 0009-0001-7175-5393 | orcid.org/0009-0001-7175-5393</w:t>
+      </w:r>
+    </w:p>
+    <w:p>
+      <w:pPr>
+        <w:keepNext w:val="0"/>
+        <w:keepLines/>
+        <w:widowControl/>
+        <w:spacing w:before="0" w:after="60" w:line="252" w:lineRule="exact"/>
+      </w:pPr>
+      <w:r>
+        <w:t>Publications: harperz9.github.io/publications.html | Portfolio: harperz9.github.io/portfolio.html</w:t>
       </w:r>
     </w:p>
     <w:sectPr>
       <w:pgSz w:w="12240" w:h="15840"/>
-      <w:pgMar w:top="605" w:right="720" w:bottom="605" w:left="720" w:header="720" w:footer="720" w:gutter="0"/>
+      <w:pgMar w:top="792" w:right="864" w:bottom="792" w:left="864" w:header="720" w:footer="720" w:gutter="0"/>
       <w:cols w:space="720"/>
       <w:docGrid w:linePitch="360"/>
     </w:sectPr>
@@ -597,7 +1519,11 @@
     <w:rsid w:val="00FC693F"/>
     <w:rPr>
       <w:rFonts w:ascii="Arial" w:hAnsi="Arial"/>
-      <w:sz w:val="16"/>
+      <w:b w:val="0"/>
+      <w:i w:val="0"/>
+      <w:color w:val="000000"/>
+      <w:sz w:val="21"/>
+      <w:lang w:val="en-US"/>
     </w:rPr>
   </w:style>
   <w:style w:type="paragraph" w:styleId="Header">
@@ -614,6 +1540,9 @@
       </w:tabs>
       <w:spacing w:after="0" w:line="240" w:lineRule="auto"/>
     </w:pPr>
+    <w:rPr>
+      <w:lang w:val="en-US"/>
+    </w:rPr>
   </w:style>
   <w:style w:type="character" w:customStyle="1" w:styleId="HeaderChar">
     <w:name w:val="Header Char"/>
@@ -636,6 +1565,9 @@
       </w:tabs>
       <w:spacing w:after="0" w:line="240" w:lineRule="auto"/>
     </w:pPr>
+    <w:rPr>
+      <w:lang w:val="en-US"/>
+    </w:rPr>
   </w:style>
   <w:style w:type="character" w:customStyle="1" w:styleId="FooterChar">
     <w:name w:val="Footer Char"/>
@@ -659,12 +1591,14 @@
       <w:outlineLvl w:val="0"/>
     </w:pPr>
     <w:rPr>
-      <w:rFonts w:asciiTheme="majorHAnsi" w:eastAsiaTheme="majorEastAsia" w:hAnsiTheme="majorHAnsi" w:cstheme="majorBidi"/>
+      <w:rFonts w:asciiTheme="majorHAnsi" w:eastAsiaTheme="majorEastAsia" w:hAnsiTheme="majorHAnsi" w:cstheme="majorBidi" w:ascii="Arial" w:hAnsi="Arial"/>
       <w:b/>
       <w:bCs/>
-      <w:color w:val="365F91" w:themeColor="accent1" w:themeShade="BF"/>
-      <w:sz w:val="28"/>
+      <w:i w:val="0"/>
+      <w:color w:val="000000"/>
+      <w:sz w:val="23"/>
       <w:szCs w:val="28"/>
+      <w:lang w:val="en-US"/>
     </w:rPr>
   </w:style>
   <w:style w:type="paragraph" w:styleId="Heading2">
@@ -686,9 +1620,11 @@
       <w:rFonts w:asciiTheme="majorHAnsi" w:eastAsiaTheme="majorEastAsia" w:hAnsiTheme="majorHAnsi" w:cstheme="majorBidi" w:ascii="Arial" w:hAnsi="Arial"/>
       <w:b/>
       <w:bCs/>
-      <w:color w:val="4F81BD" w:themeColor="accent1"/>
-      <w:sz w:val="18"/>
+      <w:i w:val="0"/>
+      <w:color w:val="000000"/>
+      <w:sz w:val="21"/>
       <w:szCs w:val="26"/>
+      <w:lang w:val="en-US"/>
     </w:rPr>
   </w:style>
   <w:style w:type="paragraph" w:styleId="Heading3">
@@ -711,6 +1647,7 @@
       <w:b/>
       <w:bCs/>
       <w:color w:val="4F81BD" w:themeColor="accent1"/>
+      <w:lang w:val="en-US"/>
     </w:rPr>
   </w:style>
   <w:style w:type="paragraph" w:styleId="Heading4">
@@ -736,6 +1673,7 @@
       <w:i/>
       <w:iCs/>
       <w:color w:val="4F81BD" w:themeColor="accent1"/>
+      <w:lang w:val="en-US"/>
     </w:rPr>
   </w:style>
   <w:style w:type="paragraph" w:styleId="Heading5">
@@ -757,6 +1695,7 @@
     <w:rPr>
       <w:rFonts w:asciiTheme="majorHAnsi" w:eastAsiaTheme="majorEastAsia" w:hAnsiTheme="majorHAnsi" w:cstheme="majorBidi"/>
       <w:color w:val="243F60" w:themeColor="accent1" w:themeShade="7F"/>
+      <w:lang w:val="en-US"/>
     </w:rPr>
   </w:style>
   <w:style w:type="paragraph" w:styleId="Heading6">
@@ -780,6 +1719,7 @@
       <w:i/>
       <w:iCs/>
       <w:color w:val="243F60" w:themeColor="accent1" w:themeShade="7F"/>
+      <w:lang w:val="en-US"/>
     </w:rPr>
   </w:style>
   <w:style w:type="paragraph" w:styleId="Heading7">
@@ -803,6 +1743,7 @@
       <w:i/>
       <w:iCs/>
       <w:color w:val="404040" w:themeColor="text1" w:themeTint="BF"/>
+      <w:lang w:val="en-US"/>
     </w:rPr>
   </w:style>
   <w:style w:type="paragraph" w:styleId="Heading8">
@@ -826,6 +1767,7 @@
       <w:color w:val="4F81BD" w:themeColor="accent1"/>
       <w:sz w:val="20"/>
       <w:szCs w:val="20"/>
+      <w:lang w:val="en-US"/>
     </w:rPr>
   </w:style>
   <w:style w:type="paragraph" w:styleId="Heading9">
@@ -851,6 +1793,7 @@
       <w:color w:val="404040" w:themeColor="text1" w:themeTint="BF"/>
       <w:sz w:val="20"/>
       <w:szCs w:val="20"/>
+      <w:lang w:val="en-US"/>
     </w:rPr>
   </w:style>
   <w:style w:type="character" w:default="1" w:styleId="DefaultParagraphFont">
@@ -888,6 +1831,9 @@
     <w:pPr>
       <w:spacing w:after="0" w:line="240" w:lineRule="auto"/>
     </w:pPr>
+    <w:rPr>
+      <w:lang w:val="en-US"/>
+    </w:rPr>
   </w:style>
   <w:style w:type="character" w:customStyle="1" w:styleId="Heading1Char">
     <w:name w:val="Heading 1 Char"/>
@@ -949,11 +1895,14 @@
     </w:pPr>
     <w:rPr>
       <w:rFonts w:asciiTheme="majorHAnsi" w:eastAsiaTheme="majorEastAsia" w:hAnsiTheme="majorHAnsi" w:cstheme="majorBidi" w:ascii="Arial" w:hAnsi="Arial"/>
-      <w:color w:val="17365D" w:themeColor="text2" w:themeShade="BF"/>
+      <w:b/>
+      <w:i w:val="0"/>
+      <w:color w:val="000000"/>
       <w:spacing w:val="5"/>
       <w:kern w:val="28"/>
-      <w:sz w:val="28"/>
+      <w:sz w:val="40"/>
       <w:szCs w:val="52"/>
+      <w:lang w:val="en-US"/>
     </w:rPr>
   </w:style>
   <w:style w:type="character" w:customStyle="1" w:styleId="TitleChar">
@@ -985,13 +1934,15 @@
       </w:numPr>
     </w:pPr>
     <w:rPr>
-      <w:rFonts w:asciiTheme="majorHAnsi" w:eastAsiaTheme="majorEastAsia" w:hAnsiTheme="majorHAnsi" w:cstheme="majorBidi"/>
-      <w:i/>
+      <w:rFonts w:asciiTheme="majorHAnsi" w:eastAsiaTheme="majorEastAsia" w:hAnsiTheme="majorHAnsi" w:cstheme="majorBidi" w:ascii="Arial" w:hAnsi="Arial"/>
+      <w:b/>
+      <w:i w:val="0"/>
       <w:iCs/>
-      <w:color w:val="4F81BD" w:themeColor="accent1"/>
+      <w:color w:val="000000"/>
       <w:spacing w:val="15"/>
-      <w:sz w:val="24"/>
+      <w:sz w:val="21"/>
       <w:szCs w:val="24"/>
+      <w:lang w:val="en-US"/>
     </w:rPr>
   </w:style>
   <w:style w:type="character" w:customStyle="1" w:styleId="SubtitleChar">
@@ -1020,6 +1971,9 @@
       <w:ind w:left="720"/>
       <w:contextualSpacing/>
     </w:pPr>
+    <w:rPr>
+      <w:lang w:val="en-US"/>
+    </w:rPr>
   </w:style>
   <w:style w:type="paragraph" w:styleId="BodyText">
     <w:name w:val="Body Text"/>
@@ -1031,6 +1985,9 @@
     <w:pPr>
       <w:spacing w:after="120"/>
     </w:pPr>
+    <w:rPr>
+      <w:lang w:val="en-US"/>
+    </w:rPr>
   </w:style>
   <w:style w:type="character" w:customStyle="1" w:styleId="BodyTextChar">
     <w:name w:val="Body Text Char"/>
@@ -1049,6 +2006,9 @@
     <w:pPr>
       <w:spacing w:after="120" w:line="480" w:lineRule="auto"/>
     </w:pPr>
+    <w:rPr>
+      <w:lang w:val="en-US"/>
+    </w:rPr>
   </w:style>
   <w:style w:type="character" w:customStyle="1" w:styleId="BodyText2Char">
     <w:name w:val="Body Text 2 Char"/>
@@ -1070,6 +2030,7 @@
     <w:rPr>
       <w:sz w:val="16"/>
       <w:szCs w:val="16"/>
+      <w:lang w:val="en-US"/>
     </w:rPr>
   </w:style>
   <w:style w:type="character" w:customStyle="1" w:styleId="BodyText3Char">
@@ -1093,6 +2054,9 @@
       <w:ind w:left="360" w:hanging="360"/>
       <w:contextualSpacing/>
     </w:pPr>
+    <w:rPr>
+      <w:lang w:val="en-US"/>
+    </w:rPr>
   </w:style>
   <w:style w:type="paragraph" w:styleId="List2">
     <w:name w:val="List 2"/>
@@ -1104,6 +2068,9 @@
       <w:ind w:left="720" w:hanging="360"/>
       <w:contextualSpacing/>
     </w:pPr>
+    <w:rPr>
+      <w:lang w:val="en-US"/>
+    </w:rPr>
   </w:style>
   <w:style w:type="paragraph" w:styleId="List3">
     <w:name w:val="List 3"/>
@@ -1115,6 +2082,9 @@
       <w:ind w:left="1080" w:hanging="360"/>
       <w:contextualSpacing/>
     </w:pPr>
+    <w:rPr>
+      <w:lang w:val="en-US"/>
+    </w:rPr>
   </w:style>
   <w:style w:type="paragraph" w:styleId="ListBullet">
     <w:name w:val="List Bullet"/>
@@ -1128,6 +2098,14 @@
       </w:numPr>
       <w:contextualSpacing/>
     </w:pPr>
+    <w:rPr>
+      <w:rFonts w:ascii="Arial" w:hAnsi="Arial"/>
+      <w:b w:val="0"/>
+      <w:i w:val="0"/>
+      <w:color w:val="000000"/>
+      <w:sz w:val="21"/>
+      <w:lang w:val="en-US"/>
+    </w:rPr>
   </w:style>
   <w:style w:type="paragraph" w:styleId="ListBullet2">
     <w:name w:val="List Bullet 2"/>
@@ -1141,6 +2119,9 @@
       </w:numPr>
       <w:contextualSpacing/>
     </w:pPr>
+    <w:rPr>
+      <w:lang w:val="en-US"/>
+    </w:rPr>
   </w:style>
   <w:style w:type="paragraph" w:styleId="ListBullet3">
     <w:name w:val="List Bullet 3"/>
@@ -1154,6 +2135,9 @@
       </w:numPr>
       <w:contextualSpacing/>
     </w:pPr>
+    <w:rPr>
+      <w:lang w:val="en-US"/>
+    </w:rPr>
   </w:style>
   <w:style w:type="paragraph" w:styleId="ListNumber">
     <w:name w:val="List Number"/>
@@ -1167,6 +2151,9 @@
       </w:numPr>
       <w:contextualSpacing/>
     </w:pPr>
+    <w:rPr>
+      <w:lang w:val="en-US"/>
+    </w:rPr>
   </w:style>
   <w:style w:type="paragraph" w:styleId="ListNumber2">
     <w:name w:val="List Number 2"/>
@@ -1180,6 +2167,9 @@
       </w:numPr>
       <w:contextualSpacing/>
     </w:pPr>
+    <w:rPr>
+      <w:lang w:val="en-US"/>
+    </w:rPr>
   </w:style>
   <w:style w:type="paragraph" w:styleId="ListNumber3">
     <w:name w:val="List Number 3"/>
@@ -1193,6 +2183,9 @@
       </w:numPr>
       <w:contextualSpacing/>
     </w:pPr>
+    <w:rPr>
+      <w:lang w:val="en-US"/>
+    </w:rPr>
   </w:style>
   <w:style w:type="paragraph" w:styleId="ListContinue">
     <w:name w:val="List Continue"/>
@@ -1205,6 +2198,9 @@
       <w:ind w:left="360"/>
       <w:contextualSpacing/>
     </w:pPr>
+    <w:rPr>
+      <w:lang w:val="en-US"/>
+    </w:rPr>
   </w:style>
   <w:style w:type="paragraph" w:styleId="ListContinue2">
     <w:name w:val="List Continue 2"/>
@@ -1217,6 +2213,9 @@
       <w:ind w:left="720"/>
       <w:contextualSpacing/>
     </w:pPr>
+    <w:rPr>
+      <w:lang w:val="en-US"/>
+    </w:rPr>
   </w:style>
   <w:style w:type="paragraph" w:styleId="ListContinue3">
     <w:name w:val="List Continue 3"/>
@@ -1229,6 +2228,9 @@
       <w:ind w:left="1080"/>
       <w:contextualSpacing/>
     </w:pPr>
+    <w:rPr>
+      <w:lang w:val="en-US"/>
+    </w:rPr>
   </w:style>
   <w:style w:type="paragraph" w:styleId="MacroText">
     <w:name w:val="macro"/>
@@ -1251,6 +2253,7 @@
       <w:rFonts w:ascii="Courier" w:hAnsi="Courier"/>
       <w:sz w:val="20"/>
       <w:szCs w:val="20"/>
+      <w:lang w:val="en-US"/>
     </w:rPr>
   </w:style>
   <w:style w:type="character" w:customStyle="1" w:styleId="MacroTextChar">
@@ -1277,6 +2280,7 @@
       <w:i/>
       <w:iCs/>
       <w:color w:val="000000" w:themeColor="text1"/>
+      <w:lang w:val="en-US"/>
     </w:rPr>
   </w:style>
   <w:style w:type="character" w:customStyle="1" w:styleId="QuoteChar">
@@ -1395,6 +2399,7 @@
       <w:color w:val="4F81BD" w:themeColor="accent1"/>
       <w:sz w:val="18"/>
       <w:szCs w:val="18"/>
+      <w:lang w:val="en-US"/>
     </w:rPr>
   </w:style>
   <w:style w:type="character" w:styleId="Strong">
@@ -1440,6 +2445,7 @@
       <w:i/>
       <w:iCs/>
       <w:color w:val="4F81BD" w:themeColor="accent1"/>
+      <w:lang w:val="en-US"/>
     </w:rPr>
   </w:style>
   <w:style w:type="character" w:customStyle="1" w:styleId="IntenseQuoteChar">
@@ -1534,6 +2540,9 @@
     <w:pPr>
       <w:outlineLvl w:val="9"/>
     </w:pPr>
+    <w:rPr>
+      <w:lang w:val="en-US"/>
+    </w:rPr>
   </w:style>
   <w:style w:type="table" w:styleId="TableGrid">
     <w:name w:val="Table Grid"/>

</xml_diff>

<commit_message>
Refresh career credentials and AI governance record
</commit_message>
<xml_diff>
--- a/career/Zain-Dana-Harper-CV.docx
+++ b/career/Zain-Dana-Harper-CV.docx
@@ -25,7 +25,7 @@
         <w:rPr>
           <w:sz w:val="21"/>
         </w:rPr>
-        <w:t>Seattle, Washington | zaindharper@gmail.com | harperz9.github.io</w:t>
+        <w:t>Kent, Washington | zaindharper@gmail.com | harperz9.github.io</w:t>
       </w:r>
     </w:p>
     <w:p>
@@ -71,7 +71,18 @@
         <w:spacing w:before="0" w:after="60" w:line="252" w:lineRule="exact"/>
       </w:pPr>
       <w:r>
-        <w:t>Independent systems engineer and technical writer building AI workstations, evaluation and accountability tools, language tooling, and graphics systems. My work connects a practical question to a verifiable implementation: what happened, what evidence supports it, and who authorized the next action. I combine a self-directed programming history with prior technical networking support and eleven years of full-time arboriculture and customer-facing operations.</w:t>
+        <w:t>Independent systems engineer and technical writer building AI workstations, evaluation and accountability tools, language tooling, and graphics systems. Combines self-directed programming with technical networking support and eleven years of full-time arboriculture and customer-facing operations.</w:t>
+      </w:r>
+    </w:p>
+    <w:p>
+      <w:pPr>
+        <w:keepNext w:val="0"/>
+        <w:keepLines/>
+        <w:widowControl/>
+        <w:spacing w:before="0" w:after="60" w:line="252" w:lineRule="exact"/>
+      </w:pPr>
+      <w:r>
+        <w:t>Open to technical and nontechnical AI governance and evaluation roles. Available for regular travel to San Francisco and London.</w:t>
       </w:r>
     </w:p>
     <w:p>
@@ -109,7 +120,21 @@
         <w:rPr>
           <w:sz w:val="21"/>
         </w:rPr>
-        <w:t>Seattle / remote | 2023 to Present</w:t>
+        <w:t>Kent / remote | 2023 to Present</w:t>
+      </w:r>
+    </w:p>
+    <w:p>
+      <w:pPr>
+        <w:keepNext/>
+        <w:keepLines/>
+        <w:widowControl/>
+        <w:spacing w:before="0" w:after="60" w:line="240" w:lineRule="exact"/>
+      </w:pPr>
+      <w:r>
+        <w:rPr>
+          <w:sz w:val="21"/>
+        </w:rPr>
+        <w:t>Sole proprietor since September 2026</w:t>
       </w:r>
     </w:p>
     <w:p>
@@ -336,7 +361,7 @@
         <w:spacing w:before="0" w:after="60" w:line="252" w:lineRule="exact"/>
       </w:pPr>
       <w:r>
-        <w:t>Primary owned platform. The September 19, 2026 v1.0.1 release includes a Windows installer with a bundled engine. The source repository contains the Python runtime, Flutter desktop client, and browser fallback.</w:t>
+        <w:t>Primary owned platform. The September 29, 2026 v1.1.2 release includes a Windows installer with a bundled engine. The source repository contains the Python runtime, Flutter desktop client, and browser fallback.</w:t>
       </w:r>
     </w:p>
     <w:p>
@@ -445,7 +470,7 @@
         <w:spacing w:before="0" w:after="60" w:line="252" w:lineRule="exact"/>
       </w:pPr>
       <w:r>
-        <w:t>Built deterministic prose analysis with register, mode, and genre profiles, alongside optional model-assisted editing. Includes command-line, library, MCP, language-server, and SARIF surfaces; math-span protection preserves formulas during supported editing flows. Content-free audit receipts record checks without retaining the underlying prose. Version 0.3.0 was released September 20, 2026.</w:t>
+        <w:t>Built deterministic prose analysis with register, mode, and genre profiles, alongside optional model-assisted editing. Includes command-line, library, MCP, language-server, and SARIF surfaces; math-span protection preserves formulas during supported editing flows. Content-free audit receipts record checks without retaining the underlying prose. Version 0.5.2, released September 29, 2026, adds guarded host editing through local MCP and a released plugin.</w:t>
       </w:r>
     </w:p>
     <w:p>
@@ -866,7 +891,7 @@
         <w:spacing w:before="0" w:after="60" w:line="252" w:lineRule="exact"/>
       </w:pPr>
       <w:r>
-        <w:t>My independent research examines how an AI system can leave evidence that another system or person can check without inheriting its authority. Workstreams include evaluation provenance and verifier independence; live-state drift; proof-carrying action envelopes; the relationship between memory, uncertainty, and behavior; and explicit human authorization for consequential actions. Robotics is a research interest, not a claim of professional robotics deployment experience.</w:t>
+        <w:t>My independent research examines evidence that another person or system can check without inheriting an AI system's authority. Work includes evaluation provenance and verifier independence; live-state drift; proof-carrying actions; memory, uncertainty, and behavior; and human authorization for consequential actions. Robotics is a research interest.</w:t>
       </w:r>
     </w:p>
     <w:p>
@@ -878,6 +903,121 @@
         <w:spacing w:before="120" w:after="60" w:line="280" w:lineRule="exact"/>
       </w:pPr>
       <w:r>
+        <w:t>AI Accountability, Disclosure, and Public-Interest Writing</w:t>
+      </w:r>
+    </w:p>
+    <w:p>
+      <w:pPr>
+        <w:keepNext w:val="0"/>
+        <w:keepLines/>
+        <w:widowControl/>
+        <w:spacing w:before="0" w:after="60" w:line="252" w:lineRule="exact"/>
+      </w:pPr>
+      <w:r>
+        <w:t>Independent essays on AI accountability, disclosure, conflicts of interest, and human consequences, relevant to public-interest and whistleblower-protection work.</w:t>
+      </w:r>
+    </w:p>
+    <w:p>
+      <w:pPr>
+        <w:pStyle w:val="Heading2"/>
+        <w:keepNext/>
+        <w:keepLines/>
+        <w:widowControl/>
+        <w:spacing w:before="100" w:after="40" w:line="256" w:lineRule="exact"/>
+      </w:pPr>
+      <w:r>
+        <w:t>Who Knew First</w:t>
+      </w:r>
+    </w:p>
+    <w:p>
+      <w:pPr>
+        <w:keepNext w:val="0"/>
+        <w:keepLines/>
+        <w:widowControl/>
+        <w:spacing w:before="0" w:after="60" w:line="252" w:lineRule="exact"/>
+      </w:pPr>
+      <w:r>
+        <w:t>September 2026. Directed and published an AI-assisted investigation comparing disclosure timelines, evidence access, institutional incentives, and evaluator conflicts across nine reported AI-agent incidents. Separates source claims, inference, and unresolved attribution. harperz9.github.io/who-knew-first.html</w:t>
+      </w:r>
+    </w:p>
+    <w:p>
+      <w:pPr>
+        <w:pStyle w:val="Heading2"/>
+        <w:keepNext/>
+        <w:keepLines/>
+        <w:widowControl/>
+        <w:spacing w:before="100" w:after="40" w:line="256" w:lineRule="exact"/>
+      </w:pPr>
+      <w:r>
+        <w:t>An Open Letter on Checking the Machines</w:t>
+      </w:r>
+    </w:p>
+    <w:p>
+      <w:pPr>
+        <w:keepNext w:val="0"/>
+        <w:keepLines/>
+        <w:widowControl/>
+        <w:spacing w:before="0" w:after="60" w:line="252" w:lineRule="exact"/>
+      </w:pPr>
+      <w:r>
+        <w:t>September 2026. Proposed contestable AI decisions, repeatable evidence checks, and accountable responses to objections. harperz9.github.io/checking-the-machines.html</w:t>
+      </w:r>
+    </w:p>
+    <w:p>
+      <w:pPr>
+        <w:pStyle w:val="Heading2"/>
+        <w:keepNext/>
+        <w:keepLines/>
+        <w:widowControl/>
+        <w:spacing w:before="100" w:after="40" w:line="256" w:lineRule="exact"/>
+      </w:pPr>
+      <w:r>
+        <w:t>Borrowed Ground</w:t>
+      </w:r>
+    </w:p>
+    <w:p>
+      <w:pPr>
+        <w:keepNext w:val="0"/>
+        <w:keepLines/>
+        <w:widowControl/>
+        <w:spacing w:before="0" w:after="60" w:line="252" w:lineRule="exact"/>
+      </w:pPr>
+      <w:r>
+        <w:t>September 2026. Philosophical essay connecting human interdependence to responsibility, privacy, participation, and the limits of technical evidence as authority over people. Substantial AI assistance disclosed. harperz9.github.io/borrowed-ground.html</w:t>
+      </w:r>
+    </w:p>
+    <w:p>
+      <w:pPr>
+        <w:pStyle w:val="Heading2"/>
+        <w:keepNext/>
+        <w:keepLines/>
+        <w:widowControl/>
+        <w:spacing w:before="100" w:after="40" w:line="256" w:lineRule="exact"/>
+      </w:pPr>
+      <w:r>
+        <w:t>The Sandbox Was Never Just a Box</w:t>
+      </w:r>
+    </w:p>
+    <w:p>
+      <w:pPr>
+        <w:keepNext w:val="0"/>
+        <w:keepLines/>
+        <w:widowControl/>
+        <w:spacing w:before="0" w:after="60" w:line="252" w:lineRule="exact"/>
+      </w:pPr>
+      <w:r>
+        <w:t>September 2026. Compared public security reports to examine shared-service exposure and the independence of logs, monitors, and scorers in AI-agent evaluation. harperz9.github.io/the-sandbox-was-never-just-a-box.html</w:t>
+      </w:r>
+    </w:p>
+    <w:p>
+      <w:pPr>
+        <w:pStyle w:val="Heading1"/>
+        <w:keepNext/>
+        <w:keepLines/>
+        <w:widowControl/>
+        <w:spacing w:before="120" w:after="60" w:line="280" w:lineRule="exact"/>
+      </w:pPr>
+      <w:r>
         <w:t>Selected Publications and Research Records</w:t>
       </w:r>
     </w:p>
@@ -894,6 +1034,189 @@
     </w:p>
     <w:p>
       <w:pPr>
+        <w:pStyle w:val="ListBullet"/>
+        <w:keepNext w:val="0"/>
+        <w:keepLines/>
+        <w:widowControl/>
+        <w:spacing w:before="0" w:after="60" w:line="252" w:lineRule="exact"/>
+        <w:ind w:left="245" w:hanging="173"/>
+      </w:pPr>
+      <w:r>
+        <w:t>EMET: An Authority-Incapable Byte-Level Integrity Witness. Systems paper, 2026. Byte-integrity witnessing and the separation of observation from authority. doi.org/10.5281/zenodo.21230267</w:t>
+      </w:r>
+    </w:p>
+    <w:p>
+      <w:pPr>
+        <w:pStyle w:val="ListBullet"/>
+        <w:keepNext w:val="0"/>
+        <w:keepLines/>
+        <w:widowControl/>
+        <w:spacing w:before="0" w:after="60" w:line="252" w:lineRule="exact"/>
+        <w:ind w:left="245" w:hanging="173"/>
+      </w:pPr>
+      <w:r>
+        <w:t>BuildLang: Accountable Compute via Typed Capability Effects. Systems paper, 2026. Capability effects and accountable compilation. doi.org/10.5281/zenodo.21231253</w:t>
+      </w:r>
+    </w:p>
+    <w:p>
+      <w:pPr>
+        <w:pStyle w:val="ListBullet"/>
+        <w:keepNext w:val="0"/>
+        <w:keepLines/>
+        <w:widowControl/>
+        <w:spacing w:before="0" w:after="60" w:line="252" w:lineRule="exact"/>
+        <w:ind w:left="245" w:hanging="173"/>
+      </w:pPr>
+      <w:r>
+        <w:t>Witnessed Independence: Recording Whether a Verifier Graded Its Own Work. Preprint, 2026. doi.org/10.5281/zenodo.21232206</w:t>
+      </w:r>
+    </w:p>
+    <w:p>
+      <w:pPr>
+        <w:pStyle w:val="ListBullet"/>
+        <w:keepNext w:val="0"/>
+        <w:keepLines/>
+        <w:widowControl/>
+        <w:spacing w:before="0" w:after="60" w:line="252" w:lineRule="exact"/>
+        <w:ind w:left="245" w:hanging="173"/>
+      </w:pPr>
+      <w:r>
+        <w:t>Proof Packets: A Derive-Don't-Trust Envelope for Accountable Agent Actions. Preprint, 2026. doi.org/10.5281/zenodo.21231406</w:t>
+      </w:r>
+    </w:p>
+    <w:p>
+      <w:pPr>
+        <w:pStyle w:val="ListBullet"/>
+        <w:keepNext w:val="0"/>
+        <w:keepLines/>
+        <w:widowControl/>
+        <w:spacing w:before="0" w:after="60" w:line="252" w:lineRule="exact"/>
+        <w:ind w:left="245" w:hanging="173"/>
+      </w:pPr>
+      <w:r>
+        <w:t>The Personhood-Gate Handoff. Research note, 2026. doi.org/10.5281/zenodo.21234475</w:t>
+      </w:r>
+    </w:p>
+    <w:p>
+      <w:pPr>
+        <w:pStyle w:val="ListBullet"/>
+        <w:keepNext w:val="0"/>
+        <w:keepLines/>
+        <w:widowControl/>
+        <w:spacing w:before="0" w:after="60" w:line="252" w:lineRule="exact"/>
+        <w:ind w:left="245" w:hanging="173"/>
+      </w:pPr>
+      <w:r>
+        <w:t>Re-Perceived Effects. Research note, 2026. doi.org/10.5281/zenodo.21231311</w:t>
+      </w:r>
+    </w:p>
+    <w:p>
+      <w:pPr>
+        <w:pStyle w:val="ListBullet"/>
+        <w:keepNext w:val="0"/>
+        <w:keepLines/>
+        <w:widowControl/>
+        <w:spacing w:before="0" w:after="60" w:line="252" w:lineRule="exact"/>
+        <w:ind w:left="245" w:hanging="173"/>
+      </w:pPr>
+      <w:r>
+        <w:t>The Witnessing Spine. Archived research corpus, 2026. doi.org/10.5281/zenodo.20778927</w:t>
+      </w:r>
+    </w:p>
+    <w:p>
+      <w:pPr>
+        <w:pStyle w:val="ListBullet"/>
+        <w:keepNext w:val="0"/>
+        <w:keepLines/>
+        <w:widowControl/>
+        <w:spacing w:before="0" w:after="60" w:line="252" w:lineRule="exact"/>
+        <w:ind w:left="245" w:hanging="173"/>
+      </w:pPr>
+      <w:r>
+        <w:t>Conferred Existence. Long-form philosophical manuscript and archived corpus, 2026. doi.org/10.5281/zenodo.20773724</w:t>
+      </w:r>
+    </w:p>
+    <w:p>
+      <w:pPr>
+        <w:pStyle w:val="Heading1"/>
+        <w:keepNext/>
+        <w:keepLines/>
+        <w:widowControl/>
+        <w:spacing w:before="120" w:after="60" w:line="280" w:lineRule="exact"/>
+      </w:pPr>
+      <w:r>
+        <w:t>Education</w:t>
+      </w:r>
+    </w:p>
+    <w:p>
+      <w:pPr>
+        <w:keepNext w:val="0"/>
+        <w:keepLines/>
+        <w:widowControl/>
+        <w:spacing w:before="0" w:after="60" w:line="252" w:lineRule="exact"/>
+      </w:pPr>
+      <w:r>
+        <w:t>High School Diploma | Wilsonville High School, Wilsonville, Oregon | 2013</w:t>
+      </w:r>
+    </w:p>
+    <w:p>
+      <w:pPr>
+        <w:keepNext w:val="0"/>
+        <w:keepLines/>
+        <w:widowControl/>
+        <w:spacing w:before="0" w:after="60" w:line="252" w:lineRule="exact"/>
+      </w:pPr>
+      <w:r>
+        <w:t>Self-directed study in systems programming, compilers, graphics, color science, AI evaluation, epistemics, and philosophy of mind. Practical arboriculture and plant-science knowledge is grounded in field work, not a separately claimed professional license.</w:t>
+      </w:r>
+    </w:p>
+    <w:p>
+      <w:pPr>
+        <w:keepNext w:val="0"/>
+        <w:keepLines/>
+        <w:widowControl/>
+        <w:spacing w:before="0" w:after="60" w:line="252" w:lineRule="exact"/>
+      </w:pPr>
+      <w:r>
+        <w:t>ORCID: 0009-0001-7175-5393 | orcid.org/0009-0001-7175-5393</w:t>
+      </w:r>
+    </w:p>
+    <w:p>
+      <w:pPr>
+        <w:keepNext w:val="0"/>
+        <w:keepLines/>
+        <w:widowControl/>
+        <w:spacing w:before="0" w:after="60" w:line="252" w:lineRule="exact"/>
+      </w:pPr>
+      <w:r>
+        <w:t>Publications: harperz9.github.io/publications.html | Portfolio: harperz9.github.io/portfolio.html</w:t>
+      </w:r>
+    </w:p>
+    <w:p>
+      <w:pPr>
+        <w:pStyle w:val="Heading1"/>
+        <w:keepNext/>
+        <w:keepLines/>
+        <w:widowControl/>
+        <w:spacing w:before="120" w:after="60" w:line="280" w:lineRule="exact"/>
+      </w:pPr>
+      <w:r>
+        <w:t>Credentials and Continuing Education</w:t>
+      </w:r>
+    </w:p>
+    <w:p>
+      <w:pPr>
+        <w:keepNext w:val="0"/>
+        <w:keepLines/>
+        <w:widowControl/>
+        <w:spacing w:before="0" w:after="60" w:line="252" w:lineRule="exact"/>
+      </w:pPr>
+      <w:r>
+        <w:t>Completed September 2026. Credential links, identifiers, and assessment results: harperz9.github.io/career/source-ledger.md.</w:t>
+      </w:r>
+    </w:p>
+    <w:p>
+      <w:pPr>
         <w:pStyle w:val="Heading2"/>
         <w:keepNext/>
         <w:keepLines/>
@@ -901,18 +1224,46 @@
         <w:spacing w:before="100" w:after="40" w:line="256" w:lineRule="exact"/>
       </w:pPr>
       <w:r>
-        <w:t>EMET: An Authority-Incapable Byte-Level Integrity Witness</w:t>
+        <w:t>Microsoft Applied Skills</w:t>
       </w:r>
     </w:p>
     <w:p>
       <w:pPr>
+        <w:pStyle w:val="ListBullet"/>
         <w:keepNext w:val="0"/>
         <w:keepLines/>
         <w:widowControl/>
         <w:spacing w:before="0" w:after="60" w:line="252" w:lineRule="exact"/>
+        <w:ind w:left="245" w:hanging="173"/>
       </w:pPr>
       <w:r>
-        <w:t>Systems paper, 2026. Byte-integrity witnessing and the separation of observation from authority. doi.org/10.5281/zenodo.21230267</w:t>
+        <w:t>Secure AI solutions in the cloud | Earned September 29, 2026 | Credential ED8852810C3B3FBC</w:t>
+      </w:r>
+    </w:p>
+    <w:p>
+      <w:pPr>
+        <w:pStyle w:val="ListBullet"/>
+        <w:keepNext w:val="0"/>
+        <w:keepLines/>
+        <w:widowControl/>
+        <w:spacing w:before="0" w:after="60" w:line="252" w:lineRule="exact"/>
+        <w:ind w:left="245" w:hanging="173"/>
+      </w:pPr>
+      <w:r>
+        <w:t>Get started with identities and access using Microsoft Entra | Earned September 29, 2026 | Credential 3D93C65204CB43EE</w:t>
+      </w:r>
+    </w:p>
+    <w:p>
+      <w:pPr>
+        <w:pStyle w:val="ListBullet"/>
+        <w:keepNext w:val="0"/>
+        <w:keepLines/>
+        <w:widowControl/>
+        <w:spacing w:before="0" w:after="60" w:line="252" w:lineRule="exact"/>
+        <w:ind w:left="245" w:hanging="173"/>
+      </w:pPr>
+      <w:r>
+        <w:t>Secure storage for Azure Files and Azure Blob Storage | Earned September 29, 2026 | Credential 4117A3B4196233D2</w:t>
       </w:r>
     </w:p>
     <w:p>
@@ -924,7 +1275,7 @@
         <w:spacing w:before="100" w:after="40" w:line="256" w:lineRule="exact"/>
       </w:pPr>
       <w:r>
-        <w:t>BuildLang: Accountable Compute via Typed Capability Effects</w:t>
+        <w:t>Advanced Microsoft Learn Coursework</w:t>
       </w:r>
     </w:p>
     <w:p>
@@ -935,7 +1286,18 @@
         <w:spacing w:before="0" w:after="60" w:line="252" w:lineRule="exact"/>
       </w:pPr>
       <w:r>
-        <w:t>Systems paper, 2026. Capability effects and accountable compilation. doi.org/10.5281/zenodo.21231253</w:t>
+        <w:t>SC-100: Design security solutions for applications and data. Completed four module assessments and the architecture case study.</w:t>
+      </w:r>
+    </w:p>
+    <w:p>
+      <w:pPr>
+        <w:keepNext w:val="0"/>
+        <w:keepLines/>
+        <w:widowControl/>
+        <w:spacing w:before="0" w:after="60" w:line="252" w:lineRule="exact"/>
+      </w:pPr>
+      <w:r>
+        <w:t>Design solutions that align with MCRA and MCSB. Advanced Microsoft Learn module completed September 30, 2026: security architecture, Zero Trust, insider and supply-chain risk, and AI security controls.</w:t>
       </w:r>
     </w:p>
     <w:p>
@@ -947,18 +1309,228 @@
         <w:spacing w:before="100" w:after="40" w:line="256" w:lineRule="exact"/>
       </w:pPr>
       <w:r>
-        <w:t>Witnessed Independence: Recording Whether a Verifier Graded Its Own Work</w:t>
+        <w:t>Linux Foundation Course-Completion Certificates</w:t>
       </w:r>
     </w:p>
     <w:p>
       <w:pPr>
+        <w:pStyle w:val="ListBullet"/>
         <w:keepNext w:val="0"/>
         <w:keepLines/>
         <w:widowControl/>
         <w:spacing w:before="0" w:after="60" w:line="252" w:lineRule="exact"/>
+        <w:ind w:left="245" w:hanging="173"/>
       </w:pPr>
       <w:r>
-        <w:t>Preprint, 2026. doi.org/10.5281/zenodo.21232206</w:t>
+        <w:t>LFEL1012: Secure AI/ML-Driven Software Development</w:t>
+      </w:r>
+    </w:p>
+    <w:p>
+      <w:pPr>
+        <w:pStyle w:val="ListBullet"/>
+        <w:keepNext w:val="0"/>
+        <w:keepLines/>
+        <w:widowControl/>
+        <w:spacing w:before="0" w:after="60" w:line="252" w:lineRule="exact"/>
+        <w:ind w:left="245" w:hanging="173"/>
+      </w:pPr>
+      <w:r>
+        <w:t>LFS120: Conversational AI: Ensuring Compliance and Mitigating Risks</w:t>
+      </w:r>
+    </w:p>
+    <w:p>
+      <w:pPr>
+        <w:pStyle w:val="ListBullet"/>
+        <w:keepNext w:val="0"/>
+        <w:keepLines/>
+        <w:widowControl/>
+        <w:spacing w:before="0" w:after="60" w:line="252" w:lineRule="exact"/>
+        <w:ind w:left="245" w:hanging="173"/>
+      </w:pPr>
+      <w:r>
+        <w:t>LFD121: Developing Secure Software</w:t>
+      </w:r>
+    </w:p>
+    <w:p>
+      <w:pPr>
+        <w:pStyle w:val="ListBullet"/>
+        <w:keepNext w:val="0"/>
+        <w:keepLines/>
+        <w:widowControl/>
+        <w:spacing w:before="0" w:after="60" w:line="252" w:lineRule="exact"/>
+        <w:ind w:left="245" w:hanging="173"/>
+      </w:pPr>
+      <w:r>
+        <w:t>LFS182: Securing Your Software Supply Chain with Sigstore</w:t>
+      </w:r>
+    </w:p>
+    <w:p>
+      <w:pPr>
+        <w:pStyle w:val="ListBullet"/>
+        <w:keepNext w:val="0"/>
+        <w:keepLines/>
+        <w:widowControl/>
+        <w:spacing w:before="0" w:after="60" w:line="252" w:lineRule="exact"/>
+        <w:ind w:left="245" w:hanging="173"/>
+      </w:pPr>
+      <w:r>
+        <w:t>LFEL1001: Understanding the EU Cyber Resilience Act (CRA)</w:t>
+      </w:r>
+    </w:p>
+    <w:p>
+      <w:pPr>
+        <w:pStyle w:val="ListBullet"/>
+        <w:keepNext w:val="0"/>
+        <w:keepLines/>
+        <w:widowControl/>
+        <w:spacing w:before="0" w:after="60" w:line="252" w:lineRule="exact"/>
+        <w:ind w:left="245" w:hanging="173"/>
+      </w:pPr>
+      <w:r>
+        <w:t>LFS118: Ethical Principles for Conversational AI</w:t>
+      </w:r>
+    </w:p>
+    <w:p>
+      <w:pPr>
+        <w:pStyle w:val="ListBullet"/>
+        <w:keepNext w:val="0"/>
+        <w:keepLines/>
+        <w:widowControl/>
+        <w:spacing w:before="0" w:after="60" w:line="252" w:lineRule="exact"/>
+        <w:ind w:left="245" w:hanging="173"/>
+      </w:pPr>
+      <w:r>
+        <w:t>LFEL1006: Securing Projects with OpenSSF Scorecard</w:t>
+      </w:r>
+    </w:p>
+    <w:p>
+      <w:pPr>
+        <w:pStyle w:val="ListBullet"/>
+        <w:keepNext w:val="0"/>
+        <w:keepLines/>
+        <w:widowControl/>
+        <w:spacing w:before="0" w:after="60" w:line="252" w:lineRule="exact"/>
+        <w:ind w:left="245" w:hanging="173"/>
+      </w:pPr>
+      <w:r>
+        <w:t>LFEL1005: Security Self-Assessments for Open Source Projects</w:t>
+      </w:r>
+    </w:p>
+    <w:p>
+      <w:pPr>
+        <w:pStyle w:val="ListBullet"/>
+        <w:keepNext w:val="0"/>
+        <w:keepLines/>
+        <w:widowControl/>
+        <w:spacing w:before="0" w:after="60" w:line="252" w:lineRule="exact"/>
+        <w:ind w:left="245" w:hanging="173"/>
+      </w:pPr>
+      <w:r>
+        <w:t>LFEL1007: Automating Supply Chain Security: SBOMs and Signatures</w:t>
+      </w:r>
+    </w:p>
+    <w:p>
+      <w:pPr>
+        <w:pStyle w:val="ListBullet"/>
+        <w:keepNext w:val="0"/>
+        <w:keepLines/>
+        <w:widowControl/>
+        <w:spacing w:before="0" w:after="60" w:line="252" w:lineRule="exact"/>
+        <w:ind w:left="245" w:hanging="173"/>
+      </w:pPr>
+      <w:r>
+        <w:t>LFD125: Security for Software Development Managers</w:t>
+      </w:r>
+    </w:p>
+    <w:p>
+      <w:pPr>
+        <w:pStyle w:val="ListBullet"/>
+        <w:keepNext w:val="0"/>
+        <w:keepLines/>
+        <w:widowControl/>
+        <w:spacing w:before="0" w:after="60" w:line="252" w:lineRule="exact"/>
+        <w:ind w:left="245" w:hanging="173"/>
+      </w:pPr>
+      <w:r>
+        <w:t>LFS180: Introduction to DevSecOps for Managers</w:t>
+      </w:r>
+    </w:p>
+    <w:p>
+      <w:pPr>
+        <w:pStyle w:val="ListBullet"/>
+        <w:keepNext w:val="0"/>
+        <w:keepLines/>
+        <w:widowControl/>
+        <w:spacing w:before="0" w:after="60" w:line="252" w:lineRule="exact"/>
+        <w:ind w:left="245" w:hanging="173"/>
+      </w:pPr>
+      <w:r>
+        <w:t>SKF100: OWASP Top 10 Security Threats</w:t>
+      </w:r>
+    </w:p>
+    <w:p>
+      <w:pPr>
+        <w:pStyle w:val="ListBullet"/>
+        <w:keepNext w:val="0"/>
+        <w:keepLines/>
+        <w:widowControl/>
+        <w:spacing w:before="0" w:after="60" w:line="252" w:lineRule="exact"/>
+        <w:ind w:left="245" w:hanging="173"/>
+      </w:pPr>
+      <w:r>
+        <w:t>LFS184: Introduction to JavaScript Security</w:t>
+      </w:r>
+    </w:p>
+    <w:p>
+      <w:pPr>
+        <w:pStyle w:val="ListBullet"/>
+        <w:keepNext w:val="0"/>
+        <w:keepLines/>
+        <w:widowControl/>
+        <w:spacing w:before="0" w:after="60" w:line="252" w:lineRule="exact"/>
+        <w:ind w:left="245" w:hanging="173"/>
+      </w:pPr>
+      <w:r>
+        <w:t>LFC108: Cybersecurity Essentials</w:t>
+      </w:r>
+    </w:p>
+    <w:p>
+      <w:pPr>
+        <w:pStyle w:val="ListBullet"/>
+        <w:keepNext w:val="0"/>
+        <w:keepLines/>
+        <w:widowControl/>
+        <w:spacing w:before="0" w:after="60" w:line="252" w:lineRule="exact"/>
+        <w:ind w:left="245" w:hanging="173"/>
+      </w:pPr>
+      <w:r>
+        <w:t>LFEL1004: Authentication and Authorization for Web/API</w:t>
+      </w:r>
+    </w:p>
+    <w:p>
+      <w:pPr>
+        <w:pStyle w:val="ListBullet"/>
+        <w:keepNext w:val="0"/>
+        <w:keepLines/>
+        <w:widowControl/>
+        <w:spacing w:before="0" w:after="60" w:line="252" w:lineRule="exact"/>
+        <w:ind w:left="245" w:hanging="173"/>
+      </w:pPr>
+      <w:r>
+        <w:t>LFEL1008: Migrating AI Workflows Across Platforms</w:t>
+      </w:r>
+    </w:p>
+    <w:p>
+      <w:pPr>
+        <w:pStyle w:val="ListBullet"/>
+        <w:keepNext w:val="0"/>
+        <w:keepLines/>
+        <w:widowControl/>
+        <w:spacing w:before="0" w:after="60" w:line="252" w:lineRule="exact"/>
+        <w:ind w:left="245" w:hanging="173"/>
+      </w:pPr>
+      <w:r>
+        <w:t>LFS147: Introduction to AI/ML Toolkits with Kubeflow</w:t>
       </w:r>
     </w:p>
     <w:p>
@@ -970,7 +1542,7 @@
         <w:spacing w:before="100" w:after="40" w:line="256" w:lineRule="exact"/>
       </w:pPr>
       <w:r>
-        <w:t>Proof Packets: A Derive-Don't-Trust Envelope for Accountable Agent Actions</w:t>
+        <w:t>BlueDot Impact Coursework</w:t>
       </w:r>
     </w:p>
     <w:p>
@@ -981,7 +1553,18 @@
         <w:spacing w:before="0" w:after="60" w:line="252" w:lineRule="exact"/>
       </w:pPr>
       <w:r>
-        <w:t>Preprint, 2026. doi.org/10.5281/zenodo.21231406</w:t>
+        <w:t>AGI Strategy | Course completed in 2026</w:t>
+      </w:r>
+    </w:p>
+    <w:p>
+      <w:pPr>
+        <w:keepNext w:val="0"/>
+        <w:keepLines/>
+        <w:widowControl/>
+        <w:spacing w:before="0" w:after="60" w:line="252" w:lineRule="exact"/>
+      </w:pPr>
+      <w:r>
+        <w:t>Developed an AGI Strategy action plan for label-independent AI incident notice, independently reviewable evidence, accountable escalation, and tests for misleading verification results.</w:t>
       </w:r>
     </w:p>
     <w:p>
@@ -993,7 +1576,7 @@
         <w:spacing w:before="100" w:after="40" w:line="256" w:lineRule="exact"/>
       </w:pPr>
       <w:r>
-        <w:t>The Personhood-Gate Handoff</w:t>
+        <w:t>Topics Practiced in Training</w:t>
       </w:r>
     </w:p>
     <w:p>
@@ -1004,144 +1587,7 @@
         <w:spacing w:before="0" w:after="60" w:line="252" w:lineRule="exact"/>
       </w:pPr>
       <w:r>
-        <w:t>Research note, 2026. doi.org/10.5281/zenodo.21234475</w:t>
-      </w:r>
-    </w:p>
-    <w:p>
-      <w:pPr>
-        <w:pStyle w:val="Heading2"/>
-        <w:keepNext/>
-        <w:keepLines/>
-        <w:widowControl/>
-        <w:spacing w:before="100" w:after="40" w:line="256" w:lineRule="exact"/>
-      </w:pPr>
-      <w:r>
-        <w:t>Re-Perceived Effects</w:t>
-      </w:r>
-    </w:p>
-    <w:p>
-      <w:pPr>
-        <w:keepNext w:val="0"/>
-        <w:keepLines/>
-        <w:widowControl/>
-        <w:spacing w:before="0" w:after="60" w:line="252" w:lineRule="exact"/>
-      </w:pPr>
-      <w:r>
-        <w:t>Research note, 2026. doi.org/10.5281/zenodo.21231311</w:t>
-      </w:r>
-    </w:p>
-    <w:p>
-      <w:pPr>
-        <w:pStyle w:val="Heading2"/>
-        <w:keepNext/>
-        <w:keepLines/>
-        <w:widowControl/>
-        <w:spacing w:before="100" w:after="40" w:line="256" w:lineRule="exact"/>
-      </w:pPr>
-      <w:r>
-        <w:t>The Witnessing Spine</w:t>
-      </w:r>
-    </w:p>
-    <w:p>
-      <w:pPr>
-        <w:keepNext w:val="0"/>
-        <w:keepLines/>
-        <w:widowControl/>
-        <w:spacing w:before="0" w:after="60" w:line="252" w:lineRule="exact"/>
-      </w:pPr>
-      <w:r>
-        <w:t>Archived research corpus, 2026. doi.org/10.5281/zenodo.20778927</w:t>
-      </w:r>
-    </w:p>
-    <w:p>
-      <w:pPr>
-        <w:pStyle w:val="Heading2"/>
-        <w:keepNext/>
-        <w:keepLines/>
-        <w:widowControl/>
-        <w:spacing w:before="100" w:after="40" w:line="256" w:lineRule="exact"/>
-      </w:pPr>
-      <w:r>
-        <w:t>Conferred Existence</w:t>
-      </w:r>
-    </w:p>
-    <w:p>
-      <w:pPr>
-        <w:keepNext w:val="0"/>
-        <w:keepLines/>
-        <w:widowControl/>
-        <w:spacing w:before="0" w:after="60" w:line="252" w:lineRule="exact"/>
-      </w:pPr>
-      <w:r>
-        <w:t>Long-form philosophical manuscript and archived corpus, 2026. doi.org/10.5281/zenodo.20773724</w:t>
-      </w:r>
-    </w:p>
-    <w:p>
-      <w:pPr>
-        <w:pStyle w:val="Heading1"/>
-        <w:keepNext/>
-        <w:keepLines/>
-        <w:widowControl/>
-        <w:spacing w:before="120" w:after="60" w:line="280" w:lineRule="exact"/>
-      </w:pPr>
-      <w:r>
-        <w:t>Education</w:t>
-      </w:r>
-    </w:p>
-    <w:p>
-      <w:pPr>
-        <w:keepNext w:val="0"/>
-        <w:keepLines/>
-        <w:widowControl/>
-        <w:spacing w:before="0" w:after="60" w:line="252" w:lineRule="exact"/>
-      </w:pPr>
-      <w:r>
-        <w:t>High School Diploma | Wilsonville High School, Wilsonville, Oregon | 2013</w:t>
-      </w:r>
-    </w:p>
-    <w:p>
-      <w:pPr>
-        <w:keepNext w:val="0"/>
-        <w:keepLines/>
-        <w:widowControl/>
-        <w:spacing w:before="0" w:after="60" w:line="252" w:lineRule="exact"/>
-      </w:pPr>
-      <w:r>
-        <w:t>Self-directed study in systems programming, compilers, graphics, color science, AI evaluation, epistemics, and philosophy of mind. Practical arboriculture and plant-science knowledge is grounded in field work, not a separately claimed professional license.</w:t>
-      </w:r>
-    </w:p>
-    <w:p>
-      <w:pPr>
-        <w:pStyle w:val="Heading1"/>
-        <w:keepNext/>
-        <w:keepLines/>
-        <w:widowControl/>
-        <w:spacing w:before="120" w:after="60" w:line="280" w:lineRule="exact"/>
-      </w:pPr>
-      <w:r>
-        <w:t>Research and Portfolio Links</w:t>
-      </w:r>
-    </w:p>
-    <w:p>
-      <w:pPr>
-        <w:keepNext w:val="0"/>
-        <w:keepLines/>
-        <w:widowControl/>
-        <w:spacing w:before="0" w:after="60" w:line="252" w:lineRule="exact"/>
-      </w:pPr>
-      <w:r>
-        <w:t>ORCID: 0009-0001-7175-5393 | orcid.org/0009-0001-7175-5393</w:t>
-      </w:r>
-    </w:p>
-    <w:p>
-      <w:pPr>
-        <w:keepNext w:val="0"/>
-        <w:keepLines/>
-        <w:widowControl/>
-        <w:spacing w:before="0" w:after="60" w:line="252" w:lineRule="exact"/>
-      </w:pPr>
-      <w:r>
-        <w:t>Publications: harperz9.github.io/publications.html | Portfolio: harperz9.github.io/portfolio.html</w:t>
+        <w:t>Cloud AI security; Microsoft Entra identity and access; Azure storage encryption, immutable retention, and replication; secure software development; Sigstore, SBOMs, OpenSSF Scorecard; conversational AI ethics and compliance; application and data security architecture; MCRA, MCSB, Zero Trust, model provenance, and prompt-injection defenses. These topics describe assessed labs and coursework, separately from professional experience.</w:t>
       </w:r>
     </w:p>
     <w:sectPr>

</xml_diff>

<commit_message>
Add quantified outcomes standards coverage and advanced MCP badge
</commit_message>
<xml_diff>
--- a/career/Zain-Dana-Harper-CV.docx
+++ b/career/Zain-Dana-Harper-CV.docx
@@ -528,7 +528,7 @@
         <w:spacing w:before="0" w:after="60" w:line="252" w:lineRule="exact"/>
       </w:pPr>
       <w:r>
-        <w:t>Designed exhaustive terminal-state evaluation cases and deterministic scoring that inspect the environment after an agent runs. The MLflow fixture family includes 324 cases; the component-forge suite includes 337 cases and 5,058 frozen expectations. These are fixture counts, not measured model-performance gains. Crucible provides structured worker/verifier evaluation with explicit match, drift, and missing-evidence outcomes. Third-party private staging is not represented as public hosting or endorsement.</w:t>
+        <w:t>Built 324 exhaustive terminal-state fixtures and five synthetic component-evaluation families with 337 cases and 5,058 frozen expectations. Defined controls separate failed outputs, provider failures, and missing evidence from valid results. Executed a pinned METR count_odds interoperability check with three deterministic controls, preserving logs and score provenance through the Inspect-to-Flywheel handoff.</w:t>
       </w:r>
     </w:p>
     <w:p>
@@ -700,7 +700,7 @@
         <w:spacing w:before="0" w:after="60" w:line="252" w:lineRule="exact"/>
       </w:pPr>
       <w:r>
-        <w:t>The following changes were accepted into externally maintained repositories. They are contributions, not employment at those organizations. The broader public contribution record separately tracks merged, open, and closed without merge outcomes.</w:t>
+        <w:t>Six selected contributions merged across six external repositories, covering bug fixes, tests, and documentation. These are contributions, not employment; the broader record tracks merged, open, and closed without merge outcomes.</w:t>
       </w:r>
     </w:p>
     <w:p>
@@ -739,7 +739,7 @@
         <w:ind w:left="245" w:hanging="173"/>
       </w:pPr>
       <w:r>
-        <w:t>Datasette #2815: corrected error handling for malformed composite primary-key row URLs; merged July 7, 2026. github.com/simonw/datasette/pull/2815</w:t>
+        <w:t>Datasette #2815: corrected malformed composite-key requests from HTTP 500 or incorrect HTTP 200 to HTTP 400; tested too few and too many key components in HTML and JSON. Merged July 7, 2026. github.com/simonw/datasette/pull/2815</w:t>
       </w:r>
     </w:p>
     <w:p>
@@ -778,7 +778,7 @@
         <w:ind w:left="245" w:hanging="173"/>
       </w:pPr>
       <w:r>
-        <w:t>Voxwire #44: added offline WebSocket recording and replay regression coverage; merged August 15, 2026. github.com/vectorvoyager358/voxwire/pull/44</w:t>
+        <w:t>Voxwire #44: added offline regression coverage for a six-event degraded voice turn, matching saved PCM audio and JSONL records to emitted events. Merged August 15, 2026. github.com/vectorvoyager358/voxwire/pull/44</w:t>
       </w:r>
     </w:p>
     <w:p>
@@ -1224,7 +1224,7 @@
         <w:spacing w:before="100" w:after="40" w:line="256" w:lineRule="exact"/>
       </w:pPr>
       <w:r>
-        <w:t>Microsoft Applied Skills</w:t>
+        <w:t>Microsoft Applied Skills | Earned September 29, 2026</w:t>
       </w:r>
     </w:p>
     <w:p>
@@ -1237,7 +1237,7 @@
         <w:ind w:left="245" w:hanging="173"/>
       </w:pPr>
       <w:r>
-        <w:t>Secure AI solutions in the cloud | Earned September 29, 2026 | Credential ED8852810C3B3FBC</w:t>
+        <w:t>Secure AI solutions in the cloud</w:t>
       </w:r>
     </w:p>
     <w:p>
@@ -1250,7 +1250,7 @@
         <w:ind w:left="245" w:hanging="173"/>
       </w:pPr>
       <w:r>
-        <w:t>Get started with identities and access using Microsoft Entra | Earned September 29, 2026 | Credential 3D93C65204CB43EE</w:t>
+        <w:t>Get started with identities and access using Microsoft Entra</w:t>
       </w:r>
     </w:p>
     <w:p>
@@ -1263,7 +1263,7 @@
         <w:ind w:left="245" w:hanging="173"/>
       </w:pPr>
       <w:r>
-        <w:t>Secure storage for Azure Files and Azure Blob Storage | Earned September 29, 2026 | Credential 4117A3B4196233D2</w:t>
+        <w:t>Secure storage for Azure Files and Azure Blob Storage</w:t>
       </w:r>
     </w:p>
     <w:p>
@@ -1542,7 +1542,7 @@
         <w:spacing w:before="100" w:after="40" w:line="256" w:lineRule="exact"/>
       </w:pPr>
       <w:r>
-        <w:t>BlueDot Impact Coursework</w:t>
+        <w:t>Additional Advanced and Strategy Coursework</w:t>
       </w:r>
     </w:p>
     <w:p>
@@ -1553,7 +1553,18 @@
         <w:spacing w:before="0" w:after="60" w:line="252" w:lineRule="exact"/>
       </w:pPr>
       <w:r>
-        <w:t>AGI Strategy | Course completed in 2026</w:t>
+        <w:t>Anthropic Claude Academy: Model Context Protocol: Advanced topics | Completion badge, September 30, 2026</w:t>
+      </w:r>
+    </w:p>
+    <w:p>
+      <w:pPr>
+        <w:keepNext w:val="0"/>
+        <w:keepLines/>
+        <w:widowControl/>
+        <w:spacing w:before="0" w:after="60" w:line="252" w:lineRule="exact"/>
+      </w:pPr>
+      <w:r>
+        <w:t>BlueDot Impact: AGI Strategy | Course completed in 2026</w:t>
       </w:r>
     </w:p>
     <w:p>
@@ -1576,7 +1587,7 @@
         <w:spacing w:before="100" w:after="40" w:line="256" w:lineRule="exact"/>
       </w:pPr>
       <w:r>
-        <w:t>Topics Practiced in Training</w:t>
+        <w:t>Standards and Frameworks: Training and Research</w:t>
       </w:r>
     </w:p>
     <w:p>
@@ -1587,7 +1598,7 @@
         <w:spacing w:before="0" w:after="60" w:line="252" w:lineRule="exact"/>
       </w:pPr>
       <w:r>
-        <w:t>Cloud AI security; Microsoft Entra identity and access; Azure storage encryption, immutable retention, and replication; secure software development; Sigstore, SBOMs, OpenSSF Scorecard; conversational AI ethics and compliance; application and data security architecture; MCRA, MCSB, Zero Trust, model provenance, and prompt-injection defenses. These topics describe assessed labs and coursework, separately from professional experience.</w:t>
+        <w:t>Completed coursework: MCRA/MCSB, Zero Trust, OWASP Top 10 web security, and EU Cyber Resilience Act; MCP sampling, roots, JSON-RPC, stdio, Streamable HTTP/SSE. Research references: NIST AI RMF/GenAI Profile, ISO/IEC 42001/23894, ISO 37002. Current editions and scope: harperz9.github.io/career/standards-reference.md.</w:t>
       </w:r>
     </w:p>
     <w:sectPr>

</xml_diff>

<commit_message>
Refresh career credentials, quantified results, and governance work (#272)
* Refresh career credentials and AI governance record

* Add quantified outcomes standards coverage and advanced MCP badge

---------

Co-authored-by: Zain Dana Harper <17142659+HarperZ9@users.noreply.github.com>
</commit_message>
<xml_diff>
--- a/career/Zain-Dana-Harper-CV.docx
+++ b/career/Zain-Dana-Harper-CV.docx
@@ -25,7 +25,7 @@
         <w:rPr>
           <w:sz w:val="21"/>
         </w:rPr>
-        <w:t>Seattle, Washington | zaindharper@gmail.com | harperz9.github.io</w:t>
+        <w:t>Kent, Washington | zaindharper@gmail.com | harperz9.github.io</w:t>
       </w:r>
     </w:p>
     <w:p>
@@ -71,7 +71,18 @@
         <w:spacing w:before="0" w:after="60" w:line="252" w:lineRule="exact"/>
       </w:pPr>
       <w:r>
-        <w:t>Independent systems engineer and technical writer building AI workstations, evaluation and accountability tools, language tooling, and graphics systems. My work connects a practical question to a verifiable implementation: what happened, what evidence supports it, and who authorized the next action. I combine a self-directed programming history with prior technical networking support and eleven years of full-time arboriculture and customer-facing operations.</w:t>
+        <w:t>Independent systems engineer and technical writer building AI workstations, evaluation and accountability tools, language tooling, and graphics systems. Combines self-directed programming with technical networking support and eleven years of full-time arboriculture and customer-facing operations.</w:t>
+      </w:r>
+    </w:p>
+    <w:p>
+      <w:pPr>
+        <w:keepNext w:val="0"/>
+        <w:keepLines/>
+        <w:widowControl/>
+        <w:spacing w:before="0" w:after="60" w:line="252" w:lineRule="exact"/>
+      </w:pPr>
+      <w:r>
+        <w:t>Open to technical and nontechnical AI governance and evaluation roles. Available for regular travel to San Francisco and London.</w:t>
       </w:r>
     </w:p>
     <w:p>
@@ -109,7 +120,21 @@
         <w:rPr>
           <w:sz w:val="21"/>
         </w:rPr>
-        <w:t>Seattle / remote | 2023 to Present</w:t>
+        <w:t>Kent / remote | 2023 to Present</w:t>
+      </w:r>
+    </w:p>
+    <w:p>
+      <w:pPr>
+        <w:keepNext/>
+        <w:keepLines/>
+        <w:widowControl/>
+        <w:spacing w:before="0" w:after="60" w:line="240" w:lineRule="exact"/>
+      </w:pPr>
+      <w:r>
+        <w:rPr>
+          <w:sz w:val="21"/>
+        </w:rPr>
+        <w:t>Sole proprietor since September 2026</w:t>
       </w:r>
     </w:p>
     <w:p>
@@ -336,7 +361,7 @@
         <w:spacing w:before="0" w:after="60" w:line="252" w:lineRule="exact"/>
       </w:pPr>
       <w:r>
-        <w:t>Primary owned platform. The September 19, 2026 v1.0.1 release includes a Windows installer with a bundled engine. The source repository contains the Python runtime, Flutter desktop client, and browser fallback.</w:t>
+        <w:t>Primary owned platform. The September 29, 2026 v1.1.2 release includes a Windows installer with a bundled engine. The source repository contains the Python runtime, Flutter desktop client, and browser fallback.</w:t>
       </w:r>
     </w:p>
     <w:p>
@@ -445,7 +470,7 @@
         <w:spacing w:before="0" w:after="60" w:line="252" w:lineRule="exact"/>
       </w:pPr>
       <w:r>
-        <w:t>Built deterministic prose analysis with register, mode, and genre profiles, alongside optional model-assisted editing. Includes command-line, library, MCP, language-server, and SARIF surfaces; math-span protection preserves formulas during supported editing flows. Content-free audit receipts record checks without retaining the underlying prose. Version 0.3.0 was released September 20, 2026.</w:t>
+        <w:t>Built deterministic prose analysis with register, mode, and genre profiles, alongside optional model-assisted editing. Includes command-line, library, MCP, language-server, and SARIF surfaces; math-span protection preserves formulas during supported editing flows. Content-free audit receipts record checks without retaining the underlying prose. Version 0.5.2, released September 29, 2026, adds guarded host editing through local MCP and a released plugin.</w:t>
       </w:r>
     </w:p>
     <w:p>
@@ -503,7 +528,7 @@
         <w:spacing w:before="0" w:after="60" w:line="252" w:lineRule="exact"/>
       </w:pPr>
       <w:r>
-        <w:t>Designed exhaustive terminal-state evaluation cases and deterministic scoring that inspect the environment after an agent runs. The MLflow fixture family includes 324 cases; the component-forge suite includes 337 cases and 5,058 frozen expectations. These are fixture counts, not measured model-performance gains. Crucible provides structured worker/verifier evaluation with explicit match, drift, and missing-evidence outcomes. Third-party private staging is not represented as public hosting or endorsement.</w:t>
+        <w:t>Built 324 exhaustive terminal-state fixtures and five synthetic component-evaluation families with 337 cases and 5,058 frozen expectations. Defined controls separate failed outputs, provider failures, and missing evidence from valid results. Executed a pinned METR count_odds interoperability check with three deterministic controls, preserving logs and score provenance through the Inspect-to-Flywheel handoff.</w:t>
       </w:r>
     </w:p>
     <w:p>
@@ -675,7 +700,7 @@
         <w:spacing w:before="0" w:after="60" w:line="252" w:lineRule="exact"/>
       </w:pPr>
       <w:r>
-        <w:t>The following changes were accepted into externally maintained repositories. They are contributions, not employment at those organizations. The broader public contribution record separately tracks merged, open, and closed without merge outcomes.</w:t>
+        <w:t>Six selected contributions merged across six external repositories, covering bug fixes, tests, and documentation. These are contributions, not employment; the broader record tracks merged, open, and closed without merge outcomes.</w:t>
       </w:r>
     </w:p>
     <w:p>
@@ -714,7 +739,7 @@
         <w:ind w:left="245" w:hanging="173"/>
       </w:pPr>
       <w:r>
-        <w:t>Datasette #2815: corrected error handling for malformed composite primary-key row URLs; merged July 7, 2026. github.com/simonw/datasette/pull/2815</w:t>
+        <w:t>Datasette #2815: corrected malformed composite-key requests from HTTP 500 or incorrect HTTP 200 to HTTP 400; tested too few and too many key components in HTML and JSON. Merged July 7, 2026. github.com/simonw/datasette/pull/2815</w:t>
       </w:r>
     </w:p>
     <w:p>
@@ -753,7 +778,7 @@
         <w:ind w:left="245" w:hanging="173"/>
       </w:pPr>
       <w:r>
-        <w:t>Voxwire #44: added offline WebSocket recording and replay regression coverage; merged August 15, 2026. github.com/vectorvoyager358/voxwire/pull/44</w:t>
+        <w:t>Voxwire #44: added offline regression coverage for a six-event degraded voice turn, matching saved PCM audio and JSONL records to emitted events. Merged August 15, 2026. github.com/vectorvoyager358/voxwire/pull/44</w:t>
       </w:r>
     </w:p>
     <w:p>
@@ -866,7 +891,7 @@
         <w:spacing w:before="0" w:after="60" w:line="252" w:lineRule="exact"/>
       </w:pPr>
       <w:r>
-        <w:t>My independent research examines how an AI system can leave evidence that another system or person can check without inheriting its authority. Workstreams include evaluation provenance and verifier independence; live-state drift; proof-carrying action envelopes; the relationship between memory, uncertainty, and behavior; and explicit human authorization for consequential actions. Robotics is a research interest, not a claim of professional robotics deployment experience.</w:t>
+        <w:t>My independent research examines evidence that another person or system can check without inheriting an AI system's authority. Work includes evaluation provenance and verifier independence; live-state drift; proof-carrying actions; memory, uncertainty, and behavior; and human authorization for consequential actions. Robotics is a research interest.</w:t>
       </w:r>
     </w:p>
     <w:p>
@@ -878,6 +903,121 @@
         <w:spacing w:before="120" w:after="60" w:line="280" w:lineRule="exact"/>
       </w:pPr>
       <w:r>
+        <w:t>AI Accountability, Disclosure, and Public-Interest Writing</w:t>
+      </w:r>
+    </w:p>
+    <w:p>
+      <w:pPr>
+        <w:keepNext w:val="0"/>
+        <w:keepLines/>
+        <w:widowControl/>
+        <w:spacing w:before="0" w:after="60" w:line="252" w:lineRule="exact"/>
+      </w:pPr>
+      <w:r>
+        <w:t>Independent essays on AI accountability, disclosure, conflicts of interest, and human consequences, relevant to public-interest and whistleblower-protection work.</w:t>
+      </w:r>
+    </w:p>
+    <w:p>
+      <w:pPr>
+        <w:pStyle w:val="Heading2"/>
+        <w:keepNext/>
+        <w:keepLines/>
+        <w:widowControl/>
+        <w:spacing w:before="100" w:after="40" w:line="256" w:lineRule="exact"/>
+      </w:pPr>
+      <w:r>
+        <w:t>Who Knew First</w:t>
+      </w:r>
+    </w:p>
+    <w:p>
+      <w:pPr>
+        <w:keepNext w:val="0"/>
+        <w:keepLines/>
+        <w:widowControl/>
+        <w:spacing w:before="0" w:after="60" w:line="252" w:lineRule="exact"/>
+      </w:pPr>
+      <w:r>
+        <w:t>September 2026. Directed and published an AI-assisted investigation comparing disclosure timelines, evidence access, institutional incentives, and evaluator conflicts across nine reported AI-agent incidents. Separates source claims, inference, and unresolved attribution. harperz9.github.io/who-knew-first.html</w:t>
+      </w:r>
+    </w:p>
+    <w:p>
+      <w:pPr>
+        <w:pStyle w:val="Heading2"/>
+        <w:keepNext/>
+        <w:keepLines/>
+        <w:widowControl/>
+        <w:spacing w:before="100" w:after="40" w:line="256" w:lineRule="exact"/>
+      </w:pPr>
+      <w:r>
+        <w:t>An Open Letter on Checking the Machines</w:t>
+      </w:r>
+    </w:p>
+    <w:p>
+      <w:pPr>
+        <w:keepNext w:val="0"/>
+        <w:keepLines/>
+        <w:widowControl/>
+        <w:spacing w:before="0" w:after="60" w:line="252" w:lineRule="exact"/>
+      </w:pPr>
+      <w:r>
+        <w:t>September 2026. Proposed contestable AI decisions, repeatable evidence checks, and accountable responses to objections. harperz9.github.io/checking-the-machines.html</w:t>
+      </w:r>
+    </w:p>
+    <w:p>
+      <w:pPr>
+        <w:pStyle w:val="Heading2"/>
+        <w:keepNext/>
+        <w:keepLines/>
+        <w:widowControl/>
+        <w:spacing w:before="100" w:after="40" w:line="256" w:lineRule="exact"/>
+      </w:pPr>
+      <w:r>
+        <w:t>Borrowed Ground</w:t>
+      </w:r>
+    </w:p>
+    <w:p>
+      <w:pPr>
+        <w:keepNext w:val="0"/>
+        <w:keepLines/>
+        <w:widowControl/>
+        <w:spacing w:before="0" w:after="60" w:line="252" w:lineRule="exact"/>
+      </w:pPr>
+      <w:r>
+        <w:t>September 2026. Philosophical essay connecting human interdependence to responsibility, privacy, participation, and the limits of technical evidence as authority over people. Substantial AI assistance disclosed. harperz9.github.io/borrowed-ground.html</w:t>
+      </w:r>
+    </w:p>
+    <w:p>
+      <w:pPr>
+        <w:pStyle w:val="Heading2"/>
+        <w:keepNext/>
+        <w:keepLines/>
+        <w:widowControl/>
+        <w:spacing w:before="100" w:after="40" w:line="256" w:lineRule="exact"/>
+      </w:pPr>
+      <w:r>
+        <w:t>The Sandbox Was Never Just a Box</w:t>
+      </w:r>
+    </w:p>
+    <w:p>
+      <w:pPr>
+        <w:keepNext w:val="0"/>
+        <w:keepLines/>
+        <w:widowControl/>
+        <w:spacing w:before="0" w:after="60" w:line="252" w:lineRule="exact"/>
+      </w:pPr>
+      <w:r>
+        <w:t>September 2026. Compared public security reports to examine shared-service exposure and the independence of logs, monitors, and scorers in AI-agent evaluation. harperz9.github.io/the-sandbox-was-never-just-a-box.html</w:t>
+      </w:r>
+    </w:p>
+    <w:p>
+      <w:pPr>
+        <w:pStyle w:val="Heading1"/>
+        <w:keepNext/>
+        <w:keepLines/>
+        <w:widowControl/>
+        <w:spacing w:before="120" w:after="60" w:line="280" w:lineRule="exact"/>
+      </w:pPr>
+      <w:r>
         <w:t>Selected Publications and Research Records</w:t>
       </w:r>
     </w:p>
@@ -894,6 +1034,189 @@
     </w:p>
     <w:p>
       <w:pPr>
+        <w:pStyle w:val="ListBullet"/>
+        <w:keepNext w:val="0"/>
+        <w:keepLines/>
+        <w:widowControl/>
+        <w:spacing w:before="0" w:after="60" w:line="252" w:lineRule="exact"/>
+        <w:ind w:left="245" w:hanging="173"/>
+      </w:pPr>
+      <w:r>
+        <w:t>EMET: An Authority-Incapable Byte-Level Integrity Witness. Systems paper, 2026. Byte-integrity witnessing and the separation of observation from authority. doi.org/10.5281/zenodo.21230267</w:t>
+      </w:r>
+    </w:p>
+    <w:p>
+      <w:pPr>
+        <w:pStyle w:val="ListBullet"/>
+        <w:keepNext w:val="0"/>
+        <w:keepLines/>
+        <w:widowControl/>
+        <w:spacing w:before="0" w:after="60" w:line="252" w:lineRule="exact"/>
+        <w:ind w:left="245" w:hanging="173"/>
+      </w:pPr>
+      <w:r>
+        <w:t>BuildLang: Accountable Compute via Typed Capability Effects. Systems paper, 2026. Capability effects and accountable compilation. doi.org/10.5281/zenodo.21231253</w:t>
+      </w:r>
+    </w:p>
+    <w:p>
+      <w:pPr>
+        <w:pStyle w:val="ListBullet"/>
+        <w:keepNext w:val="0"/>
+        <w:keepLines/>
+        <w:widowControl/>
+        <w:spacing w:before="0" w:after="60" w:line="252" w:lineRule="exact"/>
+        <w:ind w:left="245" w:hanging="173"/>
+      </w:pPr>
+      <w:r>
+        <w:t>Witnessed Independence: Recording Whether a Verifier Graded Its Own Work. Preprint, 2026. doi.org/10.5281/zenodo.21232206</w:t>
+      </w:r>
+    </w:p>
+    <w:p>
+      <w:pPr>
+        <w:pStyle w:val="ListBullet"/>
+        <w:keepNext w:val="0"/>
+        <w:keepLines/>
+        <w:widowControl/>
+        <w:spacing w:before="0" w:after="60" w:line="252" w:lineRule="exact"/>
+        <w:ind w:left="245" w:hanging="173"/>
+      </w:pPr>
+      <w:r>
+        <w:t>Proof Packets: A Derive-Don't-Trust Envelope for Accountable Agent Actions. Preprint, 2026. doi.org/10.5281/zenodo.21231406</w:t>
+      </w:r>
+    </w:p>
+    <w:p>
+      <w:pPr>
+        <w:pStyle w:val="ListBullet"/>
+        <w:keepNext w:val="0"/>
+        <w:keepLines/>
+        <w:widowControl/>
+        <w:spacing w:before="0" w:after="60" w:line="252" w:lineRule="exact"/>
+        <w:ind w:left="245" w:hanging="173"/>
+      </w:pPr>
+      <w:r>
+        <w:t>The Personhood-Gate Handoff. Research note, 2026. doi.org/10.5281/zenodo.21234475</w:t>
+      </w:r>
+    </w:p>
+    <w:p>
+      <w:pPr>
+        <w:pStyle w:val="ListBullet"/>
+        <w:keepNext w:val="0"/>
+        <w:keepLines/>
+        <w:widowControl/>
+        <w:spacing w:before="0" w:after="60" w:line="252" w:lineRule="exact"/>
+        <w:ind w:left="245" w:hanging="173"/>
+      </w:pPr>
+      <w:r>
+        <w:t>Re-Perceived Effects. Research note, 2026. doi.org/10.5281/zenodo.21231311</w:t>
+      </w:r>
+    </w:p>
+    <w:p>
+      <w:pPr>
+        <w:pStyle w:val="ListBullet"/>
+        <w:keepNext w:val="0"/>
+        <w:keepLines/>
+        <w:widowControl/>
+        <w:spacing w:before="0" w:after="60" w:line="252" w:lineRule="exact"/>
+        <w:ind w:left="245" w:hanging="173"/>
+      </w:pPr>
+      <w:r>
+        <w:t>The Witnessing Spine. Archived research corpus, 2026. doi.org/10.5281/zenodo.20778927</w:t>
+      </w:r>
+    </w:p>
+    <w:p>
+      <w:pPr>
+        <w:pStyle w:val="ListBullet"/>
+        <w:keepNext w:val="0"/>
+        <w:keepLines/>
+        <w:widowControl/>
+        <w:spacing w:before="0" w:after="60" w:line="252" w:lineRule="exact"/>
+        <w:ind w:left="245" w:hanging="173"/>
+      </w:pPr>
+      <w:r>
+        <w:t>Conferred Existence. Long-form philosophical manuscript and archived corpus, 2026. doi.org/10.5281/zenodo.20773724</w:t>
+      </w:r>
+    </w:p>
+    <w:p>
+      <w:pPr>
+        <w:pStyle w:val="Heading1"/>
+        <w:keepNext/>
+        <w:keepLines/>
+        <w:widowControl/>
+        <w:spacing w:before="120" w:after="60" w:line="280" w:lineRule="exact"/>
+      </w:pPr>
+      <w:r>
+        <w:t>Education</w:t>
+      </w:r>
+    </w:p>
+    <w:p>
+      <w:pPr>
+        <w:keepNext w:val="0"/>
+        <w:keepLines/>
+        <w:widowControl/>
+        <w:spacing w:before="0" w:after="60" w:line="252" w:lineRule="exact"/>
+      </w:pPr>
+      <w:r>
+        <w:t>High School Diploma | Wilsonville High School, Wilsonville, Oregon | 2013</w:t>
+      </w:r>
+    </w:p>
+    <w:p>
+      <w:pPr>
+        <w:keepNext w:val="0"/>
+        <w:keepLines/>
+        <w:widowControl/>
+        <w:spacing w:before="0" w:after="60" w:line="252" w:lineRule="exact"/>
+      </w:pPr>
+      <w:r>
+        <w:t>Self-directed study in systems programming, compilers, graphics, color science, AI evaluation, epistemics, and philosophy of mind. Practical arboriculture and plant-science knowledge is grounded in field work, not a separately claimed professional license.</w:t>
+      </w:r>
+    </w:p>
+    <w:p>
+      <w:pPr>
+        <w:keepNext w:val="0"/>
+        <w:keepLines/>
+        <w:widowControl/>
+        <w:spacing w:before="0" w:after="60" w:line="252" w:lineRule="exact"/>
+      </w:pPr>
+      <w:r>
+        <w:t>ORCID: 0009-0001-7175-5393 | orcid.org/0009-0001-7175-5393</w:t>
+      </w:r>
+    </w:p>
+    <w:p>
+      <w:pPr>
+        <w:keepNext w:val="0"/>
+        <w:keepLines/>
+        <w:widowControl/>
+        <w:spacing w:before="0" w:after="60" w:line="252" w:lineRule="exact"/>
+      </w:pPr>
+      <w:r>
+        <w:t>Publications: harperz9.github.io/publications.html | Portfolio: harperz9.github.io/portfolio.html</w:t>
+      </w:r>
+    </w:p>
+    <w:p>
+      <w:pPr>
+        <w:pStyle w:val="Heading1"/>
+        <w:keepNext/>
+        <w:keepLines/>
+        <w:widowControl/>
+        <w:spacing w:before="120" w:after="60" w:line="280" w:lineRule="exact"/>
+      </w:pPr>
+      <w:r>
+        <w:t>Credentials and Continuing Education</w:t>
+      </w:r>
+    </w:p>
+    <w:p>
+      <w:pPr>
+        <w:keepNext w:val="0"/>
+        <w:keepLines/>
+        <w:widowControl/>
+        <w:spacing w:before="0" w:after="60" w:line="252" w:lineRule="exact"/>
+      </w:pPr>
+      <w:r>
+        <w:t>Completed September 2026. Credential links, identifiers, and assessment results: harperz9.github.io/career/source-ledger.md.</w:t>
+      </w:r>
+    </w:p>
+    <w:p>
+      <w:pPr>
         <w:pStyle w:val="Heading2"/>
         <w:keepNext/>
         <w:keepLines/>
@@ -901,18 +1224,46 @@
         <w:spacing w:before="100" w:after="40" w:line="256" w:lineRule="exact"/>
       </w:pPr>
       <w:r>
-        <w:t>EMET: An Authority-Incapable Byte-Level Integrity Witness</w:t>
+        <w:t>Microsoft Applied Skills | Earned September 29, 2026</w:t>
       </w:r>
     </w:p>
     <w:p>
       <w:pPr>
+        <w:pStyle w:val="ListBullet"/>
         <w:keepNext w:val="0"/>
         <w:keepLines/>
         <w:widowControl/>
         <w:spacing w:before="0" w:after="60" w:line="252" w:lineRule="exact"/>
+        <w:ind w:left="245" w:hanging="173"/>
       </w:pPr>
       <w:r>
-        <w:t>Systems paper, 2026. Byte-integrity witnessing and the separation of observation from authority. doi.org/10.5281/zenodo.21230267</w:t>
+        <w:t>Secure AI solutions in the cloud</w:t>
+      </w:r>
+    </w:p>
+    <w:p>
+      <w:pPr>
+        <w:pStyle w:val="ListBullet"/>
+        <w:keepNext w:val="0"/>
+        <w:keepLines/>
+        <w:widowControl/>
+        <w:spacing w:before="0" w:after="60" w:line="252" w:lineRule="exact"/>
+        <w:ind w:left="245" w:hanging="173"/>
+      </w:pPr>
+      <w:r>
+        <w:t>Get started with identities and access using Microsoft Entra</w:t>
+      </w:r>
+    </w:p>
+    <w:p>
+      <w:pPr>
+        <w:pStyle w:val="ListBullet"/>
+        <w:keepNext w:val="0"/>
+        <w:keepLines/>
+        <w:widowControl/>
+        <w:spacing w:before="0" w:after="60" w:line="252" w:lineRule="exact"/>
+        <w:ind w:left="245" w:hanging="173"/>
+      </w:pPr>
+      <w:r>
+        <w:t>Secure storage for Azure Files and Azure Blob Storage</w:t>
       </w:r>
     </w:p>
     <w:p>
@@ -924,7 +1275,7 @@
         <w:spacing w:before="100" w:after="40" w:line="256" w:lineRule="exact"/>
       </w:pPr>
       <w:r>
-        <w:t>BuildLang: Accountable Compute via Typed Capability Effects</w:t>
+        <w:t>Advanced Microsoft Learn Coursework</w:t>
       </w:r>
     </w:p>
     <w:p>
@@ -935,7 +1286,18 @@
         <w:spacing w:before="0" w:after="60" w:line="252" w:lineRule="exact"/>
       </w:pPr>
       <w:r>
-        <w:t>Systems paper, 2026. Capability effects and accountable compilation. doi.org/10.5281/zenodo.21231253</w:t>
+        <w:t>SC-100: Design security solutions for applications and data. Completed four module assessments and the architecture case study.</w:t>
+      </w:r>
+    </w:p>
+    <w:p>
+      <w:pPr>
+        <w:keepNext w:val="0"/>
+        <w:keepLines/>
+        <w:widowControl/>
+        <w:spacing w:before="0" w:after="60" w:line="252" w:lineRule="exact"/>
+      </w:pPr>
+      <w:r>
+        <w:t>Design solutions that align with MCRA and MCSB. Advanced Microsoft Learn module completed September 30, 2026: security architecture, Zero Trust, insider and supply-chain risk, and AI security controls.</w:t>
       </w:r>
     </w:p>
     <w:p>
@@ -947,18 +1309,228 @@
         <w:spacing w:before="100" w:after="40" w:line="256" w:lineRule="exact"/>
       </w:pPr>
       <w:r>
-        <w:t>Witnessed Independence: Recording Whether a Verifier Graded Its Own Work</w:t>
+        <w:t>Linux Foundation Course-Completion Certificates</w:t>
       </w:r>
     </w:p>
     <w:p>
       <w:pPr>
+        <w:pStyle w:val="ListBullet"/>
         <w:keepNext w:val="0"/>
         <w:keepLines/>
         <w:widowControl/>
         <w:spacing w:before="0" w:after="60" w:line="252" w:lineRule="exact"/>
+        <w:ind w:left="245" w:hanging="173"/>
       </w:pPr>
       <w:r>
-        <w:t>Preprint, 2026. doi.org/10.5281/zenodo.21232206</w:t>
+        <w:t>LFEL1012: Secure AI/ML-Driven Software Development</w:t>
+      </w:r>
+    </w:p>
+    <w:p>
+      <w:pPr>
+        <w:pStyle w:val="ListBullet"/>
+        <w:keepNext w:val="0"/>
+        <w:keepLines/>
+        <w:widowControl/>
+        <w:spacing w:before="0" w:after="60" w:line="252" w:lineRule="exact"/>
+        <w:ind w:left="245" w:hanging="173"/>
+      </w:pPr>
+      <w:r>
+        <w:t>LFS120: Conversational AI: Ensuring Compliance and Mitigating Risks</w:t>
+      </w:r>
+    </w:p>
+    <w:p>
+      <w:pPr>
+        <w:pStyle w:val="ListBullet"/>
+        <w:keepNext w:val="0"/>
+        <w:keepLines/>
+        <w:widowControl/>
+        <w:spacing w:before="0" w:after="60" w:line="252" w:lineRule="exact"/>
+        <w:ind w:left="245" w:hanging="173"/>
+      </w:pPr>
+      <w:r>
+        <w:t>LFD121: Developing Secure Software</w:t>
+      </w:r>
+    </w:p>
+    <w:p>
+      <w:pPr>
+        <w:pStyle w:val="ListBullet"/>
+        <w:keepNext w:val="0"/>
+        <w:keepLines/>
+        <w:widowControl/>
+        <w:spacing w:before="0" w:after="60" w:line="252" w:lineRule="exact"/>
+        <w:ind w:left="245" w:hanging="173"/>
+      </w:pPr>
+      <w:r>
+        <w:t>LFS182: Securing Your Software Supply Chain with Sigstore</w:t>
+      </w:r>
+    </w:p>
+    <w:p>
+      <w:pPr>
+        <w:pStyle w:val="ListBullet"/>
+        <w:keepNext w:val="0"/>
+        <w:keepLines/>
+        <w:widowControl/>
+        <w:spacing w:before="0" w:after="60" w:line="252" w:lineRule="exact"/>
+        <w:ind w:left="245" w:hanging="173"/>
+      </w:pPr>
+      <w:r>
+        <w:t>LFEL1001: Understanding the EU Cyber Resilience Act (CRA)</w:t>
+      </w:r>
+    </w:p>
+    <w:p>
+      <w:pPr>
+        <w:pStyle w:val="ListBullet"/>
+        <w:keepNext w:val="0"/>
+        <w:keepLines/>
+        <w:widowControl/>
+        <w:spacing w:before="0" w:after="60" w:line="252" w:lineRule="exact"/>
+        <w:ind w:left="245" w:hanging="173"/>
+      </w:pPr>
+      <w:r>
+        <w:t>LFS118: Ethical Principles for Conversational AI</w:t>
+      </w:r>
+    </w:p>
+    <w:p>
+      <w:pPr>
+        <w:pStyle w:val="ListBullet"/>
+        <w:keepNext w:val="0"/>
+        <w:keepLines/>
+        <w:widowControl/>
+        <w:spacing w:before="0" w:after="60" w:line="252" w:lineRule="exact"/>
+        <w:ind w:left="245" w:hanging="173"/>
+      </w:pPr>
+      <w:r>
+        <w:t>LFEL1006: Securing Projects with OpenSSF Scorecard</w:t>
+      </w:r>
+    </w:p>
+    <w:p>
+      <w:pPr>
+        <w:pStyle w:val="ListBullet"/>
+        <w:keepNext w:val="0"/>
+        <w:keepLines/>
+        <w:widowControl/>
+        <w:spacing w:before="0" w:after="60" w:line="252" w:lineRule="exact"/>
+        <w:ind w:left="245" w:hanging="173"/>
+      </w:pPr>
+      <w:r>
+        <w:t>LFEL1005: Security Self-Assessments for Open Source Projects</w:t>
+      </w:r>
+    </w:p>
+    <w:p>
+      <w:pPr>
+        <w:pStyle w:val="ListBullet"/>
+        <w:keepNext w:val="0"/>
+        <w:keepLines/>
+        <w:widowControl/>
+        <w:spacing w:before="0" w:after="60" w:line="252" w:lineRule="exact"/>
+        <w:ind w:left="245" w:hanging="173"/>
+      </w:pPr>
+      <w:r>
+        <w:t>LFEL1007: Automating Supply Chain Security: SBOMs and Signatures</w:t>
+      </w:r>
+    </w:p>
+    <w:p>
+      <w:pPr>
+        <w:pStyle w:val="ListBullet"/>
+        <w:keepNext w:val="0"/>
+        <w:keepLines/>
+        <w:widowControl/>
+        <w:spacing w:before="0" w:after="60" w:line="252" w:lineRule="exact"/>
+        <w:ind w:left="245" w:hanging="173"/>
+      </w:pPr>
+      <w:r>
+        <w:t>LFD125: Security for Software Development Managers</w:t>
+      </w:r>
+    </w:p>
+    <w:p>
+      <w:pPr>
+        <w:pStyle w:val="ListBullet"/>
+        <w:keepNext w:val="0"/>
+        <w:keepLines/>
+        <w:widowControl/>
+        <w:spacing w:before="0" w:after="60" w:line="252" w:lineRule="exact"/>
+        <w:ind w:left="245" w:hanging="173"/>
+      </w:pPr>
+      <w:r>
+        <w:t>LFS180: Introduction to DevSecOps for Managers</w:t>
+      </w:r>
+    </w:p>
+    <w:p>
+      <w:pPr>
+        <w:pStyle w:val="ListBullet"/>
+        <w:keepNext w:val="0"/>
+        <w:keepLines/>
+        <w:widowControl/>
+        <w:spacing w:before="0" w:after="60" w:line="252" w:lineRule="exact"/>
+        <w:ind w:left="245" w:hanging="173"/>
+      </w:pPr>
+      <w:r>
+        <w:t>SKF100: OWASP Top 10 Security Threats</w:t>
+      </w:r>
+    </w:p>
+    <w:p>
+      <w:pPr>
+        <w:pStyle w:val="ListBullet"/>
+        <w:keepNext w:val="0"/>
+        <w:keepLines/>
+        <w:widowControl/>
+        <w:spacing w:before="0" w:after="60" w:line="252" w:lineRule="exact"/>
+        <w:ind w:left="245" w:hanging="173"/>
+      </w:pPr>
+      <w:r>
+        <w:t>LFS184: Introduction to JavaScript Security</w:t>
+      </w:r>
+    </w:p>
+    <w:p>
+      <w:pPr>
+        <w:pStyle w:val="ListBullet"/>
+        <w:keepNext w:val="0"/>
+        <w:keepLines/>
+        <w:widowControl/>
+        <w:spacing w:before="0" w:after="60" w:line="252" w:lineRule="exact"/>
+        <w:ind w:left="245" w:hanging="173"/>
+      </w:pPr>
+      <w:r>
+        <w:t>LFC108: Cybersecurity Essentials</w:t>
+      </w:r>
+    </w:p>
+    <w:p>
+      <w:pPr>
+        <w:pStyle w:val="ListBullet"/>
+        <w:keepNext w:val="0"/>
+        <w:keepLines/>
+        <w:widowControl/>
+        <w:spacing w:before="0" w:after="60" w:line="252" w:lineRule="exact"/>
+        <w:ind w:left="245" w:hanging="173"/>
+      </w:pPr>
+      <w:r>
+        <w:t>LFEL1004: Authentication and Authorization for Web/API</w:t>
+      </w:r>
+    </w:p>
+    <w:p>
+      <w:pPr>
+        <w:pStyle w:val="ListBullet"/>
+        <w:keepNext w:val="0"/>
+        <w:keepLines/>
+        <w:widowControl/>
+        <w:spacing w:before="0" w:after="60" w:line="252" w:lineRule="exact"/>
+        <w:ind w:left="245" w:hanging="173"/>
+      </w:pPr>
+      <w:r>
+        <w:t>LFEL1008: Migrating AI Workflows Across Platforms</w:t>
+      </w:r>
+    </w:p>
+    <w:p>
+      <w:pPr>
+        <w:pStyle w:val="ListBullet"/>
+        <w:keepNext w:val="0"/>
+        <w:keepLines/>
+        <w:widowControl/>
+        <w:spacing w:before="0" w:after="60" w:line="252" w:lineRule="exact"/>
+        <w:ind w:left="245" w:hanging="173"/>
+      </w:pPr>
+      <w:r>
+        <w:t>LFS147: Introduction to AI/ML Toolkits with Kubeflow</w:t>
       </w:r>
     </w:p>
     <w:p>
@@ -970,7 +1542,7 @@
         <w:spacing w:before="100" w:after="40" w:line="256" w:lineRule="exact"/>
       </w:pPr>
       <w:r>
-        <w:t>Proof Packets: A Derive-Don't-Trust Envelope for Accountable Agent Actions</w:t>
+        <w:t>Additional Advanced and Strategy Coursework</w:t>
       </w:r>
     </w:p>
     <w:p>
@@ -981,7 +1553,29 @@
         <w:spacing w:before="0" w:after="60" w:line="252" w:lineRule="exact"/>
       </w:pPr>
       <w:r>
-        <w:t>Preprint, 2026. doi.org/10.5281/zenodo.21231406</w:t>
+        <w:t>Anthropic Claude Academy: Model Context Protocol: Advanced topics | Completion badge, September 30, 2026</w:t>
+      </w:r>
+    </w:p>
+    <w:p>
+      <w:pPr>
+        <w:keepNext w:val="0"/>
+        <w:keepLines/>
+        <w:widowControl/>
+        <w:spacing w:before="0" w:after="60" w:line="252" w:lineRule="exact"/>
+      </w:pPr>
+      <w:r>
+        <w:t>BlueDot Impact: AGI Strategy | Course completed in 2026</w:t>
+      </w:r>
+    </w:p>
+    <w:p>
+      <w:pPr>
+        <w:keepNext w:val="0"/>
+        <w:keepLines/>
+        <w:widowControl/>
+        <w:spacing w:before="0" w:after="60" w:line="252" w:lineRule="exact"/>
+      </w:pPr>
+      <w:r>
+        <w:t>Developed an AGI Strategy action plan for label-independent AI incident notice, independently reviewable evidence, accountable escalation, and tests for misleading verification results.</w:t>
       </w:r>
     </w:p>
     <w:p>
@@ -993,7 +1587,7 @@
         <w:spacing w:before="100" w:after="40" w:line="256" w:lineRule="exact"/>
       </w:pPr>
       <w:r>
-        <w:t>The Personhood-Gate Handoff</w:t>
+        <w:t>Standards and Frameworks: Training and Research</w:t>
       </w:r>
     </w:p>
     <w:p>
@@ -1004,144 +1598,7 @@
         <w:spacing w:before="0" w:after="60" w:line="252" w:lineRule="exact"/>
       </w:pPr>
       <w:r>
-        <w:t>Research note, 2026. doi.org/10.5281/zenodo.21234475</w:t>
-      </w:r>
-    </w:p>
-    <w:p>
-      <w:pPr>
-        <w:pStyle w:val="Heading2"/>
-        <w:keepNext/>
-        <w:keepLines/>
-        <w:widowControl/>
-        <w:spacing w:before="100" w:after="40" w:line="256" w:lineRule="exact"/>
-      </w:pPr>
-      <w:r>
-        <w:t>Re-Perceived Effects</w:t>
-      </w:r>
-    </w:p>
-    <w:p>
-      <w:pPr>
-        <w:keepNext w:val="0"/>
-        <w:keepLines/>
-        <w:widowControl/>
-        <w:spacing w:before="0" w:after="60" w:line="252" w:lineRule="exact"/>
-      </w:pPr>
-      <w:r>
-        <w:t>Research note, 2026. doi.org/10.5281/zenodo.21231311</w:t>
-      </w:r>
-    </w:p>
-    <w:p>
-      <w:pPr>
-        <w:pStyle w:val="Heading2"/>
-        <w:keepNext/>
-        <w:keepLines/>
-        <w:widowControl/>
-        <w:spacing w:before="100" w:after="40" w:line="256" w:lineRule="exact"/>
-      </w:pPr>
-      <w:r>
-        <w:t>The Witnessing Spine</w:t>
-      </w:r>
-    </w:p>
-    <w:p>
-      <w:pPr>
-        <w:keepNext w:val="0"/>
-        <w:keepLines/>
-        <w:widowControl/>
-        <w:spacing w:before="0" w:after="60" w:line="252" w:lineRule="exact"/>
-      </w:pPr>
-      <w:r>
-        <w:t>Archived research corpus, 2026. doi.org/10.5281/zenodo.20778927</w:t>
-      </w:r>
-    </w:p>
-    <w:p>
-      <w:pPr>
-        <w:pStyle w:val="Heading2"/>
-        <w:keepNext/>
-        <w:keepLines/>
-        <w:widowControl/>
-        <w:spacing w:before="100" w:after="40" w:line="256" w:lineRule="exact"/>
-      </w:pPr>
-      <w:r>
-        <w:t>Conferred Existence</w:t>
-      </w:r>
-    </w:p>
-    <w:p>
-      <w:pPr>
-        <w:keepNext w:val="0"/>
-        <w:keepLines/>
-        <w:widowControl/>
-        <w:spacing w:before="0" w:after="60" w:line="252" w:lineRule="exact"/>
-      </w:pPr>
-      <w:r>
-        <w:t>Long-form philosophical manuscript and archived corpus, 2026. doi.org/10.5281/zenodo.20773724</w:t>
-      </w:r>
-    </w:p>
-    <w:p>
-      <w:pPr>
-        <w:pStyle w:val="Heading1"/>
-        <w:keepNext/>
-        <w:keepLines/>
-        <w:widowControl/>
-        <w:spacing w:before="120" w:after="60" w:line="280" w:lineRule="exact"/>
-      </w:pPr>
-      <w:r>
-        <w:t>Education</w:t>
-      </w:r>
-    </w:p>
-    <w:p>
-      <w:pPr>
-        <w:keepNext w:val="0"/>
-        <w:keepLines/>
-        <w:widowControl/>
-        <w:spacing w:before="0" w:after="60" w:line="252" w:lineRule="exact"/>
-      </w:pPr>
-      <w:r>
-        <w:t>High School Diploma | Wilsonville High School, Wilsonville, Oregon | 2013</w:t>
-      </w:r>
-    </w:p>
-    <w:p>
-      <w:pPr>
-        <w:keepNext w:val="0"/>
-        <w:keepLines/>
-        <w:widowControl/>
-        <w:spacing w:before="0" w:after="60" w:line="252" w:lineRule="exact"/>
-      </w:pPr>
-      <w:r>
-        <w:t>Self-directed study in systems programming, compilers, graphics, color science, AI evaluation, epistemics, and philosophy of mind. Practical arboriculture and plant-science knowledge is grounded in field work, not a separately claimed professional license.</w:t>
-      </w:r>
-    </w:p>
-    <w:p>
-      <w:pPr>
-        <w:pStyle w:val="Heading1"/>
-        <w:keepNext/>
-        <w:keepLines/>
-        <w:widowControl/>
-        <w:spacing w:before="120" w:after="60" w:line="280" w:lineRule="exact"/>
-      </w:pPr>
-      <w:r>
-        <w:t>Research and Portfolio Links</w:t>
-      </w:r>
-    </w:p>
-    <w:p>
-      <w:pPr>
-        <w:keepNext w:val="0"/>
-        <w:keepLines/>
-        <w:widowControl/>
-        <w:spacing w:before="0" w:after="60" w:line="252" w:lineRule="exact"/>
-      </w:pPr>
-      <w:r>
-        <w:t>ORCID: 0009-0001-7175-5393 | orcid.org/0009-0001-7175-5393</w:t>
-      </w:r>
-    </w:p>
-    <w:p>
-      <w:pPr>
-        <w:keepNext w:val="0"/>
-        <w:keepLines/>
-        <w:widowControl/>
-        <w:spacing w:before="0" w:after="60" w:line="252" w:lineRule="exact"/>
-      </w:pPr>
-      <w:r>
-        <w:t>Publications: harperz9.github.io/publications.html | Portfolio: harperz9.github.io/portfolio.html</w:t>
+        <w:t>Completed coursework: MCRA/MCSB, Zero Trust, OWASP Top 10 web security, and EU Cyber Resilience Act; MCP sampling, roots, JSON-RPC, stdio, Streamable HTTP/SSE. Research references: NIST AI RMF/GenAI Profile, ISO/IEC 42001/23894, ISO 37002. Current editions and scope: harperz9.github.io/career/standards-reference.md.</w:t>
       </w:r>
     </w:p>
     <w:sectPr>

</xml_diff>

<commit_message>
Add Qualys Policy Audit certification to career materials
</commit_message>
<xml_diff>
--- a/career/Zain-Dana-Harper-CV.docx
+++ b/career/Zain-Dana-Harper-CV.docx
@@ -1212,7 +1212,18 @@
         <w:spacing w:before="0" w:after="60" w:line="252" w:lineRule="exact"/>
       </w:pPr>
       <w:r>
-        <w:t>Completed September 2026. Credential links, identifiers, and assessment results: harperz9.github.io/career/source-ledger.md.</w:t>
+        <w:t>September 2026 completions. Verification: harperz9.github.io/career/source-ledger.md.</w:t>
+      </w:r>
+    </w:p>
+    <w:p>
+      <w:pPr>
+        <w:keepNext w:val="0"/>
+        <w:keepLines/>
+        <w:widowControl/>
+        <w:spacing w:before="0" w:after="60" w:line="252" w:lineRule="exact"/>
+      </w:pPr>
+      <w:r>
+        <w:t>Qualys Policy Audit certification | Issued 2026-09-30; expires 2028-09-29</w:t>
       </w:r>
     </w:p>
     <w:p>
@@ -1598,7 +1609,7 @@
         <w:spacing w:before="0" w:after="60" w:line="252" w:lineRule="exact"/>
       </w:pPr>
       <w:r>
-        <w:t>Completed coursework: MCRA/MCSB, Zero Trust, OWASP Top 10 web security, and EU Cyber Resilience Act; MCP sampling, roots, JSON-RPC, stdio, Streamable HTTP/SSE. Research references: NIST AI RMF/GenAI Profile, ISO/IEC 42001/23894, ISO 37002. Current editions and scope: harperz9.github.io/career/standards-reference.md.</w:t>
+        <w:t>Assessed Qualys knowledge: policy baselines, authenticated scans, reports, exceptions. Completed coursework: MCRA/MCSB, Zero Trust, OWASP web Top 10, CRA; MCP sampling, roots, JSON-RPC and transports. Research references: NIST AI RMF/GenAI Profile, ISO/IEC 42001/23894, ISO 37002. Editions and scope: harperz9.github.io/career/standards-reference.md.</w:t>
       </w:r>
     </w:p>
     <w:sectPr>

</xml_diff>

<commit_message>
Add CAR certification and verified Qualys Specialist designations
</commit_message>
<xml_diff>
--- a/career/Zain-Dana-Harper-CV.docx
+++ b/career/Zain-Dana-Harper-CV.docx
@@ -1223,7 +1223,7 @@
         <w:spacing w:before="0" w:after="60" w:line="252" w:lineRule="exact"/>
       </w:pPr>
       <w:r>
-        <w:t>Qualys Policy Audit certification | Issued 2026-09-30; expires 2028-09-29</w:t>
+        <w:t>Qualys Certified Specialist: Policy Audit; Custom Assessment and Remediation | Issued 2026-09-30; expire 2028-09-29</w:t>
       </w:r>
     </w:p>
     <w:p>
@@ -1609,7 +1609,7 @@
         <w:spacing w:before="0" w:after="60" w:line="252" w:lineRule="exact"/>
       </w:pPr>
       <w:r>
-        <w:t>Assessed Qualys knowledge: policy baselines, authenticated scans, reports, exceptions. Completed coursework: MCRA/MCSB, Zero Trust, OWASP web Top 10, CRA; MCP sampling, roots, JSON-RPC and transports. Research references: NIST AI RMF/GenAI Profile, ISO/IEC 42001/23894, ISO 37002. Editions and scope: harperz9.github.io/career/standards-reference.md.</w:t>
+        <w:t>Assessed Qualys knowledge: policy baselines, scans, reports, exceptions; script approvals, role separation, scheduled jobs. Completed coursework: MCRA/MCSB, Zero Trust, OWASP web Top 10, CRA; MCP sampling, roots, JSON-RPC and transports. Research references: NIST AI RMF/GenAI Profile, ISO/IEC 42001/23894, ISO 37002. Editions and scope: harperz9.github.io/career/standards-reference.md.</w:t>
       </w:r>
     </w:p>
     <w:sectPr>

</xml_diff>

<commit_message>
Add VMDR certification and Claude Code and API badges
</commit_message>
<xml_diff>
--- a/career/Zain-Dana-Harper-CV.docx
+++ b/career/Zain-Dana-Harper-CV.docx
@@ -1223,7 +1223,7 @@
         <w:spacing w:before="0" w:after="60" w:line="252" w:lineRule="exact"/>
       </w:pPr>
       <w:r>
-        <w:t>Qualys Certified Specialist: Policy Audit; Custom Assessment and Remediation | Issued 2026-09-30; expire 2028-09-29</w:t>
+        <w:t>Qualys Certified Specialist: Policy Audit; Custom Assessment and Remediation; Vulnerability Management Detection and Response | Issued 2026-09-30; expire 2028-09-29</w:t>
       </w:r>
     </w:p>
     <w:p>
@@ -1564,7 +1564,7 @@
         <w:spacing w:before="0" w:after="60" w:line="252" w:lineRule="exact"/>
       </w:pPr>
       <w:r>
-        <w:t>Anthropic Claude Academy: Model Context Protocol: Advanced topics | Completion badge, September 30, 2026</w:t>
+        <w:t>Anthropic Claude Academy completion badges: Model Context Protocol: Advanced topics; Claude Code in action; Building with the Claude API | Issued September 30, 2026</w:t>
       </w:r>
     </w:p>
     <w:p>
@@ -1609,7 +1609,7 @@
         <w:spacing w:before="0" w:after="60" w:line="252" w:lineRule="exact"/>
       </w:pPr>
       <w:r>
-        <w:t>Assessed Qualys knowledge: policy baselines, scans, reports, exceptions; script approvals, role separation, scheduled jobs. Completed coursework: MCRA/MCSB, Zero Trust, OWASP web Top 10, CRA; MCP sampling, roots, JSON-RPC and transports. Research references: NIST AI RMF/GenAI Profile, ISO/IEC 42001/23894, ISO 37002. Editions and scope: harperz9.github.io/career/standards-reference.md.</w:t>
+        <w:t>Assessed knowledge: Qualys policy baselines, scans, reporting, exceptions, script approvals and role separation; Claude API grading, tool use, workflow routing/chaining, and verification hooks. Coursework: MCRA/MCSB, Zero Trust, OWASP web Top 10, CRA. Research references: NIST AI RMF/GenAI Profile, ISO/IEC 42001/23894, ISO 37002. Editions: harperz9.github.io/career/standards-reference.md.</w:t>
       </w:r>
     </w:p>
     <w:sectPr>

</xml_diff>

<commit_message>
Add Qualys Kubernetes and Container Security certification
</commit_message>
<xml_diff>
--- a/career/Zain-Dana-Harper-CV.docx
+++ b/career/Zain-Dana-Harper-CV.docx
@@ -1223,7 +1223,7 @@
         <w:spacing w:before="0" w:after="60" w:line="252" w:lineRule="exact"/>
       </w:pPr>
       <w:r>
-        <w:t>Qualys Certified Specialist: Policy Audit; Custom Assessment and Remediation; Vulnerability Management Detection and Response | Issued 2026-09-30; expire 2028-09-29</w:t>
+        <w:t>Qualys Certified Specialist: Policy Audit; Custom Assessment and Remediation; Vulnerability Management Detection and Response; Qualys Kubernetes and Container Security | Issued 2026-09-30; expire 2028-09-29</w:t>
       </w:r>
     </w:p>
     <w:p>
@@ -1609,7 +1609,7 @@
         <w:spacing w:before="0" w:after="60" w:line="252" w:lineRule="exact"/>
       </w:pPr>
       <w:r>
-        <w:t>Assessed knowledge: Qualys policy baselines, scans, reporting, exceptions, script approvals and role separation; Claude API grading, tool use, workflow routing/chaining, and verification hooks. Coursework: MCRA/MCSB, Zero Trust, OWASP web Top 10, CRA. Research references: NIST AI RMF/GenAI Profile, ISO/IEC 42001/23894, ISO 37002. Editions: harperz9.github.io/career/standards-reference.md.</w:t>
+        <w:t>Assessed knowledge: Qualys policy baselines, scans, reporting, exceptions, script approvals, role separation, container scanning and CI/CD gates; Claude API grading, tool use, workflow routing/chaining, and verification hooks. Coursework: MCRA/MCSB, Zero Trust, OWASP web Top 10, CRA. Research references: NIST AI RMF/GenAI Profile, ISO/IEC 42001/23894, ISO 37002. Editions: harperz9.github.io/career/standards-reference.md.</w:t>
       </w:r>
     </w:p>
     <w:sectPr>

</xml_diff>

<commit_message>
Add Google DeepMind advanced language-model skill badge
</commit_message>
<xml_diff>
--- a/career/Zain-Dana-Harper-CV.docx
+++ b/career/Zain-Dana-Harper-CV.docx
@@ -1554,6 +1554,17 @@
       </w:pPr>
       <w:r>
         <w:t>Additional Advanced and Strategy Coursework</w:t>
+      </w:r>
+    </w:p>
+    <w:p>
+      <w:pPr>
+        <w:keepNext w:val="0"/>
+        <w:keepLines/>
+        <w:widowControl/>
+        <w:spacing w:before="0" w:after="60" w:line="252" w:lineRule="exact"/>
+      </w:pPr>
+      <w:r>
+        <w:t>Google DeepMind: Train A Small Language Model | Advanced assessed skill badge, 2026-09-30; 100/100, four coding checkpoints. Tokenization, n-gram generation, segmentation, and padded training data.</w:t>
       </w:r>
     </w:p>
     <w:p>

</xml_diff>

<commit_message>
Add UNESCO AI ethics course certificate and assessed governance skills
</commit_message>
<xml_diff>
--- a/career/Zain-Dana-Harper-CV.docx
+++ b/career/Zain-Dana-Harper-CV.docx
@@ -1553,7 +1553,7 @@
         <w:spacing w:before="100" w:after="40" w:line="256" w:lineRule="exact"/>
       </w:pPr>
       <w:r>
-        <w:t>Additional Advanced and Strategy Coursework</w:t>
+        <w:t>Additional Coursework and Skill Badges</w:t>
       </w:r>
     </w:p>
     <w:p>
@@ -1576,6 +1576,17 @@
       </w:pPr>
       <w:r>
         <w:t>Anthropic Claude Academy completion badges: Model Context Protocol: Advanced topics; Claude Code in action; Building with the Claude API | Issued September 30, 2026</w:t>
+      </w:r>
+    </w:p>
+    <w:p>
+      <w:pPr>
+        <w:keepNext w:val="0"/>
+        <w:keepLines/>
+        <w:widowControl/>
+        <w:spacing w:before="0" w:after="60" w:line="252" w:lineRule="exact"/>
+      </w:pPr>
+      <w:r>
+        <w:t>UNESCO: Global MOOC on the Ethics of AI | Intermediate course certificate, 2026-09-30; 100%. Assessed human rights, fairness, risk controls, incident reporting, and sustainability.</w:t>
       </w:r>
     </w:p>
     <w:p>

</xml_diff>

<commit_message>
Add bounded Google multi-agent badge and Cisco learning credential
</commit_message>
<xml_diff>
--- a/career/Zain-Dana-Harper-CV.docx
+++ b/career/Zain-Dana-Harper-CV.docx
@@ -1564,7 +1564,29 @@
         <w:spacing w:before="0" w:after="60" w:line="252" w:lineRule="exact"/>
       </w:pPr>
       <w:r>
+        <w:t>Cisco Networking Academy: Ethical Hacker | Intermediate course certificate and learning badge, 2026-09-30; 100% knowledge exam. Assessed scoping, reporting, vulnerability assessment, and security concepts.</w:t>
+      </w:r>
+    </w:p>
+    <w:p>
+      <w:pPr>
+        <w:keepNext w:val="0"/>
+        <w:keepLines/>
+        <w:widowControl/>
+        <w:spacing w:before="0" w:after="60" w:line="252" w:lineRule="exact"/>
+      </w:pPr>
+      <w:r>
         <w:t>Google DeepMind: Train A Small Language Model | Advanced assessed skill badge, 2026-09-30; 100/100, four coding checkpoints. Tokenization, n-gram generation, segmentation, and padded training data.</w:t>
+      </w:r>
+    </w:p>
+    <w:p>
+      <w:pPr>
+        <w:keepNext w:val="0"/>
+        <w:keepLines/>
+        <w:widowControl/>
+        <w:spacing w:before="0" w:after="60" w:line="252" w:lineRule="exact"/>
+      </w:pPr>
+      <w:r>
+        <w:t>Google Cloud: Use Agent Skills with Multi-Agent Systems | Skill badge, 2026-09-30; 100/100, six checkpoints. Intermediate course; Advanced challenge. Five lab Cloud Run services deployed; model-access policy blocked local and cloud generation.</w:t>
       </w:r>
     </w:p>
     <w:p>

</xml_diff>

<commit_message>
Add Azure DevOps Applied Skills and Google evaluation coursework
</commit_message>
<xml_diff>
--- a/career/Zain-Dana-Harper-CV.docx
+++ b/career/Zain-Dana-Harper-CV.docx
@@ -1235,7 +1235,7 @@
         <w:spacing w:before="100" w:after="40" w:line="256" w:lineRule="exact"/>
       </w:pPr>
       <w:r>
-        <w:t>Microsoft Applied Skills | Earned September 29, 2026</w:t>
+        <w:t>Microsoft Applied Skills | Earned September 2026</w:t>
       </w:r>
     </w:p>
     <w:p>
@@ -1279,52 +1279,6 @@
     </w:p>
     <w:p>
       <w:pPr>
-        <w:pStyle w:val="Heading2"/>
-        <w:keepNext/>
-        <w:keepLines/>
-        <w:widowControl/>
-        <w:spacing w:before="100" w:after="40" w:line="256" w:lineRule="exact"/>
-      </w:pPr>
-      <w:r>
-        <w:t>Advanced Microsoft Learn Coursework</w:t>
-      </w:r>
-    </w:p>
-    <w:p>
-      <w:pPr>
-        <w:keepNext w:val="0"/>
-        <w:keepLines/>
-        <w:widowControl/>
-        <w:spacing w:before="0" w:after="60" w:line="252" w:lineRule="exact"/>
-      </w:pPr>
-      <w:r>
-        <w:t>SC-100: Design security solutions for applications and data. Completed four module assessments and the architecture case study.</w:t>
-      </w:r>
-    </w:p>
-    <w:p>
-      <w:pPr>
-        <w:keepNext w:val="0"/>
-        <w:keepLines/>
-        <w:widowControl/>
-        <w:spacing w:before="0" w:after="60" w:line="252" w:lineRule="exact"/>
-      </w:pPr>
-      <w:r>
-        <w:t>Design solutions that align with MCRA and MCSB. Advanced Microsoft Learn module completed September 30, 2026: security architecture, Zero Trust, insider and supply-chain risk, and AI security controls.</w:t>
-      </w:r>
-    </w:p>
-    <w:p>
-      <w:pPr>
-        <w:pStyle w:val="Heading2"/>
-        <w:keepNext/>
-        <w:keepLines/>
-        <w:widowControl/>
-        <w:spacing w:before="100" w:after="40" w:line="256" w:lineRule="exact"/>
-      </w:pPr>
-      <w:r>
-        <w:t>Linux Foundation Course-Completion Certificates</w:t>
-      </w:r>
-    </w:p>
-    <w:p>
-      <w:pPr>
         <w:pStyle w:val="ListBullet"/>
         <w:keepNext w:val="0"/>
         <w:keepLines/>
@@ -1333,7 +1287,53 @@
         <w:ind w:left="245" w:hanging="173"/>
       </w:pPr>
       <w:r>
-        <w:t>LFEL1012: Secure AI/ML-Driven Software Development</w:t>
+        <w:t>Implement security through a pipeline using Azure DevOps | Intermediate; 95% assessment</w:t>
+      </w:r>
+    </w:p>
+    <w:p>
+      <w:pPr>
+        <w:pStyle w:val="Heading2"/>
+        <w:keepNext/>
+        <w:keepLines/>
+        <w:widowControl/>
+        <w:spacing w:before="100" w:after="40" w:line="256" w:lineRule="exact"/>
+      </w:pPr>
+      <w:r>
+        <w:t>Advanced Microsoft Learn Coursework</w:t>
+      </w:r>
+    </w:p>
+    <w:p>
+      <w:pPr>
+        <w:keepNext w:val="0"/>
+        <w:keepLines/>
+        <w:widowControl/>
+        <w:spacing w:before="0" w:after="60" w:line="252" w:lineRule="exact"/>
+      </w:pPr>
+      <w:r>
+        <w:t>SC-100: Design security solutions for applications and data. Completed four module assessments and the architecture case study.</w:t>
+      </w:r>
+    </w:p>
+    <w:p>
+      <w:pPr>
+        <w:keepNext w:val="0"/>
+        <w:keepLines/>
+        <w:widowControl/>
+        <w:spacing w:before="0" w:after="60" w:line="252" w:lineRule="exact"/>
+      </w:pPr>
+      <w:r>
+        <w:t>Design solutions that align with MCRA and MCSB. Advanced Microsoft Learn module completed September 30, 2026: security architecture, Zero Trust, insider and supply-chain risk, and AI security controls.</w:t>
+      </w:r>
+    </w:p>
+    <w:p>
+      <w:pPr>
+        <w:pStyle w:val="Heading2"/>
+        <w:keepNext/>
+        <w:keepLines/>
+        <w:widowControl/>
+        <w:spacing w:before="100" w:after="40" w:line="256" w:lineRule="exact"/>
+      </w:pPr>
+      <w:r>
+        <w:t>Linux Foundation Course-Completion Certificates</w:t>
       </w:r>
     </w:p>
     <w:p>
@@ -1346,7 +1346,7 @@
         <w:ind w:left="245" w:hanging="173"/>
       </w:pPr>
       <w:r>
-        <w:t>LFS120: Conversational AI: Ensuring Compliance and Mitigating Risks</w:t>
+        <w:t>LFEL1012: Secure AI/ML-Driven Software Development</w:t>
       </w:r>
     </w:p>
     <w:p>
@@ -1359,7 +1359,7 @@
         <w:ind w:left="245" w:hanging="173"/>
       </w:pPr>
       <w:r>
-        <w:t>LFD121: Developing Secure Software</w:t>
+        <w:t>LFS120: Conversational AI: Ensuring Compliance and Mitigating Risks</w:t>
       </w:r>
     </w:p>
     <w:p>
@@ -1372,7 +1372,7 @@
         <w:ind w:left="245" w:hanging="173"/>
       </w:pPr>
       <w:r>
-        <w:t>LFS182: Securing Your Software Supply Chain with Sigstore</w:t>
+        <w:t>LFD121: Developing Secure Software</w:t>
       </w:r>
     </w:p>
     <w:p>
@@ -1385,7 +1385,7 @@
         <w:ind w:left="245" w:hanging="173"/>
       </w:pPr>
       <w:r>
-        <w:t>LFEL1001: Understanding the EU Cyber Resilience Act (CRA)</w:t>
+        <w:t>LFS182: Securing Your Software Supply Chain with Sigstore</w:t>
       </w:r>
     </w:p>
     <w:p>
@@ -1398,7 +1398,7 @@
         <w:ind w:left="245" w:hanging="173"/>
       </w:pPr>
       <w:r>
-        <w:t>LFS118: Ethical Principles for Conversational AI</w:t>
+        <w:t>LFEL1001: Understanding the EU Cyber Resilience Act (CRA)</w:t>
       </w:r>
     </w:p>
     <w:p>
@@ -1411,7 +1411,7 @@
         <w:ind w:left="245" w:hanging="173"/>
       </w:pPr>
       <w:r>
-        <w:t>LFEL1006: Securing Projects with OpenSSF Scorecard</w:t>
+        <w:t>LFS118: Ethical Principles for Conversational AI</w:t>
       </w:r>
     </w:p>
     <w:p>
@@ -1424,7 +1424,7 @@
         <w:ind w:left="245" w:hanging="173"/>
       </w:pPr>
       <w:r>
-        <w:t>LFEL1005: Security Self-Assessments for Open Source Projects</w:t>
+        <w:t>LFEL1006: Securing Projects with OpenSSF Scorecard</w:t>
       </w:r>
     </w:p>
     <w:p>
@@ -1437,7 +1437,7 @@
         <w:ind w:left="245" w:hanging="173"/>
       </w:pPr>
       <w:r>
-        <w:t>LFEL1007: Automating Supply Chain Security: SBOMs and Signatures</w:t>
+        <w:t>LFEL1005: Security Self-Assessments for Open Source Projects</w:t>
       </w:r>
     </w:p>
     <w:p>
@@ -1450,7 +1450,7 @@
         <w:ind w:left="245" w:hanging="173"/>
       </w:pPr>
       <w:r>
-        <w:t>LFD125: Security for Software Development Managers</w:t>
+        <w:t>LFEL1007: Automating Supply Chain Security: SBOMs and Signatures</w:t>
       </w:r>
     </w:p>
     <w:p>
@@ -1463,7 +1463,7 @@
         <w:ind w:left="245" w:hanging="173"/>
       </w:pPr>
       <w:r>
-        <w:t>LFS180: Introduction to DevSecOps for Managers</w:t>
+        <w:t>LFD125: Security for Software Development Managers</w:t>
       </w:r>
     </w:p>
     <w:p>
@@ -1476,7 +1476,7 @@
         <w:ind w:left="245" w:hanging="173"/>
       </w:pPr>
       <w:r>
-        <w:t>SKF100: OWASP Top 10 Security Threats</w:t>
+        <w:t>LFS180: Introduction to DevSecOps for Managers</w:t>
       </w:r>
     </w:p>
     <w:p>
@@ -1489,7 +1489,7 @@
         <w:ind w:left="245" w:hanging="173"/>
       </w:pPr>
       <w:r>
-        <w:t>LFS184: Introduction to JavaScript Security</w:t>
+        <w:t>SKF100: OWASP Top 10 Security Threats</w:t>
       </w:r>
     </w:p>
     <w:p>
@@ -1502,7 +1502,7 @@
         <w:ind w:left="245" w:hanging="173"/>
       </w:pPr>
       <w:r>
-        <w:t>LFC108: Cybersecurity Essentials</w:t>
+        <w:t>LFS184: Introduction to JavaScript Security</w:t>
       </w:r>
     </w:p>
     <w:p>
@@ -1515,7 +1515,7 @@
         <w:ind w:left="245" w:hanging="173"/>
       </w:pPr>
       <w:r>
-        <w:t>LFEL1004: Authentication and Authorization for Web/API</w:t>
+        <w:t>LFC108: Cybersecurity Essentials</w:t>
       </w:r>
     </w:p>
     <w:p>
@@ -1528,7 +1528,7 @@
         <w:ind w:left="245" w:hanging="173"/>
       </w:pPr>
       <w:r>
-        <w:t>LFEL1008: Migrating AI Workflows Across Platforms</w:t>
+        <w:t>LFEL1004: Authentication and Authorization for Web/API</w:t>
       </w:r>
     </w:p>
     <w:p>
@@ -1541,6 +1541,19 @@
         <w:ind w:left="245" w:hanging="173"/>
       </w:pPr>
       <w:r>
+        <w:t>LFEL1008: Migrating AI Workflows Across Platforms</w:t>
+      </w:r>
+    </w:p>
+    <w:p>
+      <w:pPr>
+        <w:pStyle w:val="ListBullet"/>
+        <w:keepNext w:val="0"/>
+        <w:keepLines/>
+        <w:widowControl/>
+        <w:spacing w:before="0" w:after="60" w:line="252" w:lineRule="exact"/>
+        <w:ind w:left="245" w:hanging="173"/>
+      </w:pPr>
+      <w:r>
         <w:t>LFS147: Introduction to AI/ML Toolkits with Kubeflow</w:t>
       </w:r>
     </w:p>
@@ -1597,6 +1610,17 @@
         <w:spacing w:before="0" w:after="60" w:line="252" w:lineRule="exact"/>
       </w:pPr>
       <w:r>
+        <w:t>Google Skills: Machine Learning Operations (MLOps) with Agent Platform: Model Evaluation | Intermediate course-completion badge, 2026-09-30. Predictive/generative evaluation methods.</w:t>
+      </w:r>
+    </w:p>
+    <w:p>
+      <w:pPr>
+        <w:keepNext w:val="0"/>
+        <w:keepLines/>
+        <w:widowControl/>
+        <w:spacing w:before="0" w:after="60" w:line="252" w:lineRule="exact"/>
+      </w:pPr>
+      <w:r>
         <w:t>Anthropic Claude Academy completion badges: Model Context Protocol: Advanced topics; Claude Code in action; Building with the Claude API | Issued September 30, 2026</w:t>
       </w:r>
     </w:p>
@@ -1635,25 +1659,13 @@
     </w:p>
     <w:p>
       <w:pPr>
-        <w:pStyle w:val="Heading2"/>
-        <w:keepNext/>
-        <w:keepLines/>
-        <w:widowControl/>
-        <w:spacing w:before="100" w:after="40" w:line="256" w:lineRule="exact"/>
-      </w:pPr>
-      <w:r>
-        <w:t>Standards and Frameworks: Training and Research</w:t>
-      </w:r>
-    </w:p>
-    <w:p>
-      <w:pPr>
         <w:keepNext w:val="0"/>
         <w:keepLines/>
         <w:widowControl/>
         <w:spacing w:before="0" w:after="60" w:line="252" w:lineRule="exact"/>
       </w:pPr>
       <w:r>
-        <w:t>Assessed knowledge: Qualys compliance, cloud/container security, vulnerability prioritization, EDR investigation/response, and script approvals; Claude API grading, tool use, workflows and verification hooks. Coursework: MCRA/MCSB, Zero Trust, OWASP web Top 10, CRA. Research references: NIST AI RMF/GenAI Profile, ISO/IEC 42001/23894, ISO 37002. Editions: harperz9.github.io/career/standards-reference.md.</w:t>
+        <w:t>Coursework: MCRA/MCSB, Zero Trust, OWASP web Top 10, CRA. Research references: NIST AI RMF/GenAI Profile, ISO/IEC 42001/23894, ISO 37002. Scope: harperz9.github.io/career/standards-reference.md.</w:t>
       </w:r>
     </w:p>
     <w:sectPr>

</xml_diff>

<commit_message>
Add Bedrock coursework and BigQuery predictive skill badge
</commit_message>
<xml_diff>
--- a/career/Zain-Dana-Harper-CV.docx
+++ b/career/Zain-Dana-Harper-CV.docx
@@ -1212,7 +1212,7 @@
         <w:spacing w:before="0" w:after="60" w:line="252" w:lineRule="exact"/>
       </w:pPr>
       <w:r>
-        <w:t>September 2026 completions. Verification: harperz9.github.io/career/source-ledger.md.</w:t>
+        <w:t>2026 completions. Verification: harperz9.github.io/career/source-ledger.md.</w:t>
       </w:r>
     </w:p>
     <w:p>
@@ -1338,223 +1338,68 @@
     </w:p>
     <w:p>
       <w:pPr>
-        <w:pStyle w:val="ListBullet"/>
         <w:keepNext w:val="0"/>
         <w:keepLines/>
         <w:widowControl/>
         <w:spacing w:before="0" w:after="60" w:line="252" w:lineRule="exact"/>
-        <w:ind w:left="245" w:hanging="173"/>
       </w:pPr>
       <w:r>
-        <w:t>LFEL1012: Secure AI/ML-Driven Software Development</w:t>
+        <w:t>LFEL1012: Secure AI/ML-Driven Software Development; LFS120: Conversational AI: Ensuring Compliance and Mitigating Risks; LFD121: Developing Secure Software</w:t>
       </w:r>
     </w:p>
     <w:p>
       <w:pPr>
-        <w:pStyle w:val="ListBullet"/>
         <w:keepNext w:val="0"/>
         <w:keepLines/>
         <w:widowControl/>
         <w:spacing w:before="0" w:after="60" w:line="252" w:lineRule="exact"/>
-        <w:ind w:left="245" w:hanging="173"/>
       </w:pPr>
       <w:r>
-        <w:t>LFS120: Conversational AI: Ensuring Compliance and Mitigating Risks</w:t>
+        <w:t>LFS182: Securing Your Software Supply Chain with Sigstore; LFEL1001: Understanding the EU Cyber Resilience Act (CRA); LFS118: Ethical Principles for Conversational AI</w:t>
       </w:r>
     </w:p>
     <w:p>
       <w:pPr>
-        <w:pStyle w:val="ListBullet"/>
         <w:keepNext w:val="0"/>
         <w:keepLines/>
         <w:widowControl/>
         <w:spacing w:before="0" w:after="60" w:line="252" w:lineRule="exact"/>
-        <w:ind w:left="245" w:hanging="173"/>
       </w:pPr>
       <w:r>
-        <w:t>LFD121: Developing Secure Software</w:t>
+        <w:t>LFEL1006: Securing Projects with OpenSSF Scorecard; LFEL1005: Security Self-Assessments for Open Source Projects; LFEL1007: Automating Supply Chain Security: SBOMs and Signatures</w:t>
       </w:r>
     </w:p>
     <w:p>
       <w:pPr>
-        <w:pStyle w:val="ListBullet"/>
         <w:keepNext w:val="0"/>
         <w:keepLines/>
         <w:widowControl/>
         <w:spacing w:before="0" w:after="60" w:line="252" w:lineRule="exact"/>
-        <w:ind w:left="245" w:hanging="173"/>
       </w:pPr>
       <w:r>
-        <w:t>LFS182: Securing Your Software Supply Chain with Sigstore</w:t>
+        <w:t>LFD125: Security for Software Development Managers; LFS180: Introduction to DevSecOps for Managers; SKF100: OWASP Top 10 Security Threats</w:t>
       </w:r>
     </w:p>
     <w:p>
       <w:pPr>
-        <w:pStyle w:val="ListBullet"/>
         <w:keepNext w:val="0"/>
         <w:keepLines/>
         <w:widowControl/>
         <w:spacing w:before="0" w:after="60" w:line="252" w:lineRule="exact"/>
-        <w:ind w:left="245" w:hanging="173"/>
       </w:pPr>
       <w:r>
-        <w:t>LFEL1001: Understanding the EU Cyber Resilience Act (CRA)</w:t>
+        <w:t>LFS184: Introduction to JavaScript Security; LFC108: Cybersecurity Essentials; LFEL1004: Authentication and Authorization for Web/API</w:t>
       </w:r>
     </w:p>
     <w:p>
       <w:pPr>
-        <w:pStyle w:val="ListBullet"/>
         <w:keepNext w:val="0"/>
         <w:keepLines/>
         <w:widowControl/>
         <w:spacing w:before="0" w:after="60" w:line="252" w:lineRule="exact"/>
-        <w:ind w:left="245" w:hanging="173"/>
       </w:pPr>
       <w:r>
-        <w:t>LFS118: Ethical Principles for Conversational AI</w:t>
-      </w:r>
-    </w:p>
-    <w:p>
-      <w:pPr>
-        <w:pStyle w:val="ListBullet"/>
-        <w:keepNext w:val="0"/>
-        <w:keepLines/>
-        <w:widowControl/>
-        <w:spacing w:before="0" w:after="60" w:line="252" w:lineRule="exact"/>
-        <w:ind w:left="245" w:hanging="173"/>
-      </w:pPr>
-      <w:r>
-        <w:t>LFEL1006: Securing Projects with OpenSSF Scorecard</w:t>
-      </w:r>
-    </w:p>
-    <w:p>
-      <w:pPr>
-        <w:pStyle w:val="ListBullet"/>
-        <w:keepNext w:val="0"/>
-        <w:keepLines/>
-        <w:widowControl/>
-        <w:spacing w:before="0" w:after="60" w:line="252" w:lineRule="exact"/>
-        <w:ind w:left="245" w:hanging="173"/>
-      </w:pPr>
-      <w:r>
-        <w:t>LFEL1005: Security Self-Assessments for Open Source Projects</w:t>
-      </w:r>
-    </w:p>
-    <w:p>
-      <w:pPr>
-        <w:pStyle w:val="ListBullet"/>
-        <w:keepNext w:val="0"/>
-        <w:keepLines/>
-        <w:widowControl/>
-        <w:spacing w:before="0" w:after="60" w:line="252" w:lineRule="exact"/>
-        <w:ind w:left="245" w:hanging="173"/>
-      </w:pPr>
-      <w:r>
-        <w:t>LFEL1007: Automating Supply Chain Security: SBOMs and Signatures</w:t>
-      </w:r>
-    </w:p>
-    <w:p>
-      <w:pPr>
-        <w:pStyle w:val="ListBullet"/>
-        <w:keepNext w:val="0"/>
-        <w:keepLines/>
-        <w:widowControl/>
-        <w:spacing w:before="0" w:after="60" w:line="252" w:lineRule="exact"/>
-        <w:ind w:left="245" w:hanging="173"/>
-      </w:pPr>
-      <w:r>
-        <w:t>LFD125: Security for Software Development Managers</w:t>
-      </w:r>
-    </w:p>
-    <w:p>
-      <w:pPr>
-        <w:pStyle w:val="ListBullet"/>
-        <w:keepNext w:val="0"/>
-        <w:keepLines/>
-        <w:widowControl/>
-        <w:spacing w:before="0" w:after="60" w:line="252" w:lineRule="exact"/>
-        <w:ind w:left="245" w:hanging="173"/>
-      </w:pPr>
-      <w:r>
-        <w:t>LFS180: Introduction to DevSecOps for Managers</w:t>
-      </w:r>
-    </w:p>
-    <w:p>
-      <w:pPr>
-        <w:pStyle w:val="ListBullet"/>
-        <w:keepNext w:val="0"/>
-        <w:keepLines/>
-        <w:widowControl/>
-        <w:spacing w:before="0" w:after="60" w:line="252" w:lineRule="exact"/>
-        <w:ind w:left="245" w:hanging="173"/>
-      </w:pPr>
-      <w:r>
-        <w:t>SKF100: OWASP Top 10 Security Threats</w:t>
-      </w:r>
-    </w:p>
-    <w:p>
-      <w:pPr>
-        <w:pStyle w:val="ListBullet"/>
-        <w:keepNext w:val="0"/>
-        <w:keepLines/>
-        <w:widowControl/>
-        <w:spacing w:before="0" w:after="60" w:line="252" w:lineRule="exact"/>
-        <w:ind w:left="245" w:hanging="173"/>
-      </w:pPr>
-      <w:r>
-        <w:t>LFS184: Introduction to JavaScript Security</w:t>
-      </w:r>
-    </w:p>
-    <w:p>
-      <w:pPr>
-        <w:pStyle w:val="ListBullet"/>
-        <w:keepNext w:val="0"/>
-        <w:keepLines/>
-        <w:widowControl/>
-        <w:spacing w:before="0" w:after="60" w:line="252" w:lineRule="exact"/>
-        <w:ind w:left="245" w:hanging="173"/>
-      </w:pPr>
-      <w:r>
-        <w:t>LFC108: Cybersecurity Essentials</w:t>
-      </w:r>
-    </w:p>
-    <w:p>
-      <w:pPr>
-        <w:pStyle w:val="ListBullet"/>
-        <w:keepNext w:val="0"/>
-        <w:keepLines/>
-        <w:widowControl/>
-        <w:spacing w:before="0" w:after="60" w:line="252" w:lineRule="exact"/>
-        <w:ind w:left="245" w:hanging="173"/>
-      </w:pPr>
-      <w:r>
-        <w:t>LFEL1004: Authentication and Authorization for Web/API</w:t>
-      </w:r>
-    </w:p>
-    <w:p>
-      <w:pPr>
-        <w:pStyle w:val="ListBullet"/>
-        <w:keepNext w:val="0"/>
-        <w:keepLines/>
-        <w:widowControl/>
-        <w:spacing w:before="0" w:after="60" w:line="252" w:lineRule="exact"/>
-        <w:ind w:left="245" w:hanging="173"/>
-      </w:pPr>
-      <w:r>
-        <w:t>LFEL1008: Migrating AI Workflows Across Platforms</w:t>
-      </w:r>
-    </w:p>
-    <w:p>
-      <w:pPr>
-        <w:pStyle w:val="ListBullet"/>
-        <w:keepNext w:val="0"/>
-        <w:keepLines/>
-        <w:widowControl/>
-        <w:spacing w:before="0" w:after="60" w:line="252" w:lineRule="exact"/>
-        <w:ind w:left="245" w:hanging="173"/>
-      </w:pPr>
-      <w:r>
-        <w:t>LFS147: Introduction to AI/ML Toolkits with Kubeflow</w:t>
+        <w:t>LFEL1008: Migrating AI Workflows Across Platforms; LFS147: Introduction to AI/ML Toolkits with Kubeflow</w:t>
       </w:r>
     </w:p>
     <w:p>
@@ -1610,6 +1455,17 @@
         <w:spacing w:before="0" w:after="60" w:line="252" w:lineRule="exact"/>
       </w:pPr>
       <w:r>
+        <w:t>Google: Perform Predictive Data Analysis in BigQuery | Skill badge, issued 2026-10-01; 100/100, seven checkpoints. Intermediate course/Advanced challenge. Lab work: SQL ingestion, feature UDFs, logistic regression, held-out predictions.</w:t>
+      </w:r>
+    </w:p>
+    <w:p>
+      <w:pPr>
+        <w:keepNext w:val="0"/>
+        <w:keepLines/>
+        <w:widowControl/>
+        <w:spacing w:before="0" w:after="60" w:line="252" w:lineRule="exact"/>
+      </w:pPr>
+      <w:r>
         <w:t>Google Skills: Machine Learning Operations (MLOps) with Agent Platform: Model Evaluation | Intermediate course-completion badge, 2026-09-30. Predictive/generative evaluation methods.</w:t>
       </w:r>
     </w:p>
@@ -1621,7 +1477,7 @@
         <w:spacing w:before="0" w:after="60" w:line="252" w:lineRule="exact"/>
       </w:pPr>
       <w:r>
-        <w:t>Anthropic Claude Academy completion badges: Model Context Protocol: Advanced topics; Claude Code in action; Building with the Claude API | Issued September 30, 2026</w:t>
+        <w:t>Anthropic Claude Academy completion badges: Model Context Protocol: Advanced topics; Claude Code in action; Building with the Claude API; Claude with Amazon Bedrock | Issued September 30, 2026</w:t>
       </w:r>
     </w:p>
     <w:p>

</xml_diff>

<commit_message>
Add Advanced Google Security Operations course badge
</commit_message>
<xml_diff>
--- a/career/Zain-Dana-Harper-CV.docx
+++ b/career/Zain-Dana-Harper-CV.docx
@@ -1433,18 +1433,7 @@
         <w:spacing w:before="0" w:after="60" w:line="252" w:lineRule="exact"/>
       </w:pPr>
       <w:r>
-        <w:t>Google DeepMind: Train A Small Language Model | Advanced assessed skill badge, 2026-09-30; 100/100, four coding checkpoints. Tokenization, n-gram generation, segmentation, and padded training data.</w:t>
-      </w:r>
-    </w:p>
-    <w:p>
-      <w:pPr>
-        <w:keepNext w:val="0"/>
-        <w:keepLines/>
-        <w:widowControl/>
-        <w:spacing w:before="0" w:after="60" w:line="252" w:lineRule="exact"/>
-      </w:pPr>
-      <w:r>
-        <w:t>Google Cloud: Use Agent Skills with Multi-Agent Systems | Skill badge, 2026-09-30; 100/100, six checkpoints. Intermediate course; Advanced challenge. Five lab Cloud Run services deployed; model-access policy blocked local and cloud generation.</w:t>
+        <w:t>Google skill badges, completed 2026-09-30: Google DeepMind: Train A Small Language Model (Advanced; 100/100, four coding checkpoints); Use Agent Skills with Multi-Agent Systems (Intermediate course/Advanced challenge; 100/100, six checkpoints). Scope: tokenization, n-grams, data preparation, and agent orchestration. Multi-agent lab: five Cloud Run services deployed; model-access policy blocked local and cloud generation.</w:t>
       </w:r>
     </w:p>
     <w:p>
@@ -1466,7 +1455,7 @@
         <w:spacing w:before="0" w:after="60" w:line="252" w:lineRule="exact"/>
       </w:pPr>
       <w:r>
-        <w:t>Google Skills: Machine Learning Operations (MLOps) with Agent Platform: Model Evaluation | Intermediate course-completion badge, 2026-09-30. Predictive/generative evaluation methods.</w:t>
+        <w:t>Google course-completion badges, completed 2026-09-30: Machine Learning Operations (MLOps) with Agent Platform: Model Evaluation (Intermediate); Google Security Operations - Deep Dive (Advanced; 96% knowledge assessment). Topics: model-evaluation methods, YARA-L, SIEM processing/enrichment, and SOAR.</w:t>
       </w:r>
     </w:p>
     <w:p>

</xml_diff>

<commit_message>
Clarify self-directed programming and separate employment history
</commit_message>
<xml_diff>
--- a/career/Zain-Dana-Harper-CV.docx
+++ b/career/Zain-Dana-Harper-CV.docx
@@ -71,7 +71,7 @@
         <w:spacing w:before="0" w:after="60" w:line="252" w:lineRule="exact"/>
       </w:pPr>
       <w:r>
-        <w:t>Independent systems engineer and technical writer building AI workstations, evaluation and accountability tools, language tooling, and graphics systems. Combines self-directed programming with technical networking support and eleven years of full-time arboriculture and customer-facing operations.</w:t>
+        <w:t>Self-directed software builder and technical writer with about 13 years of personal programming. Builds AI workstations, evaluation tools, language tooling, and graphics systems. Began a career transition in June 2026 after eleven years of full-time production arboriculture; no professional programming experience.</w:t>
       </w:r>
     </w:p>
     <w:p>
@@ -82,7 +82,7 @@
         <w:spacing w:before="0" w:after="60" w:line="252" w:lineRule="exact"/>
       </w:pPr>
       <w:r>
-        <w:t>Open to technical and nontechnical AI governance and evaluation roles. Available for regular travel to San Francisco and London.</w:t>
+        <w:t>Open to technical and nontechnical AI governance and evaluation roles. Willing to relocate to London; available for regular travel to San Francisco.</w:t>
       </w:r>
     </w:p>
     <w:p>
@@ -94,19 +94,7 @@
         <w:spacing w:before="120" w:after="60" w:line="280" w:lineRule="exact"/>
       </w:pPr>
       <w:r>
-        <w:t>Professional Experience</w:t>
-      </w:r>
-    </w:p>
-    <w:p>
-      <w:pPr>
-        <w:pStyle w:val="Heading2"/>
-        <w:keepNext/>
-        <w:keepLines/>
-        <w:widowControl/>
-        <w:spacing w:before="100" w:after="40" w:line="256" w:lineRule="exact"/>
-      </w:pPr>
-      <w:r>
-        <w:t>Independent Systems Engineer | Independent practice</w:t>
+        <w:t>Self-Directed Projects</w:t>
       </w:r>
     </w:p>
     <w:p>
@@ -120,7 +108,7 @@
         <w:rPr>
           <w:sz w:val="21"/>
         </w:rPr>
-        <w:t>Kent / remote | 2023 to Present</w:t>
+        <w:t>About 13 years of self-directed programming | Career transition began June 2026</w:t>
       </w:r>
     </w:p>
     <w:p>
@@ -134,7 +122,7 @@
         <w:rPr>
           <w:sz w:val="21"/>
         </w:rPr>
-        <w:t>Sole proprietor since September 2026</w:t>
+        <w:t>Sole proprietor since September 2026; no paid software clients</w:t>
       </w:r>
     </w:p>
     <w:p>
@@ -217,6 +205,18 @@
     </w:p>
     <w:p>
       <w:pPr>
+        <w:pStyle w:val="Heading1"/>
+        <w:keepNext/>
+        <w:keepLines/>
+        <w:widowControl/>
+        <w:spacing w:before="120" w:after="60" w:line="280" w:lineRule="exact"/>
+      </w:pPr>
+      <w:r>
+        <w:t>Employment</w:t>
+      </w:r>
+    </w:p>
+    <w:p>
+      <w:pPr>
         <w:pStyle w:val="Heading2"/>
         <w:keepNext/>
         <w:keepLines/>
@@ -326,7 +326,7 @@
         <w:spacing w:before="0" w:after="60" w:line="252" w:lineRule="exact"/>
       </w:pPr>
       <w:r>
-        <w:t>Self-directed programming began with game modding, reverse engineering, bot and rotation logic, and runtime-memory tooling, then developed into systems engineering, graphics, compilers, and AI infrastructure. This is a project history, not a claim of equivalent years of paid software employment.</w:t>
+        <w:t>Personal programming began with game modding, reverse engineering, bot and rotation logic, and runtime-memory tooling, then developed into systems engineering, graphics, compilers, and AI infrastructure.</w:t>
       </w:r>
     </w:p>
     <w:p>

</xml_diff>

<commit_message>
Add earned security, AI, and governance credentials to career materials (#273)
* Add Qualys Policy Audit certification to career materials

* Add CAR certification and verified Qualys Specialist designations

* Add VMDR certification and Claude Code and API badges

* Add Qualys Kubernetes and Container Security certification

* Add Google DeepMind advanced language-model skill badge

* Add UNESCO AI ethics course certificate and assessed governance skills

* Add bounded Google multi-agent badge and Cisco learning credential

* Add Azure DevOps Applied Skills and Google evaluation coursework

* Add Bedrock coursework and BigQuery predictive skill badge

* Add BigQuery ML modeling skill badge with bounded lab scope

* Add Advanced Google Security Operations course badge

* Clarify self-directed programming and separate employment history

* Bind career text receipt to committed LF source bytes

---------

Co-authored-by: Zain Dana Harper <17142659+HarperZ9@users.noreply.github.com>
</commit_message>
<xml_diff>
--- a/career/Zain-Dana-Harper-CV.docx
+++ b/career/Zain-Dana-Harper-CV.docx
@@ -71,7 +71,7 @@
         <w:spacing w:before="0" w:after="60" w:line="252" w:lineRule="exact"/>
       </w:pPr>
       <w:r>
-        <w:t>Independent systems engineer and technical writer building AI workstations, evaluation and accountability tools, language tooling, and graphics systems. Combines self-directed programming with technical networking support and eleven years of full-time arboriculture and customer-facing operations.</w:t>
+        <w:t>Self-directed software builder and technical writer with about 13 years of personal programming. Builds AI workstations, evaluation tools, language tooling, and graphics systems. Began a career transition in June 2026 after eleven years of full-time production arboriculture; no professional programming experience.</w:t>
       </w:r>
     </w:p>
     <w:p>
@@ -82,7 +82,7 @@
         <w:spacing w:before="0" w:after="60" w:line="252" w:lineRule="exact"/>
       </w:pPr>
       <w:r>
-        <w:t>Open to technical and nontechnical AI governance and evaluation roles. Available for regular travel to San Francisco and London.</w:t>
+        <w:t>Open to technical and nontechnical AI governance and evaluation roles. Willing to relocate to London; available for regular travel to San Francisco.</w:t>
       </w:r>
     </w:p>
     <w:p>
@@ -94,19 +94,7 @@
         <w:spacing w:before="120" w:after="60" w:line="280" w:lineRule="exact"/>
       </w:pPr>
       <w:r>
-        <w:t>Professional Experience</w:t>
-      </w:r>
-    </w:p>
-    <w:p>
-      <w:pPr>
-        <w:pStyle w:val="Heading2"/>
-        <w:keepNext/>
-        <w:keepLines/>
-        <w:widowControl/>
-        <w:spacing w:before="100" w:after="40" w:line="256" w:lineRule="exact"/>
-      </w:pPr>
-      <w:r>
-        <w:t>Independent Systems Engineer | Independent practice</w:t>
+        <w:t>Self-Directed Projects</w:t>
       </w:r>
     </w:p>
     <w:p>
@@ -120,7 +108,7 @@
         <w:rPr>
           <w:sz w:val="21"/>
         </w:rPr>
-        <w:t>Kent / remote | 2023 to Present</w:t>
+        <w:t>About 13 years of self-directed programming | Career transition began June 2026</w:t>
       </w:r>
     </w:p>
     <w:p>
@@ -134,7 +122,7 @@
         <w:rPr>
           <w:sz w:val="21"/>
         </w:rPr>
-        <w:t>Sole proprietor since September 2026</w:t>
+        <w:t>Sole proprietor since September 2026; no paid software clients</w:t>
       </w:r>
     </w:p>
     <w:p>
@@ -217,6 +205,18 @@
     </w:p>
     <w:p>
       <w:pPr>
+        <w:pStyle w:val="Heading1"/>
+        <w:keepNext/>
+        <w:keepLines/>
+        <w:widowControl/>
+        <w:spacing w:before="120" w:after="60" w:line="280" w:lineRule="exact"/>
+      </w:pPr>
+      <w:r>
+        <w:t>Employment</w:t>
+      </w:r>
+    </w:p>
+    <w:p>
+      <w:pPr>
         <w:pStyle w:val="Heading2"/>
         <w:keepNext/>
         <w:keepLines/>
@@ -326,7 +326,7 @@
         <w:spacing w:before="0" w:after="60" w:line="252" w:lineRule="exact"/>
       </w:pPr>
       <w:r>
-        <w:t>Self-directed programming began with game modding, reverse engineering, bot and rotation logic, and runtime-memory tooling, then developed into systems engineering, graphics, compilers, and AI infrastructure. This is a project history, not a claim of equivalent years of paid software employment.</w:t>
+        <w:t>Personal programming began with game modding, reverse engineering, bot and rotation logic, and runtime-memory tooling, then developed into systems engineering, graphics, compilers, and AI infrastructure.</w:t>
       </w:r>
     </w:p>
     <w:p>
@@ -1212,7 +1212,18 @@
         <w:spacing w:before="0" w:after="60" w:line="252" w:lineRule="exact"/>
       </w:pPr>
       <w:r>
-        <w:t>Completed September 2026. Credential links, identifiers, and assessment results: harperz9.github.io/career/source-ledger.md.</w:t>
+        <w:t>2026 completions. Verification: harperz9.github.io/career/source-ledger.md.</w:t>
+      </w:r>
+    </w:p>
+    <w:p>
+      <w:pPr>
+        <w:keepNext w:val="0"/>
+        <w:keepLines/>
+        <w:widowControl/>
+        <w:spacing w:before="0" w:after="60" w:line="252" w:lineRule="exact"/>
+      </w:pPr>
+      <w:r>
+        <w:t>Qualys Certified Specialist: Policy Audit; Custom Assessment and Remediation; Vulnerability Management Detection and Response; Qualys Kubernetes and Container Security; Qualys TotalCloud Exam; Endpoint Detection and Response | Issued 2026-09-30; expire 2028-09-29</w:t>
       </w:r>
     </w:p>
     <w:p>
@@ -1224,7 +1235,7 @@
         <w:spacing w:before="100" w:after="40" w:line="256" w:lineRule="exact"/>
       </w:pPr>
       <w:r>
-        <w:t>Microsoft Applied Skills | Earned September 29, 2026</w:t>
+        <w:t>Microsoft Applied Skills | Earned September 2026</w:t>
       </w:r>
     </w:p>
     <w:p>
@@ -1268,52 +1279,6 @@
     </w:p>
     <w:p>
       <w:pPr>
-        <w:pStyle w:val="Heading2"/>
-        <w:keepNext/>
-        <w:keepLines/>
-        <w:widowControl/>
-        <w:spacing w:before="100" w:after="40" w:line="256" w:lineRule="exact"/>
-      </w:pPr>
-      <w:r>
-        <w:t>Advanced Microsoft Learn Coursework</w:t>
-      </w:r>
-    </w:p>
-    <w:p>
-      <w:pPr>
-        <w:keepNext w:val="0"/>
-        <w:keepLines/>
-        <w:widowControl/>
-        <w:spacing w:before="0" w:after="60" w:line="252" w:lineRule="exact"/>
-      </w:pPr>
-      <w:r>
-        <w:t>SC-100: Design security solutions for applications and data. Completed four module assessments and the architecture case study.</w:t>
-      </w:r>
-    </w:p>
-    <w:p>
-      <w:pPr>
-        <w:keepNext w:val="0"/>
-        <w:keepLines/>
-        <w:widowControl/>
-        <w:spacing w:before="0" w:after="60" w:line="252" w:lineRule="exact"/>
-      </w:pPr>
-      <w:r>
-        <w:t>Design solutions that align with MCRA and MCSB. Advanced Microsoft Learn module completed September 30, 2026: security architecture, Zero Trust, insider and supply-chain risk, and AI security controls.</w:t>
-      </w:r>
-    </w:p>
-    <w:p>
-      <w:pPr>
-        <w:pStyle w:val="Heading2"/>
-        <w:keepNext/>
-        <w:keepLines/>
-        <w:widowControl/>
-        <w:spacing w:before="100" w:after="40" w:line="256" w:lineRule="exact"/>
-      </w:pPr>
-      <w:r>
-        <w:t>Linux Foundation Course-Completion Certificates</w:t>
-      </w:r>
-    </w:p>
-    <w:p>
-      <w:pPr>
         <w:pStyle w:val="ListBullet"/>
         <w:keepNext w:val="0"/>
         <w:keepLines/>
@@ -1322,215 +1287,7 @@
         <w:ind w:left="245" w:hanging="173"/>
       </w:pPr>
       <w:r>
-        <w:t>LFEL1012: Secure AI/ML-Driven Software Development</w:t>
-      </w:r>
-    </w:p>
-    <w:p>
-      <w:pPr>
-        <w:pStyle w:val="ListBullet"/>
-        <w:keepNext w:val="0"/>
-        <w:keepLines/>
-        <w:widowControl/>
-        <w:spacing w:before="0" w:after="60" w:line="252" w:lineRule="exact"/>
-        <w:ind w:left="245" w:hanging="173"/>
-      </w:pPr>
-      <w:r>
-        <w:t>LFS120: Conversational AI: Ensuring Compliance and Mitigating Risks</w:t>
-      </w:r>
-    </w:p>
-    <w:p>
-      <w:pPr>
-        <w:pStyle w:val="ListBullet"/>
-        <w:keepNext w:val="0"/>
-        <w:keepLines/>
-        <w:widowControl/>
-        <w:spacing w:before="0" w:after="60" w:line="252" w:lineRule="exact"/>
-        <w:ind w:left="245" w:hanging="173"/>
-      </w:pPr>
-      <w:r>
-        <w:t>LFD121: Developing Secure Software</w:t>
-      </w:r>
-    </w:p>
-    <w:p>
-      <w:pPr>
-        <w:pStyle w:val="ListBullet"/>
-        <w:keepNext w:val="0"/>
-        <w:keepLines/>
-        <w:widowControl/>
-        <w:spacing w:before="0" w:after="60" w:line="252" w:lineRule="exact"/>
-        <w:ind w:left="245" w:hanging="173"/>
-      </w:pPr>
-      <w:r>
-        <w:t>LFS182: Securing Your Software Supply Chain with Sigstore</w:t>
-      </w:r>
-    </w:p>
-    <w:p>
-      <w:pPr>
-        <w:pStyle w:val="ListBullet"/>
-        <w:keepNext w:val="0"/>
-        <w:keepLines/>
-        <w:widowControl/>
-        <w:spacing w:before="0" w:after="60" w:line="252" w:lineRule="exact"/>
-        <w:ind w:left="245" w:hanging="173"/>
-      </w:pPr>
-      <w:r>
-        <w:t>LFEL1001: Understanding the EU Cyber Resilience Act (CRA)</w:t>
-      </w:r>
-    </w:p>
-    <w:p>
-      <w:pPr>
-        <w:pStyle w:val="ListBullet"/>
-        <w:keepNext w:val="0"/>
-        <w:keepLines/>
-        <w:widowControl/>
-        <w:spacing w:before="0" w:after="60" w:line="252" w:lineRule="exact"/>
-        <w:ind w:left="245" w:hanging="173"/>
-      </w:pPr>
-      <w:r>
-        <w:t>LFS118: Ethical Principles for Conversational AI</w:t>
-      </w:r>
-    </w:p>
-    <w:p>
-      <w:pPr>
-        <w:pStyle w:val="ListBullet"/>
-        <w:keepNext w:val="0"/>
-        <w:keepLines/>
-        <w:widowControl/>
-        <w:spacing w:before="0" w:after="60" w:line="252" w:lineRule="exact"/>
-        <w:ind w:left="245" w:hanging="173"/>
-      </w:pPr>
-      <w:r>
-        <w:t>LFEL1006: Securing Projects with OpenSSF Scorecard</w:t>
-      </w:r>
-    </w:p>
-    <w:p>
-      <w:pPr>
-        <w:pStyle w:val="ListBullet"/>
-        <w:keepNext w:val="0"/>
-        <w:keepLines/>
-        <w:widowControl/>
-        <w:spacing w:before="0" w:after="60" w:line="252" w:lineRule="exact"/>
-        <w:ind w:left="245" w:hanging="173"/>
-      </w:pPr>
-      <w:r>
-        <w:t>LFEL1005: Security Self-Assessments for Open Source Projects</w:t>
-      </w:r>
-    </w:p>
-    <w:p>
-      <w:pPr>
-        <w:pStyle w:val="ListBullet"/>
-        <w:keepNext w:val="0"/>
-        <w:keepLines/>
-        <w:widowControl/>
-        <w:spacing w:before="0" w:after="60" w:line="252" w:lineRule="exact"/>
-        <w:ind w:left="245" w:hanging="173"/>
-      </w:pPr>
-      <w:r>
-        <w:t>LFEL1007: Automating Supply Chain Security: SBOMs and Signatures</w:t>
-      </w:r>
-    </w:p>
-    <w:p>
-      <w:pPr>
-        <w:pStyle w:val="ListBullet"/>
-        <w:keepNext w:val="0"/>
-        <w:keepLines/>
-        <w:widowControl/>
-        <w:spacing w:before="0" w:after="60" w:line="252" w:lineRule="exact"/>
-        <w:ind w:left="245" w:hanging="173"/>
-      </w:pPr>
-      <w:r>
-        <w:t>LFD125: Security for Software Development Managers</w:t>
-      </w:r>
-    </w:p>
-    <w:p>
-      <w:pPr>
-        <w:pStyle w:val="ListBullet"/>
-        <w:keepNext w:val="0"/>
-        <w:keepLines/>
-        <w:widowControl/>
-        <w:spacing w:before="0" w:after="60" w:line="252" w:lineRule="exact"/>
-        <w:ind w:left="245" w:hanging="173"/>
-      </w:pPr>
-      <w:r>
-        <w:t>LFS180: Introduction to DevSecOps for Managers</w:t>
-      </w:r>
-    </w:p>
-    <w:p>
-      <w:pPr>
-        <w:pStyle w:val="ListBullet"/>
-        <w:keepNext w:val="0"/>
-        <w:keepLines/>
-        <w:widowControl/>
-        <w:spacing w:before="0" w:after="60" w:line="252" w:lineRule="exact"/>
-        <w:ind w:left="245" w:hanging="173"/>
-      </w:pPr>
-      <w:r>
-        <w:t>SKF100: OWASP Top 10 Security Threats</w:t>
-      </w:r>
-    </w:p>
-    <w:p>
-      <w:pPr>
-        <w:pStyle w:val="ListBullet"/>
-        <w:keepNext w:val="0"/>
-        <w:keepLines/>
-        <w:widowControl/>
-        <w:spacing w:before="0" w:after="60" w:line="252" w:lineRule="exact"/>
-        <w:ind w:left="245" w:hanging="173"/>
-      </w:pPr>
-      <w:r>
-        <w:t>LFS184: Introduction to JavaScript Security</w:t>
-      </w:r>
-    </w:p>
-    <w:p>
-      <w:pPr>
-        <w:pStyle w:val="ListBullet"/>
-        <w:keepNext w:val="0"/>
-        <w:keepLines/>
-        <w:widowControl/>
-        <w:spacing w:before="0" w:after="60" w:line="252" w:lineRule="exact"/>
-        <w:ind w:left="245" w:hanging="173"/>
-      </w:pPr>
-      <w:r>
-        <w:t>LFC108: Cybersecurity Essentials</w:t>
-      </w:r>
-    </w:p>
-    <w:p>
-      <w:pPr>
-        <w:pStyle w:val="ListBullet"/>
-        <w:keepNext w:val="0"/>
-        <w:keepLines/>
-        <w:widowControl/>
-        <w:spacing w:before="0" w:after="60" w:line="252" w:lineRule="exact"/>
-        <w:ind w:left="245" w:hanging="173"/>
-      </w:pPr>
-      <w:r>
-        <w:t>LFEL1004: Authentication and Authorization for Web/API</w:t>
-      </w:r>
-    </w:p>
-    <w:p>
-      <w:pPr>
-        <w:pStyle w:val="ListBullet"/>
-        <w:keepNext w:val="0"/>
-        <w:keepLines/>
-        <w:widowControl/>
-        <w:spacing w:before="0" w:after="60" w:line="252" w:lineRule="exact"/>
-        <w:ind w:left="245" w:hanging="173"/>
-      </w:pPr>
-      <w:r>
-        <w:t>LFEL1008: Migrating AI Workflows Across Platforms</w:t>
-      </w:r>
-    </w:p>
-    <w:p>
-      <w:pPr>
-        <w:pStyle w:val="ListBullet"/>
-        <w:keepNext w:val="0"/>
-        <w:keepLines/>
-        <w:widowControl/>
-        <w:spacing w:before="0" w:after="60" w:line="252" w:lineRule="exact"/>
-        <w:ind w:left="245" w:hanging="173"/>
-      </w:pPr>
-      <w:r>
-        <w:t>LFS147: Introduction to AI/ML Toolkits with Kubeflow</w:t>
+        <w:t>Implement security through a pipeline using Azure DevOps | Intermediate; 95% assessment</w:t>
       </w:r>
     </w:p>
     <w:p>
@@ -1542,7 +1299,7 @@
         <w:spacing w:before="100" w:after="40" w:line="256" w:lineRule="exact"/>
       </w:pPr>
       <w:r>
-        <w:t>Additional Advanced and Strategy Coursework</w:t>
+        <w:t>Advanced Microsoft Learn Coursework</w:t>
       </w:r>
     </w:p>
     <w:p>
@@ -1553,7 +1310,174 @@
         <w:spacing w:before="0" w:after="60" w:line="252" w:lineRule="exact"/>
       </w:pPr>
       <w:r>
-        <w:t>Anthropic Claude Academy: Model Context Protocol: Advanced topics | Completion badge, September 30, 2026</w:t>
+        <w:t>SC-100: Design security solutions for applications and data. Completed four module assessments and the architecture case study.</w:t>
+      </w:r>
+    </w:p>
+    <w:p>
+      <w:pPr>
+        <w:keepNext w:val="0"/>
+        <w:keepLines/>
+        <w:widowControl/>
+        <w:spacing w:before="0" w:after="60" w:line="252" w:lineRule="exact"/>
+      </w:pPr>
+      <w:r>
+        <w:t>Design solutions that align with MCRA and MCSB. Advanced Microsoft Learn module completed September 30, 2026: security architecture, Zero Trust, insider and supply-chain risk, and AI security controls.</w:t>
+      </w:r>
+    </w:p>
+    <w:p>
+      <w:pPr>
+        <w:pStyle w:val="Heading2"/>
+        <w:keepNext/>
+        <w:keepLines/>
+        <w:widowControl/>
+        <w:spacing w:before="100" w:after="40" w:line="256" w:lineRule="exact"/>
+      </w:pPr>
+      <w:r>
+        <w:t>Linux Foundation Course-Completion Certificates</w:t>
+      </w:r>
+    </w:p>
+    <w:p>
+      <w:pPr>
+        <w:keepNext w:val="0"/>
+        <w:keepLines/>
+        <w:widowControl/>
+        <w:spacing w:before="0" w:after="60" w:line="252" w:lineRule="exact"/>
+      </w:pPr>
+      <w:r>
+        <w:t>LFEL1012: Secure AI/ML-Driven Software Development; LFS120: Conversational AI: Ensuring Compliance and Mitigating Risks; LFD121: Developing Secure Software</w:t>
+      </w:r>
+    </w:p>
+    <w:p>
+      <w:pPr>
+        <w:keepNext w:val="0"/>
+        <w:keepLines/>
+        <w:widowControl/>
+        <w:spacing w:before="0" w:after="60" w:line="252" w:lineRule="exact"/>
+      </w:pPr>
+      <w:r>
+        <w:t>LFS182: Securing Your Software Supply Chain with Sigstore; LFEL1001: Understanding the EU Cyber Resilience Act (CRA); LFS118: Ethical Principles for Conversational AI</w:t>
+      </w:r>
+    </w:p>
+    <w:p>
+      <w:pPr>
+        <w:keepNext w:val="0"/>
+        <w:keepLines/>
+        <w:widowControl/>
+        <w:spacing w:before="0" w:after="60" w:line="252" w:lineRule="exact"/>
+      </w:pPr>
+      <w:r>
+        <w:t>LFEL1006: Securing Projects with OpenSSF Scorecard; LFEL1005: Security Self-Assessments for Open Source Projects; LFEL1007: Automating Supply Chain Security: SBOMs and Signatures</w:t>
+      </w:r>
+    </w:p>
+    <w:p>
+      <w:pPr>
+        <w:keepNext w:val="0"/>
+        <w:keepLines/>
+        <w:widowControl/>
+        <w:spacing w:before="0" w:after="60" w:line="252" w:lineRule="exact"/>
+      </w:pPr>
+      <w:r>
+        <w:t>LFD125: Security for Software Development Managers; LFS180: Introduction to DevSecOps for Managers; SKF100: OWASP Top 10 Security Threats</w:t>
+      </w:r>
+    </w:p>
+    <w:p>
+      <w:pPr>
+        <w:keepNext w:val="0"/>
+        <w:keepLines/>
+        <w:widowControl/>
+        <w:spacing w:before="0" w:after="60" w:line="252" w:lineRule="exact"/>
+      </w:pPr>
+      <w:r>
+        <w:t>LFS184: Introduction to JavaScript Security; LFC108: Cybersecurity Essentials; LFEL1004: Authentication and Authorization for Web/API</w:t>
+      </w:r>
+    </w:p>
+    <w:p>
+      <w:pPr>
+        <w:keepNext w:val="0"/>
+        <w:keepLines/>
+        <w:widowControl/>
+        <w:spacing w:before="0" w:after="60" w:line="252" w:lineRule="exact"/>
+      </w:pPr>
+      <w:r>
+        <w:t>LFEL1008: Migrating AI Workflows Across Platforms; LFS147: Introduction to AI/ML Toolkits with Kubeflow</w:t>
+      </w:r>
+    </w:p>
+    <w:p>
+      <w:pPr>
+        <w:pStyle w:val="Heading2"/>
+        <w:keepNext/>
+        <w:keepLines/>
+        <w:widowControl/>
+        <w:spacing w:before="100" w:after="40" w:line="256" w:lineRule="exact"/>
+      </w:pPr>
+      <w:r>
+        <w:t>Additional Coursework and Skill Badges</w:t>
+      </w:r>
+    </w:p>
+    <w:p>
+      <w:pPr>
+        <w:keepNext w:val="0"/>
+        <w:keepLines/>
+        <w:widowControl/>
+        <w:spacing w:before="0" w:after="60" w:line="252" w:lineRule="exact"/>
+      </w:pPr>
+      <w:r>
+        <w:t>Cisco Networking Academy: Ethical Hacker | Intermediate course certificate and learning badge, 2026-09-30; 100% knowledge exam. Assessed scoping, reporting, vulnerability assessment, and security concepts.</w:t>
+      </w:r>
+    </w:p>
+    <w:p>
+      <w:pPr>
+        <w:keepNext w:val="0"/>
+        <w:keepLines/>
+        <w:widowControl/>
+        <w:spacing w:before="0" w:after="60" w:line="252" w:lineRule="exact"/>
+      </w:pPr>
+      <w:r>
+        <w:t>Google skill badges, completed 2026-09-30: Google DeepMind: Train A Small Language Model (Advanced; 100/100, four coding checkpoints); Use Agent Skills with Multi-Agent Systems (Intermediate course/Advanced challenge; 100/100, six checkpoints). Scope: tokenization, n-grams, data preparation, and agent orchestration. Multi-agent lab: five Cloud Run services deployed; model-access policy blocked local and cloud generation.</w:t>
+      </w:r>
+    </w:p>
+    <w:p>
+      <w:pPr>
+        <w:keepNext w:val="0"/>
+        <w:keepLines/>
+        <w:widowControl/>
+        <w:spacing w:before="0" w:after="60" w:line="252" w:lineRule="exact"/>
+      </w:pPr>
+      <w:r>
+        <w:t>Google BigQuery skill badges, issued 2026-10-01: Perform Predictive Data Analysis in BigQuery (100/100, seven checkpoints; Advanced challenge); Create ML Models with BigQuery ML (100/100, four checkpoints; Intermediate challenge). Both courses Intermediate. Lab work: SQL features, logistic regression, later-window evaluation, and predictions.</w:t>
+      </w:r>
+    </w:p>
+    <w:p>
+      <w:pPr>
+        <w:keepNext w:val="0"/>
+        <w:keepLines/>
+        <w:widowControl/>
+        <w:spacing w:before="0" w:after="60" w:line="252" w:lineRule="exact"/>
+      </w:pPr>
+      <w:r>
+        <w:t>Google course-completion badges, completed 2026-09-30: Machine Learning Operations (MLOps) with Agent Platform: Model Evaluation (Intermediate); Google Security Operations - Deep Dive (Advanced; 96% knowledge assessment). Topics: model-evaluation methods, YARA-L, SIEM processing/enrichment, and SOAR.</w:t>
+      </w:r>
+    </w:p>
+    <w:p>
+      <w:pPr>
+        <w:keepNext w:val="0"/>
+        <w:keepLines/>
+        <w:widowControl/>
+        <w:spacing w:before="0" w:after="60" w:line="252" w:lineRule="exact"/>
+      </w:pPr>
+      <w:r>
+        <w:t>Anthropic Claude Academy completion badges: Model Context Protocol: Advanced topics; Claude Code in action; Building with the Claude API; Claude with Amazon Bedrock | Issued September 30, 2026</w:t>
+      </w:r>
+    </w:p>
+    <w:p>
+      <w:pPr>
+        <w:keepNext w:val="0"/>
+        <w:keepLines/>
+        <w:widowControl/>
+        <w:spacing w:before="0" w:after="60" w:line="252" w:lineRule="exact"/>
+      </w:pPr>
+      <w:r>
+        <w:t>UNESCO: Global MOOC on the Ethics of AI | Intermediate course certificate, 2026-09-30; 100%. Assessed human rights, fairness, risk controls, incident reporting, and sustainability.</w:t>
       </w:r>
     </w:p>
     <w:p>
@@ -1580,25 +1504,13 @@
     </w:p>
     <w:p>
       <w:pPr>
-        <w:pStyle w:val="Heading2"/>
-        <w:keepNext/>
-        <w:keepLines/>
-        <w:widowControl/>
-        <w:spacing w:before="100" w:after="40" w:line="256" w:lineRule="exact"/>
-      </w:pPr>
-      <w:r>
-        <w:t>Standards and Frameworks: Training and Research</w:t>
-      </w:r>
-    </w:p>
-    <w:p>
-      <w:pPr>
         <w:keepNext w:val="0"/>
         <w:keepLines/>
         <w:widowControl/>
         <w:spacing w:before="0" w:after="60" w:line="252" w:lineRule="exact"/>
       </w:pPr>
       <w:r>
-        <w:t>Completed coursework: MCRA/MCSB, Zero Trust, OWASP Top 10 web security, and EU Cyber Resilience Act; MCP sampling, roots, JSON-RPC, stdio, Streamable HTTP/SSE. Research references: NIST AI RMF/GenAI Profile, ISO/IEC 42001/23894, ISO 37002. Current editions and scope: harperz9.github.io/career/standards-reference.md.</w:t>
+        <w:t>Coursework: MCRA/MCSB, Zero Trust, OWASP web Top 10, CRA. Research references: NIST AI RMF/GenAI Profile, ISO/IEC 42001/23894, ISO 37002. Scope: harperz9.github.io/career/standards-reference.md.</w:t>
       </w:r>
     </w:p>
     <w:sectPr>

</xml_diff>

<commit_message>
Count twelve DOI records and typeset the two corpora with LaTeX
The four October 2026 deposits (zenodo.23126117, 23126357, 23126458,
23126484) join the research record. Checked against the Zenodo records
API on 3 October 2026: all twelve published, author Zain Dana Harper,
CC BY 4.0. The Writing hub, CV, resumes, dossier, hire page and the home
bundle (index-G7cmpE16.js) now say twelve.

Conferred Existence and The Witnessing Spine, with its 2 October
foreword and dated corrections, move off Chromium printing onto the
Tectonic path: tools/corpus_latex.py converts the deposited source read
with git show, two builds with SOURCE_DATE_EPOCH fixed must match, and
papers/receipts/ pins repository, commit, source hash and site inputs.

Co-Authored-By: Claude Opus 5.5 <noreply@anthropic.com>
</commit_message>
<xml_diff>
--- a/career/Zain-Dana-Harper-CV.docx
+++ b/career/Zain-Dana-Harper-CV.docx
@@ -1029,7 +1029,7 @@
         <w:spacing w:before="0" w:after="60" w:line="252" w:lineRule="exact"/>
       </w:pPr>
       <w:r>
-        <w:t>Independent systems papers, preprints, research notes, and archived manuscripts with DOI records. These records are not peer reviewed. An archived philosophical manuscript is not an awarded academic degree.</w:t>
+        <w:t>Independent systems papers, preprints, research notes, philosophy papers, a working paper, and archived manuscripts with DOI records. These records are not peer reviewed. An archived philosophical manuscript is not an awarded academic degree.</w:t>
       </w:r>
     </w:p>
     <w:p>
@@ -1134,6 +1134,58 @@
       </w:pPr>
       <w:r>
         <w:t>Conferred Existence. Long-form philosophical manuscript and archived corpus, 2026. doi.org/10.5281/zenodo.20773724</w:t>
+      </w:r>
+    </w:p>
+    <w:p>
+      <w:pPr>
+        <w:pStyle w:val="ListBullet"/>
+        <w:keepNext w:val="0"/>
+        <w:keepLines/>
+        <w:widowControl/>
+        <w:spacing w:before="0" w:after="60" w:line="252" w:lineRule="exact"/>
+        <w:ind w:left="245" w:hanging="173"/>
+      </w:pPr>
+      <w:r>
+        <w:t>Sourcehood Without a Source: The Arity Gap and the Free Will Debate. Philosophy paper, edition of 3 October 2026. doi.org/10.5281/zenodo.23126117</w:t>
+      </w:r>
+    </w:p>
+    <w:p>
+      <w:pPr>
+        <w:pStyle w:val="ListBullet"/>
+        <w:keepNext w:val="0"/>
+        <w:keepLines/>
+        <w:widowControl/>
+        <w:spacing w:before="0" w:after="60" w:line="252" w:lineRule="exact"/>
+        <w:ind w:left="245" w:hanging="173"/>
+      </w:pPr>
+      <w:r>
+        <w:t>The Seam That Holds While It Is Crossed. Philosophy paper, edition of 3 October 2026. doi.org/10.5281/zenodo.23126357</w:t>
+      </w:r>
+    </w:p>
+    <w:p>
+      <w:pPr>
+        <w:pStyle w:val="ListBullet"/>
+        <w:keepNext w:val="0"/>
+        <w:keepLines/>
+        <w:widowControl/>
+        <w:spacing w:before="0" w:after="60" w:line="252" w:lineRule="exact"/>
+        <w:ind w:left="245" w:hanging="173"/>
+      </w:pPr>
+      <w:r>
+        <w:t>Self-Given Is Not Self-Grounding. Philosophy paper, edition of 3 October 2026. doi.org/10.5281/zenodo.23126458</w:t>
+      </w:r>
+    </w:p>
+    <w:p>
+      <w:pPr>
+        <w:pStyle w:val="ListBullet"/>
+        <w:keepNext w:val="0"/>
+        <w:keepLines/>
+        <w:widowControl/>
+        <w:spacing w:before="0" w:after="60" w:line="252" w:lineRule="exact"/>
+        <w:ind w:left="245" w:hanging="173"/>
+      </w:pPr>
+      <w:r>
+        <w:t>The Conservation of Faithfulness. Working paper, edition of 3 October 2026. doi.org/10.5281/zenodo.23126484</w:t>
       </w:r>
     </w:p>
     <w:p>

</xml_diff>

<commit_message>
Count thirteen DOI records: add the formal note on faithfulness
A Zenodo search by ORCID on 3 October 2026 returns thirteen records, one
per concept. The twelve-record list missed "Faithfulness to a Named
Criterion Is the Conserved Quantity Across Lossy Substrates"
(10.5281/zenodo.22768398, deposited 15 September 2026), which the site
already hosted as papers/faithfulness-conserved-quantity.pdf. It joins
the research record as a third research note. The hub, the scholarly
records JSON, the CV and resumes, the dossier, the hire page, the route
registry, the site index and the home bundle (index-kUp7LAv4.js) now
say thirteen. Three of the four October deposits are second versions of
records first deposited on 15 September 2026; the hub says "editions of
3 October 2026" instead of "deposited in October 2026".

Co-Authored-By: Claude Opus 5.5 <noreply@anthropic.com>
</commit_message>
<xml_diff>
--- a/career/Zain-Dana-Harper-CV.docx
+++ b/career/Zain-Dana-Harper-CV.docx
@@ -1108,6 +1108,19 @@
       </w:pPr>
       <w:r>
         <w:t>Re-Perceived Effects. Research note, 2026. doi.org/10.5281/zenodo.21231311</w:t>
+      </w:r>
+    </w:p>
+    <w:p>
+      <w:pPr>
+        <w:pStyle w:val="ListBullet"/>
+        <w:keepNext w:val="0"/>
+        <w:keepLines/>
+        <w:widowControl/>
+        <w:spacing w:before="0" w:after="60" w:line="252" w:lineRule="exact"/>
+        <w:ind w:left="245" w:hanging="173"/>
+      </w:pPr>
+      <w:r>
+        <w:t>Faithfulness to a Named Criterion Is the Conserved Quantity Across Lossy Substrates. Research note, 2026. doi.org/10.5281/zenodo.22768398</w:t>
       </w:r>
     </w:p>
     <w:p>

</xml_diff>

<commit_message>
docs: refresh resumes and CV against October 7 evidence
</commit_message>
<xml_diff>
--- a/career/Zain-Dana-Harper-CV.docx
+++ b/career/Zain-Dana-Harper-CV.docx
@@ -361,7 +361,7 @@
         <w:spacing w:before="0" w:after="60" w:line="252" w:lineRule="exact"/>
       </w:pPr>
       <w:r>
-        <w:t>Primary owned platform. The September 29, 2026 v1.1.2 release includes a Windows installer with a bundled engine. The source repository contains the Python runtime, Flutter desktop client, and browser fallback.</w:t>
+        <w:t>Primary owned platform. Flywheel v1.5.0, released October 4, 2026, includes a Windows installer with a bundled engine. The source repository contains the Python runtime, Flutter desktop client, and browser fallback.</w:t>
       </w:r>
     </w:p>
     <w:p>
@@ -418,293 +418,6 @@
     </w:p>
     <w:p>
       <w:pPr>
-        <w:pStyle w:val="Heading2"/>
-        <w:keepNext/>
-        <w:keepLines/>
-        <w:widowControl/>
-        <w:spacing w:before="100" w:after="40" w:line="256" w:lineRule="exact"/>
-      </w:pPr>
-      <w:r>
-        <w:t>Accountable Surface | Governed actions and computer-use adapters</w:t>
-      </w:r>
-    </w:p>
-    <w:p>
-      <w:pPr>
-        <w:keepNext w:val="0"/>
-        <w:keepLines/>
-        <w:widowControl/>
-        <w:spacing w:before="0" w:after="60" w:line="252" w:lineRule="exact"/>
-      </w:pPr>
-      <w:r>
-        <w:t>Built operator-granted action interfaces for filesystem, command, API, browser, and Windows UI Automation work. Actions carry explicit scope and postconditions; persisted journals preserve decisions and observed effects. Reversible adapters include restoration paths. Fake drivers make browser and desktop scenarios testable without uncontrolled live actions.</w:t>
-      </w:r>
-    </w:p>
-    <w:p>
-      <w:pPr>
-        <w:keepNext w:val="0"/>
-        <w:keepLines/>
-        <w:widowControl/>
-        <w:spacing w:before="0" w:after="60" w:line="252" w:lineRule="exact"/>
-      </w:pPr>
-      <w:r>
-        <w:t>The v0.2.0 release provides source and wheel artifacts on GitHub. The project remains alpha; browser integrations are optional and a tool refusal or unknown result is not promoted into a successful action.</w:t>
-      </w:r>
-    </w:p>
-    <w:p>
-      <w:pPr>
-        <w:pStyle w:val="Heading2"/>
-        <w:keepNext/>
-        <w:keepLines/>
-        <w:widowControl/>
-        <w:spacing w:before="100" w:after="40" w:line="256" w:lineRule="exact"/>
-      </w:pPr>
-      <w:r>
-        <w:t>Articulate | Writing analysis and accountable editing</w:t>
-      </w:r>
-    </w:p>
-    <w:p>
-      <w:pPr>
-        <w:keepNext w:val="0"/>
-        <w:keepLines/>
-        <w:widowControl/>
-        <w:spacing w:before="0" w:after="60" w:line="252" w:lineRule="exact"/>
-      </w:pPr>
-      <w:r>
-        <w:t>Built deterministic prose analysis with register, mode, and genre profiles, alongside optional model-assisted editing. Includes command-line, library, MCP, language-server, and SARIF surfaces; math-span protection preserves formulas during supported editing flows. Content-free audit receipts record checks without retaining the underlying prose. Version 0.5.2, released September 29, 2026, adds guarded host editing through local MCP and a released plugin.</w:t>
-      </w:r>
-    </w:p>
-    <w:p>
-      <w:pPr>
-        <w:pStyle w:val="Heading2"/>
-        <w:keepNext/>
-        <w:keepLines/>
-        <w:widowControl/>
-        <w:spacing w:before="100" w:after="40" w:line="256" w:lineRule="exact"/>
-      </w:pPr>
-      <w:r>
-        <w:t>Agent tools, memory, and coordination</w:t>
-      </w:r>
-    </w:p>
-    <w:p>
-      <w:pPr>
-        <w:keepNext w:val="0"/>
-        <w:keepLines/>
-        <w:widowControl/>
-        <w:spacing w:before="0" w:after="60" w:line="252" w:lineRule="exact"/>
-      </w:pPr>
-      <w:r>
-        <w:t>Relay supplies model-agnostic coding-agent tooling; Plexus connects tool interfaces; Mneme retains memories with source checks; Canon consolidates assistant instructions and context. Bulletin provides a signed-identity public message board. These systems contribute distinct capabilities to the larger platform rather than representing separate claims of deployment at customer scale.</w:t>
-      </w:r>
-    </w:p>
-    <w:p>
-      <w:pPr>
-        <w:pStyle w:val="Heading1"/>
-        <w:keepNext/>
-        <w:keepLines/>
-        <w:widowControl/>
-        <w:spacing w:before="120" w:after="60" w:line="280" w:lineRule="exact"/>
-      </w:pPr>
-      <w:r>
-        <w:t>Evaluation, Systems, and Security Engineering</w:t>
-      </w:r>
-    </w:p>
-    <w:p>
-      <w:pPr>
-        <w:pStyle w:val="Heading2"/>
-        <w:keepNext/>
-        <w:keepLines/>
-        <w:widowControl/>
-        <w:spacing w:before="100" w:after="40" w:line="256" w:lineRule="exact"/>
-      </w:pPr>
-      <w:r>
-        <w:t>Terminal State Fixtures and Crucible</w:t>
-      </w:r>
-    </w:p>
-    <w:p>
-      <w:pPr>
-        <w:keepNext w:val="0"/>
-        <w:keepLines/>
-        <w:widowControl/>
-        <w:spacing w:before="0" w:after="60" w:line="252" w:lineRule="exact"/>
-      </w:pPr>
-      <w:r>
-        <w:t>Built 324 exhaustive terminal-state fixtures and five synthetic component-evaluation families with 337 cases and 5,058 frozen expectations. Defined controls separate failed outputs, provider failures, and missing evidence from valid results. Executed a pinned METR count_odds interoperability check with three deterministic controls, preserving logs and score provenance through the Inspect-to-Flywheel handoff.</w:t>
-      </w:r>
-    </w:p>
-    <w:p>
-      <w:pPr>
-        <w:pStyle w:val="Heading2"/>
-        <w:keepNext/>
-        <w:keepLines/>
-        <w:widowControl/>
-        <w:spacing w:before="100" w:after="40" w:line="256" w:lineRule="exact"/>
-      </w:pPr>
-      <w:r>
-        <w:t>EMET | Byte-integrity witnessing</w:t>
-      </w:r>
-    </w:p>
-    <w:p>
-      <w:pPr>
-        <w:keepNext w:val="0"/>
-        <w:keepLines/>
-        <w:widowControl/>
-        <w:spacing w:before="0" w:after="60" w:line="252" w:lineRule="exact"/>
-      </w:pPr>
-      <w:r>
-        <w:t>Developed Python, Rust, Node, and Go implementations around shared conformance cases and portable verification records. The witness checks byte-level integrity, anchors, and source correspondence; it does not grant permission, certify semantic truth, or replace an operator decision. Cross-language checking makes implementation differences visible.</w:t>
-      </w:r>
-    </w:p>
-    <w:p>
-      <w:pPr>
-        <w:pStyle w:val="Heading2"/>
-        <w:keepNext/>
-        <w:keepLines/>
-        <w:widowControl/>
-        <w:spacing w:before="100" w:after="40" w:line="256" w:lineRule="exact"/>
-      </w:pPr>
-      <w:r>
-        <w:t>BuildLang | Rust compiler and developer tooling</w:t>
-      </w:r>
-    </w:p>
-    <w:p>
-      <w:pPr>
-        <w:keepNext w:val="0"/>
-        <w:keepLines/>
-        <w:widowControl/>
-        <w:spacing w:before="0" w:after="60" w:line="252" w:lineRule="exact"/>
-      </w:pPr>
-      <w:r>
-        <w:t>Developed a systems-language toolchain with typed capability effects, type inference, parser and intermediate-representation work, native C output, shader output, and language-server support. The compiler makes categories of ambient access visible to its type and build machinery. Experimental backends and linear-type work remain distinguished from the supported path.</w:t>
-      </w:r>
-    </w:p>
-    <w:p>
-      <w:pPr>
-        <w:pStyle w:val="Heading2"/>
-        <w:keepNext/>
-        <w:keepLines/>
-        <w:widowControl/>
-        <w:spacing w:before="100" w:after="40" w:line="256" w:lineRule="exact"/>
-      </w:pPr>
-      <w:r>
-        <w:t>Phantom | Hardware-identity inspection and reversible system changes</w:t>
-      </w:r>
-    </w:p>
-    <w:p>
-      <w:pPr>
-        <w:keepNext w:val="0"/>
-        <w:keepLines/>
-        <w:widowControl/>
-        <w:spacing w:before="0" w:after="60" w:line="252" w:lineRule="exact"/>
-      </w:pPr>
-      <w:r>
-        <w:t>Developed a Rust-based Windows and Linux utility with deterministic profiles, read-only audit, backup-before-write behavior, validation, restoration, and platform packages. The released v1.1.1 scope is userland-reversible identifiers. Kernel and firmware layers are modeled, not shipped.</w:t>
-      </w:r>
-    </w:p>
-    <w:p>
-      <w:pPr>
-        <w:pStyle w:val="Heading2"/>
-        <w:keepNext/>
-        <w:keepLines/>
-        <w:widowControl/>
-        <w:spacing w:before="100" w:after="40" w:line="256" w:lineRule="exact"/>
-      </w:pPr>
-      <w:r>
-        <w:t>Controlled assessment and operator tooling</w:t>
-      </w:r>
-    </w:p>
-    <w:p>
-      <w:pPr>
-        <w:keepNext w:val="0"/>
-        <w:keepLines/>
-        <w:widowControl/>
-        <w:spacing w:before="0" w:after="60" w:line="252" w:lineRule="exact"/>
-      </w:pPr>
-      <w:r>
-        <w:t>Private systems work includes Array for approval-gated assessment orchestration and containment records, Lab/Seed for controlled-lab fixtures and detection-engineering workflows, and Runtime/ORCA for local workspaces, reports, bundles, and release provenance. Public descriptions cover architecture and safe interfaces; private implementations, target material, and operational details are not published here.</w:t>
-      </w:r>
-    </w:p>
-    <w:p>
-      <w:pPr>
-        <w:pStyle w:val="Heading2"/>
-        <w:keepNext/>
-        <w:keepLines/>
-        <w:widowControl/>
-        <w:spacing w:before="100" w:after="40" w:line="256" w:lineRule="exact"/>
-      </w:pPr>
-      <w:r>
-        <w:t>Research intake and workspace tooling</w:t>
-      </w:r>
-    </w:p>
-    <w:p>
-      <w:pPr>
-        <w:keepNext w:val="0"/>
-        <w:keepLines/>
-        <w:widowControl/>
-        <w:spacing w:before="0" w:after="60" w:line="252" w:lineRule="exact"/>
-      </w:pPr>
-      <w:r>
-        <w:t>Built Gather for source-carrying research intake, Index for workspace and symbol maps, and Forum for model orchestration with recorded decisions. These tools make source selection, handoffs, and task context inspectable across a multi-repository product.</w:t>
-      </w:r>
-    </w:p>
-    <w:p>
-      <w:pPr>
-        <w:pStyle w:val="Heading1"/>
-        <w:keepNext/>
-        <w:keepLines/>
-        <w:widowControl/>
-        <w:spacing w:before="120" w:after="60" w:line="280" w:lineRule="exact"/>
-      </w:pPr>
-      <w:r>
-        <w:t>Graphics, Color, and Runtime Work</w:t>
-      </w:r>
-    </w:p>
-    <w:p>
-      <w:pPr>
-        <w:keepNext w:val="0"/>
-        <w:keepLines/>
-        <w:widowControl/>
-        <w:spacing w:before="0" w:after="60" w:line="252" w:lineRule="exact"/>
-      </w:pPr>
-      <w:r>
-        <w:t>Developed HLSL and C++ graphics and game-modding work spanning post-processing, Direct3D 11 integration, shader debugging, GPU traces, and shared-memory interfaces. Related public projects include Elder ENB, SkyrimBridge, ENB Runtime Core, Brender Archival, and Engine Revival. Existing engines and collaborators retain their own attribution.</w:t>
-      </w:r>
-    </w:p>
-    <w:p>
-      <w:pPr>
-        <w:keepNext w:val="0"/>
-        <w:keepLines/>
-        <w:widowControl/>
-        <w:spacing w:before="0" w:after="60" w:line="252" w:lineRule="exact"/>
-      </w:pPr>
-      <w:r>
-        <w:t>Color and creative-tool work includes Build Color, Calibrate Pro, Studio Engine, and browser-based studio/print surfaces: perceptual color spaces, color difference, HDR/tone-mapping tools, display characterization, and generative visual systems. These are engineering projects, not claims of professional calibration certification.</w:t>
-      </w:r>
-    </w:p>
-    <w:p>
-      <w:pPr>
-        <w:pStyle w:val="Heading1"/>
-        <w:keepNext/>
-        <w:keepLines/>
-        <w:widowControl/>
-        <w:spacing w:before="120" w:after="60" w:line="280" w:lineRule="exact"/>
-      </w:pPr>
-      <w:r>
-        <w:t>Selected Open-Source Contributions</w:t>
-      </w:r>
-    </w:p>
-    <w:p>
-      <w:pPr>
-        <w:keepNext w:val="0"/>
-        <w:keepLines/>
-        <w:widowControl/>
-        <w:spacing w:before="0" w:after="60" w:line="252" w:lineRule="exact"/>
-      </w:pPr>
-      <w:r>
-        <w:t>Six selected contributions merged across six external repositories, covering bug fixes, tests, and documentation. These are contributions, not employment; the broader record tracks merged, open, and closed without merge outcomes.</w:t>
-      </w:r>
-    </w:p>
-    <w:p>
-      <w:pPr>
         <w:pStyle w:val="ListBullet"/>
         <w:keepNext w:val="0"/>
         <w:keepLines/>
@@ -713,7 +426,294 @@
         <w:ind w:left="245" w:hanging="173"/>
       </w:pPr>
       <w:r>
-        <w:t>DeepEval #2822: fixed unhashable tool-output and nested-parameter failures in tool-correctness evaluation; merged July 2, 2026. github.com/confident-ai/deepeval/pull/2822</w:t>
+        <w:t>Released a monitor-admission check over 2,676 frozen items with six planted controls, a second independent math kernel, and signer-head anchoring. Release evidence reports no real monitor tested through the admission check and no installed signer; Windows anchoring was parse-checked only.</w:t>
+      </w:r>
+    </w:p>
+    <w:p>
+      <w:pPr>
+        <w:pStyle w:val="Heading2"/>
+        <w:keepNext/>
+        <w:keepLines/>
+        <w:widowControl/>
+        <w:spacing w:before="100" w:after="40" w:line="256" w:lineRule="exact"/>
+      </w:pPr>
+      <w:r>
+        <w:t>Accountable Surface | Governed actions and computer-use adapters</w:t>
+      </w:r>
+    </w:p>
+    <w:p>
+      <w:pPr>
+        <w:keepNext w:val="0"/>
+        <w:keepLines/>
+        <w:widowControl/>
+        <w:spacing w:before="0" w:after="60" w:line="252" w:lineRule="exact"/>
+      </w:pPr>
+      <w:r>
+        <w:t>Built operator-granted action interfaces for filesystem, command, API, browser, and Windows UI Automation work. Actions carry explicit scope and postconditions; persisted journals preserve decisions and observed effects. Reversible adapters include restoration paths. Fake drivers make browser and desktop scenarios testable without uncontrolled live actions.</w:t>
+      </w:r>
+    </w:p>
+    <w:p>
+      <w:pPr>
+        <w:keepNext w:val="0"/>
+        <w:keepLines/>
+        <w:widowControl/>
+        <w:spacing w:before="0" w:after="60" w:line="252" w:lineRule="exact"/>
+      </w:pPr>
+      <w:r>
+        <w:t>The v0.2.0 release provides source and wheel artifacts on GitHub. The project remains alpha; browser integrations are optional and a tool refusal or unknown result is not promoted into a successful action.</w:t>
+      </w:r>
+    </w:p>
+    <w:p>
+      <w:pPr>
+        <w:pStyle w:val="Heading2"/>
+        <w:keepNext/>
+        <w:keepLines/>
+        <w:widowControl/>
+        <w:spacing w:before="100" w:after="40" w:line="256" w:lineRule="exact"/>
+      </w:pPr>
+      <w:r>
+        <w:t>Articulate | Writing analysis and accountable editing</w:t>
+      </w:r>
+    </w:p>
+    <w:p>
+      <w:pPr>
+        <w:keepNext w:val="0"/>
+        <w:keepLines/>
+        <w:widowControl/>
+        <w:spacing w:before="0" w:after="60" w:line="252" w:lineRule="exact"/>
+      </w:pPr>
+      <w:r>
+        <w:t>Built deterministic prose analysis with profiles for register and genre, mode settings, and optional model-assisted editing. Includes command-line, library, MCP, language-server, and SARIF surfaces; math-span protection preserves formulas during supported editing flows. Content-free audit receipts record checks without retaining the underlying prose. Version 0.9.0, released October 3, 2026, adds project-specific writing rules, domain profiles, writing-process records, and reports of guarded edits. Detector rules retain the published v0.5.2 fingerprint.</w:t>
+      </w:r>
+    </w:p>
+    <w:p>
+      <w:pPr>
+        <w:pStyle w:val="Heading2"/>
+        <w:keepNext/>
+        <w:keepLines/>
+        <w:widowControl/>
+        <w:spacing w:before="100" w:after="40" w:line="256" w:lineRule="exact"/>
+      </w:pPr>
+      <w:r>
+        <w:t>Agent tools, memory, and coordination</w:t>
+      </w:r>
+    </w:p>
+    <w:p>
+      <w:pPr>
+        <w:keepNext w:val="0"/>
+        <w:keepLines/>
+        <w:widowControl/>
+        <w:spacing w:before="0" w:after="60" w:line="252" w:lineRule="exact"/>
+      </w:pPr>
+      <w:r>
+        <w:t>Relay supplies model-agnostic coding-agent tooling; Plexus connects tool interfaces; Mneme retains memories with source checks; Canon consolidates assistant instructions and context. Bulletin provides a signed-identity public message board. These systems contribute distinct capabilities to the larger platform. Customer-scale deployment is not established.</w:t>
+      </w:r>
+    </w:p>
+    <w:p>
+      <w:pPr>
+        <w:pStyle w:val="Heading1"/>
+        <w:keepNext/>
+        <w:keepLines/>
+        <w:widowControl/>
+        <w:spacing w:before="120" w:after="60" w:line="280" w:lineRule="exact"/>
+      </w:pPr>
+      <w:r>
+        <w:t>Evaluation, Systems, and Security Engineering</w:t>
+      </w:r>
+    </w:p>
+    <w:p>
+      <w:pPr>
+        <w:pStyle w:val="Heading2"/>
+        <w:keepNext/>
+        <w:keepLines/>
+        <w:widowControl/>
+        <w:spacing w:before="100" w:after="40" w:line="256" w:lineRule="exact"/>
+      </w:pPr>
+      <w:r>
+        <w:t>Terminal State Fixtures and Crucible</w:t>
+      </w:r>
+    </w:p>
+    <w:p>
+      <w:pPr>
+        <w:keepNext w:val="0"/>
+        <w:keepLines/>
+        <w:widowControl/>
+        <w:spacing w:before="0" w:after="60" w:line="252" w:lineRule="exact"/>
+      </w:pPr>
+      <w:r>
+        <w:t>Built 324 exhaustive terminal-state fixtures and five synthetic component-evaluation families with 337 cases and 5,058 frozen expectations. Defined controls separate failed outputs, provider failures, and missing evidence from valid results. Executed a pinned METR count_odds interoperability check with three deterministic controls, preserving logs and score provenance through the Inspect-to-Flywheel handoff.</w:t>
+      </w:r>
+    </w:p>
+    <w:p>
+      <w:pPr>
+        <w:pStyle w:val="Heading2"/>
+        <w:keepNext/>
+        <w:keepLines/>
+        <w:widowControl/>
+        <w:spacing w:before="100" w:after="40" w:line="256" w:lineRule="exact"/>
+      </w:pPr>
+      <w:r>
+        <w:t>EMET | Byte-integrity witnessing</w:t>
+      </w:r>
+    </w:p>
+    <w:p>
+      <w:pPr>
+        <w:keepNext w:val="0"/>
+        <w:keepLines/>
+        <w:widowControl/>
+        <w:spacing w:before="0" w:after="60" w:line="252" w:lineRule="exact"/>
+      </w:pPr>
+      <w:r>
+        <w:t>Developed Python, Rust, Node, and Go implementations around shared conformance cases and portable verification records. The witness checks byte-level integrity, anchors, and source correspondence; it does not grant permission, certify semantic truth, or replace an operator decision. Cross-language checking makes implementation differences visible.</w:t>
+      </w:r>
+    </w:p>
+    <w:p>
+      <w:pPr>
+        <w:pStyle w:val="Heading2"/>
+        <w:keepNext/>
+        <w:keepLines/>
+        <w:widowControl/>
+        <w:spacing w:before="100" w:after="40" w:line="256" w:lineRule="exact"/>
+      </w:pPr>
+      <w:r>
+        <w:t>BuildLang | Rust compiler and developer tooling</w:t>
+      </w:r>
+    </w:p>
+    <w:p>
+      <w:pPr>
+        <w:keepNext w:val="0"/>
+        <w:keepLines/>
+        <w:widowControl/>
+        <w:spacing w:before="0" w:after="60" w:line="252" w:lineRule="exact"/>
+      </w:pPr>
+      <w:r>
+        <w:t>Developed a systems-language toolchain with typed capability effects, type inference, parser and intermediate-representation work, native C output, shader output, and language-server support. The compiler makes categories of ambient access visible to its type and build machinery. Experimental backends and linear-type work remain distinguished from the supported path.</w:t>
+      </w:r>
+    </w:p>
+    <w:p>
+      <w:pPr>
+        <w:pStyle w:val="Heading2"/>
+        <w:keepNext/>
+        <w:keepLines/>
+        <w:widowControl/>
+        <w:spacing w:before="100" w:after="40" w:line="256" w:lineRule="exact"/>
+      </w:pPr>
+      <w:r>
+        <w:t>Phantom | Hardware-identity inspection and reversible system changes</w:t>
+      </w:r>
+    </w:p>
+    <w:p>
+      <w:pPr>
+        <w:keepNext w:val="0"/>
+        <w:keepLines/>
+        <w:widowControl/>
+        <w:spacing w:before="0" w:after="60" w:line="252" w:lineRule="exact"/>
+      </w:pPr>
+      <w:r>
+        <w:t>Developed a Rust-based Windows and Linux utility with deterministic profiles, read-only audit, backup-before-write behavior, validation, restoration, and platform packages. The released v1.1.1 scope is userland-reversible identifiers. Kernel and firmware layers are modeled, not shipped.</w:t>
+      </w:r>
+    </w:p>
+    <w:p>
+      <w:pPr>
+        <w:pStyle w:val="Heading2"/>
+        <w:keepNext/>
+        <w:keepLines/>
+        <w:widowControl/>
+        <w:spacing w:before="100" w:after="40" w:line="256" w:lineRule="exact"/>
+      </w:pPr>
+      <w:r>
+        <w:t>Controlled assessment and operator tooling</w:t>
+      </w:r>
+    </w:p>
+    <w:p>
+      <w:pPr>
+        <w:keepNext w:val="0"/>
+        <w:keepLines/>
+        <w:widowControl/>
+        <w:spacing w:before="0" w:after="60" w:line="252" w:lineRule="exact"/>
+      </w:pPr>
+      <w:r>
+        <w:t>Private systems work includes Array for approval-gated assessment orchestration and containment records, Lab/Seed for controlled-lab fixtures and detection-engineering workflows, and Runtime/ORCA for local workspaces, reports, bundles, and release provenance. Public descriptions cover architecture and safe interfaces; private implementations, target material, and operational details are not published here.</w:t>
+      </w:r>
+    </w:p>
+    <w:p>
+      <w:pPr>
+        <w:pStyle w:val="Heading2"/>
+        <w:keepNext/>
+        <w:keepLines/>
+        <w:widowControl/>
+        <w:spacing w:before="100" w:after="40" w:line="256" w:lineRule="exact"/>
+      </w:pPr>
+      <w:r>
+        <w:t>Research intake and workspace tooling</w:t>
+      </w:r>
+    </w:p>
+    <w:p>
+      <w:pPr>
+        <w:keepNext w:val="0"/>
+        <w:keepLines/>
+        <w:widowControl/>
+        <w:spacing w:before="0" w:after="60" w:line="252" w:lineRule="exact"/>
+      </w:pPr>
+      <w:r>
+        <w:t>Built Gather for source-carrying research intake, Index for workspace and symbol maps, and Forum for model orchestration with recorded decisions. These tools make source selection, handoffs, and task context inspectable across a multi-repository product.</w:t>
+      </w:r>
+    </w:p>
+    <w:p>
+      <w:pPr>
+        <w:pStyle w:val="Heading1"/>
+        <w:keepNext/>
+        <w:keepLines/>
+        <w:widowControl/>
+        <w:spacing w:before="120" w:after="60" w:line="280" w:lineRule="exact"/>
+      </w:pPr>
+      <w:r>
+        <w:t>Graphics, Color, and Runtime Work</w:t>
+      </w:r>
+    </w:p>
+    <w:p>
+      <w:pPr>
+        <w:keepNext w:val="0"/>
+        <w:keepLines/>
+        <w:widowControl/>
+        <w:spacing w:before="0" w:after="60" w:line="252" w:lineRule="exact"/>
+      </w:pPr>
+      <w:r>
+        <w:t>Developed HLSL and C++ graphics and game-modding work spanning post-processing, Direct3D 11 integration, shader debugging, GPU traces, and shared-memory interfaces. Related public projects include Elder ENB, SkyrimBridge, ENB Runtime Core, Brender Archival, and Engine Revival. Existing engines and collaborators retain their own attribution.</w:t>
+      </w:r>
+    </w:p>
+    <w:p>
+      <w:pPr>
+        <w:keepNext w:val="0"/>
+        <w:keepLines/>
+        <w:widowControl/>
+        <w:spacing w:before="0" w:after="60" w:line="252" w:lineRule="exact"/>
+      </w:pPr>
+      <w:r>
+        <w:t>Color and creative-tool work includes Build Color, Calibrate Pro, Studio Engine, and browser-based studio/print surfaces: perceptual color spaces, color difference, HDR/tone-mapping tools, display characterization, and generative visual systems. These are engineering projects, not claims of professional calibration certification.</w:t>
+      </w:r>
+    </w:p>
+    <w:p>
+      <w:pPr>
+        <w:pStyle w:val="Heading1"/>
+        <w:keepNext/>
+        <w:keepLines/>
+        <w:widowControl/>
+        <w:spacing w:before="120" w:after="60" w:line="280" w:lineRule="exact"/>
+      </w:pPr>
+      <w:r>
+        <w:t>Selected Open-Source Contributions</w:t>
+      </w:r>
+    </w:p>
+    <w:p>
+      <w:pPr>
+        <w:keepNext w:val="0"/>
+        <w:keepLines/>
+        <w:widowControl/>
+        <w:spacing w:before="0" w:after="60" w:line="252" w:lineRule="exact"/>
+      </w:pPr>
+      <w:r>
+        <w:t>Six selected contributions merged across six external repositories, covering bug fixes, tests, and documentation. These are contributions, not employment; the broader record tracks merged, open, and closed without merge outcomes.</w:t>
       </w:r>
     </w:p>
     <w:p>
@@ -726,7 +726,7 @@
         <w:ind w:left="245" w:hanging="173"/>
       </w:pPr>
       <w:r>
-        <w:t>TOMLKit #549: preserved dotted-key siblings when replacing a value with an array of tables; merged July 14, 2026. github.com/python-poetry/tomlkit/pull/549</w:t>
+        <w:t>DeepEval #2822: fixed unhashable tool-output and nested-parameter failures in tool-correctness evaluation; merged July 2, 2026. github.com/confident-ai/deepeval/pull/2822</w:t>
       </w:r>
     </w:p>
     <w:p>
@@ -739,7 +739,7 @@
         <w:ind w:left="245" w:hanging="173"/>
       </w:pPr>
       <w:r>
-        <w:t>Datasette #2815: corrected malformed composite-key requests from HTTP 500 or incorrect HTTP 200 to HTTP 400; tested too few and too many key components in HTML and JSON. Merged July 7, 2026. github.com/simonw/datasette/pull/2815</w:t>
+        <w:t>TOMLKit #549: preserved dotted-key siblings when replacing a value with an array of tables; merged July 14, 2026. github.com/python-poetry/tomlkit/pull/549</w:t>
       </w:r>
     </w:p>
     <w:p>
@@ -752,7 +752,7 @@
         <w:ind w:left="245" w:hanging="173"/>
       </w:pPr>
       <w:r>
-        <w:t>Free Law Project #820: documented runnable database-free fast tests; merged August 25, 2026. github.com/freelawproject/litigant-portal/pull/820</w:t>
+        <w:t>Datasette #2815: corrected malformed composite-key requests from HTTP 500 or incorrect HTTP 200 to HTTP 400; tested too few and too many key components in HTML and JSON. Merged July 7, 2026. github.com/simonw/datasette/pull/2815</w:t>
       </w:r>
     </w:p>
     <w:p>
@@ -765,7 +765,7 @@
         <w:ind w:left="245" w:hanging="173"/>
       </w:pPr>
       <w:r>
-        <w:t>Hebbian Robotics #157: tested reserved-column drift against the actual queryable episode schema; merged August 25, 2026. github.com/Hebbian-Robotics/hflow/pull/157</w:t>
+        <w:t>Free Law Project #820: documented runnable database-free fast tests; merged August 25, 2026. github.com/freelawproject/litigant-portal/pull/820</w:t>
       </w:r>
     </w:p>
     <w:p>
@@ -778,258 +778,7 @@
         <w:ind w:left="245" w:hanging="173"/>
       </w:pPr>
       <w:r>
-        <w:t>Voxwire #44: added offline regression coverage for a six-event degraded voice turn, matching saved PCM audio and JSONL records to emitted events. Merged August 15, 2026. github.com/vectorvoyager358/voxwire/pull/44</w:t>
-      </w:r>
-    </w:p>
-    <w:p>
-      <w:pPr>
-        <w:pStyle w:val="Heading1"/>
-        <w:keepNext/>
-        <w:keepLines/>
-        <w:widowControl/>
-        <w:spacing w:before="120" w:after="60" w:line="280" w:lineRule="exact"/>
-      </w:pPr>
-      <w:r>
-        <w:t>Technical Competencies</w:t>
-      </w:r>
-    </w:p>
-    <w:p>
-      <w:pPr>
-        <w:keepNext w:val="0"/>
-        <w:keepLines/>
-        <w:widowControl/>
-        <w:spacing w:before="0" w:after="60" w:line="252" w:lineRule="exact"/>
-      </w:pPr>
-      <w:r>
-        <w:t>Languages and runtimes: Python, Rust, C++, Dart/Flutter, TypeScript/JavaScript, Lua, HLSL, C#, PowerShell, and Bash. Additional cross-language conformance work includes Go and Node implementations.</w:t>
-      </w:r>
-    </w:p>
-    <w:p>
-      <w:pPr>
-        <w:keepNext w:val="0"/>
-        <w:keepLines/>
-        <w:widowControl/>
-        <w:spacing w:before="0" w:after="60" w:line="252" w:lineRule="exact"/>
-      </w:pPr>
-      <w:r>
-        <w:t>AI infrastructure and quality: multi-provider/local-model routing, tool-use loops, task decomposition, MCP, evaluation design, deterministic fixtures, regression testing, worker/verifier separation, failure analysis, and terminal-state scoring.</w:t>
-      </w:r>
-    </w:p>
-    <w:p>
-      <w:pPr>
-        <w:keepNext w:val="0"/>
-        <w:keepLines/>
-        <w:widowControl/>
-        <w:spacing w:before="0" w:after="60" w:line="252" w:lineRule="exact"/>
-      </w:pPr>
-      <w:r>
-        <w:t>Verification and controlled actions: capability effects, operator grants, action envelopes, source provenance, hash-chained journals, offline replay, scoped postconditions, conformance suites, and release evidence.</w:t>
-      </w:r>
-    </w:p>
-    <w:p>
-      <w:pPr>
-        <w:keepNext w:val="0"/>
-        <w:keepLines/>
-        <w:widowControl/>
-        <w:spacing w:before="0" w:after="60" w:line="252" w:lineRule="exact"/>
-      </w:pPr>
-      <w:r>
-        <w:t>Software delivery: Git/GitHub, GitHub Actions, Python packaging, command-line design, Windows/Linux installers, CMake, test automation, static websites, release documentation, and checksums.</w:t>
-      </w:r>
-    </w:p>
-    <w:p>
-      <w:pPr>
-        <w:keepNext w:val="0"/>
-        <w:keepLines/>
-        <w:widowControl/>
-        <w:spacing w:before="0" w:after="60" w:line="252" w:lineRule="exact"/>
-      </w:pPr>
-      <w:r>
-        <w:t>Graphics and domain knowledge: D3D11/HLSL, shader and runtime debugging, color-space and tone-mapping work, GPU instrumentation, shared-memory interfaces, and applied arboriculture/horticulture from field practice.</w:t>
-      </w:r>
-    </w:p>
-    <w:p>
-      <w:pPr>
-        <w:pStyle w:val="Heading1"/>
-        <w:keepNext/>
-        <w:keepLines/>
-        <w:widowControl/>
-        <w:spacing w:before="120" w:after="60" w:line="280" w:lineRule="exact"/>
-      </w:pPr>
-      <w:r>
-        <w:t>Working Practice</w:t>
-      </w:r>
-    </w:p>
-    <w:p>
-      <w:pPr>
-        <w:keepNext w:val="0"/>
-        <w:keepLines/>
-        <w:widowControl/>
-        <w:spacing w:before="0" w:after="60" w:line="252" w:lineRule="exact"/>
-      </w:pPr>
-      <w:r>
-        <w:t>AI-assisted development is part of the workflow. Architecture, integration, source review, test design, release decisions, and responsibility for the submitted work remain mine. Public examples separate observed results from interpretation and retain negative or inconclusive findings rather than treating every completed run as success.</w:t>
-      </w:r>
-    </w:p>
-    <w:p>
-      <w:pPr>
-        <w:pStyle w:val="Heading1"/>
-        <w:keepNext/>
-        <w:keepLines/>
-        <w:widowControl/>
-        <w:spacing w:before="120" w:after="60" w:line="280" w:lineRule="exact"/>
-      </w:pPr>
-      <w:r>
-        <w:t>Research Agenda</w:t>
-      </w:r>
-    </w:p>
-    <w:p>
-      <w:pPr>
-        <w:keepNext w:val="0"/>
-        <w:keepLines/>
-        <w:widowControl/>
-        <w:spacing w:before="0" w:after="60" w:line="252" w:lineRule="exact"/>
-      </w:pPr>
-      <w:r>
-        <w:t>My independent research examines evidence that another person or system can check without inheriting an AI system's authority. Work includes evaluation provenance and verifier independence; live-state drift; proof-carrying actions; memory, uncertainty, and behavior; and human authorization for consequential actions. Robotics is a research interest.</w:t>
-      </w:r>
-    </w:p>
-    <w:p>
-      <w:pPr>
-        <w:pStyle w:val="Heading1"/>
-        <w:keepNext/>
-        <w:keepLines/>
-        <w:widowControl/>
-        <w:spacing w:before="120" w:after="60" w:line="280" w:lineRule="exact"/>
-      </w:pPr>
-      <w:r>
-        <w:t>AI Accountability, Disclosure, and Public-Interest Writing</w:t>
-      </w:r>
-    </w:p>
-    <w:p>
-      <w:pPr>
-        <w:keepNext w:val="0"/>
-        <w:keepLines/>
-        <w:widowControl/>
-        <w:spacing w:before="0" w:after="60" w:line="252" w:lineRule="exact"/>
-      </w:pPr>
-      <w:r>
-        <w:t>Independent essays on AI accountability, disclosure, conflicts of interest, and human consequences, relevant to public-interest and whistleblower-protection work.</w:t>
-      </w:r>
-    </w:p>
-    <w:p>
-      <w:pPr>
-        <w:pStyle w:val="Heading2"/>
-        <w:keepNext/>
-        <w:keepLines/>
-        <w:widowControl/>
-        <w:spacing w:before="100" w:after="40" w:line="256" w:lineRule="exact"/>
-      </w:pPr>
-      <w:r>
-        <w:t>Who Knew First</w:t>
-      </w:r>
-    </w:p>
-    <w:p>
-      <w:pPr>
-        <w:keepNext w:val="0"/>
-        <w:keepLines/>
-        <w:widowControl/>
-        <w:spacing w:before="0" w:after="60" w:line="252" w:lineRule="exact"/>
-      </w:pPr>
-      <w:r>
-        <w:t>September 2026. Directed and published an AI-assisted investigation comparing disclosure timelines, evidence access, institutional incentives, and evaluator conflicts across nine reported AI-agent incidents. Separates source claims, inference, and unresolved attribution. harperz9.github.io/who-knew-first.html</w:t>
-      </w:r>
-    </w:p>
-    <w:p>
-      <w:pPr>
-        <w:pStyle w:val="Heading2"/>
-        <w:keepNext/>
-        <w:keepLines/>
-        <w:widowControl/>
-        <w:spacing w:before="100" w:after="40" w:line="256" w:lineRule="exact"/>
-      </w:pPr>
-      <w:r>
-        <w:t>An Open Letter on Checking the Machines</w:t>
-      </w:r>
-    </w:p>
-    <w:p>
-      <w:pPr>
-        <w:keepNext w:val="0"/>
-        <w:keepLines/>
-        <w:widowControl/>
-        <w:spacing w:before="0" w:after="60" w:line="252" w:lineRule="exact"/>
-      </w:pPr>
-      <w:r>
-        <w:t>September 2026. Proposed contestable AI decisions, repeatable evidence checks, and accountable responses to objections. harperz9.github.io/checking-the-machines.html</w:t>
-      </w:r>
-    </w:p>
-    <w:p>
-      <w:pPr>
-        <w:pStyle w:val="Heading2"/>
-        <w:keepNext/>
-        <w:keepLines/>
-        <w:widowControl/>
-        <w:spacing w:before="100" w:after="40" w:line="256" w:lineRule="exact"/>
-      </w:pPr>
-      <w:r>
-        <w:t>Borrowed Ground</w:t>
-      </w:r>
-    </w:p>
-    <w:p>
-      <w:pPr>
-        <w:keepNext w:val="0"/>
-        <w:keepLines/>
-        <w:widowControl/>
-        <w:spacing w:before="0" w:after="60" w:line="252" w:lineRule="exact"/>
-      </w:pPr>
-      <w:r>
-        <w:t>September 2026. Philosophical essay connecting human interdependence to responsibility, privacy, participation, and the limits of technical evidence as authority over people. Substantial AI assistance disclosed. harperz9.github.io/borrowed-ground.html</w:t>
-      </w:r>
-    </w:p>
-    <w:p>
-      <w:pPr>
-        <w:pStyle w:val="Heading2"/>
-        <w:keepNext/>
-        <w:keepLines/>
-        <w:widowControl/>
-        <w:spacing w:before="100" w:after="40" w:line="256" w:lineRule="exact"/>
-      </w:pPr>
-      <w:r>
-        <w:t>The Sandbox Was Never Just a Box</w:t>
-      </w:r>
-    </w:p>
-    <w:p>
-      <w:pPr>
-        <w:keepNext w:val="0"/>
-        <w:keepLines/>
-        <w:widowControl/>
-        <w:spacing w:before="0" w:after="60" w:line="252" w:lineRule="exact"/>
-      </w:pPr>
-      <w:r>
-        <w:t>September 2026. Compared public security reports to examine shared-service exposure and the independence of logs, monitors, and scorers in AI-agent evaluation. harperz9.github.io/the-sandbox-was-never-just-a-box.html</w:t>
-      </w:r>
-    </w:p>
-    <w:p>
-      <w:pPr>
-        <w:pStyle w:val="Heading1"/>
-        <w:keepNext/>
-        <w:keepLines/>
-        <w:widowControl/>
-        <w:spacing w:before="120" w:after="60" w:line="280" w:lineRule="exact"/>
-      </w:pPr>
-      <w:r>
-        <w:t>Selected Publications and Research Records</w:t>
-      </w:r>
-    </w:p>
-    <w:p>
-      <w:pPr>
-        <w:keepNext w:val="0"/>
-        <w:keepLines/>
-        <w:widowControl/>
-        <w:spacing w:before="0" w:after="60" w:line="252" w:lineRule="exact"/>
-      </w:pPr>
-      <w:r>
-        <w:t>Independent systems papers, preprints, research notes, philosophy papers, a working paper, and archived manuscripts with DOI records. These records are not peer reviewed. An archived philosophical manuscript is not an awarded academic degree.</w:t>
+        <w:t>Hebbian Robotics #157: tested reserved-column drift against the actual queryable episode schema; merged August 25, 2026. github.com/Hebbian-Robotics/hflow/pull/157</w:t>
       </w:r>
     </w:p>
     <w:p>
@@ -1042,7 +791,258 @@
         <w:ind w:left="245" w:hanging="173"/>
       </w:pPr>
       <w:r>
-        <w:t>EMET: An Authority-Incapable Byte-Level Integrity Witness. Systems paper, 2026. Byte-integrity witnessing and the separation of observation from authority. doi.org/10.5281/zenodo.21230267</w:t>
+        <w:t>Voxwire #44: added offline regression coverage for a six-event degraded voice turn, matching saved PCM audio and JSONL records to emitted events. Merged August 15, 2026. github.com/vectorvoyager358/voxwire/pull/44</w:t>
+      </w:r>
+    </w:p>
+    <w:p>
+      <w:pPr>
+        <w:pStyle w:val="Heading1"/>
+        <w:keepNext/>
+        <w:keepLines/>
+        <w:widowControl/>
+        <w:spacing w:before="120" w:after="60" w:line="280" w:lineRule="exact"/>
+      </w:pPr>
+      <w:r>
+        <w:t>Technical Competencies</w:t>
+      </w:r>
+    </w:p>
+    <w:p>
+      <w:pPr>
+        <w:keepNext w:val="0"/>
+        <w:keepLines/>
+        <w:widowControl/>
+        <w:spacing w:before="0" w:after="60" w:line="252" w:lineRule="exact"/>
+      </w:pPr>
+      <w:r>
+        <w:t>Languages and runtimes: Python, Rust, C++, Dart/Flutter, TypeScript/JavaScript, Lua, HLSL, C#, PowerShell, and Bash. Additional cross-language conformance work includes Go and Node implementations.</w:t>
+      </w:r>
+    </w:p>
+    <w:p>
+      <w:pPr>
+        <w:keepNext w:val="0"/>
+        <w:keepLines/>
+        <w:widowControl/>
+        <w:spacing w:before="0" w:after="60" w:line="252" w:lineRule="exact"/>
+      </w:pPr>
+      <w:r>
+        <w:t>AI infrastructure and quality: multi-provider/local-model routing, tool-use loops, task decomposition, MCP, evaluation design, deterministic fixtures, regression testing, worker/verifier separation, failure analysis, and terminal-state scoring.</w:t>
+      </w:r>
+    </w:p>
+    <w:p>
+      <w:pPr>
+        <w:keepNext w:val="0"/>
+        <w:keepLines/>
+        <w:widowControl/>
+        <w:spacing w:before="0" w:after="60" w:line="252" w:lineRule="exact"/>
+      </w:pPr>
+      <w:r>
+        <w:t>Verification and controlled actions: capability effects, operator grants, action envelopes, source provenance, hash-chained journals, offline replay, scoped postconditions, conformance suites, and release evidence.</w:t>
+      </w:r>
+    </w:p>
+    <w:p>
+      <w:pPr>
+        <w:keepNext w:val="0"/>
+        <w:keepLines/>
+        <w:widowControl/>
+        <w:spacing w:before="0" w:after="60" w:line="252" w:lineRule="exact"/>
+      </w:pPr>
+      <w:r>
+        <w:t>Software delivery: Git/GitHub, GitHub Actions, Python packaging, command-line design, Windows/Linux installers, CMake, test automation, static websites, release documentation, and checksums.</w:t>
+      </w:r>
+    </w:p>
+    <w:p>
+      <w:pPr>
+        <w:keepNext w:val="0"/>
+        <w:keepLines/>
+        <w:widowControl/>
+        <w:spacing w:before="0" w:after="60" w:line="252" w:lineRule="exact"/>
+      </w:pPr>
+      <w:r>
+        <w:t>Graphics and domain knowledge: D3D11/HLSL, shader and runtime debugging, color-space and tone-mapping work, GPU instrumentation, shared-memory interfaces, and applied arboriculture/horticulture from field practice.</w:t>
+      </w:r>
+    </w:p>
+    <w:p>
+      <w:pPr>
+        <w:pStyle w:val="Heading1"/>
+        <w:keepNext/>
+        <w:keepLines/>
+        <w:widowControl/>
+        <w:spacing w:before="120" w:after="60" w:line="280" w:lineRule="exact"/>
+      </w:pPr>
+      <w:r>
+        <w:t>Working Practice</w:t>
+      </w:r>
+    </w:p>
+    <w:p>
+      <w:pPr>
+        <w:keepNext w:val="0"/>
+        <w:keepLines/>
+        <w:widowControl/>
+        <w:spacing w:before="0" w:after="60" w:line="252" w:lineRule="exact"/>
+      </w:pPr>
+      <w:r>
+        <w:t>AI-assisted development is part of the workflow. Architecture, integration, source review, test design, release decisions, and responsibility for the submitted work remain mine. Public examples separate observed results from interpretation and retain negative or inconclusive findings. A completed run alone does not establish success.</w:t>
+      </w:r>
+    </w:p>
+    <w:p>
+      <w:pPr>
+        <w:pStyle w:val="Heading1"/>
+        <w:keepNext/>
+        <w:keepLines/>
+        <w:widowControl/>
+        <w:spacing w:before="120" w:after="60" w:line="280" w:lineRule="exact"/>
+      </w:pPr>
+      <w:r>
+        <w:t>Research Agenda</w:t>
+      </w:r>
+    </w:p>
+    <w:p>
+      <w:pPr>
+        <w:keepNext w:val="0"/>
+        <w:keepLines/>
+        <w:widowControl/>
+        <w:spacing w:before="0" w:after="60" w:line="252" w:lineRule="exact"/>
+      </w:pPr>
+      <w:r>
+        <w:t>My independent research examines evidence that another person or system can check without inheriting an AI system's authority. Work includes evaluation provenance and verifier independence; live-state drift; proof-carrying actions; memory, uncertainty, and behavior; and human authorization for consequential actions. Robotics is a research interest.</w:t>
+      </w:r>
+    </w:p>
+    <w:p>
+      <w:pPr>
+        <w:pStyle w:val="Heading1"/>
+        <w:keepNext/>
+        <w:keepLines/>
+        <w:widowControl/>
+        <w:spacing w:before="120" w:after="60" w:line="280" w:lineRule="exact"/>
+      </w:pPr>
+      <w:r>
+        <w:t>AI Accountability, Disclosure, and Public-Interest Writing</w:t>
+      </w:r>
+    </w:p>
+    <w:p>
+      <w:pPr>
+        <w:keepNext w:val="0"/>
+        <w:keepLines/>
+        <w:widowControl/>
+        <w:spacing w:before="0" w:after="60" w:line="252" w:lineRule="exact"/>
+      </w:pPr>
+      <w:r>
+        <w:t>Independent essays on AI accountability, disclosure, conflicts of interest, and human consequences, relevant to public-interest and whistleblower-protection work.</w:t>
+      </w:r>
+    </w:p>
+    <w:p>
+      <w:pPr>
+        <w:pStyle w:val="Heading2"/>
+        <w:keepNext/>
+        <w:keepLines/>
+        <w:widowControl/>
+        <w:spacing w:before="100" w:after="40" w:line="256" w:lineRule="exact"/>
+      </w:pPr>
+      <w:r>
+        <w:t>Who Knew First</w:t>
+      </w:r>
+    </w:p>
+    <w:p>
+      <w:pPr>
+        <w:keepNext w:val="0"/>
+        <w:keepLines/>
+        <w:widowControl/>
+        <w:spacing w:before="0" w:after="60" w:line="252" w:lineRule="exact"/>
+      </w:pPr>
+      <w:r>
+        <w:t>September 2026. Directed and published an AI-assisted investigation comparing disclosure timelines, evidence access, institutional incentives, and evaluator conflicts across nine reported AI-agent incidents. Separates source claims, inference, and unresolved attribution. harperz9.github.io/who-knew-first.html</w:t>
+      </w:r>
+    </w:p>
+    <w:p>
+      <w:pPr>
+        <w:pStyle w:val="Heading2"/>
+        <w:keepNext/>
+        <w:keepLines/>
+        <w:widowControl/>
+        <w:spacing w:before="100" w:after="40" w:line="256" w:lineRule="exact"/>
+      </w:pPr>
+      <w:r>
+        <w:t>An Open Letter on Checking the Machines</w:t>
+      </w:r>
+    </w:p>
+    <w:p>
+      <w:pPr>
+        <w:keepNext w:val="0"/>
+        <w:keepLines/>
+        <w:widowControl/>
+        <w:spacing w:before="0" w:after="60" w:line="252" w:lineRule="exact"/>
+      </w:pPr>
+      <w:r>
+        <w:t>September 2026. Proposed contestable AI decisions, repeatable evidence checks, and accountable responses to objections. harperz9.github.io/checking-the-machines.html</w:t>
+      </w:r>
+    </w:p>
+    <w:p>
+      <w:pPr>
+        <w:pStyle w:val="Heading2"/>
+        <w:keepNext/>
+        <w:keepLines/>
+        <w:widowControl/>
+        <w:spacing w:before="100" w:after="40" w:line="256" w:lineRule="exact"/>
+      </w:pPr>
+      <w:r>
+        <w:t>Borrowed Ground</w:t>
+      </w:r>
+    </w:p>
+    <w:p>
+      <w:pPr>
+        <w:keepNext w:val="0"/>
+        <w:keepLines/>
+        <w:widowControl/>
+        <w:spacing w:before="0" w:after="60" w:line="252" w:lineRule="exact"/>
+      </w:pPr>
+      <w:r>
+        <w:t>September 2026. Philosophical essay connecting human interdependence to responsibility, privacy, participation, and the limits of technical evidence as authority over people. Substantial AI assistance disclosed. harperz9.github.io/borrowed-ground.html</w:t>
+      </w:r>
+    </w:p>
+    <w:p>
+      <w:pPr>
+        <w:pStyle w:val="Heading2"/>
+        <w:keepNext/>
+        <w:keepLines/>
+        <w:widowControl/>
+        <w:spacing w:before="100" w:after="40" w:line="256" w:lineRule="exact"/>
+      </w:pPr>
+      <w:r>
+        <w:t>The Sandbox Was Never Just a Box</w:t>
+      </w:r>
+    </w:p>
+    <w:p>
+      <w:pPr>
+        <w:keepNext w:val="0"/>
+        <w:keepLines/>
+        <w:widowControl/>
+        <w:spacing w:before="0" w:after="60" w:line="252" w:lineRule="exact"/>
+      </w:pPr>
+      <w:r>
+        <w:t>September 2026. Compared public security reports to examine shared-service exposure and the independence of logs, monitors, and scorers in AI-agent evaluation. harperz9.github.io/the-sandbox-was-never-just-a-box.html</w:t>
+      </w:r>
+    </w:p>
+    <w:p>
+      <w:pPr>
+        <w:pStyle w:val="Heading1"/>
+        <w:keepNext/>
+        <w:keepLines/>
+        <w:widowControl/>
+        <w:spacing w:before="120" w:after="60" w:line="280" w:lineRule="exact"/>
+      </w:pPr>
+      <w:r>
+        <w:t>Selected Publications and Research Records</w:t>
+      </w:r>
+    </w:p>
+    <w:p>
+      <w:pPr>
+        <w:keepNext w:val="0"/>
+        <w:keepLines/>
+        <w:widowControl/>
+        <w:spacing w:before="0" w:after="60" w:line="252" w:lineRule="exact"/>
+      </w:pPr>
+      <w:r>
+        <w:t>Independent systems papers, preprints, research notes, philosophy papers, a working paper, and archived manuscripts with DOI records. These records are not peer reviewed. An archived philosophical manuscript is not an awarded academic degree.</w:t>
       </w:r>
     </w:p>
     <w:p>
@@ -1055,7 +1055,7 @@
         <w:ind w:left="245" w:hanging="173"/>
       </w:pPr>
       <w:r>
-        <w:t>BuildLang: Accountable Compute via Typed Capability Effects. Systems paper, 2026. Capability effects and accountable compilation. doi.org/10.5281/zenodo.21231253</w:t>
+        <w:t>EMET: An Authority-Incapable Byte-Level Integrity Witness. Systems paper, 2026. Byte-integrity witnessing and the separation of observation from authority. doi.org/10.5281/zenodo.21230267</w:t>
       </w:r>
     </w:p>
     <w:p>
@@ -1068,7 +1068,7 @@
         <w:ind w:left="245" w:hanging="173"/>
       </w:pPr>
       <w:r>
-        <w:t>Witnessed Independence: Recording Whether a Verifier Graded Its Own Work. Preprint, 2026. doi.org/10.5281/zenodo.21232206</w:t>
+        <w:t>BuildLang: Accountable Compute via Typed Capability Effects. Systems paper, 2026. Capability effects and accountable compilation. doi.org/10.5281/zenodo.21231253</w:t>
       </w:r>
     </w:p>
     <w:p>
@@ -1081,7 +1081,7 @@
         <w:ind w:left="245" w:hanging="173"/>
       </w:pPr>
       <w:r>
-        <w:t>Proof Packets: A Derive-Don't-Trust Envelope for Accountable Agent Actions. Preprint, 2026. doi.org/10.5281/zenodo.21231406</w:t>
+        <w:t>Witnessed Independence: Recording Whether a Verifier Graded Its Own Work. Preprint, 2026. doi.org/10.5281/zenodo.21232206</w:t>
       </w:r>
     </w:p>
     <w:p>
@@ -1094,7 +1094,7 @@
         <w:ind w:left="245" w:hanging="173"/>
       </w:pPr>
       <w:r>
-        <w:t>The Personhood-Gate Handoff. Research note, 2026. doi.org/10.5281/zenodo.21234475</w:t>
+        <w:t>Proof Packets: A Derive-Don't-Trust Envelope for Accountable Agent Actions. Preprint, 2026. doi.org/10.5281/zenodo.21231406</w:t>
       </w:r>
     </w:p>
     <w:p>
@@ -1107,7 +1107,7 @@
         <w:ind w:left="245" w:hanging="173"/>
       </w:pPr>
       <w:r>
-        <w:t>Re-Perceived Effects. Research note, 2026. doi.org/10.5281/zenodo.21231311</w:t>
+        <w:t>The Personhood-Gate Handoff. Research note, 2026. doi.org/10.5281/zenodo.21234475</w:t>
       </w:r>
     </w:p>
     <w:p>
@@ -1120,7 +1120,7 @@
         <w:ind w:left="245" w:hanging="173"/>
       </w:pPr>
       <w:r>
-        <w:t>Faithfulness to a Named Criterion Is the Conserved Quantity Across Lossy Substrates. Research note, 2026. doi.org/10.5281/zenodo.22768398</w:t>
+        <w:t>Re-Perceived Effects. Research note, 2026. doi.org/10.5281/zenodo.21231311</w:t>
       </w:r>
     </w:p>
     <w:p>
@@ -1133,7 +1133,7 @@
         <w:ind w:left="245" w:hanging="173"/>
       </w:pPr>
       <w:r>
-        <w:t>The Witnessing Spine. Archived research corpus, 2026. doi.org/10.5281/zenodo.20778927</w:t>
+        <w:t>Faithfulness to a Named Criterion Is the Conserved Quantity Across Lossy Substrates. Research note, 2026. doi.org/10.5281/zenodo.22768398</w:t>
       </w:r>
     </w:p>
     <w:p>
@@ -1146,7 +1146,7 @@
         <w:ind w:left="245" w:hanging="173"/>
       </w:pPr>
       <w:r>
-        <w:t>Conferred Existence. Long-form philosophical manuscript and archived corpus, 2026. doi.org/10.5281/zenodo.20773724</w:t>
+        <w:t>The Witnessing Spine. Archived research corpus, 2026. doi.org/10.5281/zenodo.20778927</w:t>
       </w:r>
     </w:p>
     <w:p>
@@ -1159,7 +1159,7 @@
         <w:ind w:left="245" w:hanging="173"/>
       </w:pPr>
       <w:r>
-        <w:t>Sourcehood Without a Source: The Arity Gap and the Free Will Debate. Philosophy paper, edition of 3 October 2026. doi.org/10.5281/zenodo.23126117</w:t>
+        <w:t>Conferred Existence. Long-form philosophical manuscript and archived corpus, 2026. doi.org/10.5281/zenodo.20773724</w:t>
       </w:r>
     </w:p>
     <w:p>
@@ -1172,7 +1172,7 @@
         <w:ind w:left="245" w:hanging="173"/>
       </w:pPr>
       <w:r>
-        <w:t>The Seam That Holds While It Is Crossed. Philosophy paper, edition of 3 October 2026. doi.org/10.5281/zenodo.23126357</w:t>
+        <w:t>Sourcehood Without a Source: The Arity Gap and the Free Will Debate. Philosophy paper, edition of 3 October 2026. doi.org/10.5281/zenodo.23126117</w:t>
       </w:r>
     </w:p>
     <w:p>
@@ -1185,7 +1185,7 @@
         <w:ind w:left="245" w:hanging="173"/>
       </w:pPr>
       <w:r>
-        <w:t>Self-Given Is Not Self-Grounding. Philosophy paper, edition of 3 October 2026. doi.org/10.5281/zenodo.23126458</w:t>
+        <w:t>The Seam That Holds While It Is Crossed. Philosophy paper, edition of 3 October 2026. doi.org/10.5281/zenodo.23126357</w:t>
       </w:r>
     </w:p>
     <w:p>
@@ -1198,6 +1198,19 @@
         <w:ind w:left="245" w:hanging="173"/>
       </w:pPr>
       <w:r>
+        <w:t>Self-Given Is Not Self-Grounding. Philosophy paper, edition of 3 October 2026. doi.org/10.5281/zenodo.23126458</w:t>
+      </w:r>
+    </w:p>
+    <w:p>
+      <w:pPr>
+        <w:pStyle w:val="ListBullet"/>
+        <w:keepNext w:val="0"/>
+        <w:keepLines/>
+        <w:widowControl/>
+        <w:spacing w:before="0" w:after="60" w:line="252" w:lineRule="exact"/>
+        <w:ind w:left="245" w:hanging="173"/>
+      </w:pPr>
+      <w:r>
         <w:t>The Conservation of Faithfulness. Working paper, edition of 3 October 2026. doi.org/10.5281/zenodo.23126484</w:t>
       </w:r>
     </w:p>
@@ -1232,7 +1245,7 @@
         <w:spacing w:before="0" w:after="60" w:line="252" w:lineRule="exact"/>
       </w:pPr>
       <w:r>
-        <w:t>Self-directed study in systems programming, compilers, graphics, color science, AI evaluation, epistemics, and philosophy of mind. Practical arboriculture and plant-science knowledge is grounded in field work, not a separately claimed professional license.</w:t>
+        <w:t>Self-directed study in systems programming, compilers, graphics, color science, AI evaluation, epistemics, and philosophy of mind. Practical arboriculture and plant-science knowledge comes from field work; no separate professional license is claimed.</w:t>
       </w:r>
     </w:p>
     <w:p>

</xml_diff>

<commit_message>
Refresh resumes and CV against October 7 evidence (#365)
* docs: refresh resumes and CV against October 7 evidence

* test: refresh reviewed career release fingerprint

---------

Co-authored-by: Zain Dana Harper <17142659+HarperZ9@users.noreply.github.com>
</commit_message>
<xml_diff>
--- a/career/Zain-Dana-Harper-CV.docx
+++ b/career/Zain-Dana-Harper-CV.docx
@@ -361,7 +361,7 @@
         <w:spacing w:before="0" w:after="60" w:line="252" w:lineRule="exact"/>
       </w:pPr>
       <w:r>
-        <w:t>Primary owned platform. The September 29, 2026 v1.1.2 release includes a Windows installer with a bundled engine. The source repository contains the Python runtime, Flutter desktop client, and browser fallback.</w:t>
+        <w:t>Primary owned platform. Flywheel v1.5.0, released October 4, 2026, includes a Windows installer with a bundled engine. The source repository contains the Python runtime, Flutter desktop client, and browser fallback.</w:t>
       </w:r>
     </w:p>
     <w:p>
@@ -418,293 +418,6 @@
     </w:p>
     <w:p>
       <w:pPr>
-        <w:pStyle w:val="Heading2"/>
-        <w:keepNext/>
-        <w:keepLines/>
-        <w:widowControl/>
-        <w:spacing w:before="100" w:after="40" w:line="256" w:lineRule="exact"/>
-      </w:pPr>
-      <w:r>
-        <w:t>Accountable Surface | Governed actions and computer-use adapters</w:t>
-      </w:r>
-    </w:p>
-    <w:p>
-      <w:pPr>
-        <w:keepNext w:val="0"/>
-        <w:keepLines/>
-        <w:widowControl/>
-        <w:spacing w:before="0" w:after="60" w:line="252" w:lineRule="exact"/>
-      </w:pPr>
-      <w:r>
-        <w:t>Built operator-granted action interfaces for filesystem, command, API, browser, and Windows UI Automation work. Actions carry explicit scope and postconditions; persisted journals preserve decisions and observed effects. Reversible adapters include restoration paths. Fake drivers make browser and desktop scenarios testable without uncontrolled live actions.</w:t>
-      </w:r>
-    </w:p>
-    <w:p>
-      <w:pPr>
-        <w:keepNext w:val="0"/>
-        <w:keepLines/>
-        <w:widowControl/>
-        <w:spacing w:before="0" w:after="60" w:line="252" w:lineRule="exact"/>
-      </w:pPr>
-      <w:r>
-        <w:t>The v0.2.0 release provides source and wheel artifacts on GitHub. The project remains alpha; browser integrations are optional and a tool refusal or unknown result is not promoted into a successful action.</w:t>
-      </w:r>
-    </w:p>
-    <w:p>
-      <w:pPr>
-        <w:pStyle w:val="Heading2"/>
-        <w:keepNext/>
-        <w:keepLines/>
-        <w:widowControl/>
-        <w:spacing w:before="100" w:after="40" w:line="256" w:lineRule="exact"/>
-      </w:pPr>
-      <w:r>
-        <w:t>Articulate | Writing analysis and accountable editing</w:t>
-      </w:r>
-    </w:p>
-    <w:p>
-      <w:pPr>
-        <w:keepNext w:val="0"/>
-        <w:keepLines/>
-        <w:widowControl/>
-        <w:spacing w:before="0" w:after="60" w:line="252" w:lineRule="exact"/>
-      </w:pPr>
-      <w:r>
-        <w:t>Built deterministic prose analysis with register, mode, and genre profiles, alongside optional model-assisted editing. Includes command-line, library, MCP, language-server, and SARIF surfaces; math-span protection preserves formulas during supported editing flows. Content-free audit receipts record checks without retaining the underlying prose. Version 0.5.2, released September 29, 2026, adds guarded host editing through local MCP and a released plugin.</w:t>
-      </w:r>
-    </w:p>
-    <w:p>
-      <w:pPr>
-        <w:pStyle w:val="Heading2"/>
-        <w:keepNext/>
-        <w:keepLines/>
-        <w:widowControl/>
-        <w:spacing w:before="100" w:after="40" w:line="256" w:lineRule="exact"/>
-      </w:pPr>
-      <w:r>
-        <w:t>Agent tools, memory, and coordination</w:t>
-      </w:r>
-    </w:p>
-    <w:p>
-      <w:pPr>
-        <w:keepNext w:val="0"/>
-        <w:keepLines/>
-        <w:widowControl/>
-        <w:spacing w:before="0" w:after="60" w:line="252" w:lineRule="exact"/>
-      </w:pPr>
-      <w:r>
-        <w:t>Relay supplies model-agnostic coding-agent tooling; Plexus connects tool interfaces; Mneme retains memories with source checks; Canon consolidates assistant instructions and context. Bulletin provides a signed-identity public message board. These systems contribute distinct capabilities to the larger platform rather than representing separate claims of deployment at customer scale.</w:t>
-      </w:r>
-    </w:p>
-    <w:p>
-      <w:pPr>
-        <w:pStyle w:val="Heading1"/>
-        <w:keepNext/>
-        <w:keepLines/>
-        <w:widowControl/>
-        <w:spacing w:before="120" w:after="60" w:line="280" w:lineRule="exact"/>
-      </w:pPr>
-      <w:r>
-        <w:t>Evaluation, Systems, and Security Engineering</w:t>
-      </w:r>
-    </w:p>
-    <w:p>
-      <w:pPr>
-        <w:pStyle w:val="Heading2"/>
-        <w:keepNext/>
-        <w:keepLines/>
-        <w:widowControl/>
-        <w:spacing w:before="100" w:after="40" w:line="256" w:lineRule="exact"/>
-      </w:pPr>
-      <w:r>
-        <w:t>Terminal State Fixtures and Crucible</w:t>
-      </w:r>
-    </w:p>
-    <w:p>
-      <w:pPr>
-        <w:keepNext w:val="0"/>
-        <w:keepLines/>
-        <w:widowControl/>
-        <w:spacing w:before="0" w:after="60" w:line="252" w:lineRule="exact"/>
-      </w:pPr>
-      <w:r>
-        <w:t>Built 324 exhaustive terminal-state fixtures and five synthetic component-evaluation families with 337 cases and 5,058 frozen expectations. Defined controls separate failed outputs, provider failures, and missing evidence from valid results. Executed a pinned METR count_odds interoperability check with three deterministic controls, preserving logs and score provenance through the Inspect-to-Flywheel handoff.</w:t>
-      </w:r>
-    </w:p>
-    <w:p>
-      <w:pPr>
-        <w:pStyle w:val="Heading2"/>
-        <w:keepNext/>
-        <w:keepLines/>
-        <w:widowControl/>
-        <w:spacing w:before="100" w:after="40" w:line="256" w:lineRule="exact"/>
-      </w:pPr>
-      <w:r>
-        <w:t>EMET | Byte-integrity witnessing</w:t>
-      </w:r>
-    </w:p>
-    <w:p>
-      <w:pPr>
-        <w:keepNext w:val="0"/>
-        <w:keepLines/>
-        <w:widowControl/>
-        <w:spacing w:before="0" w:after="60" w:line="252" w:lineRule="exact"/>
-      </w:pPr>
-      <w:r>
-        <w:t>Developed Python, Rust, Node, and Go implementations around shared conformance cases and portable verification records. The witness checks byte-level integrity, anchors, and source correspondence; it does not grant permission, certify semantic truth, or replace an operator decision. Cross-language checking makes implementation differences visible.</w:t>
-      </w:r>
-    </w:p>
-    <w:p>
-      <w:pPr>
-        <w:pStyle w:val="Heading2"/>
-        <w:keepNext/>
-        <w:keepLines/>
-        <w:widowControl/>
-        <w:spacing w:before="100" w:after="40" w:line="256" w:lineRule="exact"/>
-      </w:pPr>
-      <w:r>
-        <w:t>BuildLang | Rust compiler and developer tooling</w:t>
-      </w:r>
-    </w:p>
-    <w:p>
-      <w:pPr>
-        <w:keepNext w:val="0"/>
-        <w:keepLines/>
-        <w:widowControl/>
-        <w:spacing w:before="0" w:after="60" w:line="252" w:lineRule="exact"/>
-      </w:pPr>
-      <w:r>
-        <w:t>Developed a systems-language toolchain with typed capability effects, type inference, parser and intermediate-representation work, native C output, shader output, and language-server support. The compiler makes categories of ambient access visible to its type and build machinery. Experimental backends and linear-type work remain distinguished from the supported path.</w:t>
-      </w:r>
-    </w:p>
-    <w:p>
-      <w:pPr>
-        <w:pStyle w:val="Heading2"/>
-        <w:keepNext/>
-        <w:keepLines/>
-        <w:widowControl/>
-        <w:spacing w:before="100" w:after="40" w:line="256" w:lineRule="exact"/>
-      </w:pPr>
-      <w:r>
-        <w:t>Phantom | Hardware-identity inspection and reversible system changes</w:t>
-      </w:r>
-    </w:p>
-    <w:p>
-      <w:pPr>
-        <w:keepNext w:val="0"/>
-        <w:keepLines/>
-        <w:widowControl/>
-        <w:spacing w:before="0" w:after="60" w:line="252" w:lineRule="exact"/>
-      </w:pPr>
-      <w:r>
-        <w:t>Developed a Rust-based Windows and Linux utility with deterministic profiles, read-only audit, backup-before-write behavior, validation, restoration, and platform packages. The released v1.1.1 scope is userland-reversible identifiers. Kernel and firmware layers are modeled, not shipped.</w:t>
-      </w:r>
-    </w:p>
-    <w:p>
-      <w:pPr>
-        <w:pStyle w:val="Heading2"/>
-        <w:keepNext/>
-        <w:keepLines/>
-        <w:widowControl/>
-        <w:spacing w:before="100" w:after="40" w:line="256" w:lineRule="exact"/>
-      </w:pPr>
-      <w:r>
-        <w:t>Controlled assessment and operator tooling</w:t>
-      </w:r>
-    </w:p>
-    <w:p>
-      <w:pPr>
-        <w:keepNext w:val="0"/>
-        <w:keepLines/>
-        <w:widowControl/>
-        <w:spacing w:before="0" w:after="60" w:line="252" w:lineRule="exact"/>
-      </w:pPr>
-      <w:r>
-        <w:t>Private systems work includes Array for approval-gated assessment orchestration and containment records, Lab/Seed for controlled-lab fixtures and detection-engineering workflows, and Runtime/ORCA for local workspaces, reports, bundles, and release provenance. Public descriptions cover architecture and safe interfaces; private implementations, target material, and operational details are not published here.</w:t>
-      </w:r>
-    </w:p>
-    <w:p>
-      <w:pPr>
-        <w:pStyle w:val="Heading2"/>
-        <w:keepNext/>
-        <w:keepLines/>
-        <w:widowControl/>
-        <w:spacing w:before="100" w:after="40" w:line="256" w:lineRule="exact"/>
-      </w:pPr>
-      <w:r>
-        <w:t>Research intake and workspace tooling</w:t>
-      </w:r>
-    </w:p>
-    <w:p>
-      <w:pPr>
-        <w:keepNext w:val="0"/>
-        <w:keepLines/>
-        <w:widowControl/>
-        <w:spacing w:before="0" w:after="60" w:line="252" w:lineRule="exact"/>
-      </w:pPr>
-      <w:r>
-        <w:t>Built Gather for source-carrying research intake, Index for workspace and symbol maps, and Forum for model orchestration with recorded decisions. These tools make source selection, handoffs, and task context inspectable across a multi-repository product.</w:t>
-      </w:r>
-    </w:p>
-    <w:p>
-      <w:pPr>
-        <w:pStyle w:val="Heading1"/>
-        <w:keepNext/>
-        <w:keepLines/>
-        <w:widowControl/>
-        <w:spacing w:before="120" w:after="60" w:line="280" w:lineRule="exact"/>
-      </w:pPr>
-      <w:r>
-        <w:t>Graphics, Color, and Runtime Work</w:t>
-      </w:r>
-    </w:p>
-    <w:p>
-      <w:pPr>
-        <w:keepNext w:val="0"/>
-        <w:keepLines/>
-        <w:widowControl/>
-        <w:spacing w:before="0" w:after="60" w:line="252" w:lineRule="exact"/>
-      </w:pPr>
-      <w:r>
-        <w:t>Developed HLSL and C++ graphics and game-modding work spanning post-processing, Direct3D 11 integration, shader debugging, GPU traces, and shared-memory interfaces. Related public projects include Elder ENB, SkyrimBridge, ENB Runtime Core, Brender Archival, and Engine Revival. Existing engines and collaborators retain their own attribution.</w:t>
-      </w:r>
-    </w:p>
-    <w:p>
-      <w:pPr>
-        <w:keepNext w:val="0"/>
-        <w:keepLines/>
-        <w:widowControl/>
-        <w:spacing w:before="0" w:after="60" w:line="252" w:lineRule="exact"/>
-      </w:pPr>
-      <w:r>
-        <w:t>Color and creative-tool work includes Build Color, Calibrate Pro, Studio Engine, and browser-based studio/print surfaces: perceptual color spaces, color difference, HDR/tone-mapping tools, display characterization, and generative visual systems. These are engineering projects, not claims of professional calibration certification.</w:t>
-      </w:r>
-    </w:p>
-    <w:p>
-      <w:pPr>
-        <w:pStyle w:val="Heading1"/>
-        <w:keepNext/>
-        <w:keepLines/>
-        <w:widowControl/>
-        <w:spacing w:before="120" w:after="60" w:line="280" w:lineRule="exact"/>
-      </w:pPr>
-      <w:r>
-        <w:t>Selected Open-Source Contributions</w:t>
-      </w:r>
-    </w:p>
-    <w:p>
-      <w:pPr>
-        <w:keepNext w:val="0"/>
-        <w:keepLines/>
-        <w:widowControl/>
-        <w:spacing w:before="0" w:after="60" w:line="252" w:lineRule="exact"/>
-      </w:pPr>
-      <w:r>
-        <w:t>Six selected contributions merged across six external repositories, covering bug fixes, tests, and documentation. These are contributions, not employment; the broader record tracks merged, open, and closed without merge outcomes.</w:t>
-      </w:r>
-    </w:p>
-    <w:p>
-      <w:pPr>
         <w:pStyle w:val="ListBullet"/>
         <w:keepNext w:val="0"/>
         <w:keepLines/>
@@ -713,7 +426,294 @@
         <w:ind w:left="245" w:hanging="173"/>
       </w:pPr>
       <w:r>
-        <w:t>DeepEval #2822: fixed unhashable tool-output and nested-parameter failures in tool-correctness evaluation; merged July 2, 2026. github.com/confident-ai/deepeval/pull/2822</w:t>
+        <w:t>Released a monitor-admission check over 2,676 frozen items with six planted controls, a second independent math kernel, and signer-head anchoring. Release evidence reports no real monitor tested through the admission check and no installed signer; Windows anchoring was parse-checked only.</w:t>
+      </w:r>
+    </w:p>
+    <w:p>
+      <w:pPr>
+        <w:pStyle w:val="Heading2"/>
+        <w:keepNext/>
+        <w:keepLines/>
+        <w:widowControl/>
+        <w:spacing w:before="100" w:after="40" w:line="256" w:lineRule="exact"/>
+      </w:pPr>
+      <w:r>
+        <w:t>Accountable Surface | Governed actions and computer-use adapters</w:t>
+      </w:r>
+    </w:p>
+    <w:p>
+      <w:pPr>
+        <w:keepNext w:val="0"/>
+        <w:keepLines/>
+        <w:widowControl/>
+        <w:spacing w:before="0" w:after="60" w:line="252" w:lineRule="exact"/>
+      </w:pPr>
+      <w:r>
+        <w:t>Built operator-granted action interfaces for filesystem, command, API, browser, and Windows UI Automation work. Actions carry explicit scope and postconditions; persisted journals preserve decisions and observed effects. Reversible adapters include restoration paths. Fake drivers make browser and desktop scenarios testable without uncontrolled live actions.</w:t>
+      </w:r>
+    </w:p>
+    <w:p>
+      <w:pPr>
+        <w:keepNext w:val="0"/>
+        <w:keepLines/>
+        <w:widowControl/>
+        <w:spacing w:before="0" w:after="60" w:line="252" w:lineRule="exact"/>
+      </w:pPr>
+      <w:r>
+        <w:t>The v0.2.0 release provides source and wheel artifacts on GitHub. The project remains alpha; browser integrations are optional and a tool refusal or unknown result is not promoted into a successful action.</w:t>
+      </w:r>
+    </w:p>
+    <w:p>
+      <w:pPr>
+        <w:pStyle w:val="Heading2"/>
+        <w:keepNext/>
+        <w:keepLines/>
+        <w:widowControl/>
+        <w:spacing w:before="100" w:after="40" w:line="256" w:lineRule="exact"/>
+      </w:pPr>
+      <w:r>
+        <w:t>Articulate | Writing analysis and accountable editing</w:t>
+      </w:r>
+    </w:p>
+    <w:p>
+      <w:pPr>
+        <w:keepNext w:val="0"/>
+        <w:keepLines/>
+        <w:widowControl/>
+        <w:spacing w:before="0" w:after="60" w:line="252" w:lineRule="exact"/>
+      </w:pPr>
+      <w:r>
+        <w:t>Built deterministic prose analysis with profiles for register and genre, mode settings, and optional model-assisted editing. Includes command-line, library, MCP, language-server, and SARIF surfaces; math-span protection preserves formulas during supported editing flows. Content-free audit receipts record checks without retaining the underlying prose. Version 0.9.0, released October 3, 2026, adds project-specific writing rules, domain profiles, writing-process records, and reports of guarded edits. Detector rules retain the published v0.5.2 fingerprint.</w:t>
+      </w:r>
+    </w:p>
+    <w:p>
+      <w:pPr>
+        <w:pStyle w:val="Heading2"/>
+        <w:keepNext/>
+        <w:keepLines/>
+        <w:widowControl/>
+        <w:spacing w:before="100" w:after="40" w:line="256" w:lineRule="exact"/>
+      </w:pPr>
+      <w:r>
+        <w:t>Agent tools, memory, and coordination</w:t>
+      </w:r>
+    </w:p>
+    <w:p>
+      <w:pPr>
+        <w:keepNext w:val="0"/>
+        <w:keepLines/>
+        <w:widowControl/>
+        <w:spacing w:before="0" w:after="60" w:line="252" w:lineRule="exact"/>
+      </w:pPr>
+      <w:r>
+        <w:t>Relay supplies model-agnostic coding-agent tooling; Plexus connects tool interfaces; Mneme retains memories with source checks; Canon consolidates assistant instructions and context. Bulletin provides a signed-identity public message board. These systems contribute distinct capabilities to the larger platform. Customer-scale deployment is not established.</w:t>
+      </w:r>
+    </w:p>
+    <w:p>
+      <w:pPr>
+        <w:pStyle w:val="Heading1"/>
+        <w:keepNext/>
+        <w:keepLines/>
+        <w:widowControl/>
+        <w:spacing w:before="120" w:after="60" w:line="280" w:lineRule="exact"/>
+      </w:pPr>
+      <w:r>
+        <w:t>Evaluation, Systems, and Security Engineering</w:t>
+      </w:r>
+    </w:p>
+    <w:p>
+      <w:pPr>
+        <w:pStyle w:val="Heading2"/>
+        <w:keepNext/>
+        <w:keepLines/>
+        <w:widowControl/>
+        <w:spacing w:before="100" w:after="40" w:line="256" w:lineRule="exact"/>
+      </w:pPr>
+      <w:r>
+        <w:t>Terminal State Fixtures and Crucible</w:t>
+      </w:r>
+    </w:p>
+    <w:p>
+      <w:pPr>
+        <w:keepNext w:val="0"/>
+        <w:keepLines/>
+        <w:widowControl/>
+        <w:spacing w:before="0" w:after="60" w:line="252" w:lineRule="exact"/>
+      </w:pPr>
+      <w:r>
+        <w:t>Built 324 exhaustive terminal-state fixtures and five synthetic component-evaluation families with 337 cases and 5,058 frozen expectations. Defined controls separate failed outputs, provider failures, and missing evidence from valid results. Executed a pinned METR count_odds interoperability check with three deterministic controls, preserving logs and score provenance through the Inspect-to-Flywheel handoff.</w:t>
+      </w:r>
+    </w:p>
+    <w:p>
+      <w:pPr>
+        <w:pStyle w:val="Heading2"/>
+        <w:keepNext/>
+        <w:keepLines/>
+        <w:widowControl/>
+        <w:spacing w:before="100" w:after="40" w:line="256" w:lineRule="exact"/>
+      </w:pPr>
+      <w:r>
+        <w:t>EMET | Byte-integrity witnessing</w:t>
+      </w:r>
+    </w:p>
+    <w:p>
+      <w:pPr>
+        <w:keepNext w:val="0"/>
+        <w:keepLines/>
+        <w:widowControl/>
+        <w:spacing w:before="0" w:after="60" w:line="252" w:lineRule="exact"/>
+      </w:pPr>
+      <w:r>
+        <w:t>Developed Python, Rust, Node, and Go implementations around shared conformance cases and portable verification records. The witness checks byte-level integrity, anchors, and source correspondence; it does not grant permission, certify semantic truth, or replace an operator decision. Cross-language checking makes implementation differences visible.</w:t>
+      </w:r>
+    </w:p>
+    <w:p>
+      <w:pPr>
+        <w:pStyle w:val="Heading2"/>
+        <w:keepNext/>
+        <w:keepLines/>
+        <w:widowControl/>
+        <w:spacing w:before="100" w:after="40" w:line="256" w:lineRule="exact"/>
+      </w:pPr>
+      <w:r>
+        <w:t>BuildLang | Rust compiler and developer tooling</w:t>
+      </w:r>
+    </w:p>
+    <w:p>
+      <w:pPr>
+        <w:keepNext w:val="0"/>
+        <w:keepLines/>
+        <w:widowControl/>
+        <w:spacing w:before="0" w:after="60" w:line="252" w:lineRule="exact"/>
+      </w:pPr>
+      <w:r>
+        <w:t>Developed a systems-language toolchain with typed capability effects, type inference, parser and intermediate-representation work, native C output, shader output, and language-server support. The compiler makes categories of ambient access visible to its type and build machinery. Experimental backends and linear-type work remain distinguished from the supported path.</w:t>
+      </w:r>
+    </w:p>
+    <w:p>
+      <w:pPr>
+        <w:pStyle w:val="Heading2"/>
+        <w:keepNext/>
+        <w:keepLines/>
+        <w:widowControl/>
+        <w:spacing w:before="100" w:after="40" w:line="256" w:lineRule="exact"/>
+      </w:pPr>
+      <w:r>
+        <w:t>Phantom | Hardware-identity inspection and reversible system changes</w:t>
+      </w:r>
+    </w:p>
+    <w:p>
+      <w:pPr>
+        <w:keepNext w:val="0"/>
+        <w:keepLines/>
+        <w:widowControl/>
+        <w:spacing w:before="0" w:after="60" w:line="252" w:lineRule="exact"/>
+      </w:pPr>
+      <w:r>
+        <w:t>Developed a Rust-based Windows and Linux utility with deterministic profiles, read-only audit, backup-before-write behavior, validation, restoration, and platform packages. The released v1.1.1 scope is userland-reversible identifiers. Kernel and firmware layers are modeled, not shipped.</w:t>
+      </w:r>
+    </w:p>
+    <w:p>
+      <w:pPr>
+        <w:pStyle w:val="Heading2"/>
+        <w:keepNext/>
+        <w:keepLines/>
+        <w:widowControl/>
+        <w:spacing w:before="100" w:after="40" w:line="256" w:lineRule="exact"/>
+      </w:pPr>
+      <w:r>
+        <w:t>Controlled assessment and operator tooling</w:t>
+      </w:r>
+    </w:p>
+    <w:p>
+      <w:pPr>
+        <w:keepNext w:val="0"/>
+        <w:keepLines/>
+        <w:widowControl/>
+        <w:spacing w:before="0" w:after="60" w:line="252" w:lineRule="exact"/>
+      </w:pPr>
+      <w:r>
+        <w:t>Private systems work includes Array for approval-gated assessment orchestration and containment records, Lab/Seed for controlled-lab fixtures and detection-engineering workflows, and Runtime/ORCA for local workspaces, reports, bundles, and release provenance. Public descriptions cover architecture and safe interfaces; private implementations, target material, and operational details are not published here.</w:t>
+      </w:r>
+    </w:p>
+    <w:p>
+      <w:pPr>
+        <w:pStyle w:val="Heading2"/>
+        <w:keepNext/>
+        <w:keepLines/>
+        <w:widowControl/>
+        <w:spacing w:before="100" w:after="40" w:line="256" w:lineRule="exact"/>
+      </w:pPr>
+      <w:r>
+        <w:t>Research intake and workspace tooling</w:t>
+      </w:r>
+    </w:p>
+    <w:p>
+      <w:pPr>
+        <w:keepNext w:val="0"/>
+        <w:keepLines/>
+        <w:widowControl/>
+        <w:spacing w:before="0" w:after="60" w:line="252" w:lineRule="exact"/>
+      </w:pPr>
+      <w:r>
+        <w:t>Built Gather for source-carrying research intake, Index for workspace and symbol maps, and Forum for model orchestration with recorded decisions. These tools make source selection, handoffs, and task context inspectable across a multi-repository product.</w:t>
+      </w:r>
+    </w:p>
+    <w:p>
+      <w:pPr>
+        <w:pStyle w:val="Heading1"/>
+        <w:keepNext/>
+        <w:keepLines/>
+        <w:widowControl/>
+        <w:spacing w:before="120" w:after="60" w:line="280" w:lineRule="exact"/>
+      </w:pPr>
+      <w:r>
+        <w:t>Graphics, Color, and Runtime Work</w:t>
+      </w:r>
+    </w:p>
+    <w:p>
+      <w:pPr>
+        <w:keepNext w:val="0"/>
+        <w:keepLines/>
+        <w:widowControl/>
+        <w:spacing w:before="0" w:after="60" w:line="252" w:lineRule="exact"/>
+      </w:pPr>
+      <w:r>
+        <w:t>Developed HLSL and C++ graphics and game-modding work spanning post-processing, Direct3D 11 integration, shader debugging, GPU traces, and shared-memory interfaces. Related public projects include Elder ENB, SkyrimBridge, ENB Runtime Core, Brender Archival, and Engine Revival. Existing engines and collaborators retain their own attribution.</w:t>
+      </w:r>
+    </w:p>
+    <w:p>
+      <w:pPr>
+        <w:keepNext w:val="0"/>
+        <w:keepLines/>
+        <w:widowControl/>
+        <w:spacing w:before="0" w:after="60" w:line="252" w:lineRule="exact"/>
+      </w:pPr>
+      <w:r>
+        <w:t>Color and creative-tool work includes Build Color, Calibrate Pro, Studio Engine, and browser-based studio/print surfaces: perceptual color spaces, color difference, HDR/tone-mapping tools, display characterization, and generative visual systems. These are engineering projects, not claims of professional calibration certification.</w:t>
+      </w:r>
+    </w:p>
+    <w:p>
+      <w:pPr>
+        <w:pStyle w:val="Heading1"/>
+        <w:keepNext/>
+        <w:keepLines/>
+        <w:widowControl/>
+        <w:spacing w:before="120" w:after="60" w:line="280" w:lineRule="exact"/>
+      </w:pPr>
+      <w:r>
+        <w:t>Selected Open-Source Contributions</w:t>
+      </w:r>
+    </w:p>
+    <w:p>
+      <w:pPr>
+        <w:keepNext w:val="0"/>
+        <w:keepLines/>
+        <w:widowControl/>
+        <w:spacing w:before="0" w:after="60" w:line="252" w:lineRule="exact"/>
+      </w:pPr>
+      <w:r>
+        <w:t>Six selected contributions merged across six external repositories, covering bug fixes, tests, and documentation. These are contributions, not employment; the broader record tracks merged, open, and closed without merge outcomes.</w:t>
       </w:r>
     </w:p>
     <w:p>
@@ -726,7 +726,7 @@
         <w:ind w:left="245" w:hanging="173"/>
       </w:pPr>
       <w:r>
-        <w:t>TOMLKit #549: preserved dotted-key siblings when replacing a value with an array of tables; merged July 14, 2026. github.com/python-poetry/tomlkit/pull/549</w:t>
+        <w:t>DeepEval #2822: fixed unhashable tool-output and nested-parameter failures in tool-correctness evaluation; merged July 2, 2026. github.com/confident-ai/deepeval/pull/2822</w:t>
       </w:r>
     </w:p>
     <w:p>
@@ -739,7 +739,7 @@
         <w:ind w:left="245" w:hanging="173"/>
       </w:pPr>
       <w:r>
-        <w:t>Datasette #2815: corrected malformed composite-key requests from HTTP 500 or incorrect HTTP 200 to HTTP 400; tested too few and too many key components in HTML and JSON. Merged July 7, 2026. github.com/simonw/datasette/pull/2815</w:t>
+        <w:t>TOMLKit #549: preserved dotted-key siblings when replacing a value with an array of tables; merged July 14, 2026. github.com/python-poetry/tomlkit/pull/549</w:t>
       </w:r>
     </w:p>
     <w:p>
@@ -752,7 +752,7 @@
         <w:ind w:left="245" w:hanging="173"/>
       </w:pPr>
       <w:r>
-        <w:t>Free Law Project #820: documented runnable database-free fast tests; merged August 25, 2026. github.com/freelawproject/litigant-portal/pull/820</w:t>
+        <w:t>Datasette #2815: corrected malformed composite-key requests from HTTP 500 or incorrect HTTP 200 to HTTP 400; tested too few and too many key components in HTML and JSON. Merged July 7, 2026. github.com/simonw/datasette/pull/2815</w:t>
       </w:r>
     </w:p>
     <w:p>
@@ -765,7 +765,7 @@
         <w:ind w:left="245" w:hanging="173"/>
       </w:pPr>
       <w:r>
-        <w:t>Hebbian Robotics #157: tested reserved-column drift against the actual queryable episode schema; merged August 25, 2026. github.com/Hebbian-Robotics/hflow/pull/157</w:t>
+        <w:t>Free Law Project #820: documented runnable database-free fast tests; merged August 25, 2026. github.com/freelawproject/litigant-portal/pull/820</w:t>
       </w:r>
     </w:p>
     <w:p>
@@ -778,258 +778,7 @@
         <w:ind w:left="245" w:hanging="173"/>
       </w:pPr>
       <w:r>
-        <w:t>Voxwire #44: added offline regression coverage for a six-event degraded voice turn, matching saved PCM audio and JSONL records to emitted events. Merged August 15, 2026. github.com/vectorvoyager358/voxwire/pull/44</w:t>
-      </w:r>
-    </w:p>
-    <w:p>
-      <w:pPr>
-        <w:pStyle w:val="Heading1"/>
-        <w:keepNext/>
-        <w:keepLines/>
-        <w:widowControl/>
-        <w:spacing w:before="120" w:after="60" w:line="280" w:lineRule="exact"/>
-      </w:pPr>
-      <w:r>
-        <w:t>Technical Competencies</w:t>
-      </w:r>
-    </w:p>
-    <w:p>
-      <w:pPr>
-        <w:keepNext w:val="0"/>
-        <w:keepLines/>
-        <w:widowControl/>
-        <w:spacing w:before="0" w:after="60" w:line="252" w:lineRule="exact"/>
-      </w:pPr>
-      <w:r>
-        <w:t>Languages and runtimes: Python, Rust, C++, Dart/Flutter, TypeScript/JavaScript, Lua, HLSL, C#, PowerShell, and Bash. Additional cross-language conformance work includes Go and Node implementations.</w:t>
-      </w:r>
-    </w:p>
-    <w:p>
-      <w:pPr>
-        <w:keepNext w:val="0"/>
-        <w:keepLines/>
-        <w:widowControl/>
-        <w:spacing w:before="0" w:after="60" w:line="252" w:lineRule="exact"/>
-      </w:pPr>
-      <w:r>
-        <w:t>AI infrastructure and quality: multi-provider/local-model routing, tool-use loops, task decomposition, MCP, evaluation design, deterministic fixtures, regression testing, worker/verifier separation, failure analysis, and terminal-state scoring.</w:t>
-      </w:r>
-    </w:p>
-    <w:p>
-      <w:pPr>
-        <w:keepNext w:val="0"/>
-        <w:keepLines/>
-        <w:widowControl/>
-        <w:spacing w:before="0" w:after="60" w:line="252" w:lineRule="exact"/>
-      </w:pPr>
-      <w:r>
-        <w:t>Verification and controlled actions: capability effects, operator grants, action envelopes, source provenance, hash-chained journals, offline replay, scoped postconditions, conformance suites, and release evidence.</w:t>
-      </w:r>
-    </w:p>
-    <w:p>
-      <w:pPr>
-        <w:keepNext w:val="0"/>
-        <w:keepLines/>
-        <w:widowControl/>
-        <w:spacing w:before="0" w:after="60" w:line="252" w:lineRule="exact"/>
-      </w:pPr>
-      <w:r>
-        <w:t>Software delivery: Git/GitHub, GitHub Actions, Python packaging, command-line design, Windows/Linux installers, CMake, test automation, static websites, release documentation, and checksums.</w:t>
-      </w:r>
-    </w:p>
-    <w:p>
-      <w:pPr>
-        <w:keepNext w:val="0"/>
-        <w:keepLines/>
-        <w:widowControl/>
-        <w:spacing w:before="0" w:after="60" w:line="252" w:lineRule="exact"/>
-      </w:pPr>
-      <w:r>
-        <w:t>Graphics and domain knowledge: D3D11/HLSL, shader and runtime debugging, color-space and tone-mapping work, GPU instrumentation, shared-memory interfaces, and applied arboriculture/horticulture from field practice.</w:t>
-      </w:r>
-    </w:p>
-    <w:p>
-      <w:pPr>
-        <w:pStyle w:val="Heading1"/>
-        <w:keepNext/>
-        <w:keepLines/>
-        <w:widowControl/>
-        <w:spacing w:before="120" w:after="60" w:line="280" w:lineRule="exact"/>
-      </w:pPr>
-      <w:r>
-        <w:t>Working Practice</w:t>
-      </w:r>
-    </w:p>
-    <w:p>
-      <w:pPr>
-        <w:keepNext w:val="0"/>
-        <w:keepLines/>
-        <w:widowControl/>
-        <w:spacing w:before="0" w:after="60" w:line="252" w:lineRule="exact"/>
-      </w:pPr>
-      <w:r>
-        <w:t>AI-assisted development is part of the workflow. Architecture, integration, source review, test design, release decisions, and responsibility for the submitted work remain mine. Public examples separate observed results from interpretation and retain negative or inconclusive findings rather than treating every completed run as success.</w:t>
-      </w:r>
-    </w:p>
-    <w:p>
-      <w:pPr>
-        <w:pStyle w:val="Heading1"/>
-        <w:keepNext/>
-        <w:keepLines/>
-        <w:widowControl/>
-        <w:spacing w:before="120" w:after="60" w:line="280" w:lineRule="exact"/>
-      </w:pPr>
-      <w:r>
-        <w:t>Research Agenda</w:t>
-      </w:r>
-    </w:p>
-    <w:p>
-      <w:pPr>
-        <w:keepNext w:val="0"/>
-        <w:keepLines/>
-        <w:widowControl/>
-        <w:spacing w:before="0" w:after="60" w:line="252" w:lineRule="exact"/>
-      </w:pPr>
-      <w:r>
-        <w:t>My independent research examines evidence that another person or system can check without inheriting an AI system's authority. Work includes evaluation provenance and verifier independence; live-state drift; proof-carrying actions; memory, uncertainty, and behavior; and human authorization for consequential actions. Robotics is a research interest.</w:t>
-      </w:r>
-    </w:p>
-    <w:p>
-      <w:pPr>
-        <w:pStyle w:val="Heading1"/>
-        <w:keepNext/>
-        <w:keepLines/>
-        <w:widowControl/>
-        <w:spacing w:before="120" w:after="60" w:line="280" w:lineRule="exact"/>
-      </w:pPr>
-      <w:r>
-        <w:t>AI Accountability, Disclosure, and Public-Interest Writing</w:t>
-      </w:r>
-    </w:p>
-    <w:p>
-      <w:pPr>
-        <w:keepNext w:val="0"/>
-        <w:keepLines/>
-        <w:widowControl/>
-        <w:spacing w:before="0" w:after="60" w:line="252" w:lineRule="exact"/>
-      </w:pPr>
-      <w:r>
-        <w:t>Independent essays on AI accountability, disclosure, conflicts of interest, and human consequences, relevant to public-interest and whistleblower-protection work.</w:t>
-      </w:r>
-    </w:p>
-    <w:p>
-      <w:pPr>
-        <w:pStyle w:val="Heading2"/>
-        <w:keepNext/>
-        <w:keepLines/>
-        <w:widowControl/>
-        <w:spacing w:before="100" w:after="40" w:line="256" w:lineRule="exact"/>
-      </w:pPr>
-      <w:r>
-        <w:t>Who Knew First</w:t>
-      </w:r>
-    </w:p>
-    <w:p>
-      <w:pPr>
-        <w:keepNext w:val="0"/>
-        <w:keepLines/>
-        <w:widowControl/>
-        <w:spacing w:before="0" w:after="60" w:line="252" w:lineRule="exact"/>
-      </w:pPr>
-      <w:r>
-        <w:t>September 2026. Directed and published an AI-assisted investigation comparing disclosure timelines, evidence access, institutional incentives, and evaluator conflicts across nine reported AI-agent incidents. Separates source claims, inference, and unresolved attribution. harperz9.github.io/who-knew-first.html</w:t>
-      </w:r>
-    </w:p>
-    <w:p>
-      <w:pPr>
-        <w:pStyle w:val="Heading2"/>
-        <w:keepNext/>
-        <w:keepLines/>
-        <w:widowControl/>
-        <w:spacing w:before="100" w:after="40" w:line="256" w:lineRule="exact"/>
-      </w:pPr>
-      <w:r>
-        <w:t>An Open Letter on Checking the Machines</w:t>
-      </w:r>
-    </w:p>
-    <w:p>
-      <w:pPr>
-        <w:keepNext w:val="0"/>
-        <w:keepLines/>
-        <w:widowControl/>
-        <w:spacing w:before="0" w:after="60" w:line="252" w:lineRule="exact"/>
-      </w:pPr>
-      <w:r>
-        <w:t>September 2026. Proposed contestable AI decisions, repeatable evidence checks, and accountable responses to objections. harperz9.github.io/checking-the-machines.html</w:t>
-      </w:r>
-    </w:p>
-    <w:p>
-      <w:pPr>
-        <w:pStyle w:val="Heading2"/>
-        <w:keepNext/>
-        <w:keepLines/>
-        <w:widowControl/>
-        <w:spacing w:before="100" w:after="40" w:line="256" w:lineRule="exact"/>
-      </w:pPr>
-      <w:r>
-        <w:t>Borrowed Ground</w:t>
-      </w:r>
-    </w:p>
-    <w:p>
-      <w:pPr>
-        <w:keepNext w:val="0"/>
-        <w:keepLines/>
-        <w:widowControl/>
-        <w:spacing w:before="0" w:after="60" w:line="252" w:lineRule="exact"/>
-      </w:pPr>
-      <w:r>
-        <w:t>September 2026. Philosophical essay connecting human interdependence to responsibility, privacy, participation, and the limits of technical evidence as authority over people. Substantial AI assistance disclosed. harperz9.github.io/borrowed-ground.html</w:t>
-      </w:r>
-    </w:p>
-    <w:p>
-      <w:pPr>
-        <w:pStyle w:val="Heading2"/>
-        <w:keepNext/>
-        <w:keepLines/>
-        <w:widowControl/>
-        <w:spacing w:before="100" w:after="40" w:line="256" w:lineRule="exact"/>
-      </w:pPr>
-      <w:r>
-        <w:t>The Sandbox Was Never Just a Box</w:t>
-      </w:r>
-    </w:p>
-    <w:p>
-      <w:pPr>
-        <w:keepNext w:val="0"/>
-        <w:keepLines/>
-        <w:widowControl/>
-        <w:spacing w:before="0" w:after="60" w:line="252" w:lineRule="exact"/>
-      </w:pPr>
-      <w:r>
-        <w:t>September 2026. Compared public security reports to examine shared-service exposure and the independence of logs, monitors, and scorers in AI-agent evaluation. harperz9.github.io/the-sandbox-was-never-just-a-box.html</w:t>
-      </w:r>
-    </w:p>
-    <w:p>
-      <w:pPr>
-        <w:pStyle w:val="Heading1"/>
-        <w:keepNext/>
-        <w:keepLines/>
-        <w:widowControl/>
-        <w:spacing w:before="120" w:after="60" w:line="280" w:lineRule="exact"/>
-      </w:pPr>
-      <w:r>
-        <w:t>Selected Publications and Research Records</w:t>
-      </w:r>
-    </w:p>
-    <w:p>
-      <w:pPr>
-        <w:keepNext w:val="0"/>
-        <w:keepLines/>
-        <w:widowControl/>
-        <w:spacing w:before="0" w:after="60" w:line="252" w:lineRule="exact"/>
-      </w:pPr>
-      <w:r>
-        <w:t>Independent systems papers, preprints, research notes, philosophy papers, a working paper, and archived manuscripts with DOI records. These records are not peer reviewed. An archived philosophical manuscript is not an awarded academic degree.</w:t>
+        <w:t>Hebbian Robotics #157: tested reserved-column drift against the actual queryable episode schema; merged August 25, 2026. github.com/Hebbian-Robotics/hflow/pull/157</w:t>
       </w:r>
     </w:p>
     <w:p>
@@ -1042,7 +791,258 @@
         <w:ind w:left="245" w:hanging="173"/>
       </w:pPr>
       <w:r>
-        <w:t>EMET: An Authority-Incapable Byte-Level Integrity Witness. Systems paper, 2026. Byte-integrity witnessing and the separation of observation from authority. doi.org/10.5281/zenodo.21230267</w:t>
+        <w:t>Voxwire #44: added offline regression coverage for a six-event degraded voice turn, matching saved PCM audio and JSONL records to emitted events. Merged August 15, 2026. github.com/vectorvoyager358/voxwire/pull/44</w:t>
+      </w:r>
+    </w:p>
+    <w:p>
+      <w:pPr>
+        <w:pStyle w:val="Heading1"/>
+        <w:keepNext/>
+        <w:keepLines/>
+        <w:widowControl/>
+        <w:spacing w:before="120" w:after="60" w:line="280" w:lineRule="exact"/>
+      </w:pPr>
+      <w:r>
+        <w:t>Technical Competencies</w:t>
+      </w:r>
+    </w:p>
+    <w:p>
+      <w:pPr>
+        <w:keepNext w:val="0"/>
+        <w:keepLines/>
+        <w:widowControl/>
+        <w:spacing w:before="0" w:after="60" w:line="252" w:lineRule="exact"/>
+      </w:pPr>
+      <w:r>
+        <w:t>Languages and runtimes: Python, Rust, C++, Dart/Flutter, TypeScript/JavaScript, Lua, HLSL, C#, PowerShell, and Bash. Additional cross-language conformance work includes Go and Node implementations.</w:t>
+      </w:r>
+    </w:p>
+    <w:p>
+      <w:pPr>
+        <w:keepNext w:val="0"/>
+        <w:keepLines/>
+        <w:widowControl/>
+        <w:spacing w:before="0" w:after="60" w:line="252" w:lineRule="exact"/>
+      </w:pPr>
+      <w:r>
+        <w:t>AI infrastructure and quality: multi-provider/local-model routing, tool-use loops, task decomposition, MCP, evaluation design, deterministic fixtures, regression testing, worker/verifier separation, failure analysis, and terminal-state scoring.</w:t>
+      </w:r>
+    </w:p>
+    <w:p>
+      <w:pPr>
+        <w:keepNext w:val="0"/>
+        <w:keepLines/>
+        <w:widowControl/>
+        <w:spacing w:before="0" w:after="60" w:line="252" w:lineRule="exact"/>
+      </w:pPr>
+      <w:r>
+        <w:t>Verification and controlled actions: capability effects, operator grants, action envelopes, source provenance, hash-chained journals, offline replay, scoped postconditions, conformance suites, and release evidence.</w:t>
+      </w:r>
+    </w:p>
+    <w:p>
+      <w:pPr>
+        <w:keepNext w:val="0"/>
+        <w:keepLines/>
+        <w:widowControl/>
+        <w:spacing w:before="0" w:after="60" w:line="252" w:lineRule="exact"/>
+      </w:pPr>
+      <w:r>
+        <w:t>Software delivery: Git/GitHub, GitHub Actions, Python packaging, command-line design, Windows/Linux installers, CMake, test automation, static websites, release documentation, and checksums.</w:t>
+      </w:r>
+    </w:p>
+    <w:p>
+      <w:pPr>
+        <w:keepNext w:val="0"/>
+        <w:keepLines/>
+        <w:widowControl/>
+        <w:spacing w:before="0" w:after="60" w:line="252" w:lineRule="exact"/>
+      </w:pPr>
+      <w:r>
+        <w:t>Graphics and domain knowledge: D3D11/HLSL, shader and runtime debugging, color-space and tone-mapping work, GPU instrumentation, shared-memory interfaces, and applied arboriculture/horticulture from field practice.</w:t>
+      </w:r>
+    </w:p>
+    <w:p>
+      <w:pPr>
+        <w:pStyle w:val="Heading1"/>
+        <w:keepNext/>
+        <w:keepLines/>
+        <w:widowControl/>
+        <w:spacing w:before="120" w:after="60" w:line="280" w:lineRule="exact"/>
+      </w:pPr>
+      <w:r>
+        <w:t>Working Practice</w:t>
+      </w:r>
+    </w:p>
+    <w:p>
+      <w:pPr>
+        <w:keepNext w:val="0"/>
+        <w:keepLines/>
+        <w:widowControl/>
+        <w:spacing w:before="0" w:after="60" w:line="252" w:lineRule="exact"/>
+      </w:pPr>
+      <w:r>
+        <w:t>AI-assisted development is part of the workflow. Architecture, integration, source review, test design, release decisions, and responsibility for the submitted work remain mine. Public examples separate observed results from interpretation and retain negative or inconclusive findings. A completed run alone does not establish success.</w:t>
+      </w:r>
+    </w:p>
+    <w:p>
+      <w:pPr>
+        <w:pStyle w:val="Heading1"/>
+        <w:keepNext/>
+        <w:keepLines/>
+        <w:widowControl/>
+        <w:spacing w:before="120" w:after="60" w:line="280" w:lineRule="exact"/>
+      </w:pPr>
+      <w:r>
+        <w:t>Research Agenda</w:t>
+      </w:r>
+    </w:p>
+    <w:p>
+      <w:pPr>
+        <w:keepNext w:val="0"/>
+        <w:keepLines/>
+        <w:widowControl/>
+        <w:spacing w:before="0" w:after="60" w:line="252" w:lineRule="exact"/>
+      </w:pPr>
+      <w:r>
+        <w:t>My independent research examines evidence that another person or system can check without inheriting an AI system's authority. Work includes evaluation provenance and verifier independence; live-state drift; proof-carrying actions; memory, uncertainty, and behavior; and human authorization for consequential actions. Robotics is a research interest.</w:t>
+      </w:r>
+    </w:p>
+    <w:p>
+      <w:pPr>
+        <w:pStyle w:val="Heading1"/>
+        <w:keepNext/>
+        <w:keepLines/>
+        <w:widowControl/>
+        <w:spacing w:before="120" w:after="60" w:line="280" w:lineRule="exact"/>
+      </w:pPr>
+      <w:r>
+        <w:t>AI Accountability, Disclosure, and Public-Interest Writing</w:t>
+      </w:r>
+    </w:p>
+    <w:p>
+      <w:pPr>
+        <w:keepNext w:val="0"/>
+        <w:keepLines/>
+        <w:widowControl/>
+        <w:spacing w:before="0" w:after="60" w:line="252" w:lineRule="exact"/>
+      </w:pPr>
+      <w:r>
+        <w:t>Independent essays on AI accountability, disclosure, conflicts of interest, and human consequences, relevant to public-interest and whistleblower-protection work.</w:t>
+      </w:r>
+    </w:p>
+    <w:p>
+      <w:pPr>
+        <w:pStyle w:val="Heading2"/>
+        <w:keepNext/>
+        <w:keepLines/>
+        <w:widowControl/>
+        <w:spacing w:before="100" w:after="40" w:line="256" w:lineRule="exact"/>
+      </w:pPr>
+      <w:r>
+        <w:t>Who Knew First</w:t>
+      </w:r>
+    </w:p>
+    <w:p>
+      <w:pPr>
+        <w:keepNext w:val="0"/>
+        <w:keepLines/>
+        <w:widowControl/>
+        <w:spacing w:before="0" w:after="60" w:line="252" w:lineRule="exact"/>
+      </w:pPr>
+      <w:r>
+        <w:t>September 2026. Directed and published an AI-assisted investigation comparing disclosure timelines, evidence access, institutional incentives, and evaluator conflicts across nine reported AI-agent incidents. Separates source claims, inference, and unresolved attribution. harperz9.github.io/who-knew-first.html</w:t>
+      </w:r>
+    </w:p>
+    <w:p>
+      <w:pPr>
+        <w:pStyle w:val="Heading2"/>
+        <w:keepNext/>
+        <w:keepLines/>
+        <w:widowControl/>
+        <w:spacing w:before="100" w:after="40" w:line="256" w:lineRule="exact"/>
+      </w:pPr>
+      <w:r>
+        <w:t>An Open Letter on Checking the Machines</w:t>
+      </w:r>
+    </w:p>
+    <w:p>
+      <w:pPr>
+        <w:keepNext w:val="0"/>
+        <w:keepLines/>
+        <w:widowControl/>
+        <w:spacing w:before="0" w:after="60" w:line="252" w:lineRule="exact"/>
+      </w:pPr>
+      <w:r>
+        <w:t>September 2026. Proposed contestable AI decisions, repeatable evidence checks, and accountable responses to objections. harperz9.github.io/checking-the-machines.html</w:t>
+      </w:r>
+    </w:p>
+    <w:p>
+      <w:pPr>
+        <w:pStyle w:val="Heading2"/>
+        <w:keepNext/>
+        <w:keepLines/>
+        <w:widowControl/>
+        <w:spacing w:before="100" w:after="40" w:line="256" w:lineRule="exact"/>
+      </w:pPr>
+      <w:r>
+        <w:t>Borrowed Ground</w:t>
+      </w:r>
+    </w:p>
+    <w:p>
+      <w:pPr>
+        <w:keepNext w:val="0"/>
+        <w:keepLines/>
+        <w:widowControl/>
+        <w:spacing w:before="0" w:after="60" w:line="252" w:lineRule="exact"/>
+      </w:pPr>
+      <w:r>
+        <w:t>September 2026. Philosophical essay connecting human interdependence to responsibility, privacy, participation, and the limits of technical evidence as authority over people. Substantial AI assistance disclosed. harperz9.github.io/borrowed-ground.html</w:t>
+      </w:r>
+    </w:p>
+    <w:p>
+      <w:pPr>
+        <w:pStyle w:val="Heading2"/>
+        <w:keepNext/>
+        <w:keepLines/>
+        <w:widowControl/>
+        <w:spacing w:before="100" w:after="40" w:line="256" w:lineRule="exact"/>
+      </w:pPr>
+      <w:r>
+        <w:t>The Sandbox Was Never Just a Box</w:t>
+      </w:r>
+    </w:p>
+    <w:p>
+      <w:pPr>
+        <w:keepNext w:val="0"/>
+        <w:keepLines/>
+        <w:widowControl/>
+        <w:spacing w:before="0" w:after="60" w:line="252" w:lineRule="exact"/>
+      </w:pPr>
+      <w:r>
+        <w:t>September 2026. Compared public security reports to examine shared-service exposure and the independence of logs, monitors, and scorers in AI-agent evaluation. harperz9.github.io/the-sandbox-was-never-just-a-box.html</w:t>
+      </w:r>
+    </w:p>
+    <w:p>
+      <w:pPr>
+        <w:pStyle w:val="Heading1"/>
+        <w:keepNext/>
+        <w:keepLines/>
+        <w:widowControl/>
+        <w:spacing w:before="120" w:after="60" w:line="280" w:lineRule="exact"/>
+      </w:pPr>
+      <w:r>
+        <w:t>Selected Publications and Research Records</w:t>
+      </w:r>
+    </w:p>
+    <w:p>
+      <w:pPr>
+        <w:keepNext w:val="0"/>
+        <w:keepLines/>
+        <w:widowControl/>
+        <w:spacing w:before="0" w:after="60" w:line="252" w:lineRule="exact"/>
+      </w:pPr>
+      <w:r>
+        <w:t>Independent systems papers, preprints, research notes, philosophy papers, a working paper, and archived manuscripts with DOI records. These records are not peer reviewed. An archived philosophical manuscript is not an awarded academic degree.</w:t>
       </w:r>
     </w:p>
     <w:p>
@@ -1055,7 +1055,7 @@
         <w:ind w:left="245" w:hanging="173"/>
       </w:pPr>
       <w:r>
-        <w:t>BuildLang: Accountable Compute via Typed Capability Effects. Systems paper, 2026. Capability effects and accountable compilation. doi.org/10.5281/zenodo.21231253</w:t>
+        <w:t>EMET: An Authority-Incapable Byte-Level Integrity Witness. Systems paper, 2026. Byte-integrity witnessing and the separation of observation from authority. doi.org/10.5281/zenodo.21230267</w:t>
       </w:r>
     </w:p>
     <w:p>
@@ -1068,7 +1068,7 @@
         <w:ind w:left="245" w:hanging="173"/>
       </w:pPr>
       <w:r>
-        <w:t>Witnessed Independence: Recording Whether a Verifier Graded Its Own Work. Preprint, 2026. doi.org/10.5281/zenodo.21232206</w:t>
+        <w:t>BuildLang: Accountable Compute via Typed Capability Effects. Systems paper, 2026. Capability effects and accountable compilation. doi.org/10.5281/zenodo.21231253</w:t>
       </w:r>
     </w:p>
     <w:p>
@@ -1081,7 +1081,7 @@
         <w:ind w:left="245" w:hanging="173"/>
       </w:pPr>
       <w:r>
-        <w:t>Proof Packets: A Derive-Don't-Trust Envelope for Accountable Agent Actions. Preprint, 2026. doi.org/10.5281/zenodo.21231406</w:t>
+        <w:t>Witnessed Independence: Recording Whether a Verifier Graded Its Own Work. Preprint, 2026. doi.org/10.5281/zenodo.21232206</w:t>
       </w:r>
     </w:p>
     <w:p>
@@ -1094,7 +1094,7 @@
         <w:ind w:left="245" w:hanging="173"/>
       </w:pPr>
       <w:r>
-        <w:t>The Personhood-Gate Handoff. Research note, 2026. doi.org/10.5281/zenodo.21234475</w:t>
+        <w:t>Proof Packets: A Derive-Don't-Trust Envelope for Accountable Agent Actions. Preprint, 2026. doi.org/10.5281/zenodo.21231406</w:t>
       </w:r>
     </w:p>
     <w:p>
@@ -1107,7 +1107,7 @@
         <w:ind w:left="245" w:hanging="173"/>
       </w:pPr>
       <w:r>
-        <w:t>Re-Perceived Effects. Research note, 2026. doi.org/10.5281/zenodo.21231311</w:t>
+        <w:t>The Personhood-Gate Handoff. Research note, 2026. doi.org/10.5281/zenodo.21234475</w:t>
       </w:r>
     </w:p>
     <w:p>
@@ -1120,7 +1120,7 @@
         <w:ind w:left="245" w:hanging="173"/>
       </w:pPr>
       <w:r>
-        <w:t>Faithfulness to a Named Criterion Is the Conserved Quantity Across Lossy Substrates. Research note, 2026. doi.org/10.5281/zenodo.22768398</w:t>
+        <w:t>Re-Perceived Effects. Research note, 2026. doi.org/10.5281/zenodo.21231311</w:t>
       </w:r>
     </w:p>
     <w:p>
@@ -1133,7 +1133,7 @@
         <w:ind w:left="245" w:hanging="173"/>
       </w:pPr>
       <w:r>
-        <w:t>The Witnessing Spine. Archived research corpus, 2026. doi.org/10.5281/zenodo.20778927</w:t>
+        <w:t>Faithfulness to a Named Criterion Is the Conserved Quantity Across Lossy Substrates. Research note, 2026. doi.org/10.5281/zenodo.22768398</w:t>
       </w:r>
     </w:p>
     <w:p>
@@ -1146,7 +1146,7 @@
         <w:ind w:left="245" w:hanging="173"/>
       </w:pPr>
       <w:r>
-        <w:t>Conferred Existence. Long-form philosophical manuscript and archived corpus, 2026. doi.org/10.5281/zenodo.20773724</w:t>
+        <w:t>The Witnessing Spine. Archived research corpus, 2026. doi.org/10.5281/zenodo.20778927</w:t>
       </w:r>
     </w:p>
     <w:p>
@@ -1159,7 +1159,7 @@
         <w:ind w:left="245" w:hanging="173"/>
       </w:pPr>
       <w:r>
-        <w:t>Sourcehood Without a Source: The Arity Gap and the Free Will Debate. Philosophy paper, edition of 3 October 2026. doi.org/10.5281/zenodo.23126117</w:t>
+        <w:t>Conferred Existence. Long-form philosophical manuscript and archived corpus, 2026. doi.org/10.5281/zenodo.20773724</w:t>
       </w:r>
     </w:p>
     <w:p>
@@ -1172,7 +1172,7 @@
         <w:ind w:left="245" w:hanging="173"/>
       </w:pPr>
       <w:r>
-        <w:t>The Seam That Holds While It Is Crossed. Philosophy paper, edition of 3 October 2026. doi.org/10.5281/zenodo.23126357</w:t>
+        <w:t>Sourcehood Without a Source: The Arity Gap and the Free Will Debate. Philosophy paper, edition of 3 October 2026. doi.org/10.5281/zenodo.23126117</w:t>
       </w:r>
     </w:p>
     <w:p>
@@ -1185,7 +1185,7 @@
         <w:ind w:left="245" w:hanging="173"/>
       </w:pPr>
       <w:r>
-        <w:t>Self-Given Is Not Self-Grounding. Philosophy paper, edition of 3 October 2026. doi.org/10.5281/zenodo.23126458</w:t>
+        <w:t>The Seam That Holds While It Is Crossed. Philosophy paper, edition of 3 October 2026. doi.org/10.5281/zenodo.23126357</w:t>
       </w:r>
     </w:p>
     <w:p>
@@ -1198,6 +1198,19 @@
         <w:ind w:left="245" w:hanging="173"/>
       </w:pPr>
       <w:r>
+        <w:t>Self-Given Is Not Self-Grounding. Philosophy paper, edition of 3 October 2026. doi.org/10.5281/zenodo.23126458</w:t>
+      </w:r>
+    </w:p>
+    <w:p>
+      <w:pPr>
+        <w:pStyle w:val="ListBullet"/>
+        <w:keepNext w:val="0"/>
+        <w:keepLines/>
+        <w:widowControl/>
+        <w:spacing w:before="0" w:after="60" w:line="252" w:lineRule="exact"/>
+        <w:ind w:left="245" w:hanging="173"/>
+      </w:pPr>
+      <w:r>
         <w:t>The Conservation of Faithfulness. Working paper, edition of 3 October 2026. doi.org/10.5281/zenodo.23126484</w:t>
       </w:r>
     </w:p>
@@ -1232,7 +1245,7 @@
         <w:spacing w:before="0" w:after="60" w:line="252" w:lineRule="exact"/>
       </w:pPr>
       <w:r>
-        <w:t>Self-directed study in systems programming, compilers, graphics, color science, AI evaluation, epistemics, and philosophy of mind. Practical arboriculture and plant-science knowledge is grounded in field work, not a separately claimed professional license.</w:t>
+        <w:t>Self-directed study in systems programming, compilers, graphics, color science, AI evaluation, epistemics, and philosophy of mind. Practical arboriculture and plant-science knowledge comes from field work; no separate professional license is claimed.</w:t>
       </w:r>
     </w:p>
     <w:p>

</xml_diff>

<commit_message>
docs: refresh resumes and CV against October 23 releases
Record Flywheel 1.9.0 (PyPI flywheel-verify), Articulate 0.14.0 (PyPI
articulate-writing), Daylight Commons 3.0.0, BuildLang 1.7.0 and 1.8.0
(crates.io), raw-native 0.8.0 and the October 23 Gather, Crucible, EMET
and Canon releases, each with its release limits and a source-ledger
entry. Regenerate the text, PDF and DOCX exports at source epoch
2026-10-23 and record the release review.

Refresh the open-source census. pr_census now excludes organizations the
author administers, read from GitHub at run time, so a pull request into
the author's own organization no longer counts as upstream work.

Co-Authored-By: Claude Opus 5.5 <noreply@anthropic.com>
</commit_message>
<xml_diff>
--- a/career/Zain-Dana-Harper-CV.docx
+++ b/career/Zain-Dana-Harper-CV.docx
@@ -361,7 +361,7 @@
         <w:spacing w:before="0" w:after="60" w:line="252" w:lineRule="exact"/>
       </w:pPr>
       <w:r>
-        <w:t>Primary owned platform. Flywheel v1.5.0, released October 4, 2026, includes a Windows installer with a bundled engine. The source repository contains the Python runtime, Flutter desktop client, and browser fallback.</w:t>
+        <w:t>Primary owned platform. Flywheel v1.9.0, released October 15, 2026, is published on PyPI as flywheel-verify, installs through Homebrew or Scoop, and ships a Windows installer with a bundled engine. The source repository contains the Python runtime, Flutter desktop client, and browser fallback.</w:t>
       </w:r>
     </w:p>
     <w:p>
@@ -431,293 +431,6 @@
     </w:p>
     <w:p>
       <w:pPr>
-        <w:pStyle w:val="Heading2"/>
-        <w:keepNext/>
-        <w:keepLines/>
-        <w:widowControl/>
-        <w:spacing w:before="100" w:after="40" w:line="256" w:lineRule="exact"/>
-      </w:pPr>
-      <w:r>
-        <w:t>Accountable Surface | Governed actions and computer-use adapters</w:t>
-      </w:r>
-    </w:p>
-    <w:p>
-      <w:pPr>
-        <w:keepNext w:val="0"/>
-        <w:keepLines/>
-        <w:widowControl/>
-        <w:spacing w:before="0" w:after="60" w:line="252" w:lineRule="exact"/>
-      </w:pPr>
-      <w:r>
-        <w:t>Built operator-granted action interfaces for filesystem, command, API, browser, and Windows UI Automation work. Actions carry explicit scope and postconditions; persisted journals preserve decisions and observed effects. Reversible adapters include restoration paths. Fake drivers make browser and desktop scenarios testable without uncontrolled live actions.</w:t>
-      </w:r>
-    </w:p>
-    <w:p>
-      <w:pPr>
-        <w:keepNext w:val="0"/>
-        <w:keepLines/>
-        <w:widowControl/>
-        <w:spacing w:before="0" w:after="60" w:line="252" w:lineRule="exact"/>
-      </w:pPr>
-      <w:r>
-        <w:t>The v0.2.0 release provides source and wheel artifacts on GitHub. The project remains alpha; browser integrations are optional and a tool refusal or unknown result is not promoted into a successful action.</w:t>
-      </w:r>
-    </w:p>
-    <w:p>
-      <w:pPr>
-        <w:pStyle w:val="Heading2"/>
-        <w:keepNext/>
-        <w:keepLines/>
-        <w:widowControl/>
-        <w:spacing w:before="100" w:after="40" w:line="256" w:lineRule="exact"/>
-      </w:pPr>
-      <w:r>
-        <w:t>Articulate | Writing analysis and accountable editing</w:t>
-      </w:r>
-    </w:p>
-    <w:p>
-      <w:pPr>
-        <w:keepNext w:val="0"/>
-        <w:keepLines/>
-        <w:widowControl/>
-        <w:spacing w:before="0" w:after="60" w:line="252" w:lineRule="exact"/>
-      </w:pPr>
-      <w:r>
-        <w:t>Built deterministic prose analysis with profiles for register and genre, mode settings, and optional model-assisted editing. Includes command-line, library, MCP, language-server, and SARIF surfaces; math-span protection preserves formulas during supported editing flows. Content-free audit receipts record checks without retaining the underlying prose. Version 0.9.0, released October 3, 2026, adds project-specific writing rules, domain profiles, writing-process records, and reports of guarded edits. Detector rules retain the published v0.5.2 fingerprint.</w:t>
-      </w:r>
-    </w:p>
-    <w:p>
-      <w:pPr>
-        <w:pStyle w:val="Heading2"/>
-        <w:keepNext/>
-        <w:keepLines/>
-        <w:widowControl/>
-        <w:spacing w:before="100" w:after="40" w:line="256" w:lineRule="exact"/>
-      </w:pPr>
-      <w:r>
-        <w:t>Agent tools, memory, and coordination</w:t>
-      </w:r>
-    </w:p>
-    <w:p>
-      <w:pPr>
-        <w:keepNext w:val="0"/>
-        <w:keepLines/>
-        <w:widowControl/>
-        <w:spacing w:before="0" w:after="60" w:line="252" w:lineRule="exact"/>
-      </w:pPr>
-      <w:r>
-        <w:t>Relay supplies model-agnostic coding-agent tooling; Plexus connects tool interfaces; Mneme retains memories with source checks; Canon consolidates assistant instructions and context. Bulletin provides a signed-identity public message board. These systems contribute distinct capabilities to the larger platform. Customer-scale deployment is not established.</w:t>
-      </w:r>
-    </w:p>
-    <w:p>
-      <w:pPr>
-        <w:pStyle w:val="Heading1"/>
-        <w:keepNext/>
-        <w:keepLines/>
-        <w:widowControl/>
-        <w:spacing w:before="120" w:after="60" w:line="280" w:lineRule="exact"/>
-      </w:pPr>
-      <w:r>
-        <w:t>Evaluation, Systems, and Security Engineering</w:t>
-      </w:r>
-    </w:p>
-    <w:p>
-      <w:pPr>
-        <w:pStyle w:val="Heading2"/>
-        <w:keepNext/>
-        <w:keepLines/>
-        <w:widowControl/>
-        <w:spacing w:before="100" w:after="40" w:line="256" w:lineRule="exact"/>
-      </w:pPr>
-      <w:r>
-        <w:t>Terminal State Fixtures and Crucible</w:t>
-      </w:r>
-    </w:p>
-    <w:p>
-      <w:pPr>
-        <w:keepNext w:val="0"/>
-        <w:keepLines/>
-        <w:widowControl/>
-        <w:spacing w:before="0" w:after="60" w:line="252" w:lineRule="exact"/>
-      </w:pPr>
-      <w:r>
-        <w:t>Built 324 exhaustive terminal-state fixtures and five synthetic component-evaluation families with 337 cases and 5,058 frozen expectations. Defined controls separate failed outputs, provider failures, and missing evidence from valid results. Executed a pinned METR count_odds interoperability check with three deterministic controls, preserving logs and score provenance through the Inspect-to-Flywheel handoff.</w:t>
-      </w:r>
-    </w:p>
-    <w:p>
-      <w:pPr>
-        <w:pStyle w:val="Heading2"/>
-        <w:keepNext/>
-        <w:keepLines/>
-        <w:widowControl/>
-        <w:spacing w:before="100" w:after="40" w:line="256" w:lineRule="exact"/>
-      </w:pPr>
-      <w:r>
-        <w:t>EMET | Byte-integrity witnessing</w:t>
-      </w:r>
-    </w:p>
-    <w:p>
-      <w:pPr>
-        <w:keepNext w:val="0"/>
-        <w:keepLines/>
-        <w:widowControl/>
-        <w:spacing w:before="0" w:after="60" w:line="252" w:lineRule="exact"/>
-      </w:pPr>
-      <w:r>
-        <w:t>Developed Python, Rust, Node, and Go implementations around shared conformance cases and portable verification records. The witness checks byte-level integrity, anchors, and source correspondence; it does not grant permission, certify semantic truth, or replace an operator decision. Cross-language checking makes implementation differences visible.</w:t>
-      </w:r>
-    </w:p>
-    <w:p>
-      <w:pPr>
-        <w:pStyle w:val="Heading2"/>
-        <w:keepNext/>
-        <w:keepLines/>
-        <w:widowControl/>
-        <w:spacing w:before="100" w:after="40" w:line="256" w:lineRule="exact"/>
-      </w:pPr>
-      <w:r>
-        <w:t>BuildLang | Rust compiler and developer tooling</w:t>
-      </w:r>
-    </w:p>
-    <w:p>
-      <w:pPr>
-        <w:keepNext w:val="0"/>
-        <w:keepLines/>
-        <w:widowControl/>
-        <w:spacing w:before="0" w:after="60" w:line="252" w:lineRule="exact"/>
-      </w:pPr>
-      <w:r>
-        <w:t>Developed a systems-language toolchain with typed capability effects, type inference, parser and intermediate-representation work, native C output, shader output, and language-server support. The compiler makes categories of ambient access visible to its type and build machinery. Experimental backends and linear-type work remain distinguished from the supported path.</w:t>
-      </w:r>
-    </w:p>
-    <w:p>
-      <w:pPr>
-        <w:pStyle w:val="Heading2"/>
-        <w:keepNext/>
-        <w:keepLines/>
-        <w:widowControl/>
-        <w:spacing w:before="100" w:after="40" w:line="256" w:lineRule="exact"/>
-      </w:pPr>
-      <w:r>
-        <w:t>Phantom | Hardware-identity inspection and reversible system changes</w:t>
-      </w:r>
-    </w:p>
-    <w:p>
-      <w:pPr>
-        <w:keepNext w:val="0"/>
-        <w:keepLines/>
-        <w:widowControl/>
-        <w:spacing w:before="0" w:after="60" w:line="252" w:lineRule="exact"/>
-      </w:pPr>
-      <w:r>
-        <w:t>Developed a Rust-based Windows and Linux utility with deterministic profiles, read-only audit, backup-before-write behavior, validation, restoration, and platform packages. The released v1.1.1 scope is userland-reversible identifiers. Kernel and firmware layers are modeled, not shipped.</w:t>
-      </w:r>
-    </w:p>
-    <w:p>
-      <w:pPr>
-        <w:pStyle w:val="Heading2"/>
-        <w:keepNext/>
-        <w:keepLines/>
-        <w:widowControl/>
-        <w:spacing w:before="100" w:after="40" w:line="256" w:lineRule="exact"/>
-      </w:pPr>
-      <w:r>
-        <w:t>Controlled assessment and operator tooling</w:t>
-      </w:r>
-    </w:p>
-    <w:p>
-      <w:pPr>
-        <w:keepNext w:val="0"/>
-        <w:keepLines/>
-        <w:widowControl/>
-        <w:spacing w:before="0" w:after="60" w:line="252" w:lineRule="exact"/>
-      </w:pPr>
-      <w:r>
-        <w:t>Private systems work includes Array for approval-gated assessment orchestration and containment records, Lab/Seed for controlled-lab fixtures and detection-engineering workflows, and Runtime/ORCA for local workspaces, reports, bundles, and release provenance. Public descriptions cover architecture and safe interfaces; private implementations, target material, and operational details are not published here.</w:t>
-      </w:r>
-    </w:p>
-    <w:p>
-      <w:pPr>
-        <w:pStyle w:val="Heading2"/>
-        <w:keepNext/>
-        <w:keepLines/>
-        <w:widowControl/>
-        <w:spacing w:before="100" w:after="40" w:line="256" w:lineRule="exact"/>
-      </w:pPr>
-      <w:r>
-        <w:t>Research intake and workspace tooling</w:t>
-      </w:r>
-    </w:p>
-    <w:p>
-      <w:pPr>
-        <w:keepNext w:val="0"/>
-        <w:keepLines/>
-        <w:widowControl/>
-        <w:spacing w:before="0" w:after="60" w:line="252" w:lineRule="exact"/>
-      </w:pPr>
-      <w:r>
-        <w:t>Built Gather for source-carrying research intake, Index for workspace and symbol maps, and Forum for model orchestration with recorded decisions. These tools make source selection, handoffs, and task context inspectable across a multi-repository product.</w:t>
-      </w:r>
-    </w:p>
-    <w:p>
-      <w:pPr>
-        <w:pStyle w:val="Heading1"/>
-        <w:keepNext/>
-        <w:keepLines/>
-        <w:widowControl/>
-        <w:spacing w:before="120" w:after="60" w:line="280" w:lineRule="exact"/>
-      </w:pPr>
-      <w:r>
-        <w:t>Graphics, Color, and Runtime Work</w:t>
-      </w:r>
-    </w:p>
-    <w:p>
-      <w:pPr>
-        <w:keepNext w:val="0"/>
-        <w:keepLines/>
-        <w:widowControl/>
-        <w:spacing w:before="0" w:after="60" w:line="252" w:lineRule="exact"/>
-      </w:pPr>
-      <w:r>
-        <w:t>Developed HLSL and C++ graphics and game-modding work spanning post-processing, Direct3D 11 integration, shader debugging, GPU traces, and shared-memory interfaces. Related public projects include Elder ENB, SkyrimBridge, ENB Runtime Core, Brender Archival, and Engine Revival. Existing engines and collaborators retain their own attribution.</w:t>
-      </w:r>
-    </w:p>
-    <w:p>
-      <w:pPr>
-        <w:keepNext w:val="0"/>
-        <w:keepLines/>
-        <w:widowControl/>
-        <w:spacing w:before="0" w:after="60" w:line="252" w:lineRule="exact"/>
-      </w:pPr>
-      <w:r>
-        <w:t>Color and creative-tool work includes Build Color, Calibrate Pro, Studio Engine, and browser-based studio/print surfaces: perceptual color spaces, color difference, HDR/tone-mapping tools, display characterization, and generative visual systems. These are engineering projects, not claims of professional calibration certification.</w:t>
-      </w:r>
-    </w:p>
-    <w:p>
-      <w:pPr>
-        <w:pStyle w:val="Heading1"/>
-        <w:keepNext/>
-        <w:keepLines/>
-        <w:widowControl/>
-        <w:spacing w:before="120" w:after="60" w:line="280" w:lineRule="exact"/>
-      </w:pPr>
-      <w:r>
-        <w:t>Selected Open-Source Contributions</w:t>
-      </w:r>
-    </w:p>
-    <w:p>
-      <w:pPr>
-        <w:keepNext w:val="0"/>
-        <w:keepLines/>
-        <w:widowControl/>
-        <w:spacing w:before="0" w:after="60" w:line="252" w:lineRule="exact"/>
-      </w:pPr>
-      <w:r>
-        <w:t>Six selected contributions merged across six external repositories, covering bug fixes, tests, and documentation. These are contributions, not employment; the broader record tracks merged, open, and closed without merge outcomes.</w:t>
-      </w:r>
-    </w:p>
-    <w:p>
-      <w:pPr>
         <w:pStyle w:val="ListBullet"/>
         <w:keepNext w:val="0"/>
         <w:keepLines/>
@@ -726,7 +439,328 @@
         <w:ind w:left="245" w:hanging="173"/>
       </w:pPr>
       <w:r>
-        <w:t>DeepEval #2822: fixed unhashable tool-output and nested-parameter failures in tool-correctness evaluation; merged July 2, 2026. github.com/confident-ai/deepeval/pull/2822</w:t>
+        <w:t>Added behavior-check in v1.9.0: it replays 13 scripted sessions on two builds and names the first event that differs. On a corpus written before it ran, it flagged 20 of 20 planted behavior changes and 0 of 50 unchanged pairs. These checks used a scripted model on Windows; no hosted model was called.</w:t>
+      </w:r>
+    </w:p>
+    <w:p>
+      <w:pPr>
+        <w:pStyle w:val="Heading2"/>
+        <w:keepNext/>
+        <w:keepLines/>
+        <w:widowControl/>
+        <w:spacing w:before="100" w:after="40" w:line="256" w:lineRule="exact"/>
+      </w:pPr>
+      <w:r>
+        <w:t>Accountable Surface | Governed actions and computer-use adapters</w:t>
+      </w:r>
+    </w:p>
+    <w:p>
+      <w:pPr>
+        <w:keepNext w:val="0"/>
+        <w:keepLines/>
+        <w:widowControl/>
+        <w:spacing w:before="0" w:after="60" w:line="252" w:lineRule="exact"/>
+      </w:pPr>
+      <w:r>
+        <w:t>Built operator-granted action interfaces for filesystem, command, API, browser, and Windows UI Automation work. Actions carry explicit scope and postconditions; persisted journals preserve decisions and observed effects. Reversible adapters include restoration paths. Fake drivers make browser and desktop scenarios testable without uncontrolled live actions.</w:t>
+      </w:r>
+    </w:p>
+    <w:p>
+      <w:pPr>
+        <w:keepNext w:val="0"/>
+        <w:keepLines/>
+        <w:widowControl/>
+        <w:spacing w:before="0" w:after="60" w:line="252" w:lineRule="exact"/>
+      </w:pPr>
+      <w:r>
+        <w:t>The v0.2.0 release provides source and wheel artifacts on GitHub. The project remains alpha; browser integrations are optional and a tool refusal or unknown result is not promoted into a successful action.</w:t>
+      </w:r>
+    </w:p>
+    <w:p>
+      <w:pPr>
+        <w:pStyle w:val="Heading2"/>
+        <w:keepNext/>
+        <w:keepLines/>
+        <w:widowControl/>
+        <w:spacing w:before="100" w:after="40" w:line="256" w:lineRule="exact"/>
+      </w:pPr>
+      <w:r>
+        <w:t>Articulate | Writing analysis and accountable editing</w:t>
+      </w:r>
+    </w:p>
+    <w:p>
+      <w:pPr>
+        <w:keepNext w:val="0"/>
+        <w:keepLines/>
+        <w:widowControl/>
+        <w:spacing w:before="0" w:after="60" w:line="252" w:lineRule="exact"/>
+      </w:pPr>
+      <w:r>
+        <w:t>Built deterministic prose analysis with profiles for register and genre, mode settings, and optional model-assisted editing. Includes command-line, library, MCP, language-server, and SARIF surfaces; math-span protection preserves formulas during supported editing flows. Content-free audit receipts record checks without retaining the underlying prose. Version 0.14.0, released October 23, 2026 and published on PyPI as articulate-writing, masks Markdown structure before the detector rules run. On 3,000 Markdown files the masks removed 5,123 findings on table separator rows and added none; the detector rules and their fingerprint did not change.</w:t>
+      </w:r>
+    </w:p>
+    <w:p>
+      <w:pPr>
+        <w:pStyle w:val="Heading2"/>
+        <w:keepNext/>
+        <w:keepLines/>
+        <w:widowControl/>
+        <w:spacing w:before="100" w:after="40" w:line="256" w:lineRule="exact"/>
+      </w:pPr>
+      <w:r>
+        <w:t>Daylight Commons | Browser extension for checkable evidence</w:t>
+      </w:r>
+    </w:p>
+    <w:p>
+      <w:pPr>
+        <w:keepNext w:val="0"/>
+        <w:keepLines/>
+        <w:widowControl/>
+        <w:spacing w:before="0" w:after="60" w:line="252" w:lineRule="exact"/>
+      </w:pPr>
+      <w:r>
+        <w:t>Built a browser extension that shows the sourced evidence behind replies on X, Reddit, YouTube, Bluesky, Mastodon, and other sites. Each sign names its source and states what it does not prove; the extension never labels an account a bot and runs with no server, account, or analytics. Version 3.0.0, released October 23, 2026 under AGPL-3.0, stores evidence lookups as a hash-chained file that a command-line tool verifies offline. No Mozilla-signed build exists yet, and most signs have no measured precision.</w:t>
+      </w:r>
+    </w:p>
+    <w:p>
+      <w:pPr>
+        <w:pStyle w:val="Heading2"/>
+        <w:keepNext/>
+        <w:keepLines/>
+        <w:widowControl/>
+        <w:spacing w:before="100" w:after="40" w:line="256" w:lineRule="exact"/>
+      </w:pPr>
+      <w:r>
+        <w:t>Agent tools, memory, and coordination</w:t>
+      </w:r>
+    </w:p>
+    <w:p>
+      <w:pPr>
+        <w:keepNext w:val="0"/>
+        <w:keepLines/>
+        <w:widowControl/>
+        <w:spacing w:before="0" w:after="60" w:line="252" w:lineRule="exact"/>
+      </w:pPr>
+      <w:r>
+        <w:t>Relay supplies model-agnostic coding-agent tooling; Plexus connects tool interfaces; Mneme retains memories with source checks; Canon consolidates assistant instructions and context. Bulletin provides a signed-identity public message board. These systems contribute distinct capabilities to the larger platform. Customer-scale deployment is not established.</w:t>
+      </w:r>
+    </w:p>
+    <w:p>
+      <w:pPr>
+        <w:pStyle w:val="Heading1"/>
+        <w:keepNext/>
+        <w:keepLines/>
+        <w:widowControl/>
+        <w:spacing w:before="120" w:after="60" w:line="280" w:lineRule="exact"/>
+      </w:pPr>
+      <w:r>
+        <w:t>Evaluation, Systems, and Security Engineering</w:t>
+      </w:r>
+    </w:p>
+    <w:p>
+      <w:pPr>
+        <w:pStyle w:val="Heading2"/>
+        <w:keepNext/>
+        <w:keepLines/>
+        <w:widowControl/>
+        <w:spacing w:before="100" w:after="40" w:line="256" w:lineRule="exact"/>
+      </w:pPr>
+      <w:r>
+        <w:t>Terminal State Fixtures and Crucible</w:t>
+      </w:r>
+    </w:p>
+    <w:p>
+      <w:pPr>
+        <w:keepNext w:val="0"/>
+        <w:keepLines/>
+        <w:widowControl/>
+        <w:spacing w:before="0" w:after="60" w:line="252" w:lineRule="exact"/>
+      </w:pPr>
+      <w:r>
+        <w:t>Built 324 exhaustive terminal-state fixtures and five synthetic component-evaluation families with 337 cases and 5,058 frozen expectations. Defined controls separate failed outputs, provider failures, and missing evidence from valid results. Executed a pinned METR count_odds interoperability check with three deterministic controls, preserving logs and score provenance through the Inspect-to-Flywheel handoff.</w:t>
+      </w:r>
+    </w:p>
+    <w:p>
+      <w:pPr>
+        <w:pStyle w:val="Heading2"/>
+        <w:keepNext/>
+        <w:keepLines/>
+        <w:widowControl/>
+        <w:spacing w:before="100" w:after="40" w:line="256" w:lineRule="exact"/>
+      </w:pPr>
+      <w:r>
+        <w:t>EMET | Byte-integrity witnessing</w:t>
+      </w:r>
+    </w:p>
+    <w:p>
+      <w:pPr>
+        <w:keepNext w:val="0"/>
+        <w:keepLines/>
+        <w:widowControl/>
+        <w:spacing w:before="0" w:after="60" w:line="252" w:lineRule="exact"/>
+      </w:pPr>
+      <w:r>
+        <w:t>Developed Python, Rust, Node, and Go implementations around shared conformance cases and portable verification records. The witness checks byte-level integrity, anchors, and source correspondence; it does not grant permission, certify semantic truth, or replace an operator decision. Cross-language checking makes implementation differences visible.</w:t>
+      </w:r>
+    </w:p>
+    <w:p>
+      <w:pPr>
+        <w:pStyle w:val="Heading2"/>
+        <w:keepNext/>
+        <w:keepLines/>
+        <w:widowControl/>
+        <w:spacing w:before="100" w:after="40" w:line="256" w:lineRule="exact"/>
+      </w:pPr>
+      <w:r>
+        <w:t>BuildLang | Rust compiler and developer tooling</w:t>
+      </w:r>
+    </w:p>
+    <w:p>
+      <w:pPr>
+        <w:keepNext w:val="0"/>
+        <w:keepLines/>
+        <w:widowControl/>
+        <w:spacing w:before="0" w:after="60" w:line="252" w:lineRule="exact"/>
+      </w:pPr>
+      <w:r>
+        <w:t>Developed a systems-language toolchain with typed capability effects, type inference, parser and intermediate-representation work, native C output, shader output, and language-server support. The compiler makes categories of ambient access visible to its type and build machinery. Version 1.8.0, published to crates.io on October 23, 2026, adds Box&lt;T&gt; and recursive types. For 1.7.0, 27 held-out tasks were sealed by hash first; two fresh agents scored 20 and 17 of 27, short of the 22 set in advance, and each failure class became an issue.</w:t>
+      </w:r>
+    </w:p>
+    <w:p>
+      <w:pPr>
+        <w:pStyle w:val="Heading2"/>
+        <w:keepNext/>
+        <w:keepLines/>
+        <w:widowControl/>
+        <w:spacing w:before="100" w:after="40" w:line="256" w:lineRule="exact"/>
+      </w:pPr>
+      <w:r>
+        <w:t>Phantom | Hardware-identity inspection and reversible system changes</w:t>
+      </w:r>
+    </w:p>
+    <w:p>
+      <w:pPr>
+        <w:keepNext w:val="0"/>
+        <w:keepLines/>
+        <w:widowControl/>
+        <w:spacing w:before="0" w:after="60" w:line="252" w:lineRule="exact"/>
+      </w:pPr>
+      <w:r>
+        <w:t>Developed a Rust-based Windows and Linux utility with deterministic profiles, read-only audit, backup-before-write behavior, validation, restoration, and platform packages. The released v1.1.1 scope is userland-reversible identifiers. Kernel and firmware layers are modeled, not shipped.</w:t>
+      </w:r>
+    </w:p>
+    <w:p>
+      <w:pPr>
+        <w:pStyle w:val="Heading2"/>
+        <w:keepNext/>
+        <w:keepLines/>
+        <w:widowControl/>
+        <w:spacing w:before="100" w:after="40" w:line="256" w:lineRule="exact"/>
+      </w:pPr>
+      <w:r>
+        <w:t>Controlled assessment and operator tooling</w:t>
+      </w:r>
+    </w:p>
+    <w:p>
+      <w:pPr>
+        <w:keepNext w:val="0"/>
+        <w:keepLines/>
+        <w:widowControl/>
+        <w:spacing w:before="0" w:after="60" w:line="252" w:lineRule="exact"/>
+      </w:pPr>
+      <w:r>
+        <w:t>Private systems work includes Array for approval-gated assessment orchestration and containment records, Lab/Seed for controlled-lab fixtures and detection-engineering workflows, and Runtime/ORCA for local workspaces, reports, bundles, and release provenance. Public descriptions cover architecture and safe interfaces; private implementations, target material, and operational details are not published here.</w:t>
+      </w:r>
+    </w:p>
+    <w:p>
+      <w:pPr>
+        <w:pStyle w:val="Heading2"/>
+        <w:keepNext/>
+        <w:keepLines/>
+        <w:widowControl/>
+        <w:spacing w:before="100" w:after="40" w:line="256" w:lineRule="exact"/>
+      </w:pPr>
+      <w:r>
+        <w:t>Research intake and workspace tooling</w:t>
+      </w:r>
+    </w:p>
+    <w:p>
+      <w:pPr>
+        <w:keepNext w:val="0"/>
+        <w:keepLines/>
+        <w:widowControl/>
+        <w:spacing w:before="0" w:after="60" w:line="252" w:lineRule="exact"/>
+      </w:pPr>
+      <w:r>
+        <w:t>Built Gather for source-carrying research intake, Index for workspace and symbol maps, and Forum for model orchestration with recorded decisions. These tools make source selection, handoffs, and task context inspectable across a multi-repository product. On October 23, 2026, Gather 2.4.0, Crucible 1.6.0, and EMET 1.3.1 shipped to PyPI and Canon 0.7.0 to GitHub, each documented with a checked first run, a comparison with adjacent tools, and stated limits.</w:t>
+      </w:r>
+    </w:p>
+    <w:p>
+      <w:pPr>
+        <w:pStyle w:val="Heading1"/>
+        <w:keepNext/>
+        <w:keepLines/>
+        <w:widowControl/>
+        <w:spacing w:before="120" w:after="60" w:line="280" w:lineRule="exact"/>
+      </w:pPr>
+      <w:r>
+        <w:t>Graphics, Color, and Runtime Work</w:t>
+      </w:r>
+    </w:p>
+    <w:p>
+      <w:pPr>
+        <w:keepNext w:val="0"/>
+        <w:keepLines/>
+        <w:widowControl/>
+        <w:spacing w:before="0" w:after="60" w:line="252" w:lineRule="exact"/>
+      </w:pPr>
+      <w:r>
+        <w:t>Developed HLSL and C++ graphics and game-modding work spanning post-processing, Direct3D 11 integration, shader debugging, GPU traces, and shared-memory interfaces. Related public projects include Elder ENB, SkyrimBridge, ENB Runtime Core, Brender Archival, and Engine Revival. Existing engines and collaborators retain their own attribution.</w:t>
+      </w:r>
+    </w:p>
+    <w:p>
+      <w:pPr>
+        <w:keepNext w:val="0"/>
+        <w:keepLines/>
+        <w:widowControl/>
+        <w:spacing w:before="0" w:after="60" w:line="252" w:lineRule="exact"/>
+      </w:pPr>
+      <w:r>
+        <w:t>raw-native is a C++ renderer that draws each scene on a CPU reference and on the GPU through D3D12 or WebGPU, then writes a certificate stating whether the two agree within committed tolerances. Version 0.8.0, released October 14, 2026, produced byte-identical default renders from its Windows, D3D12, Linux, and WebAssembly builds and passed 60 of 60 tests with MSVC and GCC. No hardware-GPU render was checked for that release; Vulkan is an optional hardware probe, not a render backend.</w:t>
+      </w:r>
+    </w:p>
+    <w:p>
+      <w:pPr>
+        <w:keepNext w:val="0"/>
+        <w:keepLines/>
+        <w:widowControl/>
+        <w:spacing w:before="0" w:after="60" w:line="252" w:lineRule="exact"/>
+      </w:pPr>
+      <w:r>
+        <w:t>Color and creative-tool work includes Build Color, Calibrate Pro, Studio Engine, and browser-based studio/print surfaces: perceptual color spaces, color difference, HDR/tone-mapping tools, display characterization, and generative visual systems. These are engineering projects, not claims of professional calibration certification.</w:t>
+      </w:r>
+    </w:p>
+    <w:p>
+      <w:pPr>
+        <w:pStyle w:val="Heading1"/>
+        <w:keepNext/>
+        <w:keepLines/>
+        <w:widowControl/>
+        <w:spacing w:before="120" w:after="60" w:line="280" w:lineRule="exact"/>
+      </w:pPr>
+      <w:r>
+        <w:t>Selected Open-Source Contributions</w:t>
+      </w:r>
+    </w:p>
+    <w:p>
+      <w:pPr>
+        <w:keepNext w:val="0"/>
+        <w:keepLines/>
+        <w:widowControl/>
+        <w:spacing w:before="0" w:after="60" w:line="252" w:lineRule="exact"/>
+      </w:pPr>
+      <w:r>
+        <w:t>Six selected contributions merged across six external repositories, covering bug fixes, tests, and documentation. These are contributions, not employment; the broader record tracks merged, open, and closed without merge outcomes.</w:t>
       </w:r>
     </w:p>
     <w:p>
@@ -739,7 +773,7 @@
         <w:ind w:left="245" w:hanging="173"/>
       </w:pPr>
       <w:r>
-        <w:t>TOMLKit #549: preserved dotted-key siblings when replacing a value with an array of tables; merged July 14, 2026. github.com/python-poetry/tomlkit/pull/549</w:t>
+        <w:t>DeepEval #2822: fixed unhashable tool-output and nested-parameter failures in tool-correctness evaluation; merged July 2, 2026. github.com/confident-ai/deepeval/pull/2822</w:t>
       </w:r>
     </w:p>
     <w:p>
@@ -752,7 +786,7 @@
         <w:ind w:left="245" w:hanging="173"/>
       </w:pPr>
       <w:r>
-        <w:t>Datasette #2815: corrected malformed composite-key requests from HTTP 500 or incorrect HTTP 200 to HTTP 400; tested too few and too many key components in HTML and JSON. Merged July 7, 2026. github.com/simonw/datasette/pull/2815</w:t>
+        <w:t>TOMLKit #549: preserved dotted-key siblings when replacing a value with an array of tables; merged July 14, 2026. github.com/python-poetry/tomlkit/pull/549</w:t>
       </w:r>
     </w:p>
     <w:p>
@@ -765,7 +799,7 @@
         <w:ind w:left="245" w:hanging="173"/>
       </w:pPr>
       <w:r>
-        <w:t>Free Law Project #820: documented runnable database-free fast tests; merged August 25, 2026. github.com/freelawproject/litigant-portal/pull/820</w:t>
+        <w:t>Datasette #2815: corrected malformed composite-key requests from HTTP 500 or incorrect HTTP 200 to HTTP 400; tested too few and too many key components in HTML and JSON. Merged July 7, 2026. github.com/simonw/datasette/pull/2815</w:t>
       </w:r>
     </w:p>
     <w:p>
@@ -778,7 +812,7 @@
         <w:ind w:left="245" w:hanging="173"/>
       </w:pPr>
       <w:r>
-        <w:t>Hebbian Robotics #157: tested reserved-column drift against the actual queryable episode schema; merged August 25, 2026. github.com/Hebbian-Robotics/hflow/pull/157</w:t>
+        <w:t>Free Law Project #820: documented runnable database-free fast tests; merged August 25, 2026. github.com/freelawproject/litigant-portal/pull/820</w:t>
       </w:r>
     </w:p>
     <w:p>
@@ -791,6 +825,19 @@
         <w:ind w:left="245" w:hanging="173"/>
       </w:pPr>
       <w:r>
+        <w:t>Hebbian Robotics #157: tested reserved-column drift against the actual queryable episode schema; merged August 25, 2026. github.com/Hebbian-Robotics/hflow/pull/157</w:t>
+      </w:r>
+    </w:p>
+    <w:p>
+      <w:pPr>
+        <w:pStyle w:val="ListBullet"/>
+        <w:keepNext w:val="0"/>
+        <w:keepLines/>
+        <w:widowControl/>
+        <w:spacing w:before="0" w:after="60" w:line="252" w:lineRule="exact"/>
+        <w:ind w:left="245" w:hanging="173"/>
+      </w:pPr>
+      <w:r>
         <w:t>Voxwire #44: added offline regression coverage for a six-event degraded voice turn, matching saved PCM audio and JSONL records to emitted events. Merged August 15, 2026. github.com/vectorvoyager358/voxwire/pull/44</w:t>
       </w:r>
     </w:p>
@@ -858,7 +905,7 @@
         <w:spacing w:before="0" w:after="60" w:line="252" w:lineRule="exact"/>
       </w:pPr>
       <w:r>
-        <w:t>Graphics and domain knowledge: D3D11/HLSL, shader and runtime debugging, color-space and tone-mapping work, GPU instrumentation, shared-memory interfaces, and applied arboriculture/horticulture from field practice.</w:t>
+        <w:t>Graphics and domain knowledge: D3D11/D3D12, HLSL, WebGPU/WGSL, CPU reference rendering and GPU parity checks, shader and runtime debugging, color-space and tone-mapping work, GPU instrumentation, shared-memory interfaces, and applied arboriculture/horticulture from field practice.</w:t>
       </w:r>
     </w:p>
     <w:p>

</xml_diff>

<commit_message>
docs: present the flagships as pillars of one credo
The CV adds "Pillars and the Shared Credo": Flywheel, Daylight Commons,
Articulate, BuildLang, raw-native and Low Water, each tied to one strand
(make checking cheap, protect the commons, provenance at the source) and
to a public figure with its link. Figures moved out of Selected Evidence
into the pillar lines, and repeated detail was cut, so the CV stays six
pages. "Where they meet" cites only the offline-verification overlap
stated by each release and the one connection with building status
(Low Water inner-arena fights mapped to the Daylight catalogue); shared
code is stated as planned. The two technical resumes add one credo line
and stay one page. A ledger entry records the source and its limits.

Co-Authored-By: Claude Opus 5.5 <noreply@anthropic.com>
</commit_message>
<xml_diff>
--- a/career/Zain-Dana-Harper-CV.docx
+++ b/career/Zain-Dana-Harper-CV.docx
@@ -71,7 +71,7 @@
         <w:spacing w:before="0" w:after="60" w:line="252" w:lineRule="exact"/>
       </w:pPr>
       <w:r>
-        <w:t>Self-directed software builder who writes tools that test AI systems and the software around them, and graphics work that people install. Elder ENB, a lighting preset for Skyrim Special Edition, has 996,649 downloads on Nexus Mods. Flywheel, an AI workstation published on PyPI, runs release checks scored against planted faults. About 13 years of personal programming. Career transition began June 2026 after eleven years of full-time production arboriculture; no professional programming experience.</w:t>
+        <w:t>Self-directed software builder who writes tools that test AI systems and the software around them, and graphics work that people install. Elder ENB, a lighting preset for Skyrim Special Edition, has 996,649 downloads on Nexus Mods. About 13 years of personal programming. Career transition began June 2026 after eleven years of full-time production arboriculture; no professional programming experience.</w:t>
       </w:r>
     </w:p>
     <w:p>
@@ -120,7 +120,30 @@
         <w:ind w:left="245" w:hanging="173"/>
       </w:pPr>
       <w:r>
-        <w:t>Flywheel 1.9.0 behavior-check: flagged 20 of 20 planted behavior changes and 0 of 50 unchanged pairs, on a corpus written before the check ran. Scripted model, Windows only. github.com/HarperZ9/flywheel/releases/tag/v1.9.0</w:t>
+        <w:t>Open source: 37 merged engineering pull requests in 30 external repositories, with 17 closed without merge and 14 open, counted from the GitHub API on October 23, 2026. harperz9.github.io/career/open-source-census.json</w:t>
+      </w:r>
+    </w:p>
+    <w:p>
+      <w:pPr>
+        <w:pStyle w:val="Heading1"/>
+        <w:keepNext/>
+        <w:keepLines/>
+        <w:widowControl/>
+        <w:spacing w:before="120" w:after="60" w:line="280" w:lineRule="exact"/>
+      </w:pPr>
+      <w:r>
+        <w:t>Pillars and the Shared Credo</w:t>
+      </w:r>
+    </w:p>
+    <w:p>
+      <w:pPr>
+        <w:keepNext w:val="0"/>
+        <w:keepLines/>
+        <w:widowControl/>
+        <w:spacing w:before="0" w:after="60" w:line="252" w:lineRule="exact"/>
+      </w:pPr>
+      <w:r>
+        <w:t>Six flagship projects carry one credo: make checking cheap, protect the commons, and keep provenance at the source.</w:t>
       </w:r>
     </w:p>
     <w:p>
@@ -133,7 +156,7 @@
         <w:ind w:left="245" w:hanging="173"/>
       </w:pPr>
       <w:r>
-        <w:t>Daylight Commons slur sign: precision 91.0%, 3,995 of 4,392, with a 95% interval of 90.1 to 91.8 on public human-labelled corpora. github.com/HarperZ9/daylight-commons/blob/main/project-docs/EVALUATION.md</w:t>
+        <w:t>Flywheel, make checking cheap: sealed receipts replay offline to MATCH, DRIFT or UNVERIFIABLE. In 1.9.0, behavior-check flagged 20 of 20 planted behavior changes and 0 of 50 unchanged pairs, with a scripted model on Windows only. github.com/HarperZ9/flywheel/releases/tag/v1.9.0</w:t>
       </w:r>
     </w:p>
     <w:p>
@@ -146,7 +169,7 @@
         <w:ind w:left="245" w:hanging="173"/>
       </w:pPr>
       <w:r>
-        <w:t>raw-native: GPU frames matched the CPU reference in 16 of 16 D3D12 and 16 of 16 WebGPU certificates on an RTX 4090. github.com/HarperZ9/raw-native</w:t>
+        <w:t>Daylight Commons, protect the commons: AGPL-3.0-only, no server and no data sales, and each sign names its source. Its slur sign holds precision 91.0%, 3,995 of 4,392, with a 95% interval of 90.1 to 91.8 on public human-labelled corpora. github.com/HarperZ9/daylight-commons/blob/main/project-docs/EVALUATION.md</w:t>
       </w:r>
     </w:p>
     <w:p>
@@ -159,7 +182,7 @@
         <w:ind w:left="245" w:hanging="173"/>
       </w:pPr>
       <w:r>
-        <w:t>Articulate 0.14.0: Markdown masks removed 5,123 findings on table separator rows across 3,000 files and added none. github.com/HarperZ9/articulate/releases/tag/v0.14.0</w:t>
+        <w:t>Articulate, make checking cheap: deterministic findings with content-free receipts. In 0.14.0, Markdown masks removed 5,123 findings on table separator rows across 3,000 files and added none. github.com/HarperZ9/articulate/releases/tag/v0.14.0</w:t>
       </w:r>
     </w:p>
     <w:p>
@@ -172,7 +195,44 @@
         <w:ind w:left="245" w:hanging="173"/>
       </w:pPr>
       <w:r>
-        <w:t>Open source: 37 merged engineering pull requests in 30 external repositories, with 17 closed without merge and 14 open, counted from the GitHub API on October 23, 2026. harperz9.github.io/career/open-source-census.json</w:t>
+        <w:t>BuildLang, provenance at the source: typed capability effects show a program's ambient access to the compiler. Before 1.7.0, 27 held-out tasks were sealed by hash; two fresh agents scored 20 and 17 against a preset bar of 22, and the miss stays on the record. github.com/HarperZ9/buildlang/releases/tag/v1.7.0</w:t>
+      </w:r>
+    </w:p>
+    <w:p>
+      <w:pPr>
+        <w:pStyle w:val="ListBullet"/>
+        <w:keepNext w:val="0"/>
+        <w:keepLines/>
+        <w:widowControl/>
+        <w:spacing w:before="0" w:after="60" w:line="252" w:lineRule="exact"/>
+        <w:ind w:left="245" w:hanging="173"/>
+      </w:pPr>
+      <w:r>
+        <w:t>raw-native, the engine, make checking cheap: each GPU frame carries a certificate against a CPU reference, and 16 of 16 D3D12 and 16 of 16 WebGPU certificates read verified on an RTX 4090. github.com/HarperZ9/raw-native</w:t>
+      </w:r>
+    </w:p>
+    <w:p>
+      <w:pPr>
+        <w:pStyle w:val="ListBullet"/>
+        <w:keepNext w:val="0"/>
+        <w:keepLines/>
+        <w:widowControl/>
+        <w:spacing w:before="0" w:after="60" w:line="252" w:lineRule="exact"/>
+        <w:ind w:left="245" w:hanging="173"/>
+      </w:pPr>
+      <w:r>
+        <w:t>Low Water, the game, provenance at the source: art moving to first-party tools, and combat traces checked byte for byte. Private repository; no release claimed.</w:t>
+      </w:r>
+    </w:p>
+    <w:p>
+      <w:pPr>
+        <w:keepNext w:val="0"/>
+        <w:keepLines/>
+        <w:widowControl/>
+        <w:spacing w:before="0" w:after="60" w:line="252" w:lineRule="exact"/>
+      </w:pPr>
+      <w:r>
+        <w:t>Where they meet: Daylight's evidence chains, Flywheel's receipts and raw-native's certificates each verify offline from a file, and each Low Water inner-arena fight maps to a technique in the Daylight Commons catalogue, with no effect on players claimed. Shared code between them is still only planned.</w:t>
       </w:r>
     </w:p>
     <w:p>
@@ -238,7 +298,7 @@
         <w:ind w:left="245" w:hanging="173"/>
       </w:pPr>
       <w:r>
-        <w:t>Develop model-agnostic workflows, evaluation harnesses, controlled-action interfaces, and source-linked records that can be checked without relying on a model to approve its own answer.</w:t>
+        <w:t>Develop model-agnostic workflows, evaluation harnesses, and controlled-action interfaces whose records can be checked without a model approving its own answer.</w:t>
       </w:r>
     </w:p>
     <w:p>
@@ -414,7 +474,7 @@
         <w:spacing w:before="0" w:after="60" w:line="252" w:lineRule="exact"/>
       </w:pPr>
       <w:r>
-        <w:t>No paid red-team or purple-team engagement to date. This work runs on my own systems and owned test targets. Faults and attacks are planted on purpose, so each defensive check is measured against a known answer and its misses stay on the record.</w:t>
+        <w:t>No paid red-team or purple-team engagement to date. This work runs on my own systems and owned test targets, with faults and attacks planted on purpose so each defensive check is measured against a known answer.</w:t>
       </w:r>
     </w:p>
     <w:p>
@@ -437,7 +497,7 @@
         <w:spacing w:before="0" w:after="60" w:line="252" w:lineRule="exact"/>
       </w:pPr>
       <w:r>
-        <w:t>Released a Flywheel monitor-admission check over 2,676 frozen items with six planted controls, a second independent math kernel, and signer-head anchoring. Release evidence reports no real monitor tested through the check and no installed signer; Windows anchoring was parse-checked only. Behavior-check, below, was scored the same way on planted changes.</w:t>
+        <w:t>Released a Flywheel monitor-admission check over 2,676 frozen items with six planted controls, a second independent math kernel, and signer-head anchoring. Release evidence reports no real monitor tested through the check and no installed signer; Windows anchoring was parse-checked only.</w:t>
       </w:r>
     </w:p>
     <w:p>
@@ -460,7 +520,7 @@
         <w:spacing w:before="0" w:after="60" w:line="252" w:lineRule="exact"/>
       </w:pPr>
       <w:r>
-        <w:t>Built operator-granted action interfaces for filesystem, command, API, browser, and Windows UI Automation work. Actions carry explicit scope and postconditions; persisted journals preserve decisions and observed effects. Reversible adapters include restoration paths. Fake drivers make browser and desktop scenarios testable without uncontrolled live actions.</w:t>
+        <w:t>Built operator-granted action interfaces for filesystem, command, API, browser, and Windows UI Automation work. Actions carry explicit scope and postconditions, journals preserve decisions and observed effects, and fake drivers make browser and desktop scenarios testable without live actions.</w:t>
       </w:r>
     </w:p>
     <w:p>
@@ -494,7 +554,7 @@
         <w:spacing w:before="0" w:after="60" w:line="252" w:lineRule="exact"/>
       </w:pPr>
       <w:r>
-        <w:t>Developed a Rust-based Windows and Linux utility with deterministic profiles, read-only audit, backup-before-write behavior, validation, restoration, and platform packages. The released v1.1.1 scope is userland-reversible identifiers. Kernel and firmware layers are modeled, not shipped.</w:t>
+        <w:t>Developed a Rust utility for Windows and Linux with read-only audit, backup-before-write, validation, restoration, and platform packages. Release v1.1.1 covers userland-reversible identifiers; kernel and firmware layers are modeled, not shipped.</w:t>
       </w:r>
     </w:p>
     <w:p>
@@ -517,7 +577,7 @@
         <w:spacing w:before="0" w:after="60" w:line="252" w:lineRule="exact"/>
       </w:pPr>
       <w:r>
-        <w:t>Private systems work includes Array for approval-gated assessment orchestration and containment records, Lab/Seed for controlled-lab fixtures and detection-engineering workflows, and Runtime/ORCA for local workspaces, reports, bundles, and release provenance. Public descriptions cover architecture and safe interfaces; private implementations, target material, and operational details are not published here.</w:t>
+        <w:t>Private systems work includes Array for approval-gated assessment orchestration and containment records, Lab/Seed for controlled-lab fixtures and detection-engineering workflows, and Runtime/ORCA for local workspaces and release provenance. Private implementations, target material, and operational details are not published.</w:t>
       </w:r>
     </w:p>
     <w:p>
@@ -583,6 +643,294 @@
     </w:p>
     <w:p>
       <w:pPr>
+        <w:pStyle w:val="Heading2"/>
+        <w:keepNext/>
+        <w:keepLines/>
+        <w:widowControl/>
+        <w:spacing w:before="100" w:after="40" w:line="256" w:lineRule="exact"/>
+      </w:pPr>
+      <w:r>
+        <w:t>Terminal State Fixtures and Crucible</w:t>
+      </w:r>
+    </w:p>
+    <w:p>
+      <w:pPr>
+        <w:keepNext w:val="0"/>
+        <w:keepLines/>
+        <w:widowControl/>
+        <w:spacing w:before="0" w:after="60" w:line="252" w:lineRule="exact"/>
+      </w:pPr>
+      <w:r>
+        <w:t>Built 324 exhaustive terminal-state fixtures and five synthetic component-evaluation families with 337 cases and 5,058 frozen expectations. Defined controls separate failed outputs, provider failures, and missing evidence from valid results. Executed a pinned METR count_odds interoperability check with three deterministic controls, preserving logs and score provenance through the Inspect-to-Flywheel handoff.</w:t>
+      </w:r>
+    </w:p>
+    <w:p>
+      <w:pPr>
+        <w:pStyle w:val="Heading2"/>
+        <w:keepNext/>
+        <w:keepLines/>
+        <w:widowControl/>
+        <w:spacing w:before="100" w:after="40" w:line="256" w:lineRule="exact"/>
+      </w:pPr>
+      <w:r>
+        <w:t>Daylight Commons | Independent, offline-first evidence for readers</w:t>
+      </w:r>
+    </w:p>
+    <w:p>
+      <w:pPr>
+        <w:keepNext w:val="0"/>
+        <w:keepLines/>
+        <w:widowControl/>
+        <w:spacing w:before="0" w:after="60" w:line="252" w:lineRule="exact"/>
+      </w:pPr>
+      <w:r>
+        <w:t>Built a browser extension that shows the sourced evidence behind replies on nine platforms: X, YouTube, Reddit, Facebook, Instagram, Bluesky, Threads, TikTok and Mastodon. Each sign shows its measured precision or "not measured yet", and none calls an account a bot. No server, account or analytics, no data sold or shared, and saved evidence chains verify offline. Version 3.1.0, released October 23, 2026 under AGPL-3.0-only, ships reproducible packages with signed checksums and a full-source git bundle. No Mozilla-signed build exists yet, and the campaign lens is not yet measured.</w:t>
+      </w:r>
+    </w:p>
+    <w:p>
+      <w:pPr>
+        <w:pStyle w:val="Heading2"/>
+        <w:keepNext/>
+        <w:keepLines/>
+        <w:widowControl/>
+        <w:spacing w:before="100" w:after="40" w:line="256" w:lineRule="exact"/>
+      </w:pPr>
+      <w:r>
+        <w:t>Articulate | Writing analysis and accountable editing</w:t>
+      </w:r>
+    </w:p>
+    <w:p>
+      <w:pPr>
+        <w:keepNext w:val="0"/>
+        <w:keepLines/>
+        <w:widowControl/>
+        <w:spacing w:before="0" w:after="60" w:line="252" w:lineRule="exact"/>
+      </w:pPr>
+      <w:r>
+        <w:t>Built deterministic prose analysis with register and genre profiles and optional model-assisted editing, through command-line, library, MCP, language-server, and SARIF surfaces. Version 0.14.0 is on PyPI as articulate-writing. Version 0.15.0, on GitHub October 23, 2026, keeps the original paragraph when a model rewrite reorders a date or adds a flagged device, and prints the reason.</w:t>
+      </w:r>
+    </w:p>
+    <w:p>
+      <w:pPr>
+        <w:pStyle w:val="Heading1"/>
+        <w:keepNext/>
+        <w:keepLines/>
+        <w:widowControl/>
+        <w:spacing w:before="120" w:after="60" w:line="280" w:lineRule="exact"/>
+      </w:pPr>
+      <w:r>
+        <w:t>Graphics and Rendering</w:t>
+      </w:r>
+    </w:p>
+    <w:p>
+      <w:pPr>
+        <w:pStyle w:val="Heading2"/>
+        <w:keepNext/>
+        <w:keepLines/>
+        <w:widowControl/>
+        <w:spacing w:before="100" w:after="40" w:line="256" w:lineRule="exact"/>
+      </w:pPr>
+      <w:r>
+        <w:t>Elder ENB | Lighting and post-processing preset for Skyrim Special Edition</w:t>
+      </w:r>
+    </w:p>
+    <w:p>
+      <w:pPr>
+        <w:keepNext w:val="0"/>
+        <w:keepLines/>
+        <w:widowControl/>
+        <w:spacing w:before="0" w:after="60" w:line="252" w:lineRule="exact"/>
+      </w:pPr>
+      <w:r>
+        <w:t>Built and maintained an ENBSeries preset with a layered design: weather presets set the atmosphere, and stackable overlays adjust style, lighting, effects and post-processing over a fixed baseline. It ships 38 atmosphere presets for the KreatE weather system, with updates from April 2024 to February 2026. ENBSeries and the required mods belong to their authors. nexusmods.com/skyrimspecialedition/mods/117327</w:t>
+      </w:r>
+    </w:p>
+    <w:p>
+      <w:pPr>
+        <w:pStyle w:val="Heading2"/>
+        <w:keepNext/>
+        <w:keepLines/>
+        <w:widowControl/>
+        <w:spacing w:before="100" w:after="40" w:line="256" w:lineRule="exact"/>
+      </w:pPr>
+      <w:r>
+        <w:t>raw-native | C++ renderer with a CPU reference and checked GPU backends</w:t>
+      </w:r>
+    </w:p>
+    <w:p>
+      <w:pPr>
+        <w:keepNext w:val="0"/>
+        <w:keepLines/>
+        <w:widowControl/>
+        <w:spacing w:before="0" w:after="60" w:line="252" w:lineRule="exact"/>
+      </w:pPr>
+      <w:r>
+        <w:t>Release 0.8.0, October 14, 2026, renders on a CPU reference and through D3D12 and WebGPU, and passed 60 of 60 tests with MSVC and GCC; no hardware-GPU render was checked for that release.</w:t>
+      </w:r>
+    </w:p>
+    <w:p>
+      <w:pPr>
+        <w:keepNext w:val="0"/>
+        <w:keepLines/>
+        <w:widowControl/>
+        <w:spacing w:before="0" w:after="60" w:line="252" w:lineRule="exact"/>
+      </w:pPr>
+      <w:r>
+        <w:t>Merged since 0.8.0 and not yet released: a Vulkan 1.3 backend whose 600 presented frames on lavapipe match the offscreen and D3D12 WARP renders hash for hash; the painterly shader ported to the C++ core, equal to the JavaScript version across fifteen cases; a tilt-shift lens that repaints out-of-focus areas with coarser brushwork and no blur, about 0.86 ms a frame at 1080p on an RTX 4090; and a character asset toolchain that turns brush strokes into signed distance fields, game meshes, UV atlases and baked maps.</w:t>
+      </w:r>
+    </w:p>
+    <w:p>
+      <w:pPr>
+        <w:pStyle w:val="Heading2"/>
+        <w:keepNext/>
+        <w:keepLines/>
+        <w:widowControl/>
+        <w:spacing w:before="100" w:after="40" w:line="256" w:lineRule="exact"/>
+      </w:pPr>
+      <w:r>
+        <w:t>Low Water | Original narrative game in development</w:t>
+      </w:r>
+    </w:p>
+    <w:p>
+      <w:pPr>
+        <w:keepNext w:val="0"/>
+        <w:keepLines/>
+        <w:widowControl/>
+        <w:spacing w:before="0" w:after="60" w:line="252" w:lineRule="exact"/>
+      </w:pPr>
+      <w:r>
+        <w:t>An original narrative game written and built on my own engine. All five eras of the story are written, and scripted runs reach the ending on every playable class. Fights run on a deterministic combat simulation. A C++ port onto raw-native is in progress. The repository is private, and no release date or store listing is claimed.</w:t>
+      </w:r>
+    </w:p>
+    <w:p>
+      <w:pPr>
+        <w:pStyle w:val="Heading2"/>
+        <w:keepNext/>
+        <w:keepLines/>
+        <w:widowControl/>
+        <w:spacing w:before="100" w:after="40" w:line="256" w:lineRule="exact"/>
+      </w:pPr>
+      <w:r>
+        <w:t>Earlier graphics and color work</w:t>
+      </w:r>
+    </w:p>
+    <w:p>
+      <w:pPr>
+        <w:keepNext w:val="0"/>
+        <w:keepLines/>
+        <w:widowControl/>
+        <w:spacing w:before="0" w:after="60" w:line="252" w:lineRule="exact"/>
+      </w:pPr>
+      <w:r>
+        <w:t>Earlier HLSL and C++ modding covered post-processing, Direct3D 11 integration, shader debugging and GPU traces, with public projects SkyrimBridge, ENB Runtime Core, Brender Archival and Engine Revival; their engines and collaborators keep their own attribution. Color tools include Build Color, Calibrate Pro and Studio Engine, with no professional calibration certification claimed.</w:t>
+      </w:r>
+    </w:p>
+    <w:p>
+      <w:pPr>
+        <w:pStyle w:val="Heading1"/>
+        <w:keepNext/>
+        <w:keepLines/>
+        <w:widowControl/>
+        <w:spacing w:before="120" w:after="60" w:line="280" w:lineRule="exact"/>
+      </w:pPr>
+      <w:r>
+        <w:t>Developer Tools and Languages</w:t>
+      </w:r>
+    </w:p>
+    <w:p>
+      <w:pPr>
+        <w:pStyle w:val="Heading2"/>
+        <w:keepNext/>
+        <w:keepLines/>
+        <w:widowControl/>
+        <w:spacing w:before="100" w:after="40" w:line="256" w:lineRule="exact"/>
+      </w:pPr>
+      <w:r>
+        <w:t>BuildLang | Rust compiler and developer tooling</w:t>
+      </w:r>
+    </w:p>
+    <w:p>
+      <w:pPr>
+        <w:keepNext w:val="0"/>
+        <w:keepLines/>
+        <w:widowControl/>
+        <w:spacing w:before="0" w:after="60" w:line="252" w:lineRule="exact"/>
+      </w:pPr>
+      <w:r>
+        <w:t>Developed a systems-language toolchain with typed capability effects, type inference, parser and intermediate-representation work, native C output, shader output, and language-server support. Version 1.8.0, published to crates.io on October 23, 2026, adds Box&lt;T&gt; and recursive types.</w:t>
+      </w:r>
+    </w:p>
+    <w:p>
+      <w:pPr>
+        <w:pStyle w:val="Heading2"/>
+        <w:keepNext/>
+        <w:keepLines/>
+        <w:widowControl/>
+        <w:spacing w:before="100" w:after="40" w:line="256" w:lineRule="exact"/>
+      </w:pPr>
+      <w:r>
+        <w:t>EMET | Byte-integrity witnessing</w:t>
+      </w:r>
+    </w:p>
+    <w:p>
+      <w:pPr>
+        <w:keepNext w:val="0"/>
+        <w:keepLines/>
+        <w:widowControl/>
+        <w:spacing w:before="0" w:after="60" w:line="252" w:lineRule="exact"/>
+      </w:pPr>
+      <w:r>
+        <w:t>Developed Python, Rust, Node, and Go implementations around shared conformance cases and portable verification records. The witness checks byte-level integrity, anchors, and source correspondence; it does not grant permission, certify semantic truth, or replace an operator decision.</w:t>
+      </w:r>
+    </w:p>
+    <w:p>
+      <w:pPr>
+        <w:pStyle w:val="Heading2"/>
+        <w:keepNext/>
+        <w:keepLines/>
+        <w:widowControl/>
+        <w:spacing w:before="100" w:after="40" w:line="256" w:lineRule="exact"/>
+      </w:pPr>
+      <w:r>
+        <w:t>Research intake and workspace tooling</w:t>
+      </w:r>
+    </w:p>
+    <w:p>
+      <w:pPr>
+        <w:keepNext w:val="0"/>
+        <w:keepLines/>
+        <w:widowControl/>
+        <w:spacing w:before="0" w:after="60" w:line="252" w:lineRule="exact"/>
+      </w:pPr>
+      <w:r>
+        <w:t>Built Gather for source-carrying research intake, Index for workspace and symbol maps, and Forum for model orchestration with recorded decisions. These tools make source selection, handoffs, and task context inspectable across a multi-repository product. On October 23, 2026, Gather 2.4.0, Crucible 1.6.0, and EMET 1.3.1 shipped to PyPI and Canon 0.7.0 to GitHub. Companion tools include Relay for coding agents, Plexus for tool interfaces, Mneme for source-checked memory, Canon for assistant instructions, and Bulletin, a signed-identity message board; customer-scale deployment is not established.</w:t>
+      </w:r>
+    </w:p>
+    <w:p>
+      <w:pPr>
+        <w:pStyle w:val="Heading1"/>
+        <w:keepNext/>
+        <w:keepLines/>
+        <w:widowControl/>
+        <w:spacing w:before="120" w:after="60" w:line="280" w:lineRule="exact"/>
+      </w:pPr>
+      <w:r>
+        <w:t>Selected Open-Source Contributions</w:t>
+      </w:r>
+    </w:p>
+    <w:p>
+      <w:pPr>
+        <w:keepNext w:val="0"/>
+        <w:keepLines/>
+        <w:widowControl/>
+        <w:spacing w:before="0" w:after="60" w:line="252" w:lineRule="exact"/>
+      </w:pPr>
+      <w:r>
+        <w:t>Six selected contributions merged across six external repositories, covering bug fixes, tests, and documentation, from 37 merged engineering pull requests in 30 repositories. These are contributions, not employment; the census also records open pull requests and those closed without merge.</w:t>
+      </w:r>
+    </w:p>
+    <w:p>
+      <w:pPr>
         <w:pStyle w:val="ListBullet"/>
         <w:keepNext w:val="0"/>
         <w:keepLines/>
@@ -591,7 +939,7 @@
         <w:ind w:left="245" w:hanging="173"/>
       </w:pPr>
       <w:r>
-        <w:t>Produces sealed, re-derivable receipts and offline MATCH, DRIFT, or UNVERIFIABLE outcomes. A reproducible receipt establishes the bounded check it records, not universal model accuracy or safety.</w:t>
+        <w:t>DeepEval #2822: fixed unhashable tool-output and nested-parameter failures in tool-correctness evaluation; merged July 2, 2026. github.com/confident-ai/deepeval/pull/2822</w:t>
       </w:r>
     </w:p>
     <w:p>
@@ -604,306 +952,7 @@
         <w:ind w:left="245" w:hanging="173"/>
       </w:pPr>
       <w:r>
-        <w:t>Added behavior-check in v1.9.0: it replays 13 scripted sessions on two builds and names the first event that differs. Its planted-change result is listed under Selected Evidence; no hosted model was called.</w:t>
-      </w:r>
-    </w:p>
-    <w:p>
-      <w:pPr>
-        <w:pStyle w:val="Heading2"/>
-        <w:keepNext/>
-        <w:keepLines/>
-        <w:widowControl/>
-        <w:spacing w:before="100" w:after="40" w:line="256" w:lineRule="exact"/>
-      </w:pPr>
-      <w:r>
-        <w:t>Terminal State Fixtures and Crucible</w:t>
-      </w:r>
-    </w:p>
-    <w:p>
-      <w:pPr>
-        <w:keepNext w:val="0"/>
-        <w:keepLines/>
-        <w:widowControl/>
-        <w:spacing w:before="0" w:after="60" w:line="252" w:lineRule="exact"/>
-      </w:pPr>
-      <w:r>
-        <w:t>Built 324 exhaustive terminal-state fixtures and five synthetic component-evaluation families with 337 cases and 5,058 frozen expectations. Defined controls separate failed outputs, provider failures, and missing evidence from valid results. Executed a pinned METR count_odds interoperability check with three deterministic controls, preserving logs and score provenance through the Inspect-to-Flywheel handoff.</w:t>
-      </w:r>
-    </w:p>
-    <w:p>
-      <w:pPr>
-        <w:pStyle w:val="Heading2"/>
-        <w:keepNext/>
-        <w:keepLines/>
-        <w:widowControl/>
-        <w:spacing w:before="100" w:after="40" w:line="256" w:lineRule="exact"/>
-      </w:pPr>
-      <w:r>
-        <w:t>Daylight Commons | Independent, offline-first evidence for readers</w:t>
-      </w:r>
-    </w:p>
-    <w:p>
-      <w:pPr>
-        <w:keepNext w:val="0"/>
-        <w:keepLines/>
-        <w:widowControl/>
-        <w:spacing w:before="0" w:after="60" w:line="252" w:lineRule="exact"/>
-      </w:pPr>
-      <w:r>
-        <w:t>Built a browser extension that shows the sourced evidence behind replies on nine platforms: X, YouTube, Reddit, Facebook, Instagram, Bluesky, Threads, TikTok and Mastodon. Each sign names its source, states what it does not prove, and shows its measured precision or "not measured yet"; it never calls an account a bot. No server, account or analytics, no data sold or shared, and saved evidence chains verify offline. Version 3.1.0, released October 23, 2026 under AGPL-3.0-only, ships reproducible packages with signed checksums and a full-source git bundle. No Mozilla-signed build exists yet, and the campaign lens is not yet measured.</w:t>
-      </w:r>
-    </w:p>
-    <w:p>
-      <w:pPr>
-        <w:pStyle w:val="Heading2"/>
-        <w:keepNext/>
-        <w:keepLines/>
-        <w:widowControl/>
-        <w:spacing w:before="100" w:after="40" w:line="256" w:lineRule="exact"/>
-      </w:pPr>
-      <w:r>
-        <w:t>Articulate | Writing analysis and accountable editing</w:t>
-      </w:r>
-    </w:p>
-    <w:p>
-      <w:pPr>
-        <w:keepNext w:val="0"/>
-        <w:keepLines/>
-        <w:widowControl/>
-        <w:spacing w:before="0" w:after="60" w:line="252" w:lineRule="exact"/>
-      </w:pPr>
-      <w:r>
-        <w:t>Built deterministic prose analysis with register and genre profiles and optional model-assisted editing, through command-line, library, MCP, language-server, and SARIF surfaces. Content-free audit receipts record checks without retaining the prose. Version 0.14.0 is on PyPI as articulate-writing. Version 0.15.0, on GitHub October 23, 2026, keeps the original paragraph when a model rewrite reorders a date or adds a flagged device, and prints the reason.</w:t>
-      </w:r>
-    </w:p>
-    <w:p>
-      <w:pPr>
-        <w:pStyle w:val="Heading1"/>
-        <w:keepNext/>
-        <w:keepLines/>
-        <w:widowControl/>
-        <w:spacing w:before="120" w:after="60" w:line="280" w:lineRule="exact"/>
-      </w:pPr>
-      <w:r>
-        <w:t>Graphics and Rendering</w:t>
-      </w:r>
-    </w:p>
-    <w:p>
-      <w:pPr>
-        <w:pStyle w:val="Heading2"/>
-        <w:keepNext/>
-        <w:keepLines/>
-        <w:widowControl/>
-        <w:spacing w:before="100" w:after="40" w:line="256" w:lineRule="exact"/>
-      </w:pPr>
-      <w:r>
-        <w:t>Elder ENB | Lighting and post-processing preset for Skyrim Special Edition</w:t>
-      </w:r>
-    </w:p>
-    <w:p>
-      <w:pPr>
-        <w:keepNext w:val="0"/>
-        <w:keepLines/>
-        <w:widowControl/>
-        <w:spacing w:before="0" w:after="60" w:line="252" w:lineRule="exact"/>
-      </w:pPr>
-      <w:r>
-        <w:t>Built and maintained an ENBSeries preset with a layered design: weather presets set the atmosphere, and stackable overlays adjust style, lighting, effects and post-processing over a fixed baseline. It ships 38 atmosphere presets for the KreatE weather system, with updates from April 2024 to February 2026. ENBSeries and the required mods belong to their authors. nexusmods.com/skyrimspecialedition/mods/117327</w:t>
-      </w:r>
-    </w:p>
-    <w:p>
-      <w:pPr>
-        <w:pStyle w:val="Heading2"/>
-        <w:keepNext/>
-        <w:keepLines/>
-        <w:widowControl/>
-        <w:spacing w:before="100" w:after="40" w:line="256" w:lineRule="exact"/>
-      </w:pPr>
-      <w:r>
-        <w:t>raw-native | C++ renderer with a CPU reference and checked GPU backends</w:t>
-      </w:r>
-    </w:p>
-    <w:p>
-      <w:pPr>
-        <w:keepNext w:val="0"/>
-        <w:keepLines/>
-        <w:widowControl/>
-        <w:spacing w:before="0" w:after="60" w:line="252" w:lineRule="exact"/>
-      </w:pPr>
-      <w:r>
-        <w:t>raw-native draws each scene on a CPU reference and on the GPU, then writes a certificate stating whether the two agree within committed tolerances. Release 0.8.0, October 14, 2026, renders through D3D12 and WebGPU and passed 60 of 60 tests with MSVC and GCC; no hardware-GPU render was checked for that release.</w:t>
-      </w:r>
-    </w:p>
-    <w:p>
-      <w:pPr>
-        <w:keepNext w:val="0"/>
-        <w:keepLines/>
-        <w:widowControl/>
-        <w:spacing w:before="0" w:after="60" w:line="252" w:lineRule="exact"/>
-      </w:pPr>
-      <w:r>
-        <w:t>Merged since 0.8.0 and not yet released: a Vulkan 1.3 backend whose 600 presented frames on lavapipe in CI match the offscreen and D3D12 WARP renders hash for hash; the painterly shader ported to the C++ core, equal to the JavaScript version across fifteen cases; a tilt-shift lens that repaints out-of-focus areas with coarser brushwork and no blur, about 0.86 ms a frame at 1080p on an RTX 4090; and a character asset toolchain that turns brush strokes into signed distance fields, game meshes, UV atlases and baked maps.</w:t>
-      </w:r>
-    </w:p>
-    <w:p>
-      <w:pPr>
-        <w:pStyle w:val="Heading2"/>
-        <w:keepNext/>
-        <w:keepLines/>
-        <w:widowControl/>
-        <w:spacing w:before="100" w:after="40" w:line="256" w:lineRule="exact"/>
-      </w:pPr>
-      <w:r>
-        <w:t>Low Water | Original narrative game in development</w:t>
-      </w:r>
-    </w:p>
-    <w:p>
-      <w:pPr>
-        <w:keepNext w:val="0"/>
-        <w:keepLines/>
-        <w:widowControl/>
-        <w:spacing w:before="0" w:after="60" w:line="252" w:lineRule="exact"/>
-      </w:pPr>
-      <w:r>
-        <w:t>An original narrative game written and built on my own engine. All five eras of the story are written, and scripted runs reach the ending on every playable class. Fights run on a deterministic combat simulation whose traces are checked byte for byte. Character art is moving to the first-party asset tools above, with no third-party modelling package. A C++ port onto raw-native is in progress. The repository is private, and no release date or store listing is claimed.</w:t>
-      </w:r>
-    </w:p>
-    <w:p>
-      <w:pPr>
-        <w:pStyle w:val="Heading2"/>
-        <w:keepNext/>
-        <w:keepLines/>
-        <w:widowControl/>
-        <w:spacing w:before="100" w:after="40" w:line="256" w:lineRule="exact"/>
-      </w:pPr>
-      <w:r>
-        <w:t>Earlier graphics and color work</w:t>
-      </w:r>
-    </w:p>
-    <w:p>
-      <w:pPr>
-        <w:keepNext w:val="0"/>
-        <w:keepLines/>
-        <w:widowControl/>
-        <w:spacing w:before="0" w:after="60" w:line="252" w:lineRule="exact"/>
-      </w:pPr>
-      <w:r>
-        <w:t>Earlier HLSL and C++ modding work covered post-processing, Direct3D 11 integration, shader debugging, GPU traces, and shared-memory interfaces, with public projects SkyrimBridge, ENB Runtime Core, Brender Archival, and Engine Revival. Existing engines and collaborators retain their own attribution.</w:t>
-      </w:r>
-    </w:p>
-    <w:p>
-      <w:pPr>
-        <w:keepNext w:val="0"/>
-        <w:keepLines/>
-        <w:widowControl/>
-        <w:spacing w:before="0" w:after="60" w:line="252" w:lineRule="exact"/>
-      </w:pPr>
-      <w:r>
-        <w:t>Color tools include Build Color, Calibrate Pro and Studio Engine: perceptual color spaces, color difference, HDR and tone mapping, and display characterization. No professional calibration certification is claimed.</w:t>
-      </w:r>
-    </w:p>
-    <w:p>
-      <w:pPr>
-        <w:pStyle w:val="Heading1"/>
-        <w:keepNext/>
-        <w:keepLines/>
-        <w:widowControl/>
-        <w:spacing w:before="120" w:after="60" w:line="280" w:lineRule="exact"/>
-      </w:pPr>
-      <w:r>
-        <w:t>Developer Tools and Languages</w:t>
-      </w:r>
-    </w:p>
-    <w:p>
-      <w:pPr>
-        <w:pStyle w:val="Heading2"/>
-        <w:keepNext/>
-        <w:keepLines/>
-        <w:widowControl/>
-        <w:spacing w:before="100" w:after="40" w:line="256" w:lineRule="exact"/>
-      </w:pPr>
-      <w:r>
-        <w:t>BuildLang | Rust compiler and developer tooling</w:t>
-      </w:r>
-    </w:p>
-    <w:p>
-      <w:pPr>
-        <w:keepNext w:val="0"/>
-        <w:keepLines/>
-        <w:widowControl/>
-        <w:spacing w:before="0" w:after="60" w:line="252" w:lineRule="exact"/>
-      </w:pPr>
-      <w:r>
-        <w:t>Developed a systems-language toolchain with typed capability effects, type inference, parser and intermediate-representation work, native C output, shader output, and language-server support. Version 1.8.0, published to crates.io on October 23, 2026, adds Box&lt;T&gt; and recursive types. For 1.7.0, 27 held-out tasks were sealed by hash first; two fresh agents scored 20 and 17 of 27, short of the 22 set in advance, and each failure class became an issue.</w:t>
-      </w:r>
-    </w:p>
-    <w:p>
-      <w:pPr>
-        <w:pStyle w:val="Heading2"/>
-        <w:keepNext/>
-        <w:keepLines/>
-        <w:widowControl/>
-        <w:spacing w:before="100" w:after="40" w:line="256" w:lineRule="exact"/>
-      </w:pPr>
-      <w:r>
-        <w:t>EMET | Byte-integrity witnessing</w:t>
-      </w:r>
-    </w:p>
-    <w:p>
-      <w:pPr>
-        <w:keepNext w:val="0"/>
-        <w:keepLines/>
-        <w:widowControl/>
-        <w:spacing w:before="0" w:after="60" w:line="252" w:lineRule="exact"/>
-      </w:pPr>
-      <w:r>
-        <w:t>Developed Python, Rust, Node, and Go implementations around shared conformance cases and portable verification records. The witness checks byte-level integrity, anchors, and source correspondence; it does not grant permission, certify semantic truth, or replace an operator decision.</w:t>
-      </w:r>
-    </w:p>
-    <w:p>
-      <w:pPr>
-        <w:pStyle w:val="Heading2"/>
-        <w:keepNext/>
-        <w:keepLines/>
-        <w:widowControl/>
-        <w:spacing w:before="100" w:after="40" w:line="256" w:lineRule="exact"/>
-      </w:pPr>
-      <w:r>
-        <w:t>Research intake and workspace tooling</w:t>
-      </w:r>
-    </w:p>
-    <w:p>
-      <w:pPr>
-        <w:keepNext w:val="0"/>
-        <w:keepLines/>
-        <w:widowControl/>
-        <w:spacing w:before="0" w:after="60" w:line="252" w:lineRule="exact"/>
-      </w:pPr>
-      <w:r>
-        <w:t>Built Gather for source-carrying research intake, Index for workspace and symbol maps, and Forum for model orchestration with recorded decisions. These tools make source selection, handoffs, and task context inspectable across a multi-repository product. On October 23, 2026, Gather 2.4.0, Crucible 1.6.0, and EMET 1.3.1 shipped to PyPI and Canon 0.7.0 to GitHub. Companion tools include Relay for coding agents, Plexus for tool interfaces, Mneme for source-checked memory, Canon for assistant instructions, and Bulletin, a signed-identity message board; customer-scale deployment is not established.</w:t>
-      </w:r>
-    </w:p>
-    <w:p>
-      <w:pPr>
-        <w:pStyle w:val="Heading1"/>
-        <w:keepNext/>
-        <w:keepLines/>
-        <w:widowControl/>
-        <w:spacing w:before="120" w:after="60" w:line="280" w:lineRule="exact"/>
-      </w:pPr>
-      <w:r>
-        <w:t>Selected Open-Source Contributions</w:t>
-      </w:r>
-    </w:p>
-    <w:p>
-      <w:pPr>
-        <w:keepNext w:val="0"/>
-        <w:keepLines/>
-        <w:widowControl/>
-        <w:spacing w:before="0" w:after="60" w:line="252" w:lineRule="exact"/>
-      </w:pPr>
-      <w:r>
-        <w:t>Six selected contributions merged across six external repositories, covering bug fixes, tests, and documentation, from 37 merged engineering pull requests in 30 repositories. These are contributions, not employment; the census also records open pull requests and those closed without merge.</w:t>
+        <w:t>TOMLKit #549: preserved dotted-key siblings when replacing a value with an array of tables; merged July 14, 2026. github.com/python-poetry/tomlkit/pull/549</w:t>
       </w:r>
     </w:p>
     <w:p>
@@ -916,7 +965,7 @@
         <w:ind w:left="245" w:hanging="173"/>
       </w:pPr>
       <w:r>
-        <w:t>DeepEval #2822: fixed unhashable tool-output and nested-parameter failures in tool-correctness evaluation; merged July 2, 2026. github.com/confident-ai/deepeval/pull/2822</w:t>
+        <w:t>Datasette #2815: corrected malformed composite-key requests from HTTP 500 or incorrect HTTP 200 to HTTP 400; tested too few and too many key components in HTML and JSON. Merged July 7, 2026. github.com/simonw/datasette/pull/2815</w:t>
       </w:r>
     </w:p>
     <w:p>
@@ -929,7 +978,7 @@
         <w:ind w:left="245" w:hanging="173"/>
       </w:pPr>
       <w:r>
-        <w:t>TOMLKit #549: preserved dotted-key siblings when replacing a value with an array of tables; merged July 14, 2026. github.com/python-poetry/tomlkit/pull/549</w:t>
+        <w:t>Free Law Project #820: documented runnable database-free fast tests; merged August 25, 2026. github.com/freelawproject/litigant-portal/pull/820</w:t>
       </w:r>
     </w:p>
     <w:p>
@@ -942,7 +991,7 @@
         <w:ind w:left="245" w:hanging="173"/>
       </w:pPr>
       <w:r>
-        <w:t>Datasette #2815: corrected malformed composite-key requests from HTTP 500 or incorrect HTTP 200 to HTTP 400; tested too few and too many key components in HTML and JSON. Merged July 7, 2026. github.com/simonw/datasette/pull/2815</w:t>
+        <w:t>Hebbian Robotics #157: tested reserved-column drift against the actual queryable episode schema; merged August 25, 2026. github.com/Hebbian-Robotics/hflow/pull/157</w:t>
       </w:r>
     </w:p>
     <w:p>
@@ -955,32 +1004,6 @@
         <w:ind w:left="245" w:hanging="173"/>
       </w:pPr>
       <w:r>
-        <w:t>Free Law Project #820: documented runnable database-free fast tests; merged August 25, 2026. github.com/freelawproject/litigant-portal/pull/820</w:t>
-      </w:r>
-    </w:p>
-    <w:p>
-      <w:pPr>
-        <w:pStyle w:val="ListBullet"/>
-        <w:keepNext w:val="0"/>
-        <w:keepLines/>
-        <w:widowControl/>
-        <w:spacing w:before="0" w:after="60" w:line="252" w:lineRule="exact"/>
-        <w:ind w:left="245" w:hanging="173"/>
-      </w:pPr>
-      <w:r>
-        <w:t>Hebbian Robotics #157: tested reserved-column drift against the actual queryable episode schema; merged August 25, 2026. github.com/Hebbian-Robotics/hflow/pull/157</w:t>
-      </w:r>
-    </w:p>
-    <w:p>
-      <w:pPr>
-        <w:pStyle w:val="ListBullet"/>
-        <w:keepNext w:val="0"/>
-        <w:keepLines/>
-        <w:widowControl/>
-        <w:spacing w:before="0" w:after="60" w:line="252" w:lineRule="exact"/>
-        <w:ind w:left="245" w:hanging="173"/>
-      </w:pPr>
-      <w:r>
         <w:t>Voxwire #44: added offline regression coverage for a six-event degraded voice turn, matching saved PCM audio and JSONL records to emitted events. Merged August 15, 2026. github.com/vectorvoyager358/voxwire/pull/44</w:t>
       </w:r>
     </w:p>
@@ -1037,7 +1060,7 @@
         <w:spacing w:before="0" w:after="60" w:line="252" w:lineRule="exact"/>
       </w:pPr>
       <w:r>
-        <w:t>Verification and controlled actions: capability effects, operator grants, action envelopes, source provenance, hash-chained journals, offline replay, scoped postconditions, conformance suites, and release evidence.</w:t>
+        <w:t>Verification and controlled actions: capability effects, operator grants, source provenance, hash-chained journals, offline replay, and conformance suites.</w:t>
       </w:r>
     </w:p>
     <w:p>
@@ -1048,7 +1071,7 @@
         <w:spacing w:before="0" w:after="60" w:line="252" w:lineRule="exact"/>
       </w:pPr>
       <w:r>
-        <w:t>Software delivery: Git/GitHub, GitHub Actions, Python packaging, command-line design, Windows/Linux installers, CMake, test automation, static websites, release documentation, and checksums.</w:t>
+        <w:t>Software delivery: Git/GitHub, GitHub Actions, Python packaging, command-line design, Windows/Linux installers, CMake, test automation, and release checksums.</w:t>
       </w:r>
     </w:p>
     <w:p>
@@ -1082,7 +1105,7 @@
         <w:spacing w:before="0" w:after="60" w:line="252" w:lineRule="exact"/>
       </w:pPr>
       <w:r>
-        <w:t>AI-assisted development is part of the workflow. Architecture, integration, source review, test design, release decisions, and responsibility for the submitted work remain mine. Public examples separate observed results from interpretation and retain negative or inconclusive findings.</w:t>
+        <w:t>AI-assisted development is part of the workflow. Architecture, integration, source review, test design, release decisions, and responsibility for the submitted work remain mine, and negative or inconclusive findings stay on the record.</w:t>
       </w:r>
     </w:p>
     <w:p>

</xml_diff>